<commit_message>
Revise quotation and document No. 3 from updated fact-finding record
Item names now include brand/model; damage descriptions follow the revised record.

Co-Authored-By: Claude Opus 5.5 <noreply@anthropic.com>
Claude-Session: https://claude.ai/code/session_01CLAnyDuhFnWhH7sKpyCM9s
</commit_message>
<xml_diff>
--- a/เอกสารหมายเลข3.docx
+++ b/เอกสารหมายเลข3.docx
@@ -650,7 +650,7 @@
                 <w:szCs w:val="32"/>
                 <w:cs/>
               </w:rPr>
-              <w:t>เครื่องพิมพ์ Canon MP258 พร้อม Tank</w:t>
+              <w:t>เครื่องพิมพ์ ยี่ห้อ Canon รุ่น MP258 พร้อมติดตั้งระบบหมึก Tank</w:t>
             </w:r>
           </w:p>
         </w:tc>
@@ -853,7 +853,7 @@
                 <w:szCs w:val="32"/>
                 <w:cs/>
               </w:rPr>
-              <w:t>ชำรุด ใช้งานไม่ได้ ซ่อมแซมไม่คุ้มค่า</w:t>
+              <w:t>ชำรุด พิมพ์เอกสารไม่ได้ ซ่อมแซมไม่คุ้มค่า</w:t>
             </w:r>
           </w:p>
         </w:tc>
@@ -902,7 +902,7 @@
                 <w:szCs w:val="32"/>
                 <w:cs/>
               </w:rPr>
-              <w:t>เครื่องคอมพิวเตอร์ตั้งโต๊ะ Acer Aspire TC-780 Series</w:t>
+              <w:t>เครื่องคอมพิวเตอร์ตั้งโต๊ะ ยี่ห้อ Acer รุ่น Aspire TC-780 Series</w:t>
             </w:r>
           </w:p>
         </w:tc>
@@ -1103,7 +1103,7 @@
                 <w:szCs w:val="32"/>
                 <w:cs/>
               </w:rPr>
-              <w:t>ชำรุด ใช้งานไม่ได้ ซ่อมแซมไม่คุ้มค่า</w:t>
+              <w:t>ชำรุด เปิดเครื่องไม่ได้ ซ่อมแซมไม่คุ้มค่า</w:t>
             </w:r>
           </w:p>
         </w:tc>
@@ -1152,7 +1152,7 @@
                 <w:szCs w:val="32"/>
                 <w:cs/>
               </w:rPr>
-              <w:t>เครื่องคอมพิวเตอร์ All in One สำหรับประมวลผล</w:t>
+              <w:t>เครื่องคอมพิวเตอร์ All-in-One สำหรับประมวลผล ยี่ห้อ Acer รุ่น Veriton Z4660G</w:t>
             </w:r>
           </w:p>
         </w:tc>
@@ -1353,7 +1353,7 @@
                 <w:szCs w:val="32"/>
                 <w:cs/>
               </w:rPr>
-              <w:t>ชำรุด ใช้งานไม่ได้ ซ่อมแซมไม่คุ้มค่า</w:t>
+              <w:t>ชำรุด เปิดเครื่องไม่ได้ ซ่อมแซมไม่คุ้มค่า</w:t>
             </w:r>
           </w:p>
         </w:tc>
@@ -1402,7 +1402,7 @@
                 <w:szCs w:val="32"/>
                 <w:cs/>
               </w:rPr>
-              <w:t>เครื่องคอมพิวเตอร์ All in One สำหรับประมวลผล</w:t>
+              <w:t>เครื่องคอมพิวเตอร์ All-in-One สำหรับประมวลผล ยี่ห้อ Acer รุ่น Veriton Z4660G</w:t>
             </w:r>
           </w:p>
         </w:tc>
@@ -1603,7 +1603,7 @@
                 <w:szCs w:val="32"/>
                 <w:cs/>
               </w:rPr>
-              <w:t>ชำรุด ใช้งานไม่ได้ ซ่อมแซมไม่คุ้มค่า</w:t>
+              <w:t>ชำรุด เปิดเครื่องไม่ได้ ซ่อมแซมไม่คุ้มค่า</w:t>
             </w:r>
           </w:p>
         </w:tc>
@@ -1652,7 +1652,7 @@
                 <w:szCs w:val="32"/>
                 <w:cs/>
               </w:rPr>
-              <w:t>เครื่องคอมพิวเตอร์ All in One สำหรับประมวลผล</w:t>
+              <w:t>เครื่องคอมพิวเตอร์ All-in-One สำหรับประมวลผล ยี่ห้อ Acer รุ่น Veriton Z4660G</w:t>
             </w:r>
           </w:p>
         </w:tc>
@@ -1853,7 +1853,7 @@
                 <w:szCs w:val="32"/>
                 <w:cs/>
               </w:rPr>
-              <w:t>ชำรุด ใช้งานไม่ได้ ซ่อมแซมไม่คุ้มค่า</w:t>
+              <w:t>ชำรุด เปิดเครื่องไม่ได้ ซ่อมแซมไม่คุ้มค่า</w:t>
             </w:r>
           </w:p>
         </w:tc>
@@ -1902,7 +1902,7 @@
                 <w:szCs w:val="32"/>
                 <w:cs/>
               </w:rPr>
-              <w:t>เครื่องคอมพิวเตอร์ All in One สำหรับประมวลผล</w:t>
+              <w:t>เครื่องคอมพิวเตอร์ All-in-One สำหรับประมวลผล ยี่ห้อ Acer รุ่น Veriton Z4660G</w:t>
             </w:r>
           </w:p>
         </w:tc>
@@ -2103,7 +2103,7 @@
                 <w:szCs w:val="32"/>
                 <w:cs/>
               </w:rPr>
-              <w:t>ชำรุด ใช้งานไม่ได้ ซ่อมแซมไม่คุ้มค่า</w:t>
+              <w:t>ชำรุด เปิดเครื่องไม่ได้ ซ่อมแซมไม่คุ้มค่า</w:t>
             </w:r>
           </w:p>
         </w:tc>
@@ -2152,7 +2152,7 @@
                 <w:szCs w:val="32"/>
                 <w:cs/>
               </w:rPr>
-              <w:t>เครื่องคอมพิวเตอร์ All in One สำหรับประมวลผล</w:t>
+              <w:t>เครื่องคอมพิวเตอร์ All-in-One สำหรับประมวลผล ยี่ห้อ Acer รุ่น Veriton Z4660G</w:t>
             </w:r>
           </w:p>
         </w:tc>
@@ -2353,7 +2353,7 @@
                 <w:szCs w:val="32"/>
                 <w:cs/>
               </w:rPr>
-              <w:t>ชำรุด ใช้งานไม่ได้ ซ่อมแซมไม่คุ้มค่า</w:t>
+              <w:t>ชำรุด เปิดเครื่องไม่ได้ ซ่อมแซมไม่คุ้มค่า</w:t>
             </w:r>
           </w:p>
         </w:tc>
@@ -2402,7 +2402,7 @@
                 <w:szCs w:val="32"/>
                 <w:cs/>
               </w:rPr>
-              <w:t>เครื่องพิมพ์ชนิดเลเซอร์หรือชนิด LED ขาวดำ ชนิด Network แบบที่ 2</w:t>
+              <w:t>เครื่องพิมพ์ชนิดเลเซอร์หรือชนิด LED ขาวดำ ชนิด Network แบบที่ ๒</w:t>
             </w:r>
           </w:p>
         </w:tc>
@@ -2603,7 +2603,7 @@
                 <w:szCs w:val="32"/>
                 <w:cs/>
               </w:rPr>
-              <w:t>ชำรุด ใช้งานไม่ได้ ซ่อมแซมไม่คุ้มค่า</w:t>
+              <w:t>ชำรุด พิมพ์เอกสารไม่ได้ ซ่อมแซมไม่คุ้มค่า</w:t>
             </w:r>
           </w:p>
         </w:tc>
@@ -2652,7 +2652,7 @@
                 <w:szCs w:val="32"/>
                 <w:cs/>
               </w:rPr>
-              <w:t>เครื่องคอมพิวเตอร์ รุ่น HP Elitedesk 705 q2 SFF</w:t>
+              <w:t>เครื่องคอมพิวเตอร์ตั้งโต๊ะ ยี่ห้อ HP รุ่น EliteDesk 705 G2 SFF</w:t>
             </w:r>
           </w:p>
         </w:tc>
@@ -2853,7 +2853,7 @@
                 <w:szCs w:val="32"/>
                 <w:cs/>
               </w:rPr>
-              <w:t>ชำรุด ใช้งานไม่ได้ ซ่อมแซมไม่คุ้มค่า</w:t>
+              <w:t>ชำรุด เปิดเครื่องไม่ได้ ซ่อมแซมไม่คุ้มค่า</w:t>
             </w:r>
           </w:p>
         </w:tc>
@@ -2902,7 +2902,7 @@
                 <w:szCs w:val="32"/>
                 <w:cs/>
               </w:rPr>
-              <w:t>เครื่องคอมพิวเตอร์ รุ่น HP Elitedesk 705 q2 SFF</w:t>
+              <w:t>เครื่องคอมพิวเตอร์ตั้งโต๊ะ ยี่ห้อ HP รุ่น EliteDesk 705 G2 SFF</w:t>
             </w:r>
           </w:p>
         </w:tc>
@@ -3103,7 +3103,7 @@
                 <w:szCs w:val="32"/>
                 <w:cs/>
               </w:rPr>
-              <w:t>ชำรุด ใช้งานไม่ได้ ซ่อมแซมไม่คุ้มค่า</w:t>
+              <w:t>ชำรุด เปิดเครื่องไม่ได้ ซ่อมแซมไม่คุ้มค่า</w:t>
             </w:r>
           </w:p>
         </w:tc>
@@ -3152,7 +3152,7 @@
                 <w:szCs w:val="32"/>
                 <w:cs/>
               </w:rPr>
-              <w:t>เครื่องคอมพิวเตอร์ รุ่น HP Elitedesk 705 q2 SFF</w:t>
+              <w:t>เครื่องคอมพิวเตอร์ตั้งโต๊ะ ยี่ห้อ HP รุ่น EliteDesk 705 G2 SFF</w:t>
             </w:r>
           </w:p>
         </w:tc>
@@ -3353,7 +3353,7 @@
                 <w:szCs w:val="32"/>
                 <w:cs/>
               </w:rPr>
-              <w:t>ชำรุด ใช้งานไม่ได้ ซ่อมแซมไม่คุ้มค่า</w:t>
+              <w:t>ชำรุด เปิดเครื่องไม่ได้ ซ่อมแซมไม่คุ้มค่า</w:t>
             </w:r>
           </w:p>
         </w:tc>
@@ -3402,7 +3402,7 @@
                 <w:szCs w:val="32"/>
                 <w:cs/>
               </w:rPr>
-              <w:t>เครื่องคอมพิวเตอร์ รุ่น HP Elitedesk 705 q2 SFF</w:t>
+              <w:t>เครื่องคอมพิวเตอร์ตั้งโต๊ะ ยี่ห้อ HP รุ่น EliteDesk 705 G2 SFF</w:t>
             </w:r>
           </w:p>
         </w:tc>
@@ -3603,7 +3603,7 @@
                 <w:szCs w:val="32"/>
                 <w:cs/>
               </w:rPr>
-              <w:t>ชำรุด ใช้งานไม่ได้ ซ่อมแซมไม่คุ้มค่า</w:t>
+              <w:t>ชำรุด เปิดเครื่องไม่ได้ ซ่อมแซมไม่คุ้มค่า</w:t>
             </w:r>
           </w:p>
         </w:tc>
@@ -3652,7 +3652,7 @@
                 <w:szCs w:val="32"/>
                 <w:cs/>
               </w:rPr>
-              <w:t>เครื่องคอมพิวเตอร์ รุ่น HP Elitedesk 705 q2 SFF</w:t>
+              <w:t>เครื่องคอมพิวเตอร์ตั้งโต๊ะ ยี่ห้อ HP รุ่น EliteDesk 705 G2 SFF</w:t>
             </w:r>
           </w:p>
         </w:tc>
@@ -3853,7 +3853,7 @@
                 <w:szCs w:val="32"/>
                 <w:cs/>
               </w:rPr>
-              <w:t>ชำรุด ใช้งานไม่ได้ ซ่อมแซมไม่คุ้มค่า</w:t>
+              <w:t>ชำรุด เปิดเครื่องไม่ได้ ซ่อมแซมไม่คุ้มค่า</w:t>
             </w:r>
           </w:p>
         </w:tc>
@@ -3902,7 +3902,7 @@
                 <w:szCs w:val="32"/>
                 <w:cs/>
               </w:rPr>
-              <w:t>เครื่องคอมพิวเตอร์ รุ่น HP Elitedesk 705 q2 SFF</w:t>
+              <w:t>เครื่องคอมพิวเตอร์ตั้งโต๊ะ ยี่ห้อ HP รุ่น EliteDesk 705 G2 SFF</w:t>
             </w:r>
           </w:p>
         </w:tc>
@@ -4103,7 +4103,7 @@
                 <w:szCs w:val="32"/>
                 <w:cs/>
               </w:rPr>
-              <w:t>ชำรุด ใช้งานไม่ได้ ซ่อมแซมไม่คุ้มค่า</w:t>
+              <w:t>ชำรุด เปิดเครื่องไม่ได้ ซ่อมแซมไม่คุ้มค่า</w:t>
             </w:r>
           </w:p>
         </w:tc>
@@ -4152,7 +4152,7 @@
                 <w:szCs w:val="32"/>
                 <w:cs/>
               </w:rPr>
-              <w:t>เครื่องคอมพิวเตอร์ รุ่น HP Elitedesk 705 q2 SFF</w:t>
+              <w:t>เครื่องคอมพิวเตอร์ตั้งโต๊ะ ยี่ห้อ HP รุ่น EliteDesk 705 G2 SFF</w:t>
             </w:r>
           </w:p>
         </w:tc>
@@ -4353,7 +4353,7 @@
                 <w:szCs w:val="32"/>
                 <w:cs/>
               </w:rPr>
-              <w:t>ชำรุด ใช้งานไม่ได้ ซ่อมแซมไม่คุ้มค่า</w:t>
+              <w:t>ชำรุด เปิดเครื่องไม่ได้ ซ่อมแซมไม่คุ้มค่า</w:t>
             </w:r>
           </w:p>
         </w:tc>
@@ -4402,7 +4402,7 @@
                 <w:szCs w:val="32"/>
                 <w:cs/>
               </w:rPr>
-              <w:t>เครื่องคอมพิวเตอร์ รุ่น HP Elitedesk 705 q2 SFF</w:t>
+              <w:t>เครื่องคอมพิวเตอร์ตั้งโต๊ะ ยี่ห้อ HP รุ่น EliteDesk 705 G2 SFF</w:t>
             </w:r>
           </w:p>
         </w:tc>
@@ -4603,7 +4603,7 @@
                 <w:szCs w:val="32"/>
                 <w:cs/>
               </w:rPr>
-              <w:t>ชำรุด ใช้งานไม่ได้ ซ่อมแซมไม่คุ้มค่า</w:t>
+              <w:t>ชำรุด เปิดเครื่องไม่ได้ ซ่อมแซมไม่คุ้มค่า</w:t>
             </w:r>
           </w:p>
         </w:tc>
@@ -4652,7 +4652,7 @@
                 <w:szCs w:val="32"/>
                 <w:cs/>
               </w:rPr>
-              <w:t>เครื่องคอมพิวเตอร์ รุ่น HP Elitedesk 705 q2 SFF</w:t>
+              <w:t>เครื่องคอมพิวเตอร์ตั้งโต๊ะ ยี่ห้อ HP รุ่น EliteDesk 705 G2 SFF</w:t>
             </w:r>
           </w:p>
         </w:tc>
@@ -4853,7 +4853,7 @@
                 <w:szCs w:val="32"/>
                 <w:cs/>
               </w:rPr>
-              <w:t>ชำรุด ใช้งานไม่ได้ ซ่อมแซมไม่คุ้มค่า</w:t>
+              <w:t>ชำรุด เปิดเครื่องไม่ได้ ซ่อมแซมไม่คุ้มค่า</w:t>
             </w:r>
           </w:p>
         </w:tc>
@@ -4902,7 +4902,7 @@
                 <w:szCs w:val="32"/>
                 <w:cs/>
               </w:rPr>
-              <w:t>เครื่องคอมพิวเตอร์ รุ่น HP Elitedesk 705 q2 SFF</w:t>
+              <w:t>เครื่องคอมพิวเตอร์ตั้งโต๊ะ ยี่ห้อ HP รุ่น EliteDesk 705 G2 SFF</w:t>
             </w:r>
           </w:p>
         </w:tc>
@@ -5103,7 +5103,7 @@
                 <w:szCs w:val="32"/>
                 <w:cs/>
               </w:rPr>
-              <w:t>ชำรุด ใช้งานไม่ได้ ซ่อมแซมไม่คุ้มค่า</w:t>
+              <w:t>ชำรุด เปิดเครื่องไม่ได้ ซ่อมแซมไม่คุ้มค่า</w:t>
             </w:r>
           </w:p>
         </w:tc>
@@ -5152,7 +5152,7 @@
                 <w:szCs w:val="32"/>
                 <w:cs/>
               </w:rPr>
-              <w:t>เครื่องคอมพิวเตอร์ รุ่น HP Elitedesk 705 q2 SFF</w:t>
+              <w:t>เครื่องคอมพิวเตอร์ตั้งโต๊ะ ยี่ห้อ HP รุ่น EliteDesk 705 G2 SFF</w:t>
             </w:r>
           </w:p>
         </w:tc>
@@ -5353,7 +5353,7 @@
                 <w:szCs w:val="32"/>
                 <w:cs/>
               </w:rPr>
-              <w:t>ชำรุด ใช้งานไม่ได้ ซ่อมแซมไม่คุ้มค่า</w:t>
+              <w:t>ชำรุด เปิดเครื่องไม่ได้ ซ่อมแซมไม่คุ้มค่า</w:t>
             </w:r>
           </w:p>
         </w:tc>
@@ -5402,7 +5402,7 @@
                 <w:szCs w:val="32"/>
                 <w:cs/>
               </w:rPr>
-              <w:t>เครื่องคอมพิวเตอร์ รุ่น HP Elitedesk 705 q2 SFF</w:t>
+              <w:t>เครื่องคอมพิวเตอร์ตั้งโต๊ะ ยี่ห้อ HP รุ่น EliteDesk 705 G2 SFF</w:t>
             </w:r>
           </w:p>
         </w:tc>
@@ -5603,7 +5603,7 @@
                 <w:szCs w:val="32"/>
                 <w:cs/>
               </w:rPr>
-              <w:t>ชำรุด ใช้งานไม่ได้ ซ่อมแซมไม่คุ้มค่า</w:t>
+              <w:t>ชำรุด เปิดเครื่องไม่ได้ ซ่อมแซมไม่คุ้มค่า</w:t>
             </w:r>
           </w:p>
         </w:tc>
@@ -5652,7 +5652,7 @@
                 <w:szCs w:val="32"/>
                 <w:cs/>
               </w:rPr>
-              <w:t>จอคอมพิวเตอร์ HP</w:t>
+              <w:t>จอภาพคอมพิวเตอร์ ยี่ห้อ HP รุ่น V242</w:t>
             </w:r>
           </w:p>
         </w:tc>
@@ -5853,7 +5853,7 @@
                 <w:szCs w:val="32"/>
                 <w:cs/>
               </w:rPr>
-              <w:t>ชำรุด ใช้งานไม่ได้ ซ่อมแซมไม่คุ้มค่า</w:t>
+              <w:t>ชำรุด แสดงผลภาพไม่ได้ ซ่อมแซมไม่คุ้มค่า</w:t>
             </w:r>
           </w:p>
         </w:tc>
@@ -5946,22 +5946,6 @@
                 <w:cs/>
               </w:rPr>
             </w:pPr>
-          </w:p>
-        </w:tc>
-        <w:tc>
-          <w:tcPr>
-            <w:tcW w:w="0" w:type="auto"/>
-          </w:tcPr>
-          <w:p>
-            <w:pPr>
-              <w:jc w:val="center"/>
-              <w:rPr>
-                <w:rFonts w:ascii="TH SarabunIT๙" w:eastAsia="Calibri" w:hAnsi="TH SarabunIT๙" w:cs="TH SarabunIT๙"/>
-                <w:sz w:val="32"/>
-                <w:szCs w:val="32"/>
-                <w:cs/>
-              </w:rPr>
-            </w:pPr>
             <w:r>
               <w:rPr>
                 <w:rFonts w:ascii="Segoe UI Symbol" w:eastAsia="Calibri" w:hAnsi="Segoe UI Symbol" w:cs="Segoe UI Symbol" w:hint="cs"/>
@@ -5987,30 +5971,55 @@
                 <w:cs/>
               </w:rPr>
             </w:pPr>
-          </w:p>
-        </w:tc>
-        <w:tc>
-          <w:tcPr>
-            <w:tcW w:w="0" w:type="auto"/>
-          </w:tcPr>
-          <w:p>
-            <w:pPr>
-              <w:jc w:val="center"/>
-              <w:rPr>
-                <w:rFonts w:ascii="TH SarabunIT๙" w:eastAsia="Calibri" w:hAnsi="TH SarabunIT๙" w:cs="TH SarabunIT๙"/>
-                <w:sz w:val="32"/>
-                <w:szCs w:val="32"/>
-                <w:cs/>
-              </w:rPr>
-            </w:pPr>
-            <w:r>
-              <w:rPr>
-                <w:rFonts w:ascii="TH SarabunIT๙" w:eastAsia="Calibri" w:hAnsi="TH SarabunIT๙" w:cs="TH SarabunIT๙"/>
-                <w:sz w:val="32"/>
-                <w:szCs w:val="32"/>
-                <w:cs/>
-              </w:rPr>
-              <w:t>เสื่อมสภาพ</w:t>
+            <w:r>
+              <w:rPr>
+                <w:rFonts w:ascii="Segoe UI Symbol" w:eastAsia="Calibri" w:hAnsi="Segoe UI Symbol" w:cs="Segoe UI Symbol" w:hint="cs"/>
+                <w:sz w:val="32"/>
+                <w:szCs w:val="32"/>
+                <w:cs/>
+              </w:rPr>
+              <w:t>✓</w:t>
+            </w:r>
+          </w:p>
+        </w:tc>
+        <w:tc>
+          <w:tcPr>
+            <w:tcW w:w="0" w:type="auto"/>
+          </w:tcPr>
+          <w:p>
+            <w:pPr>
+              <w:jc w:val="center"/>
+              <w:rPr>
+                <w:rFonts w:ascii="TH SarabunIT๙" w:eastAsia="Calibri" w:hAnsi="TH SarabunIT๙" w:cs="TH SarabunIT๙"/>
+                <w:sz w:val="32"/>
+                <w:szCs w:val="32"/>
+                <w:cs/>
+              </w:rPr>
+            </w:pPr>
+          </w:p>
+        </w:tc>
+        <w:tc>
+          <w:tcPr>
+            <w:tcW w:w="0" w:type="auto"/>
+          </w:tcPr>
+          <w:p>
+            <w:pPr>
+              <w:jc w:val="center"/>
+              <w:rPr>
+                <w:rFonts w:ascii="TH SarabunIT๙" w:eastAsia="Calibri" w:hAnsi="TH SarabunIT๙" w:cs="TH SarabunIT๙"/>
+                <w:sz w:val="32"/>
+                <w:szCs w:val="32"/>
+                <w:cs/>
+              </w:rPr>
+            </w:pPr>
+            <w:r>
+              <w:rPr>
+                <w:rFonts w:ascii="TH SarabunIT๙" w:eastAsia="Calibri" w:hAnsi="TH SarabunIT๙" w:cs="TH SarabunIT๙"/>
+                <w:sz w:val="32"/>
+                <w:szCs w:val="32"/>
+                <w:cs/>
+              </w:rPr>
+              <w:t>ชำรุด เสื่อมสภาพ</w:t>
             </w:r>
           </w:p>
         </w:tc>
@@ -6106,7 +6115,7 @@
                 <w:szCs w:val="32"/>
                 <w:cs/>
               </w:rPr>
-              <w:t>เสื่อมสภาพจนชำรุด ใช้งานไม่ปลอดภัย ซ่อมแซมไม่คุ้มค่า</w:t>
+              <w:t>ชำรุดและเสื่อมสภาพตามอายุการใช้งาน ใช้งานไม่ปลอดภัย ซ่อมแซมไม่คุ้มค่า</w:t>
             </w:r>
           </w:p>
         </w:tc>
@@ -6199,22 +6208,6 @@
                 <w:cs/>
               </w:rPr>
             </w:pPr>
-          </w:p>
-        </w:tc>
-        <w:tc>
-          <w:tcPr>
-            <w:tcW w:w="0" w:type="auto"/>
-          </w:tcPr>
-          <w:p>
-            <w:pPr>
-              <w:jc w:val="center"/>
-              <w:rPr>
-                <w:rFonts w:ascii="TH SarabunIT๙" w:eastAsia="Calibri" w:hAnsi="TH SarabunIT๙" w:cs="TH SarabunIT๙"/>
-                <w:sz w:val="32"/>
-                <w:szCs w:val="32"/>
-                <w:cs/>
-              </w:rPr>
-            </w:pPr>
             <w:r>
               <w:rPr>
                 <w:rFonts w:ascii="Segoe UI Symbol" w:eastAsia="Calibri" w:hAnsi="Segoe UI Symbol" w:cs="Segoe UI Symbol" w:hint="cs"/>
@@ -6240,30 +6233,55 @@
                 <w:cs/>
               </w:rPr>
             </w:pPr>
-          </w:p>
-        </w:tc>
-        <w:tc>
-          <w:tcPr>
-            <w:tcW w:w="0" w:type="auto"/>
-          </w:tcPr>
-          <w:p>
-            <w:pPr>
-              <w:jc w:val="center"/>
-              <w:rPr>
-                <w:rFonts w:ascii="TH SarabunIT๙" w:eastAsia="Calibri" w:hAnsi="TH SarabunIT๙" w:cs="TH SarabunIT๙"/>
-                <w:sz w:val="32"/>
-                <w:szCs w:val="32"/>
-                <w:cs/>
-              </w:rPr>
-            </w:pPr>
-            <w:r>
-              <w:rPr>
-                <w:rFonts w:ascii="TH SarabunIT๙" w:eastAsia="Calibri" w:hAnsi="TH SarabunIT๙" w:cs="TH SarabunIT๙"/>
-                <w:sz w:val="32"/>
-                <w:szCs w:val="32"/>
-                <w:cs/>
-              </w:rPr>
-              <w:t>เสื่อมสภาพ</w:t>
+            <w:r>
+              <w:rPr>
+                <w:rFonts w:ascii="Segoe UI Symbol" w:eastAsia="Calibri" w:hAnsi="Segoe UI Symbol" w:cs="Segoe UI Symbol" w:hint="cs"/>
+                <w:sz w:val="32"/>
+                <w:szCs w:val="32"/>
+                <w:cs/>
+              </w:rPr>
+              <w:t>✓</w:t>
+            </w:r>
+          </w:p>
+        </w:tc>
+        <w:tc>
+          <w:tcPr>
+            <w:tcW w:w="0" w:type="auto"/>
+          </w:tcPr>
+          <w:p>
+            <w:pPr>
+              <w:jc w:val="center"/>
+              <w:rPr>
+                <w:rFonts w:ascii="TH SarabunIT๙" w:eastAsia="Calibri" w:hAnsi="TH SarabunIT๙" w:cs="TH SarabunIT๙"/>
+                <w:sz w:val="32"/>
+                <w:szCs w:val="32"/>
+                <w:cs/>
+              </w:rPr>
+            </w:pPr>
+          </w:p>
+        </w:tc>
+        <w:tc>
+          <w:tcPr>
+            <w:tcW w:w="0" w:type="auto"/>
+          </w:tcPr>
+          <w:p>
+            <w:pPr>
+              <w:jc w:val="center"/>
+              <w:rPr>
+                <w:rFonts w:ascii="TH SarabunIT๙" w:eastAsia="Calibri" w:hAnsi="TH SarabunIT๙" w:cs="TH SarabunIT๙"/>
+                <w:sz w:val="32"/>
+                <w:szCs w:val="32"/>
+                <w:cs/>
+              </w:rPr>
+            </w:pPr>
+            <w:r>
+              <w:rPr>
+                <w:rFonts w:ascii="TH SarabunIT๙" w:eastAsia="Calibri" w:hAnsi="TH SarabunIT๙" w:cs="TH SarabunIT๙"/>
+                <w:sz w:val="32"/>
+                <w:szCs w:val="32"/>
+                <w:cs/>
+              </w:rPr>
+              <w:t>ชำรุด เสื่อมสภาพ</w:t>
             </w:r>
           </w:p>
         </w:tc>
@@ -6359,7 +6377,7 @@
                 <w:szCs w:val="32"/>
                 <w:cs/>
               </w:rPr>
-              <w:t>เสื่อมสภาพจนชำรุด ใช้งานไม่ปลอดภัย ซ่อมแซมไม่คุ้มค่า</w:t>
+              <w:t>ชำรุดและเสื่อมสภาพตามอายุการใช้งาน ใช้งานไม่ปลอดภัย ซ่อมแซมไม่คุ้มค่า</w:t>
             </w:r>
           </w:p>
         </w:tc>
@@ -6452,22 +6470,6 @@
                 <w:cs/>
               </w:rPr>
             </w:pPr>
-          </w:p>
-        </w:tc>
-        <w:tc>
-          <w:tcPr>
-            <w:tcW w:w="0" w:type="auto"/>
-          </w:tcPr>
-          <w:p>
-            <w:pPr>
-              <w:jc w:val="center"/>
-              <w:rPr>
-                <w:rFonts w:ascii="TH SarabunIT๙" w:eastAsia="Calibri" w:hAnsi="TH SarabunIT๙" w:cs="TH SarabunIT๙"/>
-                <w:sz w:val="32"/>
-                <w:szCs w:val="32"/>
-                <w:cs/>
-              </w:rPr>
-            </w:pPr>
             <w:r>
               <w:rPr>
                 <w:rFonts w:ascii="Segoe UI Symbol" w:eastAsia="Calibri" w:hAnsi="Segoe UI Symbol" w:cs="Segoe UI Symbol" w:hint="cs"/>
@@ -6493,30 +6495,55 @@
                 <w:cs/>
               </w:rPr>
             </w:pPr>
-          </w:p>
-        </w:tc>
-        <w:tc>
-          <w:tcPr>
-            <w:tcW w:w="0" w:type="auto"/>
-          </w:tcPr>
-          <w:p>
-            <w:pPr>
-              <w:jc w:val="center"/>
-              <w:rPr>
-                <w:rFonts w:ascii="TH SarabunIT๙" w:eastAsia="Calibri" w:hAnsi="TH SarabunIT๙" w:cs="TH SarabunIT๙"/>
-                <w:sz w:val="32"/>
-                <w:szCs w:val="32"/>
-                <w:cs/>
-              </w:rPr>
-            </w:pPr>
-            <w:r>
-              <w:rPr>
-                <w:rFonts w:ascii="TH SarabunIT๙" w:eastAsia="Calibri" w:hAnsi="TH SarabunIT๙" w:cs="TH SarabunIT๙"/>
-                <w:sz w:val="32"/>
-                <w:szCs w:val="32"/>
-                <w:cs/>
-              </w:rPr>
-              <w:t>เสื่อมสภาพ</w:t>
+            <w:r>
+              <w:rPr>
+                <w:rFonts w:ascii="Segoe UI Symbol" w:eastAsia="Calibri" w:hAnsi="Segoe UI Symbol" w:cs="Segoe UI Symbol" w:hint="cs"/>
+                <w:sz w:val="32"/>
+                <w:szCs w:val="32"/>
+                <w:cs/>
+              </w:rPr>
+              <w:t>✓</w:t>
+            </w:r>
+          </w:p>
+        </w:tc>
+        <w:tc>
+          <w:tcPr>
+            <w:tcW w:w="0" w:type="auto"/>
+          </w:tcPr>
+          <w:p>
+            <w:pPr>
+              <w:jc w:val="center"/>
+              <w:rPr>
+                <w:rFonts w:ascii="TH SarabunIT๙" w:eastAsia="Calibri" w:hAnsi="TH SarabunIT๙" w:cs="TH SarabunIT๙"/>
+                <w:sz w:val="32"/>
+                <w:szCs w:val="32"/>
+                <w:cs/>
+              </w:rPr>
+            </w:pPr>
+          </w:p>
+        </w:tc>
+        <w:tc>
+          <w:tcPr>
+            <w:tcW w:w="0" w:type="auto"/>
+          </w:tcPr>
+          <w:p>
+            <w:pPr>
+              <w:jc w:val="center"/>
+              <w:rPr>
+                <w:rFonts w:ascii="TH SarabunIT๙" w:eastAsia="Calibri" w:hAnsi="TH SarabunIT๙" w:cs="TH SarabunIT๙"/>
+                <w:sz w:val="32"/>
+                <w:szCs w:val="32"/>
+                <w:cs/>
+              </w:rPr>
+            </w:pPr>
+            <w:r>
+              <w:rPr>
+                <w:rFonts w:ascii="TH SarabunIT๙" w:eastAsia="Calibri" w:hAnsi="TH SarabunIT๙" w:cs="TH SarabunIT๙"/>
+                <w:sz w:val="32"/>
+                <w:szCs w:val="32"/>
+                <w:cs/>
+              </w:rPr>
+              <w:t>ชำรุด เสื่อมสภาพ</w:t>
             </w:r>
           </w:p>
         </w:tc>
@@ -6612,7 +6639,7 @@
                 <w:szCs w:val="32"/>
                 <w:cs/>
               </w:rPr>
-              <w:t>เสื่อมสภาพจนชำรุด ใช้งานไม่ปลอดภัย ซ่อมแซมไม่คุ้มค่า</w:t>
+              <w:t>ชำรุดและเสื่อมสภาพตามอายุการใช้งาน ใช้งานไม่ปลอดภัย ซ่อมแซมไม่คุ้มค่า</w:t>
             </w:r>
           </w:p>
         </w:tc>
@@ -6706,22 +6733,6 @@
                 <w:cs/>
               </w:rPr>
             </w:pPr>
-          </w:p>
-        </w:tc>
-        <w:tc>
-          <w:tcPr>
-            <w:tcW w:w="0" w:type="auto"/>
-          </w:tcPr>
-          <w:p>
-            <w:pPr>
-              <w:jc w:val="center"/>
-              <w:rPr>
-                <w:rFonts w:ascii="TH SarabunIT๙" w:eastAsia="Calibri" w:hAnsi="TH SarabunIT๙" w:cs="TH SarabunIT๙"/>
-                <w:sz w:val="32"/>
-                <w:szCs w:val="32"/>
-                <w:cs/>
-              </w:rPr>
-            </w:pPr>
             <w:r>
               <w:rPr>
                 <w:rFonts w:ascii="Segoe UI Symbol" w:eastAsia="Calibri" w:hAnsi="Segoe UI Symbol" w:cs="Segoe UI Symbol" w:hint="cs"/>
@@ -6747,30 +6758,55 @@
                 <w:cs/>
               </w:rPr>
             </w:pPr>
-          </w:p>
-        </w:tc>
-        <w:tc>
-          <w:tcPr>
-            <w:tcW w:w="0" w:type="auto"/>
-          </w:tcPr>
-          <w:p>
-            <w:pPr>
-              <w:jc w:val="center"/>
-              <w:rPr>
-                <w:rFonts w:ascii="TH SarabunIT๙" w:eastAsia="Calibri" w:hAnsi="TH SarabunIT๙" w:cs="TH SarabunIT๙"/>
-                <w:sz w:val="32"/>
-                <w:szCs w:val="32"/>
-                <w:cs/>
-              </w:rPr>
-            </w:pPr>
-            <w:r>
-              <w:rPr>
-                <w:rFonts w:ascii="TH SarabunIT๙" w:eastAsia="Calibri" w:hAnsi="TH SarabunIT๙" w:cs="TH SarabunIT๙"/>
-                <w:sz w:val="32"/>
-                <w:szCs w:val="32"/>
-                <w:cs/>
-              </w:rPr>
-              <w:t>เสื่อมสภาพ</w:t>
+            <w:r>
+              <w:rPr>
+                <w:rFonts w:ascii="Segoe UI Symbol" w:eastAsia="Calibri" w:hAnsi="Segoe UI Symbol" w:cs="Segoe UI Symbol" w:hint="cs"/>
+                <w:sz w:val="32"/>
+                <w:szCs w:val="32"/>
+                <w:cs/>
+              </w:rPr>
+              <w:t>✓</w:t>
+            </w:r>
+          </w:p>
+        </w:tc>
+        <w:tc>
+          <w:tcPr>
+            <w:tcW w:w="0" w:type="auto"/>
+          </w:tcPr>
+          <w:p>
+            <w:pPr>
+              <w:jc w:val="center"/>
+              <w:rPr>
+                <w:rFonts w:ascii="TH SarabunIT๙" w:eastAsia="Calibri" w:hAnsi="TH SarabunIT๙" w:cs="TH SarabunIT๙"/>
+                <w:sz w:val="32"/>
+                <w:szCs w:val="32"/>
+                <w:cs/>
+              </w:rPr>
+            </w:pPr>
+          </w:p>
+        </w:tc>
+        <w:tc>
+          <w:tcPr>
+            <w:tcW w:w="0" w:type="auto"/>
+          </w:tcPr>
+          <w:p>
+            <w:pPr>
+              <w:jc w:val="center"/>
+              <w:rPr>
+                <w:rFonts w:ascii="TH SarabunIT๙" w:eastAsia="Calibri" w:hAnsi="TH SarabunIT๙" w:cs="TH SarabunIT๙"/>
+                <w:sz w:val="32"/>
+                <w:szCs w:val="32"/>
+                <w:cs/>
+              </w:rPr>
+            </w:pPr>
+            <w:r>
+              <w:rPr>
+                <w:rFonts w:ascii="TH SarabunIT๙" w:eastAsia="Calibri" w:hAnsi="TH SarabunIT๙" w:cs="TH SarabunIT๙"/>
+                <w:sz w:val="32"/>
+                <w:szCs w:val="32"/>
+                <w:cs/>
+              </w:rPr>
+              <w:t>ชำรุด เสื่อมสภาพ</w:t>
             </w:r>
           </w:p>
         </w:tc>
@@ -6866,7 +6902,7 @@
                 <w:szCs w:val="32"/>
                 <w:cs/>
               </w:rPr>
-              <w:t>เสื่อมสภาพจนชำรุด ใช้งานไม่ปลอดภัย ซ่อมแซมไม่คุ้มค่า</w:t>
+              <w:t>ชำรุดและเสื่อมสภาพตามอายุการใช้งาน ใช้งานไม่ปลอดภัย ซ่อมแซมไม่คุ้มค่า</w:t>
             </w:r>
           </w:p>
         </w:tc>
@@ -6959,22 +6995,6 @@
                 <w:cs/>
               </w:rPr>
             </w:pPr>
-          </w:p>
-        </w:tc>
-        <w:tc>
-          <w:tcPr>
-            <w:tcW w:w="0" w:type="auto"/>
-          </w:tcPr>
-          <w:p>
-            <w:pPr>
-              <w:jc w:val="center"/>
-              <w:rPr>
-                <w:rFonts w:ascii="TH SarabunIT๙" w:eastAsia="Calibri" w:hAnsi="TH SarabunIT๙" w:cs="TH SarabunIT๙"/>
-                <w:sz w:val="32"/>
-                <w:szCs w:val="32"/>
-                <w:cs/>
-              </w:rPr>
-            </w:pPr>
             <w:r>
               <w:rPr>
                 <w:rFonts w:ascii="Segoe UI Symbol" w:eastAsia="Calibri" w:hAnsi="Segoe UI Symbol" w:cs="Segoe UI Symbol" w:hint="cs"/>
@@ -7000,30 +7020,55 @@
                 <w:cs/>
               </w:rPr>
             </w:pPr>
-          </w:p>
-        </w:tc>
-        <w:tc>
-          <w:tcPr>
-            <w:tcW w:w="0" w:type="auto"/>
-          </w:tcPr>
-          <w:p>
-            <w:pPr>
-              <w:jc w:val="center"/>
-              <w:rPr>
-                <w:rFonts w:ascii="TH SarabunIT๙" w:eastAsia="Calibri" w:hAnsi="TH SarabunIT๙" w:cs="TH SarabunIT๙"/>
-                <w:sz w:val="32"/>
-                <w:szCs w:val="32"/>
-                <w:cs/>
-              </w:rPr>
-            </w:pPr>
-            <w:r>
-              <w:rPr>
-                <w:rFonts w:ascii="TH SarabunIT๙" w:eastAsia="Calibri" w:hAnsi="TH SarabunIT๙" w:cs="TH SarabunIT๙"/>
-                <w:sz w:val="32"/>
-                <w:szCs w:val="32"/>
-                <w:cs/>
-              </w:rPr>
-              <w:t>เสื่อมสภาพ</w:t>
+            <w:r>
+              <w:rPr>
+                <w:rFonts w:ascii="Segoe UI Symbol" w:eastAsia="Calibri" w:hAnsi="Segoe UI Symbol" w:cs="Segoe UI Symbol" w:hint="cs"/>
+                <w:sz w:val="32"/>
+                <w:szCs w:val="32"/>
+                <w:cs/>
+              </w:rPr>
+              <w:t>✓</w:t>
+            </w:r>
+          </w:p>
+        </w:tc>
+        <w:tc>
+          <w:tcPr>
+            <w:tcW w:w="0" w:type="auto"/>
+          </w:tcPr>
+          <w:p>
+            <w:pPr>
+              <w:jc w:val="center"/>
+              <w:rPr>
+                <w:rFonts w:ascii="TH SarabunIT๙" w:eastAsia="Calibri" w:hAnsi="TH SarabunIT๙" w:cs="TH SarabunIT๙"/>
+                <w:sz w:val="32"/>
+                <w:szCs w:val="32"/>
+                <w:cs/>
+              </w:rPr>
+            </w:pPr>
+          </w:p>
+        </w:tc>
+        <w:tc>
+          <w:tcPr>
+            <w:tcW w:w="0" w:type="auto"/>
+          </w:tcPr>
+          <w:p>
+            <w:pPr>
+              <w:jc w:val="center"/>
+              <w:rPr>
+                <w:rFonts w:ascii="TH SarabunIT๙" w:eastAsia="Calibri" w:hAnsi="TH SarabunIT๙" w:cs="TH SarabunIT๙"/>
+                <w:sz w:val="32"/>
+                <w:szCs w:val="32"/>
+                <w:cs/>
+              </w:rPr>
+            </w:pPr>
+            <w:r>
+              <w:rPr>
+                <w:rFonts w:ascii="TH SarabunIT๙" w:eastAsia="Calibri" w:hAnsi="TH SarabunIT๙" w:cs="TH SarabunIT๙"/>
+                <w:sz w:val="32"/>
+                <w:szCs w:val="32"/>
+                <w:cs/>
+              </w:rPr>
+              <w:t>ชำรุด เสื่อมสภาพ</w:t>
             </w:r>
           </w:p>
         </w:tc>
@@ -7119,7 +7164,7 @@
                 <w:szCs w:val="32"/>
                 <w:cs/>
               </w:rPr>
-              <w:t>เสื่อมสภาพจนชำรุด ใช้งานไม่ปลอดภัย ซ่อมแซมไม่คุ้มค่า</w:t>
+              <w:t>ชำรุดและเสื่อมสภาพตามอายุการใช้งาน ใช้งานไม่ปลอดภัย ซ่อมแซมไม่คุ้มค่า</w:t>
             </w:r>
           </w:p>
         </w:tc>
@@ -7213,22 +7258,6 @@
                 <w:cs/>
               </w:rPr>
             </w:pPr>
-          </w:p>
-        </w:tc>
-        <w:tc>
-          <w:tcPr>
-            <w:tcW w:w="0" w:type="auto"/>
-          </w:tcPr>
-          <w:p>
-            <w:pPr>
-              <w:jc w:val="center"/>
-              <w:rPr>
-                <w:rFonts w:ascii="TH SarabunIT๙" w:eastAsia="Calibri" w:hAnsi="TH SarabunIT๙" w:cs="TH SarabunIT๙"/>
-                <w:sz w:val="32"/>
-                <w:szCs w:val="32"/>
-                <w:cs/>
-              </w:rPr>
-            </w:pPr>
             <w:r>
               <w:rPr>
                 <w:rFonts w:ascii="Segoe UI Symbol" w:eastAsia="Calibri" w:hAnsi="Segoe UI Symbol" w:cs="Segoe UI Symbol" w:hint="cs"/>
@@ -7254,30 +7283,55 @@
                 <w:cs/>
               </w:rPr>
             </w:pPr>
-          </w:p>
-        </w:tc>
-        <w:tc>
-          <w:tcPr>
-            <w:tcW w:w="0" w:type="auto"/>
-          </w:tcPr>
-          <w:p>
-            <w:pPr>
-              <w:jc w:val="center"/>
-              <w:rPr>
-                <w:rFonts w:ascii="TH SarabunIT๙" w:eastAsia="Calibri" w:hAnsi="TH SarabunIT๙" w:cs="TH SarabunIT๙"/>
-                <w:sz w:val="32"/>
-                <w:szCs w:val="32"/>
-                <w:cs/>
-              </w:rPr>
-            </w:pPr>
-            <w:r>
-              <w:rPr>
-                <w:rFonts w:ascii="TH SarabunIT๙" w:eastAsia="Calibri" w:hAnsi="TH SarabunIT๙" w:cs="TH SarabunIT๙"/>
-                <w:sz w:val="32"/>
-                <w:szCs w:val="32"/>
-                <w:cs/>
-              </w:rPr>
-              <w:t>เสื่อมสภาพ</w:t>
+            <w:r>
+              <w:rPr>
+                <w:rFonts w:ascii="Segoe UI Symbol" w:eastAsia="Calibri" w:hAnsi="Segoe UI Symbol" w:cs="Segoe UI Symbol" w:hint="cs"/>
+                <w:sz w:val="32"/>
+                <w:szCs w:val="32"/>
+                <w:cs/>
+              </w:rPr>
+              <w:t>✓</w:t>
+            </w:r>
+          </w:p>
+        </w:tc>
+        <w:tc>
+          <w:tcPr>
+            <w:tcW w:w="0" w:type="auto"/>
+          </w:tcPr>
+          <w:p>
+            <w:pPr>
+              <w:jc w:val="center"/>
+              <w:rPr>
+                <w:rFonts w:ascii="TH SarabunIT๙" w:eastAsia="Calibri" w:hAnsi="TH SarabunIT๙" w:cs="TH SarabunIT๙"/>
+                <w:sz w:val="32"/>
+                <w:szCs w:val="32"/>
+                <w:cs/>
+              </w:rPr>
+            </w:pPr>
+          </w:p>
+        </w:tc>
+        <w:tc>
+          <w:tcPr>
+            <w:tcW w:w="0" w:type="auto"/>
+          </w:tcPr>
+          <w:p>
+            <w:pPr>
+              <w:jc w:val="center"/>
+              <w:rPr>
+                <w:rFonts w:ascii="TH SarabunIT๙" w:eastAsia="Calibri" w:hAnsi="TH SarabunIT๙" w:cs="TH SarabunIT๙"/>
+                <w:sz w:val="32"/>
+                <w:szCs w:val="32"/>
+                <w:cs/>
+              </w:rPr>
+            </w:pPr>
+            <w:r>
+              <w:rPr>
+                <w:rFonts w:ascii="TH SarabunIT๙" w:eastAsia="Calibri" w:hAnsi="TH SarabunIT๙" w:cs="TH SarabunIT๙"/>
+                <w:sz w:val="32"/>
+                <w:szCs w:val="32"/>
+                <w:cs/>
+              </w:rPr>
+              <w:t>ชำรุด เสื่อมสภาพ</w:t>
             </w:r>
           </w:p>
         </w:tc>
@@ -7373,7 +7427,7 @@
                 <w:szCs w:val="32"/>
                 <w:cs/>
               </w:rPr>
-              <w:t>เสื่อมสภาพจนชำรุด ใช้งานไม่ปลอดภัย ซ่อมแซมไม่คุ้มค่า</w:t>
+              <w:t>ชำรุดและเสื่อมสภาพตามอายุการใช้งาน ใช้งานไม่ปลอดภัย ซ่อมแซมไม่คุ้มค่า</w:t>
             </w:r>
           </w:p>
         </w:tc>
@@ -7467,22 +7521,6 @@
                 <w:cs/>
               </w:rPr>
             </w:pPr>
-          </w:p>
-        </w:tc>
-        <w:tc>
-          <w:tcPr>
-            <w:tcW w:w="0" w:type="auto"/>
-          </w:tcPr>
-          <w:p>
-            <w:pPr>
-              <w:jc w:val="center"/>
-              <w:rPr>
-                <w:rFonts w:ascii="TH SarabunIT๙" w:eastAsia="Calibri" w:hAnsi="TH SarabunIT๙" w:cs="TH SarabunIT๙"/>
-                <w:sz w:val="32"/>
-                <w:szCs w:val="32"/>
-                <w:cs/>
-              </w:rPr>
-            </w:pPr>
             <w:r>
               <w:rPr>
                 <w:rFonts w:ascii="Segoe UI Symbol" w:eastAsia="Calibri" w:hAnsi="Segoe UI Symbol" w:cs="Segoe UI Symbol" w:hint="cs"/>
@@ -7508,30 +7546,55 @@
                 <w:cs/>
               </w:rPr>
             </w:pPr>
-          </w:p>
-        </w:tc>
-        <w:tc>
-          <w:tcPr>
-            <w:tcW w:w="0" w:type="auto"/>
-          </w:tcPr>
-          <w:p>
-            <w:pPr>
-              <w:jc w:val="center"/>
-              <w:rPr>
-                <w:rFonts w:ascii="TH SarabunIT๙" w:eastAsia="Calibri" w:hAnsi="TH SarabunIT๙" w:cs="TH SarabunIT๙"/>
-                <w:sz w:val="32"/>
-                <w:szCs w:val="32"/>
-                <w:cs/>
-              </w:rPr>
-            </w:pPr>
-            <w:r>
-              <w:rPr>
-                <w:rFonts w:ascii="TH SarabunIT๙" w:eastAsia="Calibri" w:hAnsi="TH SarabunIT๙" w:cs="TH SarabunIT๙"/>
-                <w:sz w:val="32"/>
-                <w:szCs w:val="32"/>
-                <w:cs/>
-              </w:rPr>
-              <w:t>เสื่อมสภาพ</w:t>
+            <w:r>
+              <w:rPr>
+                <w:rFonts w:ascii="Segoe UI Symbol" w:eastAsia="Calibri" w:hAnsi="Segoe UI Symbol" w:cs="Segoe UI Symbol" w:hint="cs"/>
+                <w:sz w:val="32"/>
+                <w:szCs w:val="32"/>
+                <w:cs/>
+              </w:rPr>
+              <w:t>✓</w:t>
+            </w:r>
+          </w:p>
+        </w:tc>
+        <w:tc>
+          <w:tcPr>
+            <w:tcW w:w="0" w:type="auto"/>
+          </w:tcPr>
+          <w:p>
+            <w:pPr>
+              <w:jc w:val="center"/>
+              <w:rPr>
+                <w:rFonts w:ascii="TH SarabunIT๙" w:eastAsia="Calibri" w:hAnsi="TH SarabunIT๙" w:cs="TH SarabunIT๙"/>
+                <w:sz w:val="32"/>
+                <w:szCs w:val="32"/>
+                <w:cs/>
+              </w:rPr>
+            </w:pPr>
+          </w:p>
+        </w:tc>
+        <w:tc>
+          <w:tcPr>
+            <w:tcW w:w="0" w:type="auto"/>
+          </w:tcPr>
+          <w:p>
+            <w:pPr>
+              <w:jc w:val="center"/>
+              <w:rPr>
+                <w:rFonts w:ascii="TH SarabunIT๙" w:eastAsia="Calibri" w:hAnsi="TH SarabunIT๙" w:cs="TH SarabunIT๙"/>
+                <w:sz w:val="32"/>
+                <w:szCs w:val="32"/>
+                <w:cs/>
+              </w:rPr>
+            </w:pPr>
+            <w:r>
+              <w:rPr>
+                <w:rFonts w:ascii="TH SarabunIT๙" w:eastAsia="Calibri" w:hAnsi="TH SarabunIT๙" w:cs="TH SarabunIT๙"/>
+                <w:sz w:val="32"/>
+                <w:szCs w:val="32"/>
+                <w:cs/>
+              </w:rPr>
+              <w:t>ชำรุด เสื่อมสภาพ</w:t>
             </w:r>
           </w:p>
         </w:tc>
@@ -7627,7 +7690,7 @@
                 <w:szCs w:val="32"/>
                 <w:cs/>
               </w:rPr>
-              <w:t>เสื่อมสภาพจนชำรุด ใช้งานไม่ปลอดภัย ซ่อมแซมไม่คุ้มค่า</w:t>
+              <w:t>ชำรุดและเสื่อมสภาพตามอายุการใช้งาน ใช้งานไม่ปลอดภัย ซ่อมแซมไม่คุ้มค่า</w:t>
             </w:r>
           </w:p>
         </w:tc>
@@ -7720,22 +7783,6 @@
                 <w:cs/>
               </w:rPr>
             </w:pPr>
-          </w:p>
-        </w:tc>
-        <w:tc>
-          <w:tcPr>
-            <w:tcW w:w="0" w:type="auto"/>
-          </w:tcPr>
-          <w:p>
-            <w:pPr>
-              <w:jc w:val="center"/>
-              <w:rPr>
-                <w:rFonts w:ascii="TH SarabunIT๙" w:eastAsia="Calibri" w:hAnsi="TH SarabunIT๙" w:cs="TH SarabunIT๙"/>
-                <w:sz w:val="32"/>
-                <w:szCs w:val="32"/>
-                <w:cs/>
-              </w:rPr>
-            </w:pPr>
             <w:r>
               <w:rPr>
                 <w:rFonts w:ascii="Segoe UI Symbol" w:eastAsia="Calibri" w:hAnsi="Segoe UI Symbol" w:cs="Segoe UI Symbol" w:hint="cs"/>
@@ -7761,30 +7808,55 @@
                 <w:cs/>
               </w:rPr>
             </w:pPr>
-          </w:p>
-        </w:tc>
-        <w:tc>
-          <w:tcPr>
-            <w:tcW w:w="0" w:type="auto"/>
-          </w:tcPr>
-          <w:p>
-            <w:pPr>
-              <w:jc w:val="center"/>
-              <w:rPr>
-                <w:rFonts w:ascii="TH SarabunIT๙" w:eastAsia="Calibri" w:hAnsi="TH SarabunIT๙" w:cs="TH SarabunIT๙"/>
-                <w:sz w:val="32"/>
-                <w:szCs w:val="32"/>
-                <w:cs/>
-              </w:rPr>
-            </w:pPr>
-            <w:r>
-              <w:rPr>
-                <w:rFonts w:ascii="TH SarabunIT๙" w:eastAsia="Calibri" w:hAnsi="TH SarabunIT๙" w:cs="TH SarabunIT๙"/>
-                <w:sz w:val="32"/>
-                <w:szCs w:val="32"/>
-                <w:cs/>
-              </w:rPr>
-              <w:t>เสื่อมสภาพ</w:t>
+            <w:r>
+              <w:rPr>
+                <w:rFonts w:ascii="Segoe UI Symbol" w:eastAsia="Calibri" w:hAnsi="Segoe UI Symbol" w:cs="Segoe UI Symbol" w:hint="cs"/>
+                <w:sz w:val="32"/>
+                <w:szCs w:val="32"/>
+                <w:cs/>
+              </w:rPr>
+              <w:t>✓</w:t>
+            </w:r>
+          </w:p>
+        </w:tc>
+        <w:tc>
+          <w:tcPr>
+            <w:tcW w:w="0" w:type="auto"/>
+          </w:tcPr>
+          <w:p>
+            <w:pPr>
+              <w:jc w:val="center"/>
+              <w:rPr>
+                <w:rFonts w:ascii="TH SarabunIT๙" w:eastAsia="Calibri" w:hAnsi="TH SarabunIT๙" w:cs="TH SarabunIT๙"/>
+                <w:sz w:val="32"/>
+                <w:szCs w:val="32"/>
+                <w:cs/>
+              </w:rPr>
+            </w:pPr>
+          </w:p>
+        </w:tc>
+        <w:tc>
+          <w:tcPr>
+            <w:tcW w:w="0" w:type="auto"/>
+          </w:tcPr>
+          <w:p>
+            <w:pPr>
+              <w:jc w:val="center"/>
+              <w:rPr>
+                <w:rFonts w:ascii="TH SarabunIT๙" w:eastAsia="Calibri" w:hAnsi="TH SarabunIT๙" w:cs="TH SarabunIT๙"/>
+                <w:sz w:val="32"/>
+                <w:szCs w:val="32"/>
+                <w:cs/>
+              </w:rPr>
+            </w:pPr>
+            <w:r>
+              <w:rPr>
+                <w:rFonts w:ascii="TH SarabunIT๙" w:eastAsia="Calibri" w:hAnsi="TH SarabunIT๙" w:cs="TH SarabunIT๙"/>
+                <w:sz w:val="32"/>
+                <w:szCs w:val="32"/>
+                <w:cs/>
+              </w:rPr>
+              <w:t>ชำรุด เสื่อมสภาพ</w:t>
             </w:r>
           </w:p>
         </w:tc>
@@ -7880,7 +7952,7 @@
                 <w:szCs w:val="32"/>
                 <w:cs/>
               </w:rPr>
-              <w:t>เสื่อมสภาพจนชำรุด ใช้งานไม่ปลอดภัย ซ่อมแซมไม่คุ้มค่า</w:t>
+              <w:t>ชำรุดและเสื่อมสภาพตามอายุการใช้งาน ใช้งานไม่ปลอดภัย ซ่อมแซมไม่คุ้มค่า</w:t>
             </w:r>
           </w:p>
         </w:tc>
@@ -7973,22 +8045,6 @@
                 <w:cs/>
               </w:rPr>
             </w:pPr>
-          </w:p>
-        </w:tc>
-        <w:tc>
-          <w:tcPr>
-            <w:tcW w:w="0" w:type="auto"/>
-          </w:tcPr>
-          <w:p>
-            <w:pPr>
-              <w:jc w:val="center"/>
-              <w:rPr>
-                <w:rFonts w:ascii="TH SarabunIT๙" w:eastAsia="Calibri" w:hAnsi="TH SarabunIT๙" w:cs="TH SarabunIT๙"/>
-                <w:sz w:val="32"/>
-                <w:szCs w:val="32"/>
-                <w:cs/>
-              </w:rPr>
-            </w:pPr>
             <w:r>
               <w:rPr>
                 <w:rFonts w:ascii="Segoe UI Symbol" w:eastAsia="Calibri" w:hAnsi="Segoe UI Symbol" w:cs="Segoe UI Symbol" w:hint="cs"/>
@@ -8014,30 +8070,55 @@
                 <w:cs/>
               </w:rPr>
             </w:pPr>
-          </w:p>
-        </w:tc>
-        <w:tc>
-          <w:tcPr>
-            <w:tcW w:w="0" w:type="auto"/>
-          </w:tcPr>
-          <w:p>
-            <w:pPr>
-              <w:jc w:val="center"/>
-              <w:rPr>
-                <w:rFonts w:ascii="TH SarabunIT๙" w:eastAsia="Calibri" w:hAnsi="TH SarabunIT๙" w:cs="TH SarabunIT๙"/>
-                <w:sz w:val="32"/>
-                <w:szCs w:val="32"/>
-                <w:cs/>
-              </w:rPr>
-            </w:pPr>
-            <w:r>
-              <w:rPr>
-                <w:rFonts w:ascii="TH SarabunIT๙" w:eastAsia="Calibri" w:hAnsi="TH SarabunIT๙" w:cs="TH SarabunIT๙"/>
-                <w:sz w:val="32"/>
-                <w:szCs w:val="32"/>
-                <w:cs/>
-              </w:rPr>
-              <w:t>เสื่อมสภาพ</w:t>
+            <w:r>
+              <w:rPr>
+                <w:rFonts w:ascii="Segoe UI Symbol" w:eastAsia="Calibri" w:hAnsi="Segoe UI Symbol" w:cs="Segoe UI Symbol" w:hint="cs"/>
+                <w:sz w:val="32"/>
+                <w:szCs w:val="32"/>
+                <w:cs/>
+              </w:rPr>
+              <w:t>✓</w:t>
+            </w:r>
+          </w:p>
+        </w:tc>
+        <w:tc>
+          <w:tcPr>
+            <w:tcW w:w="0" w:type="auto"/>
+          </w:tcPr>
+          <w:p>
+            <w:pPr>
+              <w:jc w:val="center"/>
+              <w:rPr>
+                <w:rFonts w:ascii="TH SarabunIT๙" w:eastAsia="Calibri" w:hAnsi="TH SarabunIT๙" w:cs="TH SarabunIT๙"/>
+                <w:sz w:val="32"/>
+                <w:szCs w:val="32"/>
+                <w:cs/>
+              </w:rPr>
+            </w:pPr>
+          </w:p>
+        </w:tc>
+        <w:tc>
+          <w:tcPr>
+            <w:tcW w:w="0" w:type="auto"/>
+          </w:tcPr>
+          <w:p>
+            <w:pPr>
+              <w:jc w:val="center"/>
+              <w:rPr>
+                <w:rFonts w:ascii="TH SarabunIT๙" w:eastAsia="Calibri" w:hAnsi="TH SarabunIT๙" w:cs="TH SarabunIT๙"/>
+                <w:sz w:val="32"/>
+                <w:szCs w:val="32"/>
+                <w:cs/>
+              </w:rPr>
+            </w:pPr>
+            <w:r>
+              <w:rPr>
+                <w:rFonts w:ascii="TH SarabunIT๙" w:eastAsia="Calibri" w:hAnsi="TH SarabunIT๙" w:cs="TH SarabunIT๙"/>
+                <w:sz w:val="32"/>
+                <w:szCs w:val="32"/>
+                <w:cs/>
+              </w:rPr>
+              <w:t>ชำรุด เสื่อมสภาพ</w:t>
             </w:r>
           </w:p>
         </w:tc>
@@ -8133,7 +8214,7 @@
                 <w:szCs w:val="32"/>
                 <w:cs/>
               </w:rPr>
-              <w:t>เสื่อมสภาพจนชำรุด ใช้งานไม่ปลอดภัย ซ่อมแซมไม่คุ้มค่า</w:t>
+              <w:t>ชำรุดและเสื่อมสภาพตามอายุการใช้งาน ใช้งานไม่ปลอดภัย ซ่อมแซมไม่คุ้มค่า</w:t>
             </w:r>
           </w:p>
         </w:tc>
@@ -8184,7 +8265,7 @@
                 <w:szCs w:val="32"/>
                 <w:cs/>
               </w:rPr>
-              <w:t>เก้าอี้พลาสติกพนักพิง</w:t>
+              <w:t>เก้าอี้พลาสติกมีพนักพิง</w:t>
             </w:r>
           </w:p>
         </w:tc>
@@ -8226,22 +8307,6 @@
                 <w:cs/>
               </w:rPr>
             </w:pPr>
-          </w:p>
-        </w:tc>
-        <w:tc>
-          <w:tcPr>
-            <w:tcW w:w="0" w:type="auto"/>
-          </w:tcPr>
-          <w:p>
-            <w:pPr>
-              <w:jc w:val="center"/>
-              <w:rPr>
-                <w:rFonts w:ascii="TH SarabunIT๙" w:eastAsia="Calibri" w:hAnsi="TH SarabunIT๙" w:cs="TH SarabunIT๙"/>
-                <w:sz w:val="32"/>
-                <w:szCs w:val="32"/>
-                <w:cs/>
-              </w:rPr>
-            </w:pPr>
             <w:r>
               <w:rPr>
                 <w:rFonts w:ascii="Segoe UI Symbol" w:eastAsia="Calibri" w:hAnsi="Segoe UI Symbol" w:cs="Segoe UI Symbol" w:hint="cs"/>
@@ -8267,30 +8332,55 @@
                 <w:cs/>
               </w:rPr>
             </w:pPr>
-          </w:p>
-        </w:tc>
-        <w:tc>
-          <w:tcPr>
-            <w:tcW w:w="0" w:type="auto"/>
-          </w:tcPr>
-          <w:p>
-            <w:pPr>
-              <w:jc w:val="center"/>
-              <w:rPr>
-                <w:rFonts w:ascii="TH SarabunIT๙" w:eastAsia="Calibri" w:hAnsi="TH SarabunIT๙" w:cs="TH SarabunIT๙"/>
-                <w:sz w:val="32"/>
-                <w:szCs w:val="32"/>
-                <w:cs/>
-              </w:rPr>
-            </w:pPr>
-            <w:r>
-              <w:rPr>
-                <w:rFonts w:ascii="TH SarabunIT๙" w:eastAsia="Calibri" w:hAnsi="TH SarabunIT๙" w:cs="TH SarabunIT๙"/>
-                <w:sz w:val="32"/>
-                <w:szCs w:val="32"/>
-                <w:cs/>
-              </w:rPr>
-              <w:t>เสื่อมสภาพ</w:t>
+            <w:r>
+              <w:rPr>
+                <w:rFonts w:ascii="Segoe UI Symbol" w:eastAsia="Calibri" w:hAnsi="Segoe UI Symbol" w:cs="Segoe UI Symbol" w:hint="cs"/>
+                <w:sz w:val="32"/>
+                <w:szCs w:val="32"/>
+                <w:cs/>
+              </w:rPr>
+              <w:t>✓</w:t>
+            </w:r>
+          </w:p>
+        </w:tc>
+        <w:tc>
+          <w:tcPr>
+            <w:tcW w:w="0" w:type="auto"/>
+          </w:tcPr>
+          <w:p>
+            <w:pPr>
+              <w:jc w:val="center"/>
+              <w:rPr>
+                <w:rFonts w:ascii="TH SarabunIT๙" w:eastAsia="Calibri" w:hAnsi="TH SarabunIT๙" w:cs="TH SarabunIT๙"/>
+                <w:sz w:val="32"/>
+                <w:szCs w:val="32"/>
+                <w:cs/>
+              </w:rPr>
+            </w:pPr>
+          </w:p>
+        </w:tc>
+        <w:tc>
+          <w:tcPr>
+            <w:tcW w:w="0" w:type="auto"/>
+          </w:tcPr>
+          <w:p>
+            <w:pPr>
+              <w:jc w:val="center"/>
+              <w:rPr>
+                <w:rFonts w:ascii="TH SarabunIT๙" w:eastAsia="Calibri" w:hAnsi="TH SarabunIT๙" w:cs="TH SarabunIT๙"/>
+                <w:sz w:val="32"/>
+                <w:szCs w:val="32"/>
+                <w:cs/>
+              </w:rPr>
+            </w:pPr>
+            <w:r>
+              <w:rPr>
+                <w:rFonts w:ascii="TH SarabunIT๙" w:eastAsia="Calibri" w:hAnsi="TH SarabunIT๙" w:cs="TH SarabunIT๙"/>
+                <w:sz w:val="32"/>
+                <w:szCs w:val="32"/>
+                <w:cs/>
+              </w:rPr>
+              <w:t>ชำรุด เสื่อมสภาพ</w:t>
             </w:r>
           </w:p>
         </w:tc>
@@ -8386,7 +8476,7 @@
                 <w:szCs w:val="32"/>
                 <w:cs/>
               </w:rPr>
-              <w:t>เสื่อมสภาพจนชำรุด ใช้งานไม่ปลอดภัย ซ่อมแซมไม่คุ้มค่า</w:t>
+              <w:t>ชำรุดและเสื่อมสภาพตามอายุการใช้งาน ใช้งานไม่ปลอดภัย ซ่อมแซมไม่คุ้มค่า</w:t>
             </w:r>
           </w:p>
         </w:tc>
@@ -8437,7 +8527,7 @@
                 <w:szCs w:val="32"/>
                 <w:cs/>
               </w:rPr>
-              <w:t>เก้าอี้พลาสติกพนักพิง</w:t>
+              <w:t>เก้าอี้พลาสติกมีพนักพิง</w:t>
             </w:r>
           </w:p>
         </w:tc>
@@ -8479,22 +8569,6 @@
                 <w:cs/>
               </w:rPr>
             </w:pPr>
-          </w:p>
-        </w:tc>
-        <w:tc>
-          <w:tcPr>
-            <w:tcW w:w="0" w:type="auto"/>
-          </w:tcPr>
-          <w:p>
-            <w:pPr>
-              <w:jc w:val="center"/>
-              <w:rPr>
-                <w:rFonts w:ascii="TH SarabunIT๙" w:eastAsia="Calibri" w:hAnsi="TH SarabunIT๙" w:cs="TH SarabunIT๙"/>
-                <w:sz w:val="32"/>
-                <w:szCs w:val="32"/>
-                <w:cs/>
-              </w:rPr>
-            </w:pPr>
             <w:r>
               <w:rPr>
                 <w:rFonts w:ascii="Segoe UI Symbol" w:eastAsia="Calibri" w:hAnsi="Segoe UI Symbol" w:cs="Segoe UI Symbol" w:hint="cs"/>
@@ -8520,30 +8594,55 @@
                 <w:cs/>
               </w:rPr>
             </w:pPr>
-          </w:p>
-        </w:tc>
-        <w:tc>
-          <w:tcPr>
-            <w:tcW w:w="0" w:type="auto"/>
-          </w:tcPr>
-          <w:p>
-            <w:pPr>
-              <w:jc w:val="center"/>
-              <w:rPr>
-                <w:rFonts w:ascii="TH SarabunIT๙" w:eastAsia="Calibri" w:hAnsi="TH SarabunIT๙" w:cs="TH SarabunIT๙"/>
-                <w:sz w:val="32"/>
-                <w:szCs w:val="32"/>
-                <w:cs/>
-              </w:rPr>
-            </w:pPr>
-            <w:r>
-              <w:rPr>
-                <w:rFonts w:ascii="TH SarabunIT๙" w:eastAsia="Calibri" w:hAnsi="TH SarabunIT๙" w:cs="TH SarabunIT๙"/>
-                <w:sz w:val="32"/>
-                <w:szCs w:val="32"/>
-                <w:cs/>
-              </w:rPr>
-              <w:t>เสื่อมสภาพ</w:t>
+            <w:r>
+              <w:rPr>
+                <w:rFonts w:ascii="Segoe UI Symbol" w:eastAsia="Calibri" w:hAnsi="Segoe UI Symbol" w:cs="Segoe UI Symbol" w:hint="cs"/>
+                <w:sz w:val="32"/>
+                <w:szCs w:val="32"/>
+                <w:cs/>
+              </w:rPr>
+              <w:t>✓</w:t>
+            </w:r>
+          </w:p>
+        </w:tc>
+        <w:tc>
+          <w:tcPr>
+            <w:tcW w:w="0" w:type="auto"/>
+          </w:tcPr>
+          <w:p>
+            <w:pPr>
+              <w:jc w:val="center"/>
+              <w:rPr>
+                <w:rFonts w:ascii="TH SarabunIT๙" w:eastAsia="Calibri" w:hAnsi="TH SarabunIT๙" w:cs="TH SarabunIT๙"/>
+                <w:sz w:val="32"/>
+                <w:szCs w:val="32"/>
+                <w:cs/>
+              </w:rPr>
+            </w:pPr>
+          </w:p>
+        </w:tc>
+        <w:tc>
+          <w:tcPr>
+            <w:tcW w:w="0" w:type="auto"/>
+          </w:tcPr>
+          <w:p>
+            <w:pPr>
+              <w:jc w:val="center"/>
+              <w:rPr>
+                <w:rFonts w:ascii="TH SarabunIT๙" w:eastAsia="Calibri" w:hAnsi="TH SarabunIT๙" w:cs="TH SarabunIT๙"/>
+                <w:sz w:val="32"/>
+                <w:szCs w:val="32"/>
+                <w:cs/>
+              </w:rPr>
+            </w:pPr>
+            <w:r>
+              <w:rPr>
+                <w:rFonts w:ascii="TH SarabunIT๙" w:eastAsia="Calibri" w:hAnsi="TH SarabunIT๙" w:cs="TH SarabunIT๙"/>
+                <w:sz w:val="32"/>
+                <w:szCs w:val="32"/>
+                <w:cs/>
+              </w:rPr>
+              <w:t>ชำรุด เสื่อมสภาพ</w:t>
             </w:r>
           </w:p>
         </w:tc>
@@ -8639,7 +8738,7 @@
                 <w:szCs w:val="32"/>
                 <w:cs/>
               </w:rPr>
-              <w:t>เสื่อมสภาพจนชำรุด ใช้งานไม่ปลอดภัย ซ่อมแซมไม่คุ้มค่า</w:t>
+              <w:t>ชำรุดและเสื่อมสภาพตามอายุการใช้งาน ใช้งานไม่ปลอดภัย ซ่อมแซมไม่คุ้มค่า</w:t>
             </w:r>
           </w:p>
         </w:tc>

</xml_diff>

<commit_message>
Reorganize document No. 6 (asset register FY2569)
Renumber rows, sort by asset number, move quantities into the balance
columns, and normalize asset number format.

Co-Authored-By: Claude Opus 5.5 <noreply@anthropic.com>
Claude-Session: https://claude.ai/code/session_01CLAnyDuhFnWhH7sKpyCM9s
</commit_message>
<xml_diff>
--- a/เอกสารหมายเลข3.docx
+++ b/เอกสารหมายเลข3.docx
@@ -102,18 +102,18 @@
         <w:tblLook w:val="04A0" w:firstRow="1" w:lastRow="0" w:firstColumn="1" w:lastColumn="0" w:noHBand="0" w:noVBand="1"/>
       </w:tblPr>
       <w:tblGrid>
-        <w:gridCol w:w="505"/>
-        <w:gridCol w:w="2912"/>
-        <w:gridCol w:w="1943"/>
+        <w:gridCol w:w="504"/>
+        <w:gridCol w:w="2781"/>
+        <w:gridCol w:w="1903"/>
         <w:gridCol w:w="594"/>
         <w:gridCol w:w="594"/>
         <w:gridCol w:w="594"/>
-        <w:gridCol w:w="825"/>
-        <w:gridCol w:w="1154"/>
-        <w:gridCol w:w="951"/>
+        <w:gridCol w:w="1287"/>
+        <w:gridCol w:w="783"/>
+        <w:gridCol w:w="897"/>
         <w:gridCol w:w="974"/>
-        <w:gridCol w:w="863"/>
-        <w:gridCol w:w="2306"/>
+        <w:gridCol w:w="791"/>
+        <w:gridCol w:w="2513"/>
       </w:tblGrid>
       <w:tr>
         <w:trPr>
@@ -650,8 +650,39 @@
                 <w:szCs w:val="32"/>
                 <w:cs/>
               </w:rPr>
-              <w:t>เครื่องพิมพ์ ยี่ห้อ Canon รุ่น MP258 พร้อมติดตั้งระบบหมึก Tank</w:t>
-            </w:r>
+              <w:t xml:space="preserve">เครื่องพิมพ์ ยี่ห้อ </w:t>
+            </w:r>
+            <w:proofErr w:type="spellStart"/>
+            <w:r>
+              <w:rPr>
+                <w:rFonts w:ascii="TH SarabunIT๙" w:eastAsia="Calibri" w:hAnsi="TH SarabunIT๙" w:cs="TH SarabunIT๙"/>
+                <w:sz w:val="32"/>
+                <w:szCs w:val="32"/>
+                <w:cs/>
+              </w:rPr>
+              <w:t>Canon</w:t>
+            </w:r>
+            <w:proofErr w:type="spellEnd"/>
+            <w:r>
+              <w:rPr>
+                <w:rFonts w:ascii="TH SarabunIT๙" w:eastAsia="Calibri" w:hAnsi="TH SarabunIT๙" w:cs="TH SarabunIT๙"/>
+                <w:sz w:val="32"/>
+                <w:szCs w:val="32"/>
+                <w:cs/>
+              </w:rPr>
+              <w:t xml:space="preserve"> รุ่น MP258 พร้อมติดตั้งระบบหมึก </w:t>
+            </w:r>
+            <w:proofErr w:type="spellStart"/>
+            <w:r>
+              <w:rPr>
+                <w:rFonts w:ascii="TH SarabunIT๙" w:eastAsia="Calibri" w:hAnsi="TH SarabunIT๙" w:cs="TH SarabunIT๙"/>
+                <w:sz w:val="32"/>
+                <w:szCs w:val="32"/>
+                <w:cs/>
+              </w:rPr>
+              <w:t>Tank</w:t>
+            </w:r>
+            <w:proofErr w:type="spellEnd"/>
           </w:p>
         </w:tc>
         <w:tc>
@@ -687,7 +718,7 @@
             <w:pPr>
               <w:jc w:val="center"/>
               <w:rPr>
-                <w:rFonts w:ascii="Segoe UI Symbol" w:eastAsia="Calibri" w:hAnsi="Segoe UI Symbol" w:cs="Segoe UI Symbol" w:hint="cs"/>
+                <w:rFonts w:ascii="Segoe UI Symbol" w:eastAsia="Calibri" w:hAnsi="Segoe UI Symbol" w:cs="Segoe UI Symbol"/>
                 <w:sz w:val="32"/>
                 <w:szCs w:val="32"/>
                 <w:cs/>
@@ -902,8 +933,59 @@
                 <w:szCs w:val="32"/>
                 <w:cs/>
               </w:rPr>
-              <w:t>เครื่องคอมพิวเตอร์ตั้งโต๊ะ ยี่ห้อ Acer รุ่น Aspire TC-780 Series</w:t>
-            </w:r>
+              <w:t xml:space="preserve">เครื่องคอมพิวเตอร์ตั้งโต๊ะ ยี่ห้อ </w:t>
+            </w:r>
+            <w:proofErr w:type="spellStart"/>
+            <w:r>
+              <w:rPr>
+                <w:rFonts w:ascii="TH SarabunIT๙" w:eastAsia="Calibri" w:hAnsi="TH SarabunIT๙" w:cs="TH SarabunIT๙"/>
+                <w:sz w:val="32"/>
+                <w:szCs w:val="32"/>
+                <w:cs/>
+              </w:rPr>
+              <w:t>Acer</w:t>
+            </w:r>
+            <w:proofErr w:type="spellEnd"/>
+            <w:r>
+              <w:rPr>
+                <w:rFonts w:ascii="TH SarabunIT๙" w:eastAsia="Calibri" w:hAnsi="TH SarabunIT๙" w:cs="TH SarabunIT๙"/>
+                <w:sz w:val="32"/>
+                <w:szCs w:val="32"/>
+                <w:cs/>
+              </w:rPr>
+              <w:t xml:space="preserve"> รุ่น </w:t>
+            </w:r>
+            <w:proofErr w:type="spellStart"/>
+            <w:r>
+              <w:rPr>
+                <w:rFonts w:ascii="TH SarabunIT๙" w:eastAsia="Calibri" w:hAnsi="TH SarabunIT๙" w:cs="TH SarabunIT๙"/>
+                <w:sz w:val="32"/>
+                <w:szCs w:val="32"/>
+                <w:cs/>
+              </w:rPr>
+              <w:t>Aspire</w:t>
+            </w:r>
+            <w:proofErr w:type="spellEnd"/>
+            <w:r>
+              <w:rPr>
+                <w:rFonts w:ascii="TH SarabunIT๙" w:eastAsia="Calibri" w:hAnsi="TH SarabunIT๙" w:cs="TH SarabunIT๙"/>
+                <w:sz w:val="32"/>
+                <w:szCs w:val="32"/>
+                <w:cs/>
+              </w:rPr>
+              <w:t xml:space="preserve"> TC-780 </w:t>
+            </w:r>
+            <w:proofErr w:type="spellStart"/>
+            <w:r>
+              <w:rPr>
+                <w:rFonts w:ascii="TH SarabunIT๙" w:eastAsia="Calibri" w:hAnsi="TH SarabunIT๙" w:cs="TH SarabunIT๙"/>
+                <w:sz w:val="32"/>
+                <w:szCs w:val="32"/>
+                <w:cs/>
+              </w:rPr>
+              <w:t>Series</w:t>
+            </w:r>
+            <w:proofErr w:type="spellEnd"/>
           </w:p>
         </w:tc>
         <w:tc>
@@ -1152,7 +1234,67 @@
                 <w:szCs w:val="32"/>
                 <w:cs/>
               </w:rPr>
-              <w:t>เครื่องคอมพิวเตอร์ All-in-One สำหรับประมวลผล ยี่ห้อ Acer รุ่น Veriton Z4660G</w:t>
+              <w:t>เครื่องคอมพิวเตอร์ All-</w:t>
+            </w:r>
+            <w:proofErr w:type="spellStart"/>
+            <w:r>
+              <w:rPr>
+                <w:rFonts w:ascii="TH SarabunIT๙" w:eastAsia="Calibri" w:hAnsi="TH SarabunIT๙" w:cs="TH SarabunIT๙"/>
+                <w:sz w:val="32"/>
+                <w:szCs w:val="32"/>
+                <w:cs/>
+              </w:rPr>
+              <w:t>in</w:t>
+            </w:r>
+            <w:proofErr w:type="spellEnd"/>
+            <w:r>
+              <w:rPr>
+                <w:rFonts w:ascii="TH SarabunIT๙" w:eastAsia="Calibri" w:hAnsi="TH SarabunIT๙" w:cs="TH SarabunIT๙"/>
+                <w:sz w:val="32"/>
+                <w:szCs w:val="32"/>
+                <w:cs/>
+              </w:rPr>
+              <w:t xml:space="preserve">-One สำหรับประมวลผล ยี่ห้อ </w:t>
+            </w:r>
+            <w:proofErr w:type="spellStart"/>
+            <w:r>
+              <w:rPr>
+                <w:rFonts w:ascii="TH SarabunIT๙" w:eastAsia="Calibri" w:hAnsi="TH SarabunIT๙" w:cs="TH SarabunIT๙"/>
+                <w:sz w:val="32"/>
+                <w:szCs w:val="32"/>
+                <w:cs/>
+              </w:rPr>
+              <w:t>Acer</w:t>
+            </w:r>
+            <w:proofErr w:type="spellEnd"/>
+            <w:r>
+              <w:rPr>
+                <w:rFonts w:ascii="TH SarabunIT๙" w:eastAsia="Calibri" w:hAnsi="TH SarabunIT๙" w:cs="TH SarabunIT๙"/>
+                <w:sz w:val="32"/>
+                <w:szCs w:val="32"/>
+                <w:cs/>
+              </w:rPr>
+              <w:t xml:space="preserve"> รุ่น </w:t>
+            </w:r>
+            <w:proofErr w:type="spellStart"/>
+            <w:r>
+              <w:rPr>
+                <w:rFonts w:ascii="TH SarabunIT๙" w:eastAsia="Calibri" w:hAnsi="TH SarabunIT๙" w:cs="TH SarabunIT๙"/>
+                <w:sz w:val="32"/>
+                <w:szCs w:val="32"/>
+                <w:cs/>
+              </w:rPr>
+              <w:t>Veriton</w:t>
+            </w:r>
+            <w:proofErr w:type="spellEnd"/>
+            <w:r>
+              <w:rPr>
+                <w:rFonts w:ascii="TH SarabunIT๙" w:eastAsia="Calibri" w:hAnsi="TH SarabunIT๙" w:cs="TH SarabunIT๙"/>
+                <w:sz w:val="32"/>
+                <w:szCs w:val="32"/>
+                <w:cs/>
+              </w:rPr>
+              <w:t xml:space="preserve"> Z4660G</w:t>
             </w:r>
           </w:p>
         </w:tc>
@@ -1402,7 +1544,67 @@
                 <w:szCs w:val="32"/>
                 <w:cs/>
               </w:rPr>
-              <w:t>เครื่องคอมพิวเตอร์ All-in-One สำหรับประมวลผล ยี่ห้อ Acer รุ่น Veriton Z4660G</w:t>
+              <w:t>เครื่องคอมพิวเตอร์ All-</w:t>
+            </w:r>
+            <w:proofErr w:type="spellStart"/>
+            <w:r>
+              <w:rPr>
+                <w:rFonts w:ascii="TH SarabunIT๙" w:eastAsia="Calibri" w:hAnsi="TH SarabunIT๙" w:cs="TH SarabunIT๙"/>
+                <w:sz w:val="32"/>
+                <w:szCs w:val="32"/>
+                <w:cs/>
+              </w:rPr>
+              <w:t>in</w:t>
+            </w:r>
+            <w:proofErr w:type="spellEnd"/>
+            <w:r>
+              <w:rPr>
+                <w:rFonts w:ascii="TH SarabunIT๙" w:eastAsia="Calibri" w:hAnsi="TH SarabunIT๙" w:cs="TH SarabunIT๙"/>
+                <w:sz w:val="32"/>
+                <w:szCs w:val="32"/>
+                <w:cs/>
+              </w:rPr>
+              <w:t xml:space="preserve">-One สำหรับประมวลผล ยี่ห้อ </w:t>
+            </w:r>
+            <w:proofErr w:type="spellStart"/>
+            <w:r>
+              <w:rPr>
+                <w:rFonts w:ascii="TH SarabunIT๙" w:eastAsia="Calibri" w:hAnsi="TH SarabunIT๙" w:cs="TH SarabunIT๙"/>
+                <w:sz w:val="32"/>
+                <w:szCs w:val="32"/>
+                <w:cs/>
+              </w:rPr>
+              <w:t>Acer</w:t>
+            </w:r>
+            <w:proofErr w:type="spellEnd"/>
+            <w:r>
+              <w:rPr>
+                <w:rFonts w:ascii="TH SarabunIT๙" w:eastAsia="Calibri" w:hAnsi="TH SarabunIT๙" w:cs="TH SarabunIT๙"/>
+                <w:sz w:val="32"/>
+                <w:szCs w:val="32"/>
+                <w:cs/>
+              </w:rPr>
+              <w:t xml:space="preserve"> รุ่น </w:t>
+            </w:r>
+            <w:proofErr w:type="spellStart"/>
+            <w:r>
+              <w:rPr>
+                <w:rFonts w:ascii="TH SarabunIT๙" w:eastAsia="Calibri" w:hAnsi="TH SarabunIT๙" w:cs="TH SarabunIT๙"/>
+                <w:sz w:val="32"/>
+                <w:szCs w:val="32"/>
+                <w:cs/>
+              </w:rPr>
+              <w:t>Veriton</w:t>
+            </w:r>
+            <w:proofErr w:type="spellEnd"/>
+            <w:r>
+              <w:rPr>
+                <w:rFonts w:ascii="TH SarabunIT๙" w:eastAsia="Calibri" w:hAnsi="TH SarabunIT๙" w:cs="TH SarabunIT๙"/>
+                <w:sz w:val="32"/>
+                <w:szCs w:val="32"/>
+                <w:cs/>
+              </w:rPr>
+              <w:t xml:space="preserve"> Z4660G</w:t>
             </w:r>
           </w:p>
         </w:tc>
@@ -1652,7 +1854,67 @@
                 <w:szCs w:val="32"/>
                 <w:cs/>
               </w:rPr>
-              <w:t>เครื่องคอมพิวเตอร์ All-in-One สำหรับประมวลผล ยี่ห้อ Acer รุ่น Veriton Z4660G</w:t>
+              <w:t>เครื่องคอมพิวเตอร์ All-</w:t>
+            </w:r>
+            <w:proofErr w:type="spellStart"/>
+            <w:r>
+              <w:rPr>
+                <w:rFonts w:ascii="TH SarabunIT๙" w:eastAsia="Calibri" w:hAnsi="TH SarabunIT๙" w:cs="TH SarabunIT๙"/>
+                <w:sz w:val="32"/>
+                <w:szCs w:val="32"/>
+                <w:cs/>
+              </w:rPr>
+              <w:t>in</w:t>
+            </w:r>
+            <w:proofErr w:type="spellEnd"/>
+            <w:r>
+              <w:rPr>
+                <w:rFonts w:ascii="TH SarabunIT๙" w:eastAsia="Calibri" w:hAnsi="TH SarabunIT๙" w:cs="TH SarabunIT๙"/>
+                <w:sz w:val="32"/>
+                <w:szCs w:val="32"/>
+                <w:cs/>
+              </w:rPr>
+              <w:t xml:space="preserve">-One สำหรับประมวลผล ยี่ห้อ </w:t>
+            </w:r>
+            <w:proofErr w:type="spellStart"/>
+            <w:r>
+              <w:rPr>
+                <w:rFonts w:ascii="TH SarabunIT๙" w:eastAsia="Calibri" w:hAnsi="TH SarabunIT๙" w:cs="TH SarabunIT๙"/>
+                <w:sz w:val="32"/>
+                <w:szCs w:val="32"/>
+                <w:cs/>
+              </w:rPr>
+              <w:t>Acer</w:t>
+            </w:r>
+            <w:proofErr w:type="spellEnd"/>
+            <w:r>
+              <w:rPr>
+                <w:rFonts w:ascii="TH SarabunIT๙" w:eastAsia="Calibri" w:hAnsi="TH SarabunIT๙" w:cs="TH SarabunIT๙"/>
+                <w:sz w:val="32"/>
+                <w:szCs w:val="32"/>
+                <w:cs/>
+              </w:rPr>
+              <w:t xml:space="preserve"> รุ่น </w:t>
+            </w:r>
+            <w:proofErr w:type="spellStart"/>
+            <w:r>
+              <w:rPr>
+                <w:rFonts w:ascii="TH SarabunIT๙" w:eastAsia="Calibri" w:hAnsi="TH SarabunIT๙" w:cs="TH SarabunIT๙"/>
+                <w:sz w:val="32"/>
+                <w:szCs w:val="32"/>
+                <w:cs/>
+              </w:rPr>
+              <w:t>Veriton</w:t>
+            </w:r>
+            <w:proofErr w:type="spellEnd"/>
+            <w:r>
+              <w:rPr>
+                <w:rFonts w:ascii="TH SarabunIT๙" w:eastAsia="Calibri" w:hAnsi="TH SarabunIT๙" w:cs="TH SarabunIT๙"/>
+                <w:sz w:val="32"/>
+                <w:szCs w:val="32"/>
+                <w:cs/>
+              </w:rPr>
+              <w:t xml:space="preserve"> Z4660G</w:t>
             </w:r>
           </w:p>
         </w:tc>
@@ -1902,7 +2164,67 @@
                 <w:szCs w:val="32"/>
                 <w:cs/>
               </w:rPr>
-              <w:t>เครื่องคอมพิวเตอร์ All-in-One สำหรับประมวลผล ยี่ห้อ Acer รุ่น Veriton Z4660G</w:t>
+              <w:t>เครื่องคอมพิวเตอร์ All-</w:t>
+            </w:r>
+            <w:proofErr w:type="spellStart"/>
+            <w:r>
+              <w:rPr>
+                <w:rFonts w:ascii="TH SarabunIT๙" w:eastAsia="Calibri" w:hAnsi="TH SarabunIT๙" w:cs="TH SarabunIT๙"/>
+                <w:sz w:val="32"/>
+                <w:szCs w:val="32"/>
+                <w:cs/>
+              </w:rPr>
+              <w:t>in</w:t>
+            </w:r>
+            <w:proofErr w:type="spellEnd"/>
+            <w:r>
+              <w:rPr>
+                <w:rFonts w:ascii="TH SarabunIT๙" w:eastAsia="Calibri" w:hAnsi="TH SarabunIT๙" w:cs="TH SarabunIT๙"/>
+                <w:sz w:val="32"/>
+                <w:szCs w:val="32"/>
+                <w:cs/>
+              </w:rPr>
+              <w:t xml:space="preserve">-One สำหรับประมวลผล ยี่ห้อ </w:t>
+            </w:r>
+            <w:proofErr w:type="spellStart"/>
+            <w:r>
+              <w:rPr>
+                <w:rFonts w:ascii="TH SarabunIT๙" w:eastAsia="Calibri" w:hAnsi="TH SarabunIT๙" w:cs="TH SarabunIT๙"/>
+                <w:sz w:val="32"/>
+                <w:szCs w:val="32"/>
+                <w:cs/>
+              </w:rPr>
+              <w:t>Acer</w:t>
+            </w:r>
+            <w:proofErr w:type="spellEnd"/>
+            <w:r>
+              <w:rPr>
+                <w:rFonts w:ascii="TH SarabunIT๙" w:eastAsia="Calibri" w:hAnsi="TH SarabunIT๙" w:cs="TH SarabunIT๙"/>
+                <w:sz w:val="32"/>
+                <w:szCs w:val="32"/>
+                <w:cs/>
+              </w:rPr>
+              <w:t xml:space="preserve"> รุ่น </w:t>
+            </w:r>
+            <w:proofErr w:type="spellStart"/>
+            <w:r>
+              <w:rPr>
+                <w:rFonts w:ascii="TH SarabunIT๙" w:eastAsia="Calibri" w:hAnsi="TH SarabunIT๙" w:cs="TH SarabunIT๙"/>
+                <w:sz w:val="32"/>
+                <w:szCs w:val="32"/>
+                <w:cs/>
+              </w:rPr>
+              <w:t>Veriton</w:t>
+            </w:r>
+            <w:proofErr w:type="spellEnd"/>
+            <w:r>
+              <w:rPr>
+                <w:rFonts w:ascii="TH SarabunIT๙" w:eastAsia="Calibri" w:hAnsi="TH SarabunIT๙" w:cs="TH SarabunIT๙"/>
+                <w:sz w:val="32"/>
+                <w:szCs w:val="32"/>
+                <w:cs/>
+              </w:rPr>
+              <w:t xml:space="preserve"> Z4660G</w:t>
             </w:r>
           </w:p>
         </w:tc>
@@ -2129,6 +2451,7 @@
                 <w:szCs w:val="32"/>
                 <w:cs/>
               </w:rPr>
+              <w:lastRenderedPageBreak/>
               <w:t>๗</w:t>
             </w:r>
           </w:p>
@@ -2152,7 +2475,67 @@
                 <w:szCs w:val="32"/>
                 <w:cs/>
               </w:rPr>
-              <w:t>เครื่องคอมพิวเตอร์ All-in-One สำหรับประมวลผล ยี่ห้อ Acer รุ่น Veriton Z4660G</w:t>
+              <w:t>เครื่องคอมพิวเตอร์ All-</w:t>
+            </w:r>
+            <w:proofErr w:type="spellStart"/>
+            <w:r>
+              <w:rPr>
+                <w:rFonts w:ascii="TH SarabunIT๙" w:eastAsia="Calibri" w:hAnsi="TH SarabunIT๙" w:cs="TH SarabunIT๙"/>
+                <w:sz w:val="32"/>
+                <w:szCs w:val="32"/>
+                <w:cs/>
+              </w:rPr>
+              <w:t>in</w:t>
+            </w:r>
+            <w:proofErr w:type="spellEnd"/>
+            <w:r>
+              <w:rPr>
+                <w:rFonts w:ascii="TH SarabunIT๙" w:eastAsia="Calibri" w:hAnsi="TH SarabunIT๙" w:cs="TH SarabunIT๙"/>
+                <w:sz w:val="32"/>
+                <w:szCs w:val="32"/>
+                <w:cs/>
+              </w:rPr>
+              <w:t xml:space="preserve">-One สำหรับประมวลผล ยี่ห้อ </w:t>
+            </w:r>
+            <w:proofErr w:type="spellStart"/>
+            <w:r>
+              <w:rPr>
+                <w:rFonts w:ascii="TH SarabunIT๙" w:eastAsia="Calibri" w:hAnsi="TH SarabunIT๙" w:cs="TH SarabunIT๙"/>
+                <w:sz w:val="32"/>
+                <w:szCs w:val="32"/>
+                <w:cs/>
+              </w:rPr>
+              <w:t>Acer</w:t>
+            </w:r>
+            <w:proofErr w:type="spellEnd"/>
+            <w:r>
+              <w:rPr>
+                <w:rFonts w:ascii="TH SarabunIT๙" w:eastAsia="Calibri" w:hAnsi="TH SarabunIT๙" w:cs="TH SarabunIT๙"/>
+                <w:sz w:val="32"/>
+                <w:szCs w:val="32"/>
+                <w:cs/>
+              </w:rPr>
+              <w:t xml:space="preserve"> รุ่น </w:t>
+            </w:r>
+            <w:proofErr w:type="spellStart"/>
+            <w:r>
+              <w:rPr>
+                <w:rFonts w:ascii="TH SarabunIT๙" w:eastAsia="Calibri" w:hAnsi="TH SarabunIT๙" w:cs="TH SarabunIT๙"/>
+                <w:sz w:val="32"/>
+                <w:szCs w:val="32"/>
+                <w:cs/>
+              </w:rPr>
+              <w:t>Veriton</w:t>
+            </w:r>
+            <w:proofErr w:type="spellEnd"/>
+            <w:r>
+              <w:rPr>
+                <w:rFonts w:ascii="TH SarabunIT๙" w:eastAsia="Calibri" w:hAnsi="TH SarabunIT๙" w:cs="TH SarabunIT๙"/>
+                <w:sz w:val="32"/>
+                <w:szCs w:val="32"/>
+                <w:cs/>
+              </w:rPr>
+              <w:t xml:space="preserve"> Z4660G</w:t>
             </w:r>
           </w:p>
         </w:tc>
@@ -2652,7 +3035,27 @@
                 <w:szCs w:val="32"/>
                 <w:cs/>
               </w:rPr>
-              <w:t>เครื่องคอมพิวเตอร์ตั้งโต๊ะ ยี่ห้อ HP รุ่น EliteDesk 705 G2 SFF</w:t>
+              <w:t xml:space="preserve">เครื่องคอมพิวเตอร์ตั้งโต๊ะ ยี่ห้อ HP รุ่น </w:t>
+            </w:r>
+            <w:proofErr w:type="spellStart"/>
+            <w:r>
+              <w:rPr>
+                <w:rFonts w:ascii="TH SarabunIT๙" w:eastAsia="Calibri" w:hAnsi="TH SarabunIT๙" w:cs="TH SarabunIT๙"/>
+                <w:sz w:val="32"/>
+                <w:szCs w:val="32"/>
+                <w:cs/>
+              </w:rPr>
+              <w:t>EliteDesk</w:t>
+            </w:r>
+            <w:proofErr w:type="spellEnd"/>
+            <w:r>
+              <w:rPr>
+                <w:rFonts w:ascii="TH SarabunIT๙" w:eastAsia="Calibri" w:hAnsi="TH SarabunIT๙" w:cs="TH SarabunIT๙"/>
+                <w:sz w:val="32"/>
+                <w:szCs w:val="32"/>
+                <w:cs/>
+              </w:rPr>
+              <w:t xml:space="preserve"> 705 G2 SFF</w:t>
             </w:r>
           </w:p>
         </w:tc>
@@ -2902,7 +3305,27 @@
                 <w:szCs w:val="32"/>
                 <w:cs/>
               </w:rPr>
-              <w:t>เครื่องคอมพิวเตอร์ตั้งโต๊ะ ยี่ห้อ HP รุ่น EliteDesk 705 G2 SFF</w:t>
+              <w:t xml:space="preserve">เครื่องคอมพิวเตอร์ตั้งโต๊ะ ยี่ห้อ HP รุ่น </w:t>
+            </w:r>
+            <w:proofErr w:type="spellStart"/>
+            <w:r>
+              <w:rPr>
+                <w:rFonts w:ascii="TH SarabunIT๙" w:eastAsia="Calibri" w:hAnsi="TH SarabunIT๙" w:cs="TH SarabunIT๙"/>
+                <w:sz w:val="32"/>
+                <w:szCs w:val="32"/>
+                <w:cs/>
+              </w:rPr>
+              <w:t>EliteDesk</w:t>
+            </w:r>
+            <w:proofErr w:type="spellEnd"/>
+            <w:r>
+              <w:rPr>
+                <w:rFonts w:ascii="TH SarabunIT๙" w:eastAsia="Calibri" w:hAnsi="TH SarabunIT๙" w:cs="TH SarabunIT๙"/>
+                <w:sz w:val="32"/>
+                <w:szCs w:val="32"/>
+                <w:cs/>
+              </w:rPr>
+              <w:t xml:space="preserve"> 705 G2 SFF</w:t>
             </w:r>
           </w:p>
         </w:tc>
@@ -3152,7 +3575,27 @@
                 <w:szCs w:val="32"/>
                 <w:cs/>
               </w:rPr>
-              <w:t>เครื่องคอมพิวเตอร์ตั้งโต๊ะ ยี่ห้อ HP รุ่น EliteDesk 705 G2 SFF</w:t>
+              <w:t xml:space="preserve">เครื่องคอมพิวเตอร์ตั้งโต๊ะ ยี่ห้อ HP รุ่น </w:t>
+            </w:r>
+            <w:proofErr w:type="spellStart"/>
+            <w:r>
+              <w:rPr>
+                <w:rFonts w:ascii="TH SarabunIT๙" w:eastAsia="Calibri" w:hAnsi="TH SarabunIT๙" w:cs="TH SarabunIT๙"/>
+                <w:sz w:val="32"/>
+                <w:szCs w:val="32"/>
+                <w:cs/>
+              </w:rPr>
+              <w:t>EliteDesk</w:t>
+            </w:r>
+            <w:proofErr w:type="spellEnd"/>
+            <w:r>
+              <w:rPr>
+                <w:rFonts w:ascii="TH SarabunIT๙" w:eastAsia="Calibri" w:hAnsi="TH SarabunIT๙" w:cs="TH SarabunIT๙"/>
+                <w:sz w:val="32"/>
+                <w:szCs w:val="32"/>
+                <w:cs/>
+              </w:rPr>
+              <w:t xml:space="preserve"> 705 G2 SFF</w:t>
             </w:r>
           </w:p>
         </w:tc>
@@ -3402,7 +3845,27 @@
                 <w:szCs w:val="32"/>
                 <w:cs/>
               </w:rPr>
-              <w:t>เครื่องคอมพิวเตอร์ตั้งโต๊ะ ยี่ห้อ HP รุ่น EliteDesk 705 G2 SFF</w:t>
+              <w:t xml:space="preserve">เครื่องคอมพิวเตอร์ตั้งโต๊ะ ยี่ห้อ HP รุ่น </w:t>
+            </w:r>
+            <w:proofErr w:type="spellStart"/>
+            <w:r>
+              <w:rPr>
+                <w:rFonts w:ascii="TH SarabunIT๙" w:eastAsia="Calibri" w:hAnsi="TH SarabunIT๙" w:cs="TH SarabunIT๙"/>
+                <w:sz w:val="32"/>
+                <w:szCs w:val="32"/>
+                <w:cs/>
+              </w:rPr>
+              <w:t>EliteDesk</w:t>
+            </w:r>
+            <w:proofErr w:type="spellEnd"/>
+            <w:r>
+              <w:rPr>
+                <w:rFonts w:ascii="TH SarabunIT๙" w:eastAsia="Calibri" w:hAnsi="TH SarabunIT๙" w:cs="TH SarabunIT๙"/>
+                <w:sz w:val="32"/>
+                <w:szCs w:val="32"/>
+                <w:cs/>
+              </w:rPr>
+              <w:t xml:space="preserve"> 705 G2 SFF</w:t>
             </w:r>
           </w:p>
         </w:tc>
@@ -3652,7 +4115,27 @@
                 <w:szCs w:val="32"/>
                 <w:cs/>
               </w:rPr>
-              <w:t>เครื่องคอมพิวเตอร์ตั้งโต๊ะ ยี่ห้อ HP รุ่น EliteDesk 705 G2 SFF</w:t>
+              <w:t xml:space="preserve">เครื่องคอมพิวเตอร์ตั้งโต๊ะ ยี่ห้อ HP รุ่น </w:t>
+            </w:r>
+            <w:proofErr w:type="spellStart"/>
+            <w:r>
+              <w:rPr>
+                <w:rFonts w:ascii="TH SarabunIT๙" w:eastAsia="Calibri" w:hAnsi="TH SarabunIT๙" w:cs="TH SarabunIT๙"/>
+                <w:sz w:val="32"/>
+                <w:szCs w:val="32"/>
+                <w:cs/>
+              </w:rPr>
+              <w:t>EliteDesk</w:t>
+            </w:r>
+            <w:proofErr w:type="spellEnd"/>
+            <w:r>
+              <w:rPr>
+                <w:rFonts w:ascii="TH SarabunIT๙" w:eastAsia="Calibri" w:hAnsi="TH SarabunIT๙" w:cs="TH SarabunIT๙"/>
+                <w:sz w:val="32"/>
+                <w:szCs w:val="32"/>
+                <w:cs/>
+              </w:rPr>
+              <w:t xml:space="preserve"> 705 G2 SFF</w:t>
             </w:r>
           </w:p>
         </w:tc>
@@ -3879,6 +4362,7 @@
                 <w:szCs w:val="32"/>
                 <w:cs/>
               </w:rPr>
+              <w:lastRenderedPageBreak/>
               <w:t>๑๔</w:t>
             </w:r>
           </w:p>
@@ -3902,7 +4386,27 @@
                 <w:szCs w:val="32"/>
                 <w:cs/>
               </w:rPr>
-              <w:t>เครื่องคอมพิวเตอร์ตั้งโต๊ะ ยี่ห้อ HP รุ่น EliteDesk 705 G2 SFF</w:t>
+              <w:t xml:space="preserve">เครื่องคอมพิวเตอร์ตั้งโต๊ะ ยี่ห้อ HP รุ่น </w:t>
+            </w:r>
+            <w:proofErr w:type="spellStart"/>
+            <w:r>
+              <w:rPr>
+                <w:rFonts w:ascii="TH SarabunIT๙" w:eastAsia="Calibri" w:hAnsi="TH SarabunIT๙" w:cs="TH SarabunIT๙"/>
+                <w:sz w:val="32"/>
+                <w:szCs w:val="32"/>
+                <w:cs/>
+              </w:rPr>
+              <w:t>EliteDesk</w:t>
+            </w:r>
+            <w:proofErr w:type="spellEnd"/>
+            <w:r>
+              <w:rPr>
+                <w:rFonts w:ascii="TH SarabunIT๙" w:eastAsia="Calibri" w:hAnsi="TH SarabunIT๙" w:cs="TH SarabunIT๙"/>
+                <w:sz w:val="32"/>
+                <w:szCs w:val="32"/>
+                <w:cs/>
+              </w:rPr>
+              <w:t xml:space="preserve"> 705 G2 SFF</w:t>
             </w:r>
           </w:p>
         </w:tc>
@@ -4152,7 +4656,27 @@
                 <w:szCs w:val="32"/>
                 <w:cs/>
               </w:rPr>
-              <w:t>เครื่องคอมพิวเตอร์ตั้งโต๊ะ ยี่ห้อ HP รุ่น EliteDesk 705 G2 SFF</w:t>
+              <w:t xml:space="preserve">เครื่องคอมพิวเตอร์ตั้งโต๊ะ ยี่ห้อ HP รุ่น </w:t>
+            </w:r>
+            <w:proofErr w:type="spellStart"/>
+            <w:r>
+              <w:rPr>
+                <w:rFonts w:ascii="TH SarabunIT๙" w:eastAsia="Calibri" w:hAnsi="TH SarabunIT๙" w:cs="TH SarabunIT๙"/>
+                <w:sz w:val="32"/>
+                <w:szCs w:val="32"/>
+                <w:cs/>
+              </w:rPr>
+              <w:t>EliteDesk</w:t>
+            </w:r>
+            <w:proofErr w:type="spellEnd"/>
+            <w:r>
+              <w:rPr>
+                <w:rFonts w:ascii="TH SarabunIT๙" w:eastAsia="Calibri" w:hAnsi="TH SarabunIT๙" w:cs="TH SarabunIT๙"/>
+                <w:sz w:val="32"/>
+                <w:szCs w:val="32"/>
+                <w:cs/>
+              </w:rPr>
+              <w:t xml:space="preserve"> 705 G2 SFF</w:t>
             </w:r>
           </w:p>
         </w:tc>
@@ -4402,7 +4926,27 @@
                 <w:szCs w:val="32"/>
                 <w:cs/>
               </w:rPr>
-              <w:t>เครื่องคอมพิวเตอร์ตั้งโต๊ะ ยี่ห้อ HP รุ่น EliteDesk 705 G2 SFF</w:t>
+              <w:t xml:space="preserve">เครื่องคอมพิวเตอร์ตั้งโต๊ะ ยี่ห้อ HP รุ่น </w:t>
+            </w:r>
+            <w:proofErr w:type="spellStart"/>
+            <w:r>
+              <w:rPr>
+                <w:rFonts w:ascii="TH SarabunIT๙" w:eastAsia="Calibri" w:hAnsi="TH SarabunIT๙" w:cs="TH SarabunIT๙"/>
+                <w:sz w:val="32"/>
+                <w:szCs w:val="32"/>
+                <w:cs/>
+              </w:rPr>
+              <w:t>EliteDesk</w:t>
+            </w:r>
+            <w:proofErr w:type="spellEnd"/>
+            <w:r>
+              <w:rPr>
+                <w:rFonts w:ascii="TH SarabunIT๙" w:eastAsia="Calibri" w:hAnsi="TH SarabunIT๙" w:cs="TH SarabunIT๙"/>
+                <w:sz w:val="32"/>
+                <w:szCs w:val="32"/>
+                <w:cs/>
+              </w:rPr>
+              <w:t xml:space="preserve"> 705 G2 SFF</w:t>
             </w:r>
           </w:p>
         </w:tc>
@@ -4652,7 +5196,27 @@
                 <w:szCs w:val="32"/>
                 <w:cs/>
               </w:rPr>
-              <w:t>เครื่องคอมพิวเตอร์ตั้งโต๊ะ ยี่ห้อ HP รุ่น EliteDesk 705 G2 SFF</w:t>
+              <w:t xml:space="preserve">เครื่องคอมพิวเตอร์ตั้งโต๊ะ ยี่ห้อ HP รุ่น </w:t>
+            </w:r>
+            <w:proofErr w:type="spellStart"/>
+            <w:r>
+              <w:rPr>
+                <w:rFonts w:ascii="TH SarabunIT๙" w:eastAsia="Calibri" w:hAnsi="TH SarabunIT๙" w:cs="TH SarabunIT๙"/>
+                <w:sz w:val="32"/>
+                <w:szCs w:val="32"/>
+                <w:cs/>
+              </w:rPr>
+              <w:t>EliteDesk</w:t>
+            </w:r>
+            <w:proofErr w:type="spellEnd"/>
+            <w:r>
+              <w:rPr>
+                <w:rFonts w:ascii="TH SarabunIT๙" w:eastAsia="Calibri" w:hAnsi="TH SarabunIT๙" w:cs="TH SarabunIT๙"/>
+                <w:sz w:val="32"/>
+                <w:szCs w:val="32"/>
+                <w:cs/>
+              </w:rPr>
+              <w:t xml:space="preserve"> 705 G2 SFF</w:t>
             </w:r>
           </w:p>
         </w:tc>
@@ -4902,7 +5466,27 @@
                 <w:szCs w:val="32"/>
                 <w:cs/>
               </w:rPr>
-              <w:t>เครื่องคอมพิวเตอร์ตั้งโต๊ะ ยี่ห้อ HP รุ่น EliteDesk 705 G2 SFF</w:t>
+              <w:t xml:space="preserve">เครื่องคอมพิวเตอร์ตั้งโต๊ะ ยี่ห้อ HP รุ่น </w:t>
+            </w:r>
+            <w:proofErr w:type="spellStart"/>
+            <w:r>
+              <w:rPr>
+                <w:rFonts w:ascii="TH SarabunIT๙" w:eastAsia="Calibri" w:hAnsi="TH SarabunIT๙" w:cs="TH SarabunIT๙"/>
+                <w:sz w:val="32"/>
+                <w:szCs w:val="32"/>
+                <w:cs/>
+              </w:rPr>
+              <w:t>EliteDesk</w:t>
+            </w:r>
+            <w:proofErr w:type="spellEnd"/>
+            <w:r>
+              <w:rPr>
+                <w:rFonts w:ascii="TH SarabunIT๙" w:eastAsia="Calibri" w:hAnsi="TH SarabunIT๙" w:cs="TH SarabunIT๙"/>
+                <w:sz w:val="32"/>
+                <w:szCs w:val="32"/>
+                <w:cs/>
+              </w:rPr>
+              <w:t xml:space="preserve"> 705 G2 SFF</w:t>
             </w:r>
           </w:p>
         </w:tc>
@@ -5152,7 +5736,27 @@
                 <w:szCs w:val="32"/>
                 <w:cs/>
               </w:rPr>
-              <w:t>เครื่องคอมพิวเตอร์ตั้งโต๊ะ ยี่ห้อ HP รุ่น EliteDesk 705 G2 SFF</w:t>
+              <w:t xml:space="preserve">เครื่องคอมพิวเตอร์ตั้งโต๊ะ ยี่ห้อ HP รุ่น </w:t>
+            </w:r>
+            <w:proofErr w:type="spellStart"/>
+            <w:r>
+              <w:rPr>
+                <w:rFonts w:ascii="TH SarabunIT๙" w:eastAsia="Calibri" w:hAnsi="TH SarabunIT๙" w:cs="TH SarabunIT๙"/>
+                <w:sz w:val="32"/>
+                <w:szCs w:val="32"/>
+                <w:cs/>
+              </w:rPr>
+              <w:t>EliteDesk</w:t>
+            </w:r>
+            <w:proofErr w:type="spellEnd"/>
+            <w:r>
+              <w:rPr>
+                <w:rFonts w:ascii="TH SarabunIT๙" w:eastAsia="Calibri" w:hAnsi="TH SarabunIT๙" w:cs="TH SarabunIT๙"/>
+                <w:sz w:val="32"/>
+                <w:szCs w:val="32"/>
+                <w:cs/>
+              </w:rPr>
+              <w:t xml:space="preserve"> 705 G2 SFF</w:t>
             </w:r>
           </w:p>
         </w:tc>
@@ -5402,7 +6006,27 @@
                 <w:szCs w:val="32"/>
                 <w:cs/>
               </w:rPr>
-              <w:t>เครื่องคอมพิวเตอร์ตั้งโต๊ะ ยี่ห้อ HP รุ่น EliteDesk 705 G2 SFF</w:t>
+              <w:t xml:space="preserve">เครื่องคอมพิวเตอร์ตั้งโต๊ะ ยี่ห้อ HP รุ่น </w:t>
+            </w:r>
+            <w:proofErr w:type="spellStart"/>
+            <w:r>
+              <w:rPr>
+                <w:rFonts w:ascii="TH SarabunIT๙" w:eastAsia="Calibri" w:hAnsi="TH SarabunIT๙" w:cs="TH SarabunIT๙"/>
+                <w:sz w:val="32"/>
+                <w:szCs w:val="32"/>
+                <w:cs/>
+              </w:rPr>
+              <w:t>EliteDesk</w:t>
+            </w:r>
+            <w:proofErr w:type="spellEnd"/>
+            <w:r>
+              <w:rPr>
+                <w:rFonts w:ascii="TH SarabunIT๙" w:eastAsia="Calibri" w:hAnsi="TH SarabunIT๙" w:cs="TH SarabunIT๙"/>
+                <w:sz w:val="32"/>
+                <w:szCs w:val="32"/>
+                <w:cs/>
+              </w:rPr>
+              <w:t xml:space="preserve"> 705 G2 SFF</w:t>
             </w:r>
           </w:p>
         </w:tc>
@@ -5629,6 +6253,7 @@
                 <w:szCs w:val="32"/>
                 <w:cs/>
               </w:rPr>
+              <w:lastRenderedPageBreak/>
               <w:t>๒๑</w:t>
             </w:r>
           </w:p>
@@ -5891,7 +6516,7 @@
           <w:p>
             <w:pPr>
               <w:rPr>
-                <w:rFonts w:ascii="TH SarabunIT๙" w:eastAsia="Calibri" w:hAnsi="TH SarabunIT๙" w:cs="TH SarabunIT๙" w:hint="cs"/>
+                <w:rFonts w:ascii="TH SarabunIT๙" w:eastAsia="Calibri" w:hAnsi="TH SarabunIT๙" w:cs="TH SarabunIT๙"/>
                 <w:sz w:val="32"/>
                 <w:szCs w:val="32"/>
                 <w:cs/>
@@ -5940,7 +6565,7 @@
             <w:pPr>
               <w:jc w:val="center"/>
               <w:rPr>
-                <w:rFonts w:ascii="Segoe UI Symbol" w:eastAsia="Calibri" w:hAnsi="Segoe UI Symbol" w:cs="Segoe UI Symbol" w:hint="cs"/>
+                <w:rFonts w:ascii="Segoe UI Symbol" w:eastAsia="Calibri" w:hAnsi="Segoe UI Symbol" w:cs="Segoe UI Symbol"/>
                 <w:sz w:val="32"/>
                 <w:szCs w:val="32"/>
                 <w:cs/>
@@ -6202,7 +6827,7 @@
             <w:pPr>
               <w:jc w:val="center"/>
               <w:rPr>
-                <w:rFonts w:ascii="Segoe UI Symbol" w:eastAsia="Calibri" w:hAnsi="Segoe UI Symbol" w:cs="Segoe UI Symbol" w:hint="cs"/>
+                <w:rFonts w:ascii="Segoe UI Symbol" w:eastAsia="Calibri" w:hAnsi="Segoe UI Symbol" w:cs="Segoe UI Symbol"/>
                 <w:sz w:val="32"/>
                 <w:szCs w:val="32"/>
                 <w:cs/>
@@ -6464,7 +7089,7 @@
             <w:pPr>
               <w:jc w:val="center"/>
               <w:rPr>
-                <w:rFonts w:ascii="Segoe UI Symbol" w:eastAsia="Calibri" w:hAnsi="Segoe UI Symbol" w:cs="Segoe UI Symbol" w:hint="cs"/>
+                <w:rFonts w:ascii="Segoe UI Symbol" w:eastAsia="Calibri" w:hAnsi="Segoe UI Symbol" w:cs="Segoe UI Symbol"/>
                 <w:sz w:val="32"/>
                 <w:szCs w:val="32"/>
                 <w:cs/>
@@ -6727,7 +7352,7 @@
             <w:pPr>
               <w:jc w:val="center"/>
               <w:rPr>
-                <w:rFonts w:ascii="Segoe UI Symbol" w:eastAsia="Calibri" w:hAnsi="Segoe UI Symbol" w:cs="Segoe UI Symbol" w:hint="cs"/>
+                <w:rFonts w:ascii="Segoe UI Symbol" w:eastAsia="Calibri" w:hAnsi="Segoe UI Symbol" w:cs="Segoe UI Symbol"/>
                 <w:sz w:val="32"/>
                 <w:szCs w:val="32"/>
                 <w:cs/>
@@ -6989,7 +7614,7 @@
             <w:pPr>
               <w:jc w:val="center"/>
               <w:rPr>
-                <w:rFonts w:ascii="Segoe UI Symbol" w:eastAsia="Calibri" w:hAnsi="Segoe UI Symbol" w:cs="Segoe UI Symbol" w:hint="cs"/>
+                <w:rFonts w:ascii="Segoe UI Symbol" w:eastAsia="Calibri" w:hAnsi="Segoe UI Symbol" w:cs="Segoe UI Symbol"/>
                 <w:sz w:val="32"/>
                 <w:szCs w:val="32"/>
                 <w:cs/>
@@ -7252,7 +7877,7 @@
             <w:pPr>
               <w:jc w:val="center"/>
               <w:rPr>
-                <w:rFonts w:ascii="Segoe UI Symbol" w:eastAsia="Calibri" w:hAnsi="Segoe UI Symbol" w:cs="Segoe UI Symbol" w:hint="cs"/>
+                <w:rFonts w:ascii="Segoe UI Symbol" w:eastAsia="Calibri" w:hAnsi="Segoe UI Symbol" w:cs="Segoe UI Symbol"/>
                 <w:sz w:val="32"/>
                 <w:szCs w:val="32"/>
                 <w:cs/>
@@ -7454,6 +8079,7 @@
                 <w:szCs w:val="32"/>
                 <w:cs/>
               </w:rPr>
+              <w:lastRenderedPageBreak/>
               <w:t>๒๘</w:t>
             </w:r>
           </w:p>
@@ -7515,7 +8141,7 @@
             <w:pPr>
               <w:jc w:val="center"/>
               <w:rPr>
-                <w:rFonts w:ascii="Segoe UI Symbol" w:eastAsia="Calibri" w:hAnsi="Segoe UI Symbol" w:cs="Segoe UI Symbol" w:hint="cs"/>
+                <w:rFonts w:ascii="Segoe UI Symbol" w:eastAsia="Calibri" w:hAnsi="Segoe UI Symbol" w:cs="Segoe UI Symbol"/>
                 <w:sz w:val="32"/>
                 <w:szCs w:val="32"/>
                 <w:cs/>
@@ -7777,7 +8403,7 @@
             <w:pPr>
               <w:jc w:val="center"/>
               <w:rPr>
-                <w:rFonts w:ascii="Segoe UI Symbol" w:eastAsia="Calibri" w:hAnsi="Segoe UI Symbol" w:cs="Segoe UI Symbol" w:hint="cs"/>
+                <w:rFonts w:ascii="Segoe UI Symbol" w:eastAsia="Calibri" w:hAnsi="Segoe UI Symbol" w:cs="Segoe UI Symbol"/>
                 <w:sz w:val="32"/>
                 <w:szCs w:val="32"/>
                 <w:cs/>
@@ -8039,7 +8665,7 @@
             <w:pPr>
               <w:jc w:val="center"/>
               <w:rPr>
-                <w:rFonts w:ascii="Segoe UI Symbol" w:eastAsia="Calibri" w:hAnsi="Segoe UI Symbol" w:cs="Segoe UI Symbol" w:hint="cs"/>
+                <w:rFonts w:ascii="Segoe UI Symbol" w:eastAsia="Calibri" w:hAnsi="Segoe UI Symbol" w:cs="Segoe UI Symbol"/>
                 <w:sz w:val="32"/>
                 <w:szCs w:val="32"/>
                 <w:cs/>
@@ -8301,7 +8927,7 @@
             <w:pPr>
               <w:jc w:val="center"/>
               <w:rPr>
-                <w:rFonts w:ascii="Segoe UI Symbol" w:eastAsia="Calibri" w:hAnsi="Segoe UI Symbol" w:cs="Segoe UI Symbol" w:hint="cs"/>
+                <w:rFonts w:ascii="Segoe UI Symbol" w:eastAsia="Calibri" w:hAnsi="Segoe UI Symbol" w:cs="Segoe UI Symbol"/>
                 <w:sz w:val="32"/>
                 <w:szCs w:val="32"/>
                 <w:cs/>
@@ -8563,7 +9189,7 @@
             <w:pPr>
               <w:jc w:val="center"/>
               <w:rPr>
-                <w:rFonts w:ascii="Segoe UI Symbol" w:eastAsia="Calibri" w:hAnsi="Segoe UI Symbol" w:cs="Segoe UI Symbol" w:hint="cs"/>
+                <w:rFonts w:ascii="Segoe UI Symbol" w:eastAsia="Calibri" w:hAnsi="Segoe UI Symbol" w:cs="Segoe UI Symbol"/>
                 <w:sz w:val="32"/>
                 <w:szCs w:val="32"/>
                 <w:cs/>
@@ -9500,7 +10126,6 @@
           <w:szCs w:val="32"/>
           <w:cs/>
         </w:rPr>
-        <w:lastRenderedPageBreak/>
         <w:t>( เอกสารหมายเลข 5)</w:t>
       </w:r>
     </w:p>
@@ -10419,7 +11044,16 @@
                           <w:szCs w:val="32"/>
                           <w:cs/>
                         </w:rPr>
-                        <w:t xml:space="preserve"> นางสาวนรินทร</w:t>
+                        <w:t xml:space="preserve"> </w:t>
+                      </w:r>
+                      <w:r>
+                        <w:rPr>
+                          <w:rFonts w:ascii="TH SarabunIT๙" w:hAnsi="TH SarabunIT๙" w:cs="TH SarabunIT๙" w:hint="cs"/>
+                          <w:sz w:val="32"/>
+                          <w:szCs w:val="32"/>
+                          <w:cs/>
+                        </w:rPr>
+                        <w:t>นางสาวนรินทร</w:t>
                       </w:r>
                       <w:r>
                         <w:rPr>
@@ -10715,6 +11349,175 @@
           <w:bCs/>
           <w:sz w:val="32"/>
           <w:szCs w:val="32"/>
+        </w:rPr>
+      </w:pPr>
+    </w:p>
+    <w:p>
+      <w:pPr>
+        <w:spacing w:after="200" w:line="276" w:lineRule="auto"/>
+        <w:jc w:val="center"/>
+        <w:rPr>
+          <w:rFonts w:ascii="TH SarabunIT๙" w:eastAsia="Calibri" w:hAnsi="TH SarabunIT๙" w:cs="TH SarabunIT๙"/>
+          <w:b/>
+          <w:bCs/>
+          <w:sz w:val="32"/>
+          <w:szCs w:val="32"/>
+        </w:rPr>
+      </w:pPr>
+    </w:p>
+    <w:p>
+      <w:pPr>
+        <w:spacing w:after="200" w:line="276" w:lineRule="auto"/>
+        <w:jc w:val="center"/>
+        <w:rPr>
+          <w:rFonts w:ascii="TH SarabunIT๙" w:eastAsia="Calibri" w:hAnsi="TH SarabunIT๙" w:cs="TH SarabunIT๙"/>
+          <w:b/>
+          <w:bCs/>
+          <w:sz w:val="32"/>
+          <w:szCs w:val="32"/>
+        </w:rPr>
+      </w:pPr>
+    </w:p>
+    <w:p>
+      <w:pPr>
+        <w:spacing w:after="200" w:line="276" w:lineRule="auto"/>
+        <w:jc w:val="center"/>
+        <w:rPr>
+          <w:rFonts w:ascii="TH SarabunIT๙" w:eastAsia="Calibri" w:hAnsi="TH SarabunIT๙" w:cs="TH SarabunIT๙"/>
+          <w:b/>
+          <w:bCs/>
+          <w:sz w:val="32"/>
+          <w:szCs w:val="32"/>
+        </w:rPr>
+      </w:pPr>
+    </w:p>
+    <w:p>
+      <w:pPr>
+        <w:spacing w:after="200" w:line="276" w:lineRule="auto"/>
+        <w:jc w:val="center"/>
+        <w:rPr>
+          <w:rFonts w:ascii="TH SarabunIT๙" w:eastAsia="Calibri" w:hAnsi="TH SarabunIT๙" w:cs="TH SarabunIT๙"/>
+          <w:b/>
+          <w:bCs/>
+          <w:sz w:val="32"/>
+          <w:szCs w:val="32"/>
+        </w:rPr>
+      </w:pPr>
+    </w:p>
+    <w:p>
+      <w:pPr>
+        <w:spacing w:after="200" w:line="276" w:lineRule="auto"/>
+        <w:jc w:val="center"/>
+        <w:rPr>
+          <w:rFonts w:ascii="TH SarabunIT๙" w:eastAsia="Calibri" w:hAnsi="TH SarabunIT๙" w:cs="TH SarabunIT๙"/>
+          <w:b/>
+          <w:bCs/>
+          <w:sz w:val="32"/>
+          <w:szCs w:val="32"/>
+        </w:rPr>
+      </w:pPr>
+    </w:p>
+    <w:p>
+      <w:pPr>
+        <w:spacing w:after="200" w:line="276" w:lineRule="auto"/>
+        <w:jc w:val="center"/>
+        <w:rPr>
+          <w:rFonts w:ascii="TH SarabunIT๙" w:eastAsia="Calibri" w:hAnsi="TH SarabunIT๙" w:cs="TH SarabunIT๙"/>
+          <w:b/>
+          <w:bCs/>
+          <w:sz w:val="32"/>
+          <w:szCs w:val="32"/>
+        </w:rPr>
+      </w:pPr>
+    </w:p>
+    <w:p>
+      <w:pPr>
+        <w:spacing w:after="200" w:line="276" w:lineRule="auto"/>
+        <w:jc w:val="center"/>
+        <w:rPr>
+          <w:rFonts w:ascii="TH SarabunIT๙" w:eastAsia="Calibri" w:hAnsi="TH SarabunIT๙" w:cs="TH SarabunIT๙"/>
+          <w:b/>
+          <w:bCs/>
+          <w:sz w:val="32"/>
+          <w:szCs w:val="32"/>
+        </w:rPr>
+      </w:pPr>
+    </w:p>
+    <w:p>
+      <w:pPr>
+        <w:spacing w:after="200" w:line="276" w:lineRule="auto"/>
+        <w:jc w:val="center"/>
+        <w:rPr>
+          <w:rFonts w:ascii="TH SarabunIT๙" w:eastAsia="Calibri" w:hAnsi="TH SarabunIT๙" w:cs="TH SarabunIT๙"/>
+          <w:b/>
+          <w:bCs/>
+          <w:sz w:val="32"/>
+          <w:szCs w:val="32"/>
+        </w:rPr>
+      </w:pPr>
+    </w:p>
+    <w:p>
+      <w:pPr>
+        <w:spacing w:after="200" w:line="276" w:lineRule="auto"/>
+        <w:jc w:val="center"/>
+        <w:rPr>
+          <w:rFonts w:ascii="TH SarabunIT๙" w:eastAsia="Calibri" w:hAnsi="TH SarabunIT๙" w:cs="TH SarabunIT๙"/>
+          <w:b/>
+          <w:bCs/>
+          <w:sz w:val="32"/>
+          <w:szCs w:val="32"/>
+        </w:rPr>
+      </w:pPr>
+    </w:p>
+    <w:p>
+      <w:pPr>
+        <w:spacing w:after="200" w:line="276" w:lineRule="auto"/>
+        <w:jc w:val="center"/>
+        <w:rPr>
+          <w:rFonts w:ascii="TH SarabunIT๙" w:eastAsia="Calibri" w:hAnsi="TH SarabunIT๙" w:cs="TH SarabunIT๙"/>
+          <w:b/>
+          <w:bCs/>
+          <w:sz w:val="32"/>
+          <w:szCs w:val="32"/>
+        </w:rPr>
+      </w:pPr>
+    </w:p>
+    <w:p>
+      <w:pPr>
+        <w:spacing w:after="200" w:line="276" w:lineRule="auto"/>
+        <w:jc w:val="center"/>
+        <w:rPr>
+          <w:rFonts w:ascii="TH SarabunIT๙" w:eastAsia="Calibri" w:hAnsi="TH SarabunIT๙" w:cs="TH SarabunIT๙"/>
+          <w:b/>
+          <w:bCs/>
+          <w:sz w:val="32"/>
+          <w:szCs w:val="32"/>
+        </w:rPr>
+      </w:pPr>
+    </w:p>
+    <w:p>
+      <w:pPr>
+        <w:spacing w:after="200" w:line="276" w:lineRule="auto"/>
+        <w:jc w:val="center"/>
+        <w:rPr>
+          <w:rFonts w:ascii="TH SarabunIT๙" w:eastAsia="Calibri" w:hAnsi="TH SarabunIT๙" w:cs="TH SarabunIT๙" w:hint="cs"/>
+          <w:b/>
+          <w:bCs/>
+          <w:sz w:val="32"/>
+          <w:szCs w:val="32"/>
+        </w:rPr>
+      </w:pPr>
+    </w:p>
+    <w:p>
+      <w:pPr>
+        <w:spacing w:after="200" w:line="276" w:lineRule="auto"/>
+        <w:jc w:val="center"/>
+        <w:rPr>
+          <w:rFonts w:ascii="TH SarabunIT๙" w:eastAsia="Calibri" w:hAnsi="TH SarabunIT๙" w:cs="TH SarabunIT๙"/>
+          <w:b/>
+          <w:bCs/>
+          <w:sz w:val="32"/>
+          <w:szCs w:val="32"/>
           <w:cs/>
         </w:rPr>
       </w:pPr>
@@ -10773,8 +11576,21 @@
           <w:szCs w:val="32"/>
           <w:cs/>
         </w:rPr>
-        <w:t>ของโรงเรียนบ้านเขาธรรมบท สพป</w:t>
+        <w:t xml:space="preserve">ของโรงเรียนบ้านเขาธรรมบท </w:t>
       </w:r>
+      <w:proofErr w:type="spellStart"/>
+      <w:r>
+        <w:rPr>
+          <w:rFonts w:ascii="TH SarabunIT๙" w:eastAsia="Calibri" w:hAnsi="TH SarabunIT๙" w:cs="TH SarabunIT๙"/>
+          <w:b/>
+          <w:bCs/>
+          <w:sz w:val="32"/>
+          <w:szCs w:val="32"/>
+          <w:cs/>
+        </w:rPr>
+        <w:t>สพป</w:t>
+      </w:r>
+      <w:proofErr w:type="spellEnd"/>
       <w:r>
         <w:rPr>
           <w:rFonts w:ascii="TH SarabunIT๙" w:eastAsia="Calibri" w:hAnsi="TH SarabunIT๙" w:cs="TH SarabunIT๙"/>
@@ -10858,6 +11674,7 @@
       <w:tr>
         <w:trPr>
           <w:trHeight w:val="682"/>
+          <w:tblHeader/>
         </w:trPr>
         <w:tc>
           <w:tcPr>
@@ -11081,7 +11898,7 @@
       </w:tr>
       <w:tr>
         <w:trPr>
-          <w:trHeight w:val="1649"/>
+          <w:trHeight w:val="739"/>
         </w:trPr>
         <w:tc>
           <w:tcPr>
@@ -11090,19 +11907,21 @@
           <w:p>
             <w:pPr>
               <w:spacing w:after="200" w:line="276" w:lineRule="auto"/>
-              <w:rPr>
-                <w:rFonts w:ascii="TH SarabunIT๙" w:eastAsia="Calibri" w:hAnsi="TH SarabunIT๙" w:cs="TH SarabunIT๙"/>
-                <w:sz w:val="32"/>
-                <w:szCs w:val="32"/>
-              </w:rPr>
-            </w:pPr>
-            <w:r>
-              <w:rPr>
-                <w:rFonts w:ascii="TH SarabunIT๙" w:eastAsia="Calibri" w:hAnsi="TH SarabunIT๙" w:cs="TH SarabunIT๙"/>
-                <w:sz w:val="32"/>
-                <w:szCs w:val="32"/>
-              </w:rPr>
-              <w:t>1</w:t>
+              <w:jc w:val="center"/>
+              <w:rPr>
+                <w:rFonts w:ascii="TH SarabunIT๙" w:eastAsia="Calibri" w:hAnsi="TH SarabunIT๙" w:cs="TH SarabunIT๙"/>
+                <w:sz w:val="32"/>
+                <w:szCs w:val="32"/>
+              </w:rPr>
+            </w:pPr>
+            <w:r>
+              <w:rPr>
+                <w:rFonts w:ascii="TH SarabunIT๙" w:hAnsi="TH SarabunIT๙" w:cs="TH SarabunIT๙"/>
+                <w:sz w:val="32"/>
+                <w:szCs w:val="32"/>
+                <w:cs/>
+              </w:rPr>
+              <w:t>๑</w:t>
             </w:r>
           </w:p>
         </w:tc>
@@ -11114,40 +11933,20 @@
             <w:pPr>
               <w:spacing w:after="200" w:line="276" w:lineRule="auto"/>
               <w:rPr>
-                <w:rFonts w:ascii="TH SarabunIT๙" w:eastAsia="Calibri" w:hAnsi="TH SarabunIT๙" w:cs="TH SarabunIT๙"/>
-                <w:color w:val="EE0000"/>
-                <w:sz w:val="32"/>
-                <w:szCs w:val="32"/>
-              </w:rPr>
-            </w:pPr>
-            <w:r>
-              <w:rPr>
-                <w:rFonts w:ascii="TH SarabunIT๙" w:eastAsia="Calibri" w:hAnsi="TH SarabunIT๙" w:cs="TH SarabunIT๙"/>
-                <w:color w:val="EE0000"/>
-                <w:sz w:val="32"/>
-                <w:szCs w:val="32"/>
-                <w:cs/>
-              </w:rPr>
-              <w:t xml:space="preserve">คอมพิวเตอร์ตั้งโต๊ะ </w:t>
-            </w:r>
-            <w:r>
-              <w:rPr>
-                <w:rFonts w:ascii="TH SarabunIT๙" w:eastAsia="Calibri" w:hAnsi="TH SarabunIT๙" w:cs="TH SarabunIT๙"/>
-                <w:color w:val="EE0000"/>
-                <w:sz w:val="32"/>
-                <w:szCs w:val="32"/>
-              </w:rPr>
-              <w:t xml:space="preserve">(AIO) 23.8 </w:t>
-            </w:r>
-            <w:r>
-              <w:rPr>
-                <w:rFonts w:ascii="TH SarabunIT๙" w:eastAsia="Calibri" w:hAnsi="TH SarabunIT๙" w:cs="TH SarabunIT๙"/>
-                <w:color w:val="EE0000"/>
-                <w:sz w:val="32"/>
-                <w:szCs w:val="32"/>
-                <w:cs/>
-              </w:rPr>
-              <w:t>นิ้ว</w:t>
+                <w:rFonts w:ascii="TH SarabunIT๙" w:hAnsi="TH SarabunIT๙" w:cs="TH SarabunIT๙" w:hint="cs"/>
+                <w:sz w:val="32"/>
+                <w:szCs w:val="32"/>
+                <w:cs/>
+              </w:rPr>
+            </w:pPr>
+            <w:r>
+              <w:rPr>
+                <w:rFonts w:ascii="TH SarabunIT๙" w:hAnsi="TH SarabunIT๙" w:cs="TH SarabunIT๙"/>
+                <w:sz w:val="32"/>
+                <w:szCs w:val="32"/>
+                <w:cs/>
+              </w:rPr>
+              <w:t>เครื่องคอมพิวเตอร์ตั้งโต๊ะ ยี่ห้อ HP รุ่น EliteDesk 705 G2 SFF พร้อมอุปกรณ์ประกอบ ได้แก่ จอภาพคอมพิวเตอร์ ยี่ห้อ HP รุ่น V1936 จำนวน ๑๐ จอ รุ่น V242 จำนวน ๑๐ จอ แป้นพิมพ์ (Keyboard) รุ่น KU-1156 จำนวน ๒๐ ตัว และเมาส์ ยี่ห้อ HP จำนวน ๒๐ ตัว</w:t>
             </w:r>
           </w:p>
         </w:tc>
@@ -11159,79 +11958,20 @@
             <w:pPr>
               <w:spacing w:after="200" w:line="276" w:lineRule="auto"/>
               <w:rPr>
-                <w:rFonts w:ascii="TH SarabunIT๙" w:eastAsia="Calibri" w:hAnsi="TH SarabunIT๙" w:cs="TH SarabunIT๙"/>
-                <w:color w:val="EE0000"/>
-                <w:sz w:val="32"/>
-                <w:szCs w:val="32"/>
-                <w:cs/>
-              </w:rPr>
-            </w:pPr>
-            <w:r>
-              <w:rPr>
-                <w:rFonts w:ascii="TH SarabunIT๙" w:eastAsia="Calibri" w:hAnsi="TH SarabunIT๙" w:cs="TH SarabunIT๙"/>
-                <w:color w:val="EE0000"/>
-                <w:sz w:val="32"/>
-                <w:szCs w:val="32"/>
-                <w:cs/>
-              </w:rPr>
-              <w:t>ขบ.</w:t>
-            </w:r>
-            <w:r>
-              <w:rPr>
-                <w:rFonts w:ascii="TH SarabunIT๙" w:eastAsia="Calibri" w:hAnsi="TH SarabunIT๙" w:cs="TH SarabunIT๙"/>
-                <w:color w:val="EE0000"/>
-                <w:sz w:val="32"/>
-                <w:szCs w:val="32"/>
-              </w:rPr>
-              <w:t>32</w:t>
-            </w:r>
-            <w:r>
-              <w:rPr>
-                <w:rFonts w:ascii="TH SarabunIT๙" w:eastAsia="Calibri" w:hAnsi="TH SarabunIT๙" w:cs="TH SarabunIT๙"/>
-                <w:color w:val="EE0000"/>
-                <w:sz w:val="32"/>
-                <w:szCs w:val="32"/>
-                <w:cs/>
-              </w:rPr>
-              <w:t>๔</w:t>
-            </w:r>
-            <w:r>
-              <w:rPr>
-                <w:rFonts w:ascii="TH SarabunIT๙" w:eastAsia="Calibri" w:hAnsi="TH SarabunIT๙" w:cs="TH SarabunIT๙"/>
-                <w:color w:val="EE0000"/>
-                <w:sz w:val="32"/>
-                <w:szCs w:val="32"/>
-              </w:rPr>
-              <w:t>/001-</w:t>
-            </w:r>
-            <w:r>
-              <w:rPr>
-                <w:rFonts w:ascii="TH SarabunIT๙" w:eastAsia="Calibri" w:hAnsi="TH SarabunIT๙" w:cs="TH SarabunIT๙"/>
-                <w:color w:val="EE0000"/>
-                <w:sz w:val="32"/>
-                <w:szCs w:val="32"/>
-                <w:cs/>
-              </w:rPr>
-              <w:t>๐๑</w:t>
-            </w:r>
-            <w:r>
-              <w:rPr>
-                <w:rFonts w:ascii="TH SarabunIT๙" w:eastAsia="Calibri" w:hAnsi="TH SarabunIT๙" w:cs="TH SarabunIT๙"/>
-                <w:color w:val="EE0000"/>
-                <w:sz w:val="32"/>
-                <w:szCs w:val="32"/>
-              </w:rPr>
-              <w:t>0/256</w:t>
-            </w:r>
-            <w:r>
-              <w:rPr>
-                <w:rFonts w:ascii="TH SarabunIT๙" w:eastAsia="Calibri" w:hAnsi="TH SarabunIT๙" w:cs="TH SarabunIT๙"/>
-                <w:color w:val="EE0000"/>
-                <w:sz w:val="32"/>
-                <w:szCs w:val="32"/>
-                <w:cs/>
-              </w:rPr>
-              <w:t>๗</w:t>
+                <w:rFonts w:ascii="TH SarabunIT๙" w:hAnsi="TH SarabunIT๙" w:cs="TH SarabunIT๙"/>
+                <w:sz w:val="32"/>
+                <w:szCs w:val="32"/>
+                <w:cs/>
+              </w:rPr>
+            </w:pPr>
+            <w:r>
+              <w:rPr>
+                <w:rFonts w:ascii="TH SarabunIT๙" w:hAnsi="TH SarabunIT๙" w:cs="TH SarabunIT๙"/>
+                <w:sz w:val="32"/>
+                <w:szCs w:val="32"/>
+                <w:cs/>
+              </w:rPr>
+              <w:t>ขบ.325/001-020/2568</w:t>
             </w:r>
           </w:p>
         </w:tc>
@@ -11244,20 +11984,20 @@
               <w:spacing w:after="200" w:line="276" w:lineRule="auto"/>
               <w:jc w:val="center"/>
               <w:rPr>
-                <w:rFonts w:ascii="TH SarabunIT๙" w:eastAsia="Calibri" w:hAnsi="TH SarabunIT๙" w:cs="TH SarabunIT๙"/>
-                <w:color w:val="EE0000"/>
-                <w:sz w:val="32"/>
-                <w:szCs w:val="32"/>
-              </w:rPr>
-            </w:pPr>
-            <w:r>
-              <w:rPr>
-                <w:rFonts w:ascii="TH SarabunIT๙" w:eastAsia="Calibri" w:hAnsi="TH SarabunIT๙" w:cs="TH SarabunIT๙"/>
-                <w:color w:val="EE0000"/>
-                <w:sz w:val="32"/>
-                <w:szCs w:val="32"/>
-              </w:rPr>
-              <w:t>10</w:t>
+                <w:rFonts w:ascii="TH SarabunIT๙" w:hAnsi="TH SarabunIT๙" w:cs="TH SarabunIT๙"/>
+                <w:sz w:val="32"/>
+                <w:szCs w:val="32"/>
+                <w:cs/>
+              </w:rPr>
+            </w:pPr>
+            <w:r>
+              <w:rPr>
+                <w:rFonts w:ascii="TH SarabunIT๙" w:hAnsi="TH SarabunIT๙" w:cs="TH SarabunIT๙"/>
+                <w:sz w:val="32"/>
+                <w:szCs w:val="32"/>
+                <w:cs/>
+              </w:rPr>
+              <w:t>๒๐ ชุด</w:t>
             </w:r>
           </w:p>
         </w:tc>
@@ -11270,17 +12010,16 @@
               <w:jc w:val="center"/>
               <w:rPr>
                 <w:rFonts w:ascii="TH SarabunIT๙" w:hAnsi="TH SarabunIT๙" w:cs="TH SarabunIT๙"/>
-                <w:color w:val="EE0000"/>
-                <w:sz w:val="32"/>
-                <w:szCs w:val="32"/>
-              </w:rPr>
-            </w:pPr>
-            <w:r>
-              <w:rPr>
-                <w:rFonts w:ascii="TH SarabunIT๙" w:eastAsia="Calibri" w:hAnsi="TH SarabunIT๙" w:cs="TH SarabunIT๙"/>
-                <w:color w:val="EE0000"/>
-                <w:sz w:val="32"/>
-                <w:szCs w:val="32"/>
+                <w:sz w:val="32"/>
+                <w:szCs w:val="32"/>
+              </w:rPr>
+            </w:pPr>
+            <w:r>
+              <w:rPr>
+                <w:rFonts w:ascii="TH SarabunIT๙" w:hAnsi="TH SarabunIT๙" w:cs="TH SarabunIT๙"/>
+                <w:sz w:val="32"/>
+                <w:szCs w:val="32"/>
+                <w:cs/>
               </w:rPr>
               <w:t>-</w:t>
             </w:r>
@@ -11295,17 +12034,17 @@
               <w:jc w:val="center"/>
               <w:rPr>
                 <w:rFonts w:ascii="TH SarabunIT๙" w:hAnsi="TH SarabunIT๙" w:cs="TH SarabunIT๙"/>
-                <w:color w:val="EE0000"/>
-                <w:sz w:val="32"/>
-                <w:szCs w:val="32"/>
-              </w:rPr>
-            </w:pPr>
-            <w:r>
-              <w:rPr>
-                <w:rFonts w:ascii="TH SarabunIT๙" w:eastAsia="Calibri" w:hAnsi="TH SarabunIT๙" w:cs="TH SarabunIT๙"/>
-                <w:color w:val="EE0000"/>
-                <w:sz w:val="32"/>
-                <w:szCs w:val="32"/>
+                <w:sz w:val="32"/>
+                <w:szCs w:val="32"/>
+                <w:cs/>
+              </w:rPr>
+            </w:pPr>
+            <w:r>
+              <w:rPr>
+                <w:rFonts w:ascii="TH SarabunIT๙" w:hAnsi="TH SarabunIT๙" w:cs="TH SarabunIT๙"/>
+                <w:sz w:val="32"/>
+                <w:szCs w:val="32"/>
+                <w:cs/>
               </w:rPr>
               <w:t>-</w:t>
             </w:r>
@@ -11318,21 +12057,22 @@
           <w:p>
             <w:pPr>
               <w:spacing w:after="200" w:line="276" w:lineRule="auto"/>
-              <w:rPr>
-                <w:rFonts w:ascii="TH SarabunIT๙" w:eastAsia="Calibri" w:hAnsi="TH SarabunIT๙" w:cs="TH SarabunIT๙"/>
-                <w:color w:val="EE0000"/>
-                <w:sz w:val="32"/>
-                <w:szCs w:val="32"/>
-              </w:rPr>
-            </w:pPr>
-            <w:r>
-              <w:rPr>
-                <w:rFonts w:ascii="TH SarabunIT๙" w:eastAsia="Calibri" w:hAnsi="TH SarabunIT๙" w:cs="TH SarabunIT๙"/>
-                <w:color w:val="EE0000"/>
-                <w:sz w:val="32"/>
-                <w:szCs w:val="32"/>
-              </w:rPr>
-              <w:t>10</w:t>
+              <w:jc w:val="center"/>
+              <w:rPr>
+                <w:rFonts w:ascii="TH SarabunIT๙" w:hAnsi="TH SarabunIT๙" w:cs="TH SarabunIT๙"/>
+                <w:sz w:val="32"/>
+                <w:szCs w:val="32"/>
+                <w:cs/>
+              </w:rPr>
+            </w:pPr>
+            <w:r>
+              <w:rPr>
+                <w:rFonts w:ascii="TH SarabunIT๙" w:hAnsi="TH SarabunIT๙" w:cs="TH SarabunIT๙"/>
+                <w:sz w:val="32"/>
+                <w:szCs w:val="32"/>
+                <w:cs/>
+              </w:rPr>
+              <w:t>๒๐ ชุด</w:t>
             </w:r>
           </w:p>
         </w:tc>
@@ -11353,7 +12093,7 @@
       </w:tr>
       <w:tr>
         <w:trPr>
-          <w:trHeight w:val="2044"/>
+          <w:trHeight w:val="739"/>
         </w:trPr>
         <w:tc>
           <w:tcPr>
@@ -11362,16 +12102,16 @@
           <w:p>
             <w:pPr>
               <w:spacing w:after="200" w:line="276" w:lineRule="auto"/>
-              <w:rPr>
-                <w:rFonts w:ascii="TH SarabunIT๙" w:eastAsia="Calibri" w:hAnsi="TH SarabunIT๙" w:cs="TH SarabunIT๙"/>
-                <w:sz w:val="32"/>
-                <w:szCs w:val="32"/>
-                <w:cs/>
-              </w:rPr>
-            </w:pPr>
-            <w:r>
-              <w:rPr>
-                <w:rFonts w:ascii="TH SarabunIT๙" w:eastAsia="Calibri" w:hAnsi="TH SarabunIT๙" w:cs="TH SarabunIT๙"/>
+              <w:jc w:val="center"/>
+              <w:rPr>
+                <w:rFonts w:ascii="TH SarabunIT๙" w:eastAsia="Calibri" w:hAnsi="TH SarabunIT๙" w:cs="TH SarabunIT๙"/>
+                <w:sz w:val="32"/>
+                <w:szCs w:val="32"/>
+              </w:rPr>
+            </w:pPr>
+            <w:r>
+              <w:rPr>
+                <w:rFonts w:ascii="TH SarabunIT๙" w:hAnsi="TH SarabunIT๙" w:cs="TH SarabunIT๙"/>
                 <w:sz w:val="32"/>
                 <w:szCs w:val="32"/>
                 <w:cs/>
@@ -11388,52 +12128,21 @@
             <w:pPr>
               <w:spacing w:after="200" w:line="276" w:lineRule="auto"/>
               <w:rPr>
-                <w:rFonts w:ascii="TH SarabunIT๙" w:eastAsia="Calibri" w:hAnsi="TH SarabunIT๙" w:cs="TH SarabunIT๙"/>
-                <w:color w:val="EE0000"/>
-                <w:sz w:val="32"/>
-                <w:szCs w:val="32"/>
-                <w:cs/>
-              </w:rPr>
-            </w:pPr>
-            <w:r>
-              <w:rPr>
-                <w:rFonts w:ascii="TH SarabunIT๙" w:eastAsia="Calibri" w:hAnsi="TH SarabunIT๙" w:cs="TH SarabunIT๙"/>
-                <w:color w:val="EE0000"/>
-                <w:sz w:val="32"/>
-                <w:szCs w:val="32"/>
-                <w:cs/>
-              </w:rPr>
-              <w:t xml:space="preserve">คอมพิวเตอร์ </w:t>
-            </w:r>
-            <w:r>
-              <w:rPr>
-                <w:rFonts w:ascii="TH SarabunIT๙" w:eastAsia="Calibri" w:hAnsi="TH SarabunIT๙" w:cs="TH SarabunIT๙"/>
-                <w:color w:val="EE0000"/>
-                <w:sz w:val="32"/>
-                <w:szCs w:val="32"/>
-                <w:cs/>
-              </w:rPr>
-              <w:br/>
-              <w:t>รุ่น</w:t>
-            </w:r>
-            <w:r>
-              <w:rPr>
-                <w:rFonts w:ascii="TH SarabunIT๙" w:eastAsia="Calibri" w:hAnsi="TH SarabunIT๙" w:cs="TH SarabunIT๙"/>
-                <w:color w:val="EE0000"/>
-                <w:sz w:val="32"/>
-                <w:szCs w:val="32"/>
-              </w:rPr>
-              <w:t xml:space="preserve"> HP EliteDesk 705 G2 SFF </w:t>
-            </w:r>
-            <w:r>
-              <w:rPr>
-                <w:rFonts w:ascii="TH SarabunIT๙" w:eastAsia="Calibri" w:hAnsi="TH SarabunIT๙" w:cs="TH SarabunIT๙"/>
-                <w:color w:val="EE0000"/>
-                <w:sz w:val="32"/>
-                <w:szCs w:val="32"/>
-                <w:cs/>
-              </w:rPr>
-              <w:t>พร้อมอุปกรณ์</w:t>
+                <w:rFonts w:ascii="TH SarabunIT๙" w:hAnsi="TH SarabunIT๙" w:cs="TH SarabunIT๙"/>
+                <w:sz w:val="32"/>
+                <w:szCs w:val="32"/>
+              </w:rPr>
+            </w:pPr>
+            <w:proofErr w:type="spellStart"/>
+            <w:proofErr w:type="spellEnd"/>
+            <w:r>
+              <w:rPr>
+                <w:rFonts w:ascii="TH SarabunIT๙" w:hAnsi="TH SarabunIT๙" w:cs="TH SarabunIT๙"/>
+                <w:sz w:val="32"/>
+                <w:szCs w:val="32"/>
+                <w:cs/>
+              </w:rPr>
+              <w:t>เครื่องพิมพ์ ยี่ห้อ Canon รุ่น G3010</w:t>
             </w:r>
           </w:p>
         </w:tc>
@@ -11445,30 +12154,20 @@
             <w:pPr>
               <w:spacing w:after="200" w:line="276" w:lineRule="auto"/>
               <w:rPr>
-                <w:rFonts w:ascii="TH SarabunIT๙" w:eastAsia="Calibri" w:hAnsi="TH SarabunIT๙" w:cs="TH SarabunIT๙"/>
-                <w:color w:val="EE0000"/>
-                <w:sz w:val="32"/>
-                <w:szCs w:val="32"/>
-              </w:rPr>
-            </w:pPr>
-            <w:r>
-              <w:rPr>
-                <w:rFonts w:ascii="TH SarabunIT๙" w:eastAsia="Calibri" w:hAnsi="TH SarabunIT๙" w:cs="TH SarabunIT๙"/>
-                <w:color w:val="EE0000"/>
-                <w:sz w:val="32"/>
-                <w:szCs w:val="32"/>
-                <w:cs/>
-              </w:rPr>
-              <w:t>ขบ</w:t>
-            </w:r>
-            <w:r>
-              <w:rPr>
-                <w:rFonts w:ascii="TH SarabunIT๙" w:eastAsia="Calibri" w:hAnsi="TH SarabunIT๙" w:cs="TH SarabunIT๙"/>
-                <w:color w:val="EE0000"/>
-                <w:sz w:val="32"/>
-                <w:szCs w:val="32"/>
-              </w:rPr>
-              <w:t>.325/001-200/2568</w:t>
+                <w:rFonts w:ascii="TH SarabunIT๙" w:hAnsi="TH SarabunIT๙" w:cs="TH SarabunIT๙"/>
+                <w:sz w:val="32"/>
+                <w:szCs w:val="32"/>
+                <w:cs/>
+              </w:rPr>
+            </w:pPr>
+            <w:r>
+              <w:rPr>
+                <w:rFonts w:ascii="TH SarabunIT๙" w:hAnsi="TH SarabunIT๙" w:cs="TH SarabunIT๙"/>
+                <w:sz w:val="32"/>
+                <w:szCs w:val="32"/>
+                <w:cs/>
+              </w:rPr>
+              <w:t>ขบ.326/001/2569</w:t>
             </w:r>
           </w:p>
         </w:tc>
@@ -11478,23 +12177,23 @@
           </w:tcPr>
           <w:p>
             <w:pPr>
+              <w:spacing w:after="200" w:line="276" w:lineRule="auto"/>
               <w:jc w:val="center"/>
               <w:rPr>
                 <w:rFonts w:ascii="TH SarabunIT๙" w:hAnsi="TH SarabunIT๙" w:cs="TH SarabunIT๙"/>
-                <w:color w:val="EE0000"/>
-                <w:sz w:val="32"/>
-                <w:szCs w:val="32"/>
+                <w:sz w:val="32"/>
+                <w:szCs w:val="32"/>
+                <w:cs/>
               </w:rPr>
             </w:pPr>
             <w:r>
               <w:rPr>
                 <w:rFonts w:ascii="TH SarabunIT๙" w:hAnsi="TH SarabunIT๙" w:cs="TH SarabunIT๙"/>
-                <w:color w:val="EE0000"/>
-                <w:sz w:val="32"/>
-                <w:szCs w:val="32"/>
-                <w:cs/>
-              </w:rPr>
-              <w:t>๒๐</w:t>
+                <w:sz w:val="32"/>
+                <w:szCs w:val="32"/>
+                <w:cs/>
+              </w:rPr>
+              <w:t>-</w:t>
             </w:r>
           </w:p>
         </w:tc>
@@ -11507,17 +12206,41 @@
               <w:jc w:val="center"/>
               <w:rPr>
                 <w:rFonts w:ascii="TH SarabunIT๙" w:hAnsi="TH SarabunIT๙" w:cs="TH SarabunIT๙"/>
-                <w:color w:val="EE0000"/>
-                <w:sz w:val="32"/>
-                <w:szCs w:val="32"/>
-              </w:rPr>
-            </w:pPr>
-            <w:r>
-              <w:rPr>
-                <w:rFonts w:ascii="TH SarabunIT๙" w:eastAsia="Calibri" w:hAnsi="TH SarabunIT๙" w:cs="TH SarabunIT๙"/>
-                <w:color w:val="EE0000"/>
-                <w:sz w:val="32"/>
-                <w:szCs w:val="32"/>
+                <w:sz w:val="32"/>
+                <w:szCs w:val="32"/>
+              </w:rPr>
+            </w:pPr>
+            <w:r>
+              <w:rPr>
+                <w:rFonts w:ascii="TH SarabunIT๙" w:hAnsi="TH SarabunIT๙" w:cs="TH SarabunIT๙"/>
+                <w:sz w:val="32"/>
+                <w:szCs w:val="32"/>
+                <w:cs/>
+              </w:rPr>
+              <w:t>๑ เครื่อง</w:t>
+            </w:r>
+          </w:p>
+        </w:tc>
+        <w:tc>
+          <w:tcPr>
+            <w:tcW w:w="511" w:type="pct"/>
+          </w:tcPr>
+          <w:p>
+            <w:pPr>
+              <w:jc w:val="center"/>
+              <w:rPr>
+                <w:rFonts w:ascii="TH SarabunIT๙" w:hAnsi="TH SarabunIT๙" w:cs="TH SarabunIT๙"/>
+                <w:sz w:val="32"/>
+                <w:szCs w:val="32"/>
+                <w:cs/>
+              </w:rPr>
+            </w:pPr>
+            <w:r>
+              <w:rPr>
+                <w:rFonts w:ascii="TH SarabunIT๙" w:hAnsi="TH SarabunIT๙" w:cs="TH SarabunIT๙"/>
+                <w:sz w:val="32"/>
+                <w:szCs w:val="32"/>
+                <w:cs/>
               </w:rPr>
               <w:t>-</w:t>
             </w:r>
@@ -11525,6 +12248,176 @@
         </w:tc>
         <w:tc>
           <w:tcPr>
+            <w:tcW w:w="488" w:type="pct"/>
+          </w:tcPr>
+          <w:p>
+            <w:pPr>
+              <w:spacing w:after="200" w:line="276" w:lineRule="auto"/>
+              <w:jc w:val="center"/>
+              <w:rPr>
+                <w:rFonts w:ascii="TH SarabunIT๙" w:hAnsi="TH SarabunIT๙" w:cs="TH SarabunIT๙"/>
+                <w:sz w:val="32"/>
+                <w:szCs w:val="32"/>
+                <w:cs/>
+              </w:rPr>
+            </w:pPr>
+            <w:r>
+              <w:rPr>
+                <w:rFonts w:ascii="TH SarabunIT๙" w:hAnsi="TH SarabunIT๙" w:cs="TH SarabunIT๙"/>
+                <w:sz w:val="32"/>
+                <w:szCs w:val="32"/>
+                <w:cs/>
+              </w:rPr>
+              <w:t>๑ เครื่อง</w:t>
+            </w:r>
+          </w:p>
+        </w:tc>
+        <w:tc>
+          <w:tcPr>
+            <w:tcW w:w="469" w:type="pct"/>
+          </w:tcPr>
+          <w:p>
+            <w:pPr>
+              <w:rPr>
+                <w:rFonts w:ascii="TH SarabunIT๙" w:eastAsia="Calibri" w:hAnsi="TH SarabunIT๙" w:cs="TH SarabunIT๙"/>
+                <w:sz w:val="32"/>
+                <w:szCs w:val="32"/>
+              </w:rPr>
+            </w:pPr>
+          </w:p>
+        </w:tc>
+      </w:tr>
+      <w:tr>
+        <w:trPr>
+          <w:trHeight w:val="739"/>
+        </w:trPr>
+        <w:tc>
+          <w:tcPr>
+            <w:tcW w:w="387" w:type="pct"/>
+          </w:tcPr>
+          <w:p>
+            <w:pPr>
+              <w:spacing w:after="200" w:line="276" w:lineRule="auto"/>
+              <w:jc w:val="center"/>
+              <w:rPr>
+                <w:rFonts w:ascii="TH SarabunIT๙" w:eastAsia="Calibri" w:hAnsi="TH SarabunIT๙" w:cs="TH SarabunIT๙"/>
+                <w:sz w:val="32"/>
+                <w:szCs w:val="32"/>
+              </w:rPr>
+            </w:pPr>
+            <w:r>
+              <w:rPr>
+                <w:rFonts w:ascii="TH SarabunIT๙" w:hAnsi="TH SarabunIT๙" w:cs="TH SarabunIT๙"/>
+                <w:sz w:val="32"/>
+                <w:szCs w:val="32"/>
+                <w:cs/>
+              </w:rPr>
+              <w:t>๓</w:t>
+            </w:r>
+          </w:p>
+        </w:tc>
+        <w:tc>
+          <w:tcPr>
+            <w:tcW w:w="992" w:type="pct"/>
+          </w:tcPr>
+          <w:p>
+            <w:pPr>
+              <w:spacing w:after="200" w:line="276" w:lineRule="auto"/>
+              <w:rPr>
+                <w:rFonts w:ascii="TH SarabunIT๙" w:hAnsi="TH SarabunIT๙" w:cs="TH SarabunIT๙" w:hint="cs"/>
+                <w:sz w:val="32"/>
+                <w:szCs w:val="32"/>
+                <w:cs/>
+              </w:rPr>
+            </w:pPr>
+            <w:r>
+              <w:rPr>
+                <w:rFonts w:ascii="TH SarabunIT๙" w:hAnsi="TH SarabunIT๙" w:cs="TH SarabunIT๙"/>
+                <w:sz w:val="32"/>
+                <w:szCs w:val="32"/>
+                <w:cs/>
+              </w:rPr>
+              <w:t>โทรทัศน์ (TV) จอแบน ยี่ห้อ Sharp</w:t>
+            </w:r>
+          </w:p>
+        </w:tc>
+        <w:tc>
+          <w:tcPr>
+            <w:tcW w:w="983" w:type="pct"/>
+          </w:tcPr>
+          <w:p>
+            <w:pPr>
+              <w:spacing w:after="200" w:line="276" w:lineRule="auto"/>
+              <w:rPr>
+                <w:rFonts w:ascii="TH SarabunIT๙" w:hAnsi="TH SarabunIT๙" w:cs="TH SarabunIT๙" w:hint="cs"/>
+                <w:sz w:val="32"/>
+                <w:szCs w:val="32"/>
+                <w:cs/>
+              </w:rPr>
+            </w:pPr>
+            <w:r>
+              <w:rPr>
+                <w:rFonts w:ascii="TH SarabunIT๙" w:hAnsi="TH SarabunIT๙" w:cs="TH SarabunIT๙"/>
+                <w:sz w:val="32"/>
+                <w:szCs w:val="32"/>
+                <w:cs/>
+              </w:rPr>
+              <w:t>ขบ.327/001-002/2569</w:t>
+            </w:r>
+          </w:p>
+        </w:tc>
+        <w:tc>
+          <w:tcPr>
+            <w:tcW w:w="696" w:type="pct"/>
+          </w:tcPr>
+          <w:p>
+            <w:pPr>
+              <w:spacing w:after="200" w:line="276" w:lineRule="auto"/>
+              <w:jc w:val="center"/>
+              <w:rPr>
+                <w:rFonts w:ascii="TH SarabunIT๙" w:hAnsi="TH SarabunIT๙" w:cs="TH SarabunIT๙"/>
+                <w:sz w:val="32"/>
+                <w:szCs w:val="32"/>
+                <w:cs/>
+              </w:rPr>
+            </w:pPr>
+            <w:r>
+              <w:rPr>
+                <w:rFonts w:ascii="TH SarabunIT๙" w:hAnsi="TH SarabunIT๙" w:cs="TH SarabunIT๙"/>
+                <w:sz w:val="32"/>
+                <w:szCs w:val="32"/>
+                <w:cs/>
+              </w:rPr>
+              <w:t>-</w:t>
+            </w:r>
+          </w:p>
+        </w:tc>
+        <w:tc>
+          <w:tcPr>
+            <w:tcW w:w="474" w:type="pct"/>
+          </w:tcPr>
+          <w:p>
+            <w:pPr>
+              <w:jc w:val="center"/>
+              <w:rPr>
+                <w:rFonts w:ascii="TH SarabunIT๙" w:hAnsi="TH SarabunIT๙" w:cs="TH SarabunIT๙"/>
+                <w:sz w:val="32"/>
+                <w:szCs w:val="32"/>
+              </w:rPr>
+            </w:pPr>
+            <w:r>
+              <w:rPr>
+                <w:rFonts w:ascii="TH SarabunIT๙" w:hAnsi="TH SarabunIT๙" w:cs="TH SarabunIT๙"/>
+                <w:sz w:val="32"/>
+                <w:szCs w:val="32"/>
+                <w:cs/>
+              </w:rPr>
+              <w:t>๒ เครื่อง</w:t>
+            </w:r>
+          </w:p>
+        </w:tc>
+        <w:tc>
+          <w:tcPr>
             <w:tcW w:w="511" w:type="pct"/>
           </w:tcPr>
           <w:p>
@@ -11532,17 +12425,17 @@
               <w:jc w:val="center"/>
               <w:rPr>
                 <w:rFonts w:ascii="TH SarabunIT๙" w:hAnsi="TH SarabunIT๙" w:cs="TH SarabunIT๙"/>
-                <w:color w:val="EE0000"/>
-                <w:sz w:val="32"/>
-                <w:szCs w:val="32"/>
-              </w:rPr>
-            </w:pPr>
-            <w:r>
-              <w:rPr>
-                <w:rFonts w:ascii="TH SarabunIT๙" w:eastAsia="Calibri" w:hAnsi="TH SarabunIT๙" w:cs="TH SarabunIT๙"/>
-                <w:color w:val="EE0000"/>
-                <w:sz w:val="32"/>
-                <w:szCs w:val="32"/>
+                <w:sz w:val="32"/>
+                <w:szCs w:val="32"/>
+                <w:cs/>
+              </w:rPr>
+            </w:pPr>
+            <w:r>
+              <w:rPr>
+                <w:rFonts w:ascii="TH SarabunIT๙" w:hAnsi="TH SarabunIT๙" w:cs="TH SarabunIT๙"/>
+                <w:sz w:val="32"/>
+                <w:szCs w:val="32"/>
+                <w:cs/>
               </w:rPr>
               <w:t>-</w:t>
             </w:r>
@@ -11554,22 +12447,1779 @@
           </w:tcPr>
           <w:p>
             <w:pPr>
+              <w:spacing w:after="200" w:line="276" w:lineRule="auto"/>
+              <w:jc w:val="center"/>
               <w:rPr>
                 <w:rFonts w:ascii="TH SarabunIT๙" w:hAnsi="TH SarabunIT๙" w:cs="TH SarabunIT๙"/>
-                <w:color w:val="EE0000"/>
-                <w:sz w:val="32"/>
-                <w:szCs w:val="32"/>
+                <w:sz w:val="32"/>
+                <w:szCs w:val="32"/>
+                <w:cs/>
               </w:rPr>
             </w:pPr>
             <w:r>
               <w:rPr>
                 <w:rFonts w:ascii="TH SarabunIT๙" w:hAnsi="TH SarabunIT๙" w:cs="TH SarabunIT๙"/>
-                <w:color w:val="EE0000"/>
-                <w:sz w:val="32"/>
-                <w:szCs w:val="32"/>
-                <w:cs/>
-              </w:rPr>
-              <w:t>๒๐</w:t>
+                <w:sz w:val="32"/>
+                <w:szCs w:val="32"/>
+                <w:cs/>
+              </w:rPr>
+              <w:t>๒ เครื่อง</w:t>
+            </w:r>
+          </w:p>
+        </w:tc>
+        <w:tc>
+          <w:tcPr>
+            <w:tcW w:w="469" w:type="pct"/>
+          </w:tcPr>
+          <w:p>
+            <w:pPr>
+              <w:rPr>
+                <w:rFonts w:ascii="TH SarabunIT๙" w:eastAsia="Calibri" w:hAnsi="TH SarabunIT๙" w:cs="TH SarabunIT๙"/>
+                <w:sz w:val="32"/>
+                <w:szCs w:val="32"/>
+              </w:rPr>
+            </w:pPr>
+          </w:p>
+        </w:tc>
+      </w:tr>
+      <w:tr>
+        <w:trPr>
+          <w:trHeight w:val="739"/>
+        </w:trPr>
+        <w:tc>
+          <w:tcPr>
+            <w:tcW w:w="387" w:type="pct"/>
+          </w:tcPr>
+          <w:p>
+            <w:pPr>
+              <w:spacing w:after="200" w:line="276" w:lineRule="auto"/>
+              <w:jc w:val="center"/>
+              <w:rPr>
+                <w:rFonts w:ascii="TH SarabunIT๙" w:eastAsia="Calibri" w:hAnsi="TH SarabunIT๙" w:cs="TH SarabunIT๙"/>
+                <w:sz w:val="32"/>
+                <w:szCs w:val="32"/>
+              </w:rPr>
+            </w:pPr>
+            <w:r>
+              <w:rPr>
+                <w:rFonts w:ascii="TH SarabunIT๙" w:hAnsi="TH SarabunIT๙" w:cs="TH SarabunIT๙"/>
+                <w:sz w:val="32"/>
+                <w:szCs w:val="32"/>
+                <w:cs/>
+              </w:rPr>
+              <w:t>๔</w:t>
+            </w:r>
+          </w:p>
+        </w:tc>
+        <w:tc>
+          <w:tcPr>
+            <w:tcW w:w="992" w:type="pct"/>
+          </w:tcPr>
+          <w:p>
+            <w:pPr>
+              <w:spacing w:after="200" w:line="276" w:lineRule="auto"/>
+              <w:rPr>
+                <w:rFonts w:ascii="TH SarabunIT๙" w:hAnsi="TH SarabunIT๙" w:cs="TH SarabunIT๙" w:hint="cs"/>
+                <w:sz w:val="32"/>
+                <w:szCs w:val="32"/>
+                <w:cs/>
+              </w:rPr>
+            </w:pPr>
+            <w:r>
+              <w:rPr>
+                <w:rFonts w:ascii="TH SarabunIT๙" w:hAnsi="TH SarabunIT๙" w:cs="TH SarabunIT๙"/>
+                <w:sz w:val="32"/>
+                <w:szCs w:val="32"/>
+                <w:cs/>
+              </w:rPr>
+              <w:t>โต๊ะเรียน</w:t>
+            </w:r>
+          </w:p>
+        </w:tc>
+        <w:tc>
+          <w:tcPr>
+            <w:tcW w:w="983" w:type="pct"/>
+          </w:tcPr>
+          <w:p>
+            <w:pPr>
+              <w:spacing w:after="200" w:line="276" w:lineRule="auto"/>
+              <w:rPr>
+                <w:rFonts w:ascii="TH SarabunIT๙" w:hAnsi="TH SarabunIT๙" w:cs="TH SarabunIT๙"/>
+                <w:sz w:val="32"/>
+                <w:szCs w:val="32"/>
+                <w:cs/>
+              </w:rPr>
+            </w:pPr>
+            <w:r>
+              <w:rPr>
+                <w:rFonts w:ascii="TH SarabunIT๙" w:hAnsi="TH SarabunIT๙" w:cs="TH SarabunIT๙"/>
+                <w:sz w:val="32"/>
+                <w:szCs w:val="32"/>
+                <w:cs/>
+              </w:rPr>
+              <w:t>ขบ.328/001-010/2569</w:t>
+            </w:r>
+          </w:p>
+        </w:tc>
+        <w:tc>
+          <w:tcPr>
+            <w:tcW w:w="696" w:type="pct"/>
+          </w:tcPr>
+          <w:p>
+            <w:pPr>
+              <w:spacing w:after="200" w:line="276" w:lineRule="auto"/>
+              <w:jc w:val="center"/>
+              <w:rPr>
+                <w:rFonts w:ascii="TH SarabunIT๙" w:hAnsi="TH SarabunIT๙" w:cs="TH SarabunIT๙"/>
+                <w:sz w:val="32"/>
+                <w:szCs w:val="32"/>
+                <w:cs/>
+              </w:rPr>
+            </w:pPr>
+            <w:r>
+              <w:rPr>
+                <w:rFonts w:ascii="TH SarabunIT๙" w:hAnsi="TH SarabunIT๙" w:cs="TH SarabunIT๙"/>
+                <w:sz w:val="32"/>
+                <w:szCs w:val="32"/>
+                <w:cs/>
+              </w:rPr>
+              <w:t>-</w:t>
+            </w:r>
+          </w:p>
+        </w:tc>
+        <w:tc>
+          <w:tcPr>
+            <w:tcW w:w="474" w:type="pct"/>
+          </w:tcPr>
+          <w:p>
+            <w:pPr>
+              <w:jc w:val="center"/>
+              <w:rPr>
+                <w:rFonts w:ascii="TH SarabunIT๙" w:hAnsi="TH SarabunIT๙" w:cs="TH SarabunIT๙"/>
+                <w:sz w:val="32"/>
+                <w:szCs w:val="32"/>
+              </w:rPr>
+            </w:pPr>
+            <w:r>
+              <w:rPr>
+                <w:rFonts w:ascii="TH SarabunIT๙" w:hAnsi="TH SarabunIT๙" w:cs="TH SarabunIT๙"/>
+                <w:sz w:val="32"/>
+                <w:szCs w:val="32"/>
+                <w:cs/>
+              </w:rPr>
+              <w:t>๑๐ ชุด</w:t>
+            </w:r>
+          </w:p>
+        </w:tc>
+        <w:tc>
+          <w:tcPr>
+            <w:tcW w:w="511" w:type="pct"/>
+          </w:tcPr>
+          <w:p>
+            <w:pPr>
+              <w:jc w:val="center"/>
+              <w:rPr>
+                <w:rFonts w:ascii="TH SarabunIT๙" w:hAnsi="TH SarabunIT๙" w:cs="TH SarabunIT๙"/>
+                <w:sz w:val="32"/>
+                <w:szCs w:val="32"/>
+                <w:cs/>
+              </w:rPr>
+            </w:pPr>
+            <w:r>
+              <w:rPr>
+                <w:rFonts w:ascii="TH SarabunIT๙" w:hAnsi="TH SarabunIT๙" w:cs="TH SarabunIT๙"/>
+                <w:sz w:val="32"/>
+                <w:szCs w:val="32"/>
+                <w:cs/>
+              </w:rPr>
+              <w:t>-</w:t>
+            </w:r>
+          </w:p>
+        </w:tc>
+        <w:tc>
+          <w:tcPr>
+            <w:tcW w:w="488" w:type="pct"/>
+          </w:tcPr>
+          <w:p>
+            <w:pPr>
+              <w:spacing w:after="200" w:line="276" w:lineRule="auto"/>
+              <w:jc w:val="center"/>
+              <w:rPr>
+                <w:rFonts w:ascii="TH SarabunIT๙" w:hAnsi="TH SarabunIT๙" w:cs="TH SarabunIT๙"/>
+                <w:sz w:val="32"/>
+                <w:szCs w:val="32"/>
+                <w:cs/>
+              </w:rPr>
+            </w:pPr>
+            <w:r>
+              <w:rPr>
+                <w:rFonts w:ascii="TH SarabunIT๙" w:hAnsi="TH SarabunIT๙" w:cs="TH SarabunIT๙"/>
+                <w:sz w:val="32"/>
+                <w:szCs w:val="32"/>
+                <w:cs/>
+              </w:rPr>
+              <w:t>๑๐ ชุด</w:t>
+            </w:r>
+          </w:p>
+        </w:tc>
+        <w:tc>
+          <w:tcPr>
+            <w:tcW w:w="469" w:type="pct"/>
+          </w:tcPr>
+          <w:p>
+            <w:pPr>
+              <w:rPr>
+                <w:rFonts w:ascii="TH SarabunIT๙" w:eastAsia="Calibri" w:hAnsi="TH SarabunIT๙" w:cs="TH SarabunIT๙"/>
+                <w:sz w:val="32"/>
+                <w:szCs w:val="32"/>
+              </w:rPr>
+            </w:pPr>
+          </w:p>
+        </w:tc>
+      </w:tr>
+      <w:tr>
+        <w:trPr>
+          <w:trHeight w:val="739"/>
+        </w:trPr>
+        <w:tc>
+          <w:tcPr>
+            <w:tcW w:w="387" w:type="pct"/>
+          </w:tcPr>
+          <w:p>
+            <w:pPr>
+              <w:spacing w:after="200" w:line="276" w:lineRule="auto"/>
+              <w:jc w:val="center"/>
+              <w:rPr>
+                <w:rFonts w:ascii="TH SarabunIT๙" w:eastAsia="Calibri" w:hAnsi="TH SarabunIT๙" w:cs="TH SarabunIT๙"/>
+                <w:sz w:val="32"/>
+                <w:szCs w:val="32"/>
+              </w:rPr>
+            </w:pPr>
+            <w:r>
+              <w:rPr>
+                <w:rFonts w:ascii="TH SarabunIT๙" w:hAnsi="TH SarabunIT๙" w:cs="TH SarabunIT๙"/>
+                <w:sz w:val="32"/>
+                <w:szCs w:val="32"/>
+                <w:cs/>
+              </w:rPr>
+              <w:t>๕</w:t>
+            </w:r>
+          </w:p>
+        </w:tc>
+        <w:tc>
+          <w:tcPr>
+            <w:tcW w:w="992" w:type="pct"/>
+          </w:tcPr>
+          <w:p>
+            <w:pPr>
+              <w:spacing w:after="200" w:line="276" w:lineRule="auto"/>
+              <w:rPr>
+                <w:rFonts w:ascii="TH SarabunIT๙" w:hAnsi="TH SarabunIT๙" w:cs="TH SarabunIT๙" w:hint="cs"/>
+                <w:sz w:val="32"/>
+                <w:szCs w:val="32"/>
+                <w:cs/>
+              </w:rPr>
+            </w:pPr>
+            <w:r>
+              <w:rPr>
+                <w:rFonts w:ascii="TH SarabunIT๙" w:hAnsi="TH SarabunIT๙" w:cs="TH SarabunIT๙"/>
+                <w:sz w:val="32"/>
+                <w:szCs w:val="32"/>
+                <w:cs/>
+              </w:rPr>
+              <w:t>ตู้เหล็กบานเปิดสองบาน</w:t>
+            </w:r>
+          </w:p>
+        </w:tc>
+        <w:tc>
+          <w:tcPr>
+            <w:tcW w:w="983" w:type="pct"/>
+          </w:tcPr>
+          <w:p>
+            <w:pPr>
+              <w:spacing w:after="200" w:line="276" w:lineRule="auto"/>
+              <w:rPr>
+                <w:rFonts w:ascii="TH SarabunIT๙" w:hAnsi="TH SarabunIT๙" w:cs="TH SarabunIT๙"/>
+                <w:sz w:val="32"/>
+                <w:szCs w:val="32"/>
+                <w:cs/>
+              </w:rPr>
+            </w:pPr>
+            <w:r>
+              <w:rPr>
+                <w:rFonts w:ascii="TH SarabunIT๙" w:hAnsi="TH SarabunIT๙" w:cs="TH SarabunIT๙"/>
+                <w:sz w:val="32"/>
+                <w:szCs w:val="32"/>
+                <w:cs/>
+              </w:rPr>
+              <w:t>ขบ.329/001/2569</w:t>
+            </w:r>
+          </w:p>
+        </w:tc>
+        <w:tc>
+          <w:tcPr>
+            <w:tcW w:w="696" w:type="pct"/>
+          </w:tcPr>
+          <w:p>
+            <w:pPr>
+              <w:spacing w:after="200" w:line="276" w:lineRule="auto"/>
+              <w:jc w:val="center"/>
+              <w:rPr>
+                <w:rFonts w:ascii="TH SarabunIT๙" w:hAnsi="TH SarabunIT๙" w:cs="TH SarabunIT๙"/>
+                <w:sz w:val="32"/>
+                <w:szCs w:val="32"/>
+                <w:cs/>
+              </w:rPr>
+            </w:pPr>
+            <w:r>
+              <w:rPr>
+                <w:rFonts w:ascii="TH SarabunIT๙" w:hAnsi="TH SarabunIT๙" w:cs="TH SarabunIT๙"/>
+                <w:sz w:val="32"/>
+                <w:szCs w:val="32"/>
+                <w:cs/>
+              </w:rPr>
+              <w:t>-</w:t>
+            </w:r>
+          </w:p>
+        </w:tc>
+        <w:tc>
+          <w:tcPr>
+            <w:tcW w:w="474" w:type="pct"/>
+          </w:tcPr>
+          <w:p>
+            <w:pPr>
+              <w:jc w:val="center"/>
+              <w:rPr>
+                <w:rFonts w:ascii="TH SarabunIT๙" w:hAnsi="TH SarabunIT๙" w:cs="TH SarabunIT๙"/>
+                <w:sz w:val="32"/>
+                <w:szCs w:val="32"/>
+              </w:rPr>
+            </w:pPr>
+            <w:r>
+              <w:rPr>
+                <w:rFonts w:ascii="TH SarabunIT๙" w:hAnsi="TH SarabunIT๙" w:cs="TH SarabunIT๙"/>
+                <w:sz w:val="32"/>
+                <w:szCs w:val="32"/>
+                <w:cs/>
+              </w:rPr>
+              <w:t>๑ ตู้</w:t>
+            </w:r>
+          </w:p>
+        </w:tc>
+        <w:tc>
+          <w:tcPr>
+            <w:tcW w:w="511" w:type="pct"/>
+          </w:tcPr>
+          <w:p>
+            <w:pPr>
+              <w:jc w:val="center"/>
+              <w:rPr>
+                <w:rFonts w:ascii="TH SarabunIT๙" w:hAnsi="TH SarabunIT๙" w:cs="TH SarabunIT๙"/>
+                <w:sz w:val="32"/>
+                <w:szCs w:val="32"/>
+                <w:cs/>
+              </w:rPr>
+            </w:pPr>
+            <w:r>
+              <w:rPr>
+                <w:rFonts w:ascii="TH SarabunIT๙" w:hAnsi="TH SarabunIT๙" w:cs="TH SarabunIT๙"/>
+                <w:sz w:val="32"/>
+                <w:szCs w:val="32"/>
+                <w:cs/>
+              </w:rPr>
+              <w:t>-</w:t>
+            </w:r>
+          </w:p>
+        </w:tc>
+        <w:tc>
+          <w:tcPr>
+            <w:tcW w:w="488" w:type="pct"/>
+          </w:tcPr>
+          <w:p>
+            <w:pPr>
+              <w:spacing w:after="200" w:line="276" w:lineRule="auto"/>
+              <w:jc w:val="center"/>
+              <w:rPr>
+                <w:rFonts w:ascii="TH SarabunIT๙" w:hAnsi="TH SarabunIT๙" w:cs="TH SarabunIT๙"/>
+                <w:sz w:val="32"/>
+                <w:szCs w:val="32"/>
+                <w:cs/>
+              </w:rPr>
+            </w:pPr>
+            <w:r>
+              <w:rPr>
+                <w:rFonts w:ascii="TH SarabunIT๙" w:hAnsi="TH SarabunIT๙" w:cs="TH SarabunIT๙"/>
+                <w:sz w:val="32"/>
+                <w:szCs w:val="32"/>
+                <w:cs/>
+              </w:rPr>
+              <w:t>๑ ตู้</w:t>
+            </w:r>
+          </w:p>
+        </w:tc>
+        <w:tc>
+          <w:tcPr>
+            <w:tcW w:w="469" w:type="pct"/>
+          </w:tcPr>
+          <w:p>
+            <w:pPr>
+              <w:rPr>
+                <w:rFonts w:ascii="TH SarabunIT๙" w:eastAsia="Calibri" w:hAnsi="TH SarabunIT๙" w:cs="TH SarabunIT๙"/>
+                <w:sz w:val="32"/>
+                <w:szCs w:val="32"/>
+              </w:rPr>
+            </w:pPr>
+          </w:p>
+        </w:tc>
+      </w:tr>
+      <w:tr>
+        <w:trPr>
+          <w:trHeight w:val="739"/>
+        </w:trPr>
+        <w:tc>
+          <w:tcPr>
+            <w:tcW w:w="387" w:type="pct"/>
+          </w:tcPr>
+          <w:p>
+            <w:pPr>
+              <w:spacing w:after="200" w:line="276" w:lineRule="auto"/>
+              <w:jc w:val="center"/>
+              <w:rPr>
+                <w:rFonts w:ascii="TH SarabunIT๙" w:eastAsia="Calibri" w:hAnsi="TH SarabunIT๙" w:cs="TH SarabunIT๙"/>
+                <w:sz w:val="32"/>
+                <w:szCs w:val="32"/>
+              </w:rPr>
+            </w:pPr>
+            <w:r>
+              <w:rPr>
+                <w:rFonts w:ascii="TH SarabunIT๙" w:hAnsi="TH SarabunIT๙" w:cs="TH SarabunIT๙"/>
+                <w:sz w:val="32"/>
+                <w:szCs w:val="32"/>
+                <w:cs/>
+              </w:rPr>
+              <w:t>๖</w:t>
+            </w:r>
+          </w:p>
+        </w:tc>
+        <w:tc>
+          <w:tcPr>
+            <w:tcW w:w="992" w:type="pct"/>
+          </w:tcPr>
+          <w:p>
+            <w:pPr>
+              <w:spacing w:after="200" w:line="276" w:lineRule="auto"/>
+              <w:rPr>
+                <w:rFonts w:ascii="TH SarabunIT๙" w:hAnsi="TH SarabunIT๙" w:cs="TH SarabunIT๙" w:hint="cs"/>
+                <w:sz w:val="32"/>
+                <w:szCs w:val="32"/>
+                <w:cs/>
+              </w:rPr>
+            </w:pPr>
+            <w:proofErr w:type="spellStart"/>
+            <w:proofErr w:type="spellEnd"/>
+            <w:r>
+              <w:rPr>
+                <w:rFonts w:ascii="TH SarabunIT๙" w:hAnsi="TH SarabunIT๙" w:cs="TH SarabunIT๙"/>
+                <w:sz w:val="32"/>
+                <w:szCs w:val="32"/>
+                <w:cs/>
+              </w:rPr>
+              <w:t>ตู้ล็อกเกอร์ ๓ ชั้น</w:t>
+            </w:r>
+          </w:p>
+        </w:tc>
+        <w:tc>
+          <w:tcPr>
+            <w:tcW w:w="983" w:type="pct"/>
+          </w:tcPr>
+          <w:p>
+            <w:pPr>
+              <w:spacing w:after="200" w:line="276" w:lineRule="auto"/>
+              <w:rPr>
+                <w:rFonts w:ascii="TH SarabunIT๙" w:hAnsi="TH SarabunIT๙" w:cs="TH SarabunIT๙"/>
+                <w:sz w:val="32"/>
+                <w:szCs w:val="32"/>
+                <w:cs/>
+              </w:rPr>
+            </w:pPr>
+            <w:r>
+              <w:rPr>
+                <w:rFonts w:ascii="TH SarabunIT๙" w:hAnsi="TH SarabunIT๙" w:cs="TH SarabunIT๙"/>
+                <w:sz w:val="32"/>
+                <w:szCs w:val="32"/>
+                <w:cs/>
+              </w:rPr>
+              <w:t>ขบ.330/001-008/2569</w:t>
+            </w:r>
+          </w:p>
+        </w:tc>
+        <w:tc>
+          <w:tcPr>
+            <w:tcW w:w="696" w:type="pct"/>
+          </w:tcPr>
+          <w:p>
+            <w:pPr>
+              <w:spacing w:after="200" w:line="276" w:lineRule="auto"/>
+              <w:jc w:val="center"/>
+              <w:rPr>
+                <w:rFonts w:ascii="TH SarabunIT๙" w:hAnsi="TH SarabunIT๙" w:cs="TH SarabunIT๙"/>
+                <w:sz w:val="32"/>
+                <w:szCs w:val="32"/>
+                <w:cs/>
+              </w:rPr>
+            </w:pPr>
+            <w:r>
+              <w:rPr>
+                <w:rFonts w:ascii="TH SarabunIT๙" w:hAnsi="TH SarabunIT๙" w:cs="TH SarabunIT๙"/>
+                <w:sz w:val="32"/>
+                <w:szCs w:val="32"/>
+                <w:cs/>
+              </w:rPr>
+              <w:t>-</w:t>
+            </w:r>
+          </w:p>
+        </w:tc>
+        <w:tc>
+          <w:tcPr>
+            <w:tcW w:w="474" w:type="pct"/>
+          </w:tcPr>
+          <w:p>
+            <w:pPr>
+              <w:jc w:val="center"/>
+              <w:rPr>
+                <w:rFonts w:ascii="TH SarabunIT๙" w:hAnsi="TH SarabunIT๙" w:cs="TH SarabunIT๙"/>
+                <w:sz w:val="32"/>
+                <w:szCs w:val="32"/>
+              </w:rPr>
+            </w:pPr>
+            <w:r>
+              <w:rPr>
+                <w:rFonts w:ascii="TH SarabunIT๙" w:hAnsi="TH SarabunIT๙" w:cs="TH SarabunIT๙"/>
+                <w:sz w:val="32"/>
+                <w:szCs w:val="32"/>
+                <w:cs/>
+              </w:rPr>
+              <w:t>๘ อัน</w:t>
+            </w:r>
+          </w:p>
+        </w:tc>
+        <w:tc>
+          <w:tcPr>
+            <w:tcW w:w="511" w:type="pct"/>
+          </w:tcPr>
+          <w:p>
+            <w:pPr>
+              <w:jc w:val="center"/>
+              <w:rPr>
+                <w:rFonts w:ascii="TH SarabunIT๙" w:hAnsi="TH SarabunIT๙" w:cs="TH SarabunIT๙"/>
+                <w:sz w:val="32"/>
+                <w:szCs w:val="32"/>
+                <w:cs/>
+              </w:rPr>
+            </w:pPr>
+            <w:r>
+              <w:rPr>
+                <w:rFonts w:ascii="TH SarabunIT๙" w:hAnsi="TH SarabunIT๙" w:cs="TH SarabunIT๙"/>
+                <w:sz w:val="32"/>
+                <w:szCs w:val="32"/>
+                <w:cs/>
+              </w:rPr>
+              <w:t>-</w:t>
+            </w:r>
+          </w:p>
+        </w:tc>
+        <w:tc>
+          <w:tcPr>
+            <w:tcW w:w="488" w:type="pct"/>
+          </w:tcPr>
+          <w:p>
+            <w:pPr>
+              <w:spacing w:after="200" w:line="276" w:lineRule="auto"/>
+              <w:jc w:val="center"/>
+              <w:rPr>
+                <w:rFonts w:ascii="TH SarabunIT๙" w:hAnsi="TH SarabunIT๙" w:cs="TH SarabunIT๙"/>
+                <w:sz w:val="32"/>
+                <w:szCs w:val="32"/>
+                <w:cs/>
+              </w:rPr>
+            </w:pPr>
+            <w:r>
+              <w:rPr>
+                <w:rFonts w:ascii="TH SarabunIT๙" w:hAnsi="TH SarabunIT๙" w:cs="TH SarabunIT๙"/>
+                <w:sz w:val="32"/>
+                <w:szCs w:val="32"/>
+                <w:cs/>
+              </w:rPr>
+              <w:t>๘ อัน</w:t>
+            </w:r>
+          </w:p>
+        </w:tc>
+        <w:tc>
+          <w:tcPr>
+            <w:tcW w:w="469" w:type="pct"/>
+          </w:tcPr>
+          <w:p>
+            <w:pPr>
+              <w:rPr>
+                <w:rFonts w:ascii="TH SarabunIT๙" w:eastAsia="Calibri" w:hAnsi="TH SarabunIT๙" w:cs="TH SarabunIT๙"/>
+                <w:sz w:val="32"/>
+                <w:szCs w:val="32"/>
+              </w:rPr>
+            </w:pPr>
+          </w:p>
+        </w:tc>
+      </w:tr>
+      <w:tr>
+        <w:trPr>
+          <w:trHeight w:val="739"/>
+        </w:trPr>
+        <w:tc>
+          <w:tcPr>
+            <w:tcW w:w="387" w:type="pct"/>
+          </w:tcPr>
+          <w:p>
+            <w:pPr>
+              <w:spacing w:after="200" w:line="276" w:lineRule="auto"/>
+              <w:jc w:val="center"/>
+              <w:rPr>
+                <w:rFonts w:ascii="TH SarabunIT๙" w:eastAsia="Calibri" w:hAnsi="TH SarabunIT๙" w:cs="TH SarabunIT๙"/>
+                <w:sz w:val="32"/>
+                <w:szCs w:val="32"/>
+              </w:rPr>
+            </w:pPr>
+            <w:r>
+              <w:rPr>
+                <w:rFonts w:ascii="TH SarabunIT๙" w:hAnsi="TH SarabunIT๙" w:cs="TH SarabunIT๙"/>
+                <w:sz w:val="32"/>
+                <w:szCs w:val="32"/>
+                <w:cs/>
+              </w:rPr>
+              <w:t>๗</w:t>
+            </w:r>
+          </w:p>
+        </w:tc>
+        <w:tc>
+          <w:tcPr>
+            <w:tcW w:w="992" w:type="pct"/>
+          </w:tcPr>
+          <w:p>
+            <w:pPr>
+              <w:spacing w:after="200" w:line="276" w:lineRule="auto"/>
+              <w:rPr>
+                <w:rFonts w:ascii="TH SarabunIT๙" w:hAnsi="TH SarabunIT๙" w:cs="TH SarabunIT๙" w:hint="cs"/>
+                <w:sz w:val="32"/>
+                <w:szCs w:val="32"/>
+                <w:cs/>
+              </w:rPr>
+            </w:pPr>
+            <w:r>
+              <w:rPr>
+                <w:rFonts w:ascii="TH SarabunIT๙" w:hAnsi="TH SarabunIT๙" w:cs="TH SarabunIT๙"/>
+                <w:sz w:val="32"/>
+                <w:szCs w:val="32"/>
+                <w:cs/>
+              </w:rPr>
+              <w:t>ชั้นอเนกประสงค์ ๓ ช่องโล่ง</w:t>
+            </w:r>
+          </w:p>
+        </w:tc>
+        <w:tc>
+          <w:tcPr>
+            <w:tcW w:w="983" w:type="pct"/>
+          </w:tcPr>
+          <w:p>
+            <w:pPr>
+              <w:spacing w:after="200" w:line="276" w:lineRule="auto"/>
+              <w:rPr>
+                <w:rFonts w:ascii="TH SarabunIT๙" w:hAnsi="TH SarabunIT๙" w:cs="TH SarabunIT๙" w:hint="cs"/>
+                <w:sz w:val="32"/>
+                <w:szCs w:val="32"/>
+                <w:cs/>
+              </w:rPr>
+            </w:pPr>
+            <w:r>
+              <w:rPr>
+                <w:rFonts w:ascii="TH SarabunIT๙" w:hAnsi="TH SarabunIT๙" w:cs="TH SarabunIT๙"/>
+                <w:sz w:val="32"/>
+                <w:szCs w:val="32"/>
+                <w:cs/>
+              </w:rPr>
+              <w:t>ขบ.331/001-002/2569</w:t>
+            </w:r>
+          </w:p>
+        </w:tc>
+        <w:tc>
+          <w:tcPr>
+            <w:tcW w:w="696" w:type="pct"/>
+          </w:tcPr>
+          <w:p>
+            <w:pPr>
+              <w:spacing w:after="200" w:line="276" w:lineRule="auto"/>
+              <w:jc w:val="center"/>
+              <w:rPr>
+                <w:rFonts w:ascii="TH SarabunIT๙" w:hAnsi="TH SarabunIT๙" w:cs="TH SarabunIT๙"/>
+                <w:sz w:val="32"/>
+                <w:szCs w:val="32"/>
+                <w:cs/>
+              </w:rPr>
+            </w:pPr>
+            <w:r>
+              <w:rPr>
+                <w:rFonts w:ascii="TH SarabunIT๙" w:hAnsi="TH SarabunIT๙" w:cs="TH SarabunIT๙"/>
+                <w:sz w:val="32"/>
+                <w:szCs w:val="32"/>
+                <w:cs/>
+              </w:rPr>
+              <w:t>-</w:t>
+            </w:r>
+          </w:p>
+        </w:tc>
+        <w:tc>
+          <w:tcPr>
+            <w:tcW w:w="474" w:type="pct"/>
+          </w:tcPr>
+          <w:p>
+            <w:pPr>
+              <w:jc w:val="center"/>
+              <w:rPr>
+                <w:rFonts w:ascii="TH SarabunIT๙" w:hAnsi="TH SarabunIT๙" w:cs="TH SarabunIT๙"/>
+                <w:sz w:val="32"/>
+                <w:szCs w:val="32"/>
+              </w:rPr>
+            </w:pPr>
+            <w:r>
+              <w:rPr>
+                <w:rFonts w:ascii="TH SarabunIT๙" w:hAnsi="TH SarabunIT๙" w:cs="TH SarabunIT๙"/>
+                <w:sz w:val="32"/>
+                <w:szCs w:val="32"/>
+                <w:cs/>
+              </w:rPr>
+              <w:t>๒ อัน</w:t>
+            </w:r>
+          </w:p>
+        </w:tc>
+        <w:tc>
+          <w:tcPr>
+            <w:tcW w:w="511" w:type="pct"/>
+          </w:tcPr>
+          <w:p>
+            <w:pPr>
+              <w:jc w:val="center"/>
+              <w:rPr>
+                <w:rFonts w:ascii="TH SarabunIT๙" w:hAnsi="TH SarabunIT๙" w:cs="TH SarabunIT๙"/>
+                <w:sz w:val="32"/>
+                <w:szCs w:val="32"/>
+                <w:cs/>
+              </w:rPr>
+            </w:pPr>
+            <w:r>
+              <w:rPr>
+                <w:rFonts w:ascii="TH SarabunIT๙" w:hAnsi="TH SarabunIT๙" w:cs="TH SarabunIT๙"/>
+                <w:sz w:val="32"/>
+                <w:szCs w:val="32"/>
+                <w:cs/>
+              </w:rPr>
+              <w:t>-</w:t>
+            </w:r>
+          </w:p>
+        </w:tc>
+        <w:tc>
+          <w:tcPr>
+            <w:tcW w:w="488" w:type="pct"/>
+          </w:tcPr>
+          <w:p>
+            <w:pPr>
+              <w:spacing w:after="200" w:line="276" w:lineRule="auto"/>
+              <w:jc w:val="center"/>
+              <w:rPr>
+                <w:rFonts w:ascii="TH SarabunIT๙" w:hAnsi="TH SarabunIT๙" w:cs="TH SarabunIT๙"/>
+                <w:sz w:val="32"/>
+                <w:szCs w:val="32"/>
+                <w:cs/>
+              </w:rPr>
+            </w:pPr>
+            <w:r>
+              <w:rPr>
+                <w:rFonts w:ascii="TH SarabunIT๙" w:hAnsi="TH SarabunIT๙" w:cs="TH SarabunIT๙"/>
+                <w:sz w:val="32"/>
+                <w:szCs w:val="32"/>
+                <w:cs/>
+              </w:rPr>
+              <w:t>๒ อัน</w:t>
+            </w:r>
+          </w:p>
+        </w:tc>
+        <w:tc>
+          <w:tcPr>
+            <w:tcW w:w="469" w:type="pct"/>
+          </w:tcPr>
+          <w:p>
+            <w:pPr>
+              <w:rPr>
+                <w:rFonts w:ascii="TH SarabunIT๙" w:eastAsia="Calibri" w:hAnsi="TH SarabunIT๙" w:cs="TH SarabunIT๙"/>
+                <w:sz w:val="32"/>
+                <w:szCs w:val="32"/>
+              </w:rPr>
+            </w:pPr>
+          </w:p>
+        </w:tc>
+      </w:tr>
+      <w:tr>
+        <w:trPr>
+          <w:trHeight w:val="739"/>
+        </w:trPr>
+        <w:tc>
+          <w:tcPr>
+            <w:tcW w:w="387" w:type="pct"/>
+          </w:tcPr>
+          <w:p>
+            <w:pPr>
+              <w:spacing w:after="200" w:line="276" w:lineRule="auto"/>
+              <w:jc w:val="center"/>
+              <w:rPr>
+                <w:rFonts w:ascii="TH SarabunIT๙" w:eastAsia="Calibri" w:hAnsi="TH SarabunIT๙" w:cs="TH SarabunIT๙"/>
+                <w:sz w:val="32"/>
+                <w:szCs w:val="32"/>
+              </w:rPr>
+            </w:pPr>
+            <w:r>
+              <w:rPr>
+                <w:rFonts w:ascii="TH SarabunIT๙" w:hAnsi="TH SarabunIT๙" w:cs="TH SarabunIT๙"/>
+                <w:sz w:val="32"/>
+                <w:szCs w:val="32"/>
+                <w:cs/>
+              </w:rPr>
+              <w:t>๘</w:t>
+            </w:r>
+          </w:p>
+        </w:tc>
+        <w:tc>
+          <w:tcPr>
+            <w:tcW w:w="992" w:type="pct"/>
+          </w:tcPr>
+          <w:p>
+            <w:pPr>
+              <w:spacing w:after="200" w:line="276" w:lineRule="auto"/>
+              <w:rPr>
+                <w:rFonts w:ascii="TH SarabunIT๙" w:hAnsi="TH SarabunIT๙" w:cs="TH SarabunIT๙" w:hint="cs"/>
+                <w:sz w:val="32"/>
+                <w:szCs w:val="32"/>
+                <w:cs/>
+              </w:rPr>
+            </w:pPr>
+            <w:r>
+              <w:rPr>
+                <w:rFonts w:ascii="TH SarabunIT๙" w:hAnsi="TH SarabunIT๙" w:cs="TH SarabunIT๙"/>
+                <w:sz w:val="32"/>
+                <w:szCs w:val="32"/>
+                <w:cs/>
+              </w:rPr>
+              <w:t>พัดลมติดผนัง ยี่ห้อฮาตาริ ขนาด ๑๘ นิ้ว</w:t>
+            </w:r>
+          </w:p>
+        </w:tc>
+        <w:tc>
+          <w:tcPr>
+            <w:tcW w:w="983" w:type="pct"/>
+          </w:tcPr>
+          <w:p>
+            <w:pPr>
+              <w:spacing w:after="200" w:line="276" w:lineRule="auto"/>
+              <w:rPr>
+                <w:rFonts w:ascii="TH SarabunIT๙" w:hAnsi="TH SarabunIT๙" w:cs="TH SarabunIT๙" w:hint="cs"/>
+                <w:sz w:val="32"/>
+                <w:szCs w:val="32"/>
+                <w:cs/>
+              </w:rPr>
+            </w:pPr>
+            <w:r>
+              <w:rPr>
+                <w:rFonts w:ascii="TH SarabunIT๙" w:hAnsi="TH SarabunIT๙" w:cs="TH SarabunIT๙"/>
+                <w:sz w:val="32"/>
+                <w:szCs w:val="32"/>
+                <w:cs/>
+              </w:rPr>
+              <w:t>ขบ.332/001-012/2569</w:t>
+            </w:r>
+          </w:p>
+        </w:tc>
+        <w:tc>
+          <w:tcPr>
+            <w:tcW w:w="696" w:type="pct"/>
+          </w:tcPr>
+          <w:p>
+            <w:pPr>
+              <w:spacing w:after="200" w:line="276" w:lineRule="auto"/>
+              <w:jc w:val="center"/>
+              <w:rPr>
+                <w:rFonts w:ascii="TH SarabunIT๙" w:hAnsi="TH SarabunIT๙" w:cs="TH SarabunIT๙"/>
+                <w:sz w:val="32"/>
+                <w:szCs w:val="32"/>
+                <w:cs/>
+              </w:rPr>
+            </w:pPr>
+            <w:r>
+              <w:rPr>
+                <w:rFonts w:ascii="TH SarabunIT๙" w:hAnsi="TH SarabunIT๙" w:cs="TH SarabunIT๙"/>
+                <w:sz w:val="32"/>
+                <w:szCs w:val="32"/>
+                <w:cs/>
+              </w:rPr>
+              <w:t>-</w:t>
+            </w:r>
+          </w:p>
+        </w:tc>
+        <w:tc>
+          <w:tcPr>
+            <w:tcW w:w="474" w:type="pct"/>
+          </w:tcPr>
+          <w:p>
+            <w:pPr>
+              <w:jc w:val="center"/>
+              <w:rPr>
+                <w:rFonts w:ascii="TH SarabunIT๙" w:hAnsi="TH SarabunIT๙" w:cs="TH SarabunIT๙"/>
+                <w:sz w:val="32"/>
+                <w:szCs w:val="32"/>
+              </w:rPr>
+            </w:pPr>
+            <w:r>
+              <w:rPr>
+                <w:rFonts w:ascii="TH SarabunIT๙" w:hAnsi="TH SarabunIT๙" w:cs="TH SarabunIT๙"/>
+                <w:sz w:val="32"/>
+                <w:szCs w:val="32"/>
+                <w:cs/>
+              </w:rPr>
+              <w:t>๑๒ ตัว</w:t>
+            </w:r>
+          </w:p>
+        </w:tc>
+        <w:tc>
+          <w:tcPr>
+            <w:tcW w:w="511" w:type="pct"/>
+          </w:tcPr>
+          <w:p>
+            <w:pPr>
+              <w:jc w:val="center"/>
+              <w:rPr>
+                <w:rFonts w:ascii="TH SarabunIT๙" w:hAnsi="TH SarabunIT๙" w:cs="TH SarabunIT๙"/>
+                <w:sz w:val="32"/>
+                <w:szCs w:val="32"/>
+                <w:cs/>
+              </w:rPr>
+            </w:pPr>
+            <w:r>
+              <w:rPr>
+                <w:rFonts w:ascii="TH SarabunIT๙" w:hAnsi="TH SarabunIT๙" w:cs="TH SarabunIT๙"/>
+                <w:sz w:val="32"/>
+                <w:szCs w:val="32"/>
+                <w:cs/>
+              </w:rPr>
+              <w:t>-</w:t>
+            </w:r>
+          </w:p>
+        </w:tc>
+        <w:tc>
+          <w:tcPr>
+            <w:tcW w:w="488" w:type="pct"/>
+          </w:tcPr>
+          <w:p>
+            <w:pPr>
+              <w:spacing w:after="200" w:line="276" w:lineRule="auto"/>
+              <w:jc w:val="center"/>
+              <w:rPr>
+                <w:rFonts w:ascii="TH SarabunIT๙" w:hAnsi="TH SarabunIT๙" w:cs="TH SarabunIT๙"/>
+                <w:sz w:val="32"/>
+                <w:szCs w:val="32"/>
+                <w:cs/>
+              </w:rPr>
+            </w:pPr>
+            <w:r>
+              <w:rPr>
+                <w:rFonts w:ascii="TH SarabunIT๙" w:hAnsi="TH SarabunIT๙" w:cs="TH SarabunIT๙"/>
+                <w:sz w:val="32"/>
+                <w:szCs w:val="32"/>
+                <w:cs/>
+              </w:rPr>
+              <w:t>๑๒ ตัว</w:t>
+            </w:r>
+          </w:p>
+        </w:tc>
+        <w:tc>
+          <w:tcPr>
+            <w:tcW w:w="469" w:type="pct"/>
+          </w:tcPr>
+          <w:p>
+            <w:pPr>
+              <w:rPr>
+                <w:rFonts w:ascii="TH SarabunIT๙" w:eastAsia="Calibri" w:hAnsi="TH SarabunIT๙" w:cs="TH SarabunIT๙"/>
+                <w:sz w:val="32"/>
+                <w:szCs w:val="32"/>
+              </w:rPr>
+            </w:pPr>
+          </w:p>
+        </w:tc>
+      </w:tr>
+      <w:tr>
+        <w:trPr>
+          <w:trHeight w:val="739"/>
+        </w:trPr>
+        <w:tc>
+          <w:tcPr>
+            <w:tcW w:w="387" w:type="pct"/>
+          </w:tcPr>
+          <w:p>
+            <w:pPr>
+              <w:spacing w:after="200" w:line="276" w:lineRule="auto"/>
+              <w:jc w:val="center"/>
+              <w:rPr>
+                <w:rFonts w:ascii="TH SarabunIT๙" w:eastAsia="Calibri" w:hAnsi="TH SarabunIT๙" w:cs="TH SarabunIT๙"/>
+                <w:sz w:val="32"/>
+                <w:szCs w:val="32"/>
+              </w:rPr>
+            </w:pPr>
+            <w:r>
+              <w:rPr>
+                <w:rFonts w:ascii="TH SarabunIT๙" w:hAnsi="TH SarabunIT๙" w:cs="TH SarabunIT๙"/>
+                <w:sz w:val="32"/>
+                <w:szCs w:val="32"/>
+                <w:cs/>
+              </w:rPr>
+              <w:t>๙</w:t>
+            </w:r>
+          </w:p>
+        </w:tc>
+        <w:tc>
+          <w:tcPr>
+            <w:tcW w:w="992" w:type="pct"/>
+          </w:tcPr>
+          <w:p>
+            <w:pPr>
+              <w:spacing w:after="200" w:line="276" w:lineRule="auto"/>
+              <w:rPr>
+                <w:rFonts w:ascii="TH SarabunIT๙" w:hAnsi="TH SarabunIT๙" w:cs="TH SarabunIT๙"/>
+                <w:sz w:val="32"/>
+                <w:szCs w:val="32"/>
+              </w:rPr>
+            </w:pPr>
+            <w:r>
+              <w:rPr>
+                <w:rFonts w:ascii="TH SarabunIT๙" w:hAnsi="TH SarabunIT๙" w:cs="TH SarabunIT๙"/>
+                <w:sz w:val="32"/>
+                <w:szCs w:val="32"/>
+                <w:cs/>
+              </w:rPr>
+              <w:t>ชั้นวางอเนกประสงค์ ๓ ช่องโล่ง</w:t>
+            </w:r>
+          </w:p>
+        </w:tc>
+        <w:tc>
+          <w:tcPr>
+            <w:tcW w:w="983" w:type="pct"/>
+          </w:tcPr>
+          <w:p>
+            <w:pPr>
+              <w:spacing w:after="200" w:line="276" w:lineRule="auto"/>
+              <w:rPr>
+                <w:rFonts w:ascii="TH SarabunIT๙" w:hAnsi="TH SarabunIT๙" w:cs="TH SarabunIT๙" w:hint="cs"/>
+                <w:sz w:val="32"/>
+                <w:szCs w:val="32"/>
+                <w:cs/>
+              </w:rPr>
+            </w:pPr>
+            <w:r>
+              <w:rPr>
+                <w:rFonts w:ascii="TH SarabunIT๙" w:hAnsi="TH SarabunIT๙" w:cs="TH SarabunIT๙"/>
+                <w:sz w:val="32"/>
+                <w:szCs w:val="32"/>
+                <w:cs/>
+              </w:rPr>
+              <w:t>ขบ.333/001-006/2569</w:t>
+            </w:r>
+          </w:p>
+        </w:tc>
+        <w:tc>
+          <w:tcPr>
+            <w:tcW w:w="696" w:type="pct"/>
+          </w:tcPr>
+          <w:p>
+            <w:pPr>
+              <w:spacing w:after="200" w:line="276" w:lineRule="auto"/>
+              <w:jc w:val="center"/>
+              <w:rPr>
+                <w:rFonts w:ascii="TH SarabunIT๙" w:hAnsi="TH SarabunIT๙" w:cs="TH SarabunIT๙"/>
+                <w:sz w:val="32"/>
+                <w:szCs w:val="32"/>
+                <w:cs/>
+              </w:rPr>
+            </w:pPr>
+            <w:r>
+              <w:rPr>
+                <w:rFonts w:ascii="TH SarabunIT๙" w:hAnsi="TH SarabunIT๙" w:cs="TH SarabunIT๙"/>
+                <w:sz w:val="32"/>
+                <w:szCs w:val="32"/>
+                <w:cs/>
+              </w:rPr>
+              <w:t>-</w:t>
+            </w:r>
+          </w:p>
+        </w:tc>
+        <w:tc>
+          <w:tcPr>
+            <w:tcW w:w="474" w:type="pct"/>
+          </w:tcPr>
+          <w:p>
+            <w:pPr>
+              <w:jc w:val="center"/>
+              <w:rPr>
+                <w:rFonts w:ascii="TH SarabunIT๙" w:hAnsi="TH SarabunIT๙" w:cs="TH SarabunIT๙"/>
+                <w:sz w:val="32"/>
+                <w:szCs w:val="32"/>
+              </w:rPr>
+            </w:pPr>
+            <w:r>
+              <w:rPr>
+                <w:rFonts w:ascii="TH SarabunIT๙" w:hAnsi="TH SarabunIT๙" w:cs="TH SarabunIT๙"/>
+                <w:sz w:val="32"/>
+                <w:szCs w:val="32"/>
+                <w:cs/>
+              </w:rPr>
+              <w:t>๖ ตัว</w:t>
+            </w:r>
+          </w:p>
+        </w:tc>
+        <w:tc>
+          <w:tcPr>
+            <w:tcW w:w="511" w:type="pct"/>
+          </w:tcPr>
+          <w:p>
+            <w:pPr>
+              <w:jc w:val="center"/>
+              <w:rPr>
+                <w:rFonts w:ascii="TH SarabunIT๙" w:hAnsi="TH SarabunIT๙" w:cs="TH SarabunIT๙"/>
+                <w:sz w:val="32"/>
+                <w:szCs w:val="32"/>
+                <w:cs/>
+              </w:rPr>
+            </w:pPr>
+            <w:r>
+              <w:rPr>
+                <w:rFonts w:ascii="TH SarabunIT๙" w:hAnsi="TH SarabunIT๙" w:cs="TH SarabunIT๙"/>
+                <w:sz w:val="32"/>
+                <w:szCs w:val="32"/>
+                <w:cs/>
+              </w:rPr>
+              <w:t>-</w:t>
+            </w:r>
+          </w:p>
+        </w:tc>
+        <w:tc>
+          <w:tcPr>
+            <w:tcW w:w="488" w:type="pct"/>
+          </w:tcPr>
+          <w:p>
+            <w:pPr>
+              <w:spacing w:after="200" w:line="276" w:lineRule="auto"/>
+              <w:jc w:val="center"/>
+              <w:rPr>
+                <w:rFonts w:ascii="TH SarabunIT๙" w:hAnsi="TH SarabunIT๙" w:cs="TH SarabunIT๙"/>
+                <w:sz w:val="32"/>
+                <w:szCs w:val="32"/>
+                <w:cs/>
+              </w:rPr>
+            </w:pPr>
+            <w:r>
+              <w:rPr>
+                <w:rFonts w:ascii="TH SarabunIT๙" w:hAnsi="TH SarabunIT๙" w:cs="TH SarabunIT๙"/>
+                <w:sz w:val="32"/>
+                <w:szCs w:val="32"/>
+                <w:cs/>
+              </w:rPr>
+              <w:t>๖ ตัว</w:t>
+            </w:r>
+          </w:p>
+        </w:tc>
+        <w:tc>
+          <w:tcPr>
+            <w:tcW w:w="469" w:type="pct"/>
+          </w:tcPr>
+          <w:p>
+            <w:pPr>
+              <w:rPr>
+                <w:rFonts w:ascii="TH SarabunIT๙" w:eastAsia="Calibri" w:hAnsi="TH SarabunIT๙" w:cs="TH SarabunIT๙"/>
+                <w:sz w:val="32"/>
+                <w:szCs w:val="32"/>
+              </w:rPr>
+            </w:pPr>
+          </w:p>
+        </w:tc>
+      </w:tr>
+      <w:tr>
+        <w:trPr>
+          <w:trHeight w:val="739"/>
+        </w:trPr>
+        <w:tc>
+          <w:tcPr>
+            <w:tcW w:w="387" w:type="pct"/>
+          </w:tcPr>
+          <w:p>
+            <w:pPr>
+              <w:spacing w:after="200" w:line="276" w:lineRule="auto"/>
+              <w:jc w:val="center"/>
+              <w:rPr>
+                <w:rFonts w:ascii="TH SarabunIT๙" w:eastAsia="Calibri" w:hAnsi="TH SarabunIT๙" w:cs="TH SarabunIT๙"/>
+                <w:sz w:val="32"/>
+                <w:szCs w:val="32"/>
+              </w:rPr>
+            </w:pPr>
+            <w:r>
+              <w:rPr>
+                <w:rFonts w:ascii="TH SarabunIT๙" w:hAnsi="TH SarabunIT๙" w:cs="TH SarabunIT๙"/>
+                <w:sz w:val="32"/>
+                <w:szCs w:val="32"/>
+                <w:cs/>
+              </w:rPr>
+              <w:t>๑๐</w:t>
+            </w:r>
+          </w:p>
+        </w:tc>
+        <w:tc>
+          <w:tcPr>
+            <w:tcW w:w="992" w:type="pct"/>
+          </w:tcPr>
+          <w:p>
+            <w:pPr>
+              <w:spacing w:after="200" w:line="276" w:lineRule="auto"/>
+              <w:rPr>
+                <w:rFonts w:ascii="TH SarabunIT๙" w:hAnsi="TH SarabunIT๙" w:cs="TH SarabunIT๙" w:hint="cs"/>
+                <w:sz w:val="32"/>
+                <w:szCs w:val="32"/>
+                <w:cs/>
+              </w:rPr>
+            </w:pPr>
+            <w:r>
+              <w:rPr>
+                <w:rFonts w:ascii="TH SarabunIT๙" w:hAnsi="TH SarabunIT๙" w:cs="TH SarabunIT๙"/>
+                <w:sz w:val="32"/>
+                <w:szCs w:val="32"/>
+                <w:cs/>
+              </w:rPr>
+              <w:t>โพเดียมหน้าฉลุ</w:t>
+            </w:r>
+          </w:p>
+        </w:tc>
+        <w:tc>
+          <w:tcPr>
+            <w:tcW w:w="983" w:type="pct"/>
+          </w:tcPr>
+          <w:p>
+            <w:pPr>
+              <w:spacing w:after="200" w:line="276" w:lineRule="auto"/>
+              <w:rPr>
+                <w:rFonts w:ascii="TH SarabunIT๙" w:hAnsi="TH SarabunIT๙" w:cs="TH SarabunIT๙" w:hint="cs"/>
+                <w:sz w:val="32"/>
+                <w:szCs w:val="32"/>
+                <w:cs/>
+              </w:rPr>
+            </w:pPr>
+            <w:r>
+              <w:rPr>
+                <w:rFonts w:ascii="TH SarabunIT๙" w:hAnsi="TH SarabunIT๙" w:cs="TH SarabunIT๙"/>
+                <w:sz w:val="32"/>
+                <w:szCs w:val="32"/>
+                <w:cs/>
+              </w:rPr>
+              <w:t>ขบ.334/001/2569</w:t>
+            </w:r>
+          </w:p>
+        </w:tc>
+        <w:tc>
+          <w:tcPr>
+            <w:tcW w:w="696" w:type="pct"/>
+          </w:tcPr>
+          <w:p>
+            <w:pPr>
+              <w:spacing w:after="200" w:line="276" w:lineRule="auto"/>
+              <w:jc w:val="center"/>
+              <w:rPr>
+                <w:rFonts w:ascii="TH SarabunIT๙" w:hAnsi="TH SarabunIT๙" w:cs="TH SarabunIT๙"/>
+                <w:sz w:val="32"/>
+                <w:szCs w:val="32"/>
+                <w:cs/>
+              </w:rPr>
+            </w:pPr>
+            <w:r>
+              <w:rPr>
+                <w:rFonts w:ascii="TH SarabunIT๙" w:hAnsi="TH SarabunIT๙" w:cs="TH SarabunIT๙"/>
+                <w:sz w:val="32"/>
+                <w:szCs w:val="32"/>
+                <w:cs/>
+              </w:rPr>
+              <w:t>-</w:t>
+            </w:r>
+          </w:p>
+        </w:tc>
+        <w:tc>
+          <w:tcPr>
+            <w:tcW w:w="474" w:type="pct"/>
+          </w:tcPr>
+          <w:p>
+            <w:pPr>
+              <w:jc w:val="center"/>
+              <w:rPr>
+                <w:rFonts w:ascii="TH SarabunIT๙" w:hAnsi="TH SarabunIT๙" w:cs="TH SarabunIT๙"/>
+                <w:sz w:val="32"/>
+                <w:szCs w:val="32"/>
+              </w:rPr>
+            </w:pPr>
+            <w:r>
+              <w:rPr>
+                <w:rFonts w:ascii="TH SarabunIT๙" w:hAnsi="TH SarabunIT๙" w:cs="TH SarabunIT๙"/>
+                <w:sz w:val="32"/>
+                <w:szCs w:val="32"/>
+                <w:cs/>
+              </w:rPr>
+              <w:t>๑ ตัว</w:t>
+            </w:r>
+          </w:p>
+        </w:tc>
+        <w:tc>
+          <w:tcPr>
+            <w:tcW w:w="511" w:type="pct"/>
+          </w:tcPr>
+          <w:p>
+            <w:pPr>
+              <w:jc w:val="center"/>
+              <w:rPr>
+                <w:rFonts w:ascii="TH SarabunIT๙" w:hAnsi="TH SarabunIT๙" w:cs="TH SarabunIT๙"/>
+                <w:sz w:val="32"/>
+                <w:szCs w:val="32"/>
+                <w:cs/>
+              </w:rPr>
+            </w:pPr>
+            <w:r>
+              <w:rPr>
+                <w:rFonts w:ascii="TH SarabunIT๙" w:hAnsi="TH SarabunIT๙" w:cs="TH SarabunIT๙"/>
+                <w:sz w:val="32"/>
+                <w:szCs w:val="32"/>
+                <w:cs/>
+              </w:rPr>
+              <w:t>-</w:t>
+            </w:r>
+          </w:p>
+        </w:tc>
+        <w:tc>
+          <w:tcPr>
+            <w:tcW w:w="488" w:type="pct"/>
+          </w:tcPr>
+          <w:p>
+            <w:pPr>
+              <w:spacing w:after="200" w:line="276" w:lineRule="auto"/>
+              <w:jc w:val="center"/>
+              <w:rPr>
+                <w:rFonts w:ascii="TH SarabunIT๙" w:hAnsi="TH SarabunIT๙" w:cs="TH SarabunIT๙"/>
+                <w:sz w:val="32"/>
+                <w:szCs w:val="32"/>
+                <w:cs/>
+              </w:rPr>
+            </w:pPr>
+            <w:r>
+              <w:rPr>
+                <w:rFonts w:ascii="TH SarabunIT๙" w:hAnsi="TH SarabunIT๙" w:cs="TH SarabunIT๙"/>
+                <w:sz w:val="32"/>
+                <w:szCs w:val="32"/>
+                <w:cs/>
+              </w:rPr>
+              <w:t>๑ ตัว</w:t>
+            </w:r>
+          </w:p>
+        </w:tc>
+        <w:tc>
+          <w:tcPr>
+            <w:tcW w:w="469" w:type="pct"/>
+          </w:tcPr>
+          <w:p>
+            <w:pPr>
+              <w:rPr>
+                <w:rFonts w:ascii="TH SarabunIT๙" w:eastAsia="Calibri" w:hAnsi="TH SarabunIT๙" w:cs="TH SarabunIT๙"/>
+                <w:sz w:val="32"/>
+                <w:szCs w:val="32"/>
+              </w:rPr>
+            </w:pPr>
+          </w:p>
+        </w:tc>
+      </w:tr>
+      <w:tr>
+        <w:trPr>
+          <w:trHeight w:val="739"/>
+        </w:trPr>
+        <w:tc>
+          <w:tcPr>
+            <w:tcW w:w="387" w:type="pct"/>
+          </w:tcPr>
+          <w:p>
+            <w:pPr>
+              <w:spacing w:after="200" w:line="276" w:lineRule="auto"/>
+              <w:jc w:val="center"/>
+              <w:rPr>
+                <w:rFonts w:ascii="TH SarabunIT๙" w:eastAsia="Calibri" w:hAnsi="TH SarabunIT๙" w:cs="TH SarabunIT๙"/>
+                <w:sz w:val="32"/>
+                <w:szCs w:val="32"/>
+              </w:rPr>
+            </w:pPr>
+            <w:r>
+              <w:rPr>
+                <w:rFonts w:ascii="TH SarabunIT๙" w:hAnsi="TH SarabunIT๙" w:cs="TH SarabunIT๙"/>
+                <w:sz w:val="32"/>
+                <w:szCs w:val="32"/>
+                <w:cs/>
+              </w:rPr>
+              <w:t>๑๑</w:t>
+            </w:r>
+          </w:p>
+        </w:tc>
+        <w:tc>
+          <w:tcPr>
+            <w:tcW w:w="992" w:type="pct"/>
+          </w:tcPr>
+          <w:p>
+            <w:pPr>
+              <w:spacing w:after="200" w:line="276" w:lineRule="auto"/>
+              <w:rPr>
+                <w:rFonts w:ascii="TH SarabunIT๙" w:hAnsi="TH SarabunIT๙" w:cs="TH SarabunIT๙" w:hint="cs"/>
+                <w:sz w:val="32"/>
+                <w:szCs w:val="32"/>
+                <w:cs/>
+              </w:rPr>
+            </w:pPr>
+            <w:r>
+              <w:rPr>
+                <w:rFonts w:ascii="TH SarabunIT๙" w:hAnsi="TH SarabunIT๙" w:cs="TH SarabunIT๙"/>
+                <w:sz w:val="32"/>
+                <w:szCs w:val="32"/>
+                <w:cs/>
+              </w:rPr>
+              <w:t>โพเดียมหน้าทึบ</w:t>
+            </w:r>
+          </w:p>
+        </w:tc>
+        <w:tc>
+          <w:tcPr>
+            <w:tcW w:w="983" w:type="pct"/>
+          </w:tcPr>
+          <w:p>
+            <w:pPr>
+              <w:spacing w:after="200" w:line="276" w:lineRule="auto"/>
+              <w:rPr>
+                <w:rFonts w:ascii="TH SarabunIT๙" w:hAnsi="TH SarabunIT๙" w:cs="TH SarabunIT๙" w:hint="cs"/>
+                <w:sz w:val="32"/>
+                <w:szCs w:val="32"/>
+                <w:cs/>
+              </w:rPr>
+            </w:pPr>
+            <w:r>
+              <w:rPr>
+                <w:rFonts w:ascii="TH SarabunIT๙" w:hAnsi="TH SarabunIT๙" w:cs="TH SarabunIT๙"/>
+                <w:sz w:val="32"/>
+                <w:szCs w:val="32"/>
+                <w:cs/>
+              </w:rPr>
+              <w:t>ขบ.334/002/2569</w:t>
+            </w:r>
+          </w:p>
+        </w:tc>
+        <w:tc>
+          <w:tcPr>
+            <w:tcW w:w="696" w:type="pct"/>
+          </w:tcPr>
+          <w:p>
+            <w:pPr>
+              <w:spacing w:after="200" w:line="276" w:lineRule="auto"/>
+              <w:jc w:val="center"/>
+              <w:rPr>
+                <w:rFonts w:ascii="TH SarabunIT๙" w:hAnsi="TH SarabunIT๙" w:cs="TH SarabunIT๙"/>
+                <w:sz w:val="32"/>
+                <w:szCs w:val="32"/>
+                <w:cs/>
+              </w:rPr>
+            </w:pPr>
+            <w:r>
+              <w:rPr>
+                <w:rFonts w:ascii="TH SarabunIT๙" w:hAnsi="TH SarabunIT๙" w:cs="TH SarabunIT๙"/>
+                <w:sz w:val="32"/>
+                <w:szCs w:val="32"/>
+                <w:cs/>
+              </w:rPr>
+              <w:t>-</w:t>
+            </w:r>
+          </w:p>
+        </w:tc>
+        <w:tc>
+          <w:tcPr>
+            <w:tcW w:w="474" w:type="pct"/>
+          </w:tcPr>
+          <w:p>
+            <w:pPr>
+              <w:jc w:val="center"/>
+              <w:rPr>
+                <w:rFonts w:ascii="TH SarabunIT๙" w:hAnsi="TH SarabunIT๙" w:cs="TH SarabunIT๙"/>
+                <w:sz w:val="32"/>
+                <w:szCs w:val="32"/>
+              </w:rPr>
+            </w:pPr>
+            <w:r>
+              <w:rPr>
+                <w:rFonts w:ascii="TH SarabunIT๙" w:hAnsi="TH SarabunIT๙" w:cs="TH SarabunIT๙"/>
+                <w:sz w:val="32"/>
+                <w:szCs w:val="32"/>
+                <w:cs/>
+              </w:rPr>
+              <w:t>๑ ตัว</w:t>
+            </w:r>
+          </w:p>
+        </w:tc>
+        <w:tc>
+          <w:tcPr>
+            <w:tcW w:w="511" w:type="pct"/>
+          </w:tcPr>
+          <w:p>
+            <w:pPr>
+              <w:jc w:val="center"/>
+              <w:rPr>
+                <w:rFonts w:ascii="TH SarabunIT๙" w:hAnsi="TH SarabunIT๙" w:cs="TH SarabunIT๙"/>
+                <w:sz w:val="32"/>
+                <w:szCs w:val="32"/>
+                <w:cs/>
+              </w:rPr>
+            </w:pPr>
+            <w:r>
+              <w:rPr>
+                <w:rFonts w:ascii="TH SarabunIT๙" w:hAnsi="TH SarabunIT๙" w:cs="TH SarabunIT๙"/>
+                <w:sz w:val="32"/>
+                <w:szCs w:val="32"/>
+                <w:cs/>
+              </w:rPr>
+              <w:t>-</w:t>
+            </w:r>
+          </w:p>
+        </w:tc>
+        <w:tc>
+          <w:tcPr>
+            <w:tcW w:w="488" w:type="pct"/>
+          </w:tcPr>
+          <w:p>
+            <w:pPr>
+              <w:spacing w:after="200" w:line="276" w:lineRule="auto"/>
+              <w:jc w:val="center"/>
+              <w:rPr>
+                <w:rFonts w:ascii="TH SarabunIT๙" w:hAnsi="TH SarabunIT๙" w:cs="TH SarabunIT๙"/>
+                <w:sz w:val="32"/>
+                <w:szCs w:val="32"/>
+                <w:cs/>
+              </w:rPr>
+            </w:pPr>
+            <w:r>
+              <w:rPr>
+                <w:rFonts w:ascii="TH SarabunIT๙" w:hAnsi="TH SarabunIT๙" w:cs="TH SarabunIT๙"/>
+                <w:sz w:val="32"/>
+                <w:szCs w:val="32"/>
+                <w:cs/>
+              </w:rPr>
+              <w:t>๑ ตัว</w:t>
+            </w:r>
+          </w:p>
+        </w:tc>
+        <w:tc>
+          <w:tcPr>
+            <w:tcW w:w="469" w:type="pct"/>
+          </w:tcPr>
+          <w:p>
+            <w:pPr>
+              <w:rPr>
+                <w:rFonts w:ascii="TH SarabunIT๙" w:eastAsia="Calibri" w:hAnsi="TH SarabunIT๙" w:cs="TH SarabunIT๙"/>
+                <w:sz w:val="32"/>
+                <w:szCs w:val="32"/>
+              </w:rPr>
+            </w:pPr>
+          </w:p>
+        </w:tc>
+      </w:tr>
+      <w:tr>
+        <w:trPr>
+          <w:trHeight w:val="739"/>
+        </w:trPr>
+        <w:tc>
+          <w:tcPr>
+            <w:tcW w:w="387" w:type="pct"/>
+          </w:tcPr>
+          <w:p>
+            <w:pPr>
+              <w:spacing w:after="200" w:line="276" w:lineRule="auto"/>
+              <w:jc w:val="center"/>
+              <w:rPr>
+                <w:rFonts w:ascii="TH SarabunIT๙" w:eastAsia="Calibri" w:hAnsi="TH SarabunIT๙" w:cs="TH SarabunIT๙"/>
+                <w:sz w:val="32"/>
+                <w:szCs w:val="32"/>
+              </w:rPr>
+            </w:pPr>
+            <w:r>
+              <w:rPr>
+                <w:rFonts w:ascii="TH SarabunIT๙" w:hAnsi="TH SarabunIT๙" w:cs="TH SarabunIT๙"/>
+                <w:sz w:val="32"/>
+                <w:szCs w:val="32"/>
+                <w:cs/>
+              </w:rPr>
+              <w:t>๑๒</w:t>
+            </w:r>
+          </w:p>
+        </w:tc>
+        <w:tc>
+          <w:tcPr>
+            <w:tcW w:w="992" w:type="pct"/>
+          </w:tcPr>
+          <w:p>
+            <w:pPr>
+              <w:spacing w:after="200" w:line="276" w:lineRule="auto"/>
+              <w:rPr>
+                <w:rFonts w:ascii="TH SarabunIT๙" w:hAnsi="TH SarabunIT๙" w:cs="TH SarabunIT๙" w:hint="cs"/>
+                <w:sz w:val="32"/>
+                <w:szCs w:val="32"/>
+                <w:cs/>
+              </w:rPr>
+            </w:pPr>
+            <w:r>
+              <w:rPr>
+                <w:rFonts w:ascii="TH SarabunIT๙" w:hAnsi="TH SarabunIT๙" w:cs="TH SarabunIT๙"/>
+                <w:sz w:val="32"/>
+                <w:szCs w:val="32"/>
+                <w:cs/>
+              </w:rPr>
+              <w:t>ตู้เก็บเอกสารบานเลื่อนกระจก</w:t>
+            </w:r>
+          </w:p>
+        </w:tc>
+        <w:tc>
+          <w:tcPr>
+            <w:tcW w:w="983" w:type="pct"/>
+          </w:tcPr>
+          <w:p>
+            <w:pPr>
+              <w:spacing w:after="200" w:line="276" w:lineRule="auto"/>
+              <w:rPr>
+                <w:rFonts w:ascii="TH SarabunIT๙" w:hAnsi="TH SarabunIT๙" w:cs="TH SarabunIT๙" w:hint="cs"/>
+                <w:sz w:val="32"/>
+                <w:szCs w:val="32"/>
+                <w:cs/>
+              </w:rPr>
+            </w:pPr>
+            <w:r>
+              <w:rPr>
+                <w:rFonts w:ascii="TH SarabunIT๙" w:hAnsi="TH SarabunIT๙" w:cs="TH SarabunIT๙"/>
+                <w:sz w:val="32"/>
+                <w:szCs w:val="32"/>
+                <w:cs/>
+              </w:rPr>
+              <w:t>ขบ.335/001-003/2569</w:t>
+            </w:r>
+          </w:p>
+        </w:tc>
+        <w:tc>
+          <w:tcPr>
+            <w:tcW w:w="696" w:type="pct"/>
+          </w:tcPr>
+          <w:p>
+            <w:pPr>
+              <w:spacing w:after="200" w:line="276" w:lineRule="auto"/>
+              <w:jc w:val="center"/>
+              <w:rPr>
+                <w:rFonts w:ascii="TH SarabunIT๙" w:hAnsi="TH SarabunIT๙" w:cs="TH SarabunIT๙"/>
+                <w:sz w:val="32"/>
+                <w:szCs w:val="32"/>
+                <w:cs/>
+              </w:rPr>
+            </w:pPr>
+            <w:r>
+              <w:rPr>
+                <w:rFonts w:ascii="TH SarabunIT๙" w:hAnsi="TH SarabunIT๙" w:cs="TH SarabunIT๙"/>
+                <w:sz w:val="32"/>
+                <w:szCs w:val="32"/>
+                <w:cs/>
+              </w:rPr>
+              <w:t>-</w:t>
+            </w:r>
+          </w:p>
+        </w:tc>
+        <w:tc>
+          <w:tcPr>
+            <w:tcW w:w="474" w:type="pct"/>
+          </w:tcPr>
+          <w:p>
+            <w:pPr>
+              <w:jc w:val="center"/>
+              <w:rPr>
+                <w:rFonts w:ascii="TH SarabunIT๙" w:hAnsi="TH SarabunIT๙" w:cs="TH SarabunIT๙"/>
+                <w:sz w:val="32"/>
+                <w:szCs w:val="32"/>
+              </w:rPr>
+            </w:pPr>
+            <w:r>
+              <w:rPr>
+                <w:rFonts w:ascii="TH SarabunIT๙" w:hAnsi="TH SarabunIT๙" w:cs="TH SarabunIT๙"/>
+                <w:sz w:val="32"/>
+                <w:szCs w:val="32"/>
+                <w:cs/>
+              </w:rPr>
+              <w:t>๓ ตู้</w:t>
+            </w:r>
+          </w:p>
+        </w:tc>
+        <w:tc>
+          <w:tcPr>
+            <w:tcW w:w="511" w:type="pct"/>
+          </w:tcPr>
+          <w:p>
+            <w:pPr>
+              <w:jc w:val="center"/>
+              <w:rPr>
+                <w:rFonts w:ascii="TH SarabunIT๙" w:hAnsi="TH SarabunIT๙" w:cs="TH SarabunIT๙"/>
+                <w:sz w:val="32"/>
+                <w:szCs w:val="32"/>
+                <w:cs/>
+              </w:rPr>
+            </w:pPr>
+            <w:r>
+              <w:rPr>
+                <w:rFonts w:ascii="TH SarabunIT๙" w:hAnsi="TH SarabunIT๙" w:cs="TH SarabunIT๙"/>
+                <w:sz w:val="32"/>
+                <w:szCs w:val="32"/>
+                <w:cs/>
+              </w:rPr>
+              <w:t>-</w:t>
+            </w:r>
+          </w:p>
+        </w:tc>
+        <w:tc>
+          <w:tcPr>
+            <w:tcW w:w="488" w:type="pct"/>
+          </w:tcPr>
+          <w:p>
+            <w:pPr>
+              <w:spacing w:after="200" w:line="276" w:lineRule="auto"/>
+              <w:jc w:val="center"/>
+              <w:rPr>
+                <w:rFonts w:ascii="TH SarabunIT๙" w:hAnsi="TH SarabunIT๙" w:cs="TH SarabunIT๙"/>
+                <w:sz w:val="32"/>
+                <w:szCs w:val="32"/>
+                <w:cs/>
+              </w:rPr>
+            </w:pPr>
+            <w:r>
+              <w:rPr>
+                <w:rFonts w:ascii="TH SarabunIT๙" w:hAnsi="TH SarabunIT๙" w:cs="TH SarabunIT๙"/>
+                <w:sz w:val="32"/>
+                <w:szCs w:val="32"/>
+                <w:cs/>
+              </w:rPr>
+              <w:t>๓ ตู้</w:t>
             </w:r>
           </w:p>
         </w:tc>
@@ -11990,7 +14640,16 @@
                           <w:szCs w:val="32"/>
                           <w:cs/>
                         </w:rPr>
-                        <w:t xml:space="preserve"> นางสาวนรินทร</w:t>
+                        <w:t xml:space="preserve"> </w:t>
+                      </w:r>
+                      <w:r>
+                        <w:rPr>
+                          <w:rFonts w:ascii="TH SarabunIT๙" w:hAnsi="TH SarabunIT๙" w:cs="TH SarabunIT๙" w:hint="cs"/>
+                          <w:sz w:val="32"/>
+                          <w:szCs w:val="32"/>
+                          <w:cs/>
+                        </w:rPr>
+                        <w:t>นางสาวนรินทร</w:t>
                       </w:r>
                       <w:r>
                         <w:rPr>
@@ -12897,6 +15556,7 @@
   <w:style w:type="character" w:default="1" w:styleId="a0">
     <w:name w:val="Default Paragraph Font"/>
     <w:uiPriority w:val="1"/>
+    <w:semiHidden/>
     <w:unhideWhenUsed/>
   </w:style>
   <w:style w:type="table" w:default="1" w:styleId="a1">

</xml_diff>

<commit_message>
Document No. 6: record disposal of 12 HP sets and restore AIO row
Co-Authored-By: Claude Opus 5.5 <noreply@anthropic.com>
Claude-Session: https://claude.ai/code/session_01CLAnyDuhFnWhH7sKpyCM9s
</commit_message>
<xml_diff>
--- a/เอกสารหมายเลข3.docx
+++ b/เอกสารหมายเลข3.docx
@@ -11044,16 +11044,7 @@
                           <w:szCs w:val="32"/>
                           <w:cs/>
                         </w:rPr>
-                        <w:t xml:space="preserve"> </w:t>
-                      </w:r>
-                      <w:r>
-                        <w:rPr>
-                          <w:rFonts w:ascii="TH SarabunIT๙" w:hAnsi="TH SarabunIT๙" w:cs="TH SarabunIT๙" w:hint="cs"/>
-                          <w:sz w:val="32"/>
-                          <w:szCs w:val="32"/>
-                          <w:cs/>
-                        </w:rPr>
-                        <w:t>นางสาวนรินทร</w:t>
+                        <w:t xml:space="preserve"> นางสาวนรินทร</w:t>
                       </w:r>
                       <w:r>
                         <w:rPr>
@@ -11500,7 +11491,7 @@
         <w:spacing w:after="200" w:line="276" w:lineRule="auto"/>
         <w:jc w:val="center"/>
         <w:rPr>
-          <w:rFonts w:ascii="TH SarabunIT๙" w:eastAsia="Calibri" w:hAnsi="TH SarabunIT๙" w:cs="TH SarabunIT๙" w:hint="cs"/>
+          <w:rFonts w:ascii="TH SarabunIT๙" w:eastAsia="Calibri" w:hAnsi="TH SarabunIT๙" w:cs="TH SarabunIT๙"/>
           <w:b/>
           <w:bCs/>
           <w:sz w:val="32"/>
@@ -11933,20 +11924,20 @@
             <w:pPr>
               <w:spacing w:after="200" w:line="276" w:lineRule="auto"/>
               <w:rPr>
-                <w:rFonts w:ascii="TH SarabunIT๙" w:hAnsi="TH SarabunIT๙" w:cs="TH SarabunIT๙" w:hint="cs"/>
-                <w:sz w:val="32"/>
-                <w:szCs w:val="32"/>
-                <w:cs/>
-              </w:rPr>
-            </w:pPr>
-            <w:r>
-              <w:rPr>
-                <w:rFonts w:ascii="TH SarabunIT๙" w:hAnsi="TH SarabunIT๙" w:cs="TH SarabunIT๙"/>
-                <w:sz w:val="32"/>
-                <w:szCs w:val="32"/>
-                <w:cs/>
-              </w:rPr>
-              <w:t>เครื่องคอมพิวเตอร์ตั้งโต๊ะ ยี่ห้อ HP รุ่น EliteDesk 705 G2 SFF พร้อมอุปกรณ์ประกอบ ได้แก่ จอภาพคอมพิวเตอร์ ยี่ห้อ HP รุ่น V1936 จำนวน ๑๐ จอ รุ่น V242 จำนวน ๑๐ จอ แป้นพิมพ์ (Keyboard) รุ่น KU-1156 จำนวน ๒๐ ตัว และเมาส์ ยี่ห้อ HP จำนวน ๒๐ ตัว</w:t>
+                <w:rFonts w:ascii="TH SarabunIT๙" w:hAnsi="TH SarabunIT๙" w:cs="TH SarabunIT๙"/>
+                <w:sz w:val="32"/>
+                <w:szCs w:val="32"/>
+                <w:cs/>
+              </w:rPr>
+            </w:pPr>
+            <w:r>
+              <w:rPr>
+                <w:rFonts w:ascii="TH SarabunIT๙" w:hAnsi="TH SarabunIT๙" w:cs="TH SarabunIT๙"/>
+                <w:sz w:val="32"/>
+                <w:szCs w:val="32"/>
+                <w:cs/>
+              </w:rPr>
+              <w:t>คอมพิวเตอร์ตั้งโต๊ะ (AIO) ขนาด ๒๓.๘ นิ้ว</w:t>
             </w:r>
           </w:p>
         </w:tc>
@@ -11971,7 +11962,7 @@
                 <w:szCs w:val="32"/>
                 <w:cs/>
               </w:rPr>
-              <w:t>ขบ.325/001-020/2568</w:t>
+              <w:t>ขบ.324/001-010/2567</w:t>
             </w:r>
           </w:p>
         </w:tc>
@@ -11997,7 +11988,7 @@
                 <w:szCs w:val="32"/>
                 <w:cs/>
               </w:rPr>
-              <w:t>๒๐ ชุด</w:t>
+              <w:t>๑๐ เครื่อง</w:t>
             </w:r>
           </w:p>
         </w:tc>
@@ -12072,7 +12063,7 @@
                 <w:szCs w:val="32"/>
                 <w:cs/>
               </w:rPr>
-              <w:t>๒๐ ชุด</w:t>
+              <w:t>๑๐ เครื่อง</w:t>
             </w:r>
           </w:p>
         </w:tc>
@@ -12133,16 +12124,14 @@
                 <w:szCs w:val="32"/>
               </w:rPr>
             </w:pPr>
-            <w:proofErr w:type="spellStart"/>
-            <w:proofErr w:type="spellEnd"/>
-            <w:r>
-              <w:rPr>
-                <w:rFonts w:ascii="TH SarabunIT๙" w:hAnsi="TH SarabunIT๙" w:cs="TH SarabunIT๙"/>
-                <w:sz w:val="32"/>
-                <w:szCs w:val="32"/>
-                <w:cs/>
-              </w:rPr>
-              <w:t>เครื่องพิมพ์ ยี่ห้อ Canon รุ่น G3010</w:t>
+            <w:r>
+              <w:rPr>
+                <w:rFonts w:ascii="TH SarabunIT๙" w:hAnsi="TH SarabunIT๙" w:cs="TH SarabunIT๙"/>
+                <w:sz w:val="32"/>
+                <w:szCs w:val="32"/>
+                <w:cs/>
+              </w:rPr>
+              <w:t>เครื่องคอมพิวเตอร์ตั้งโต๊ะ ยี่ห้อ HP รุ่น EliteDesk 705 G2 SFF พร้อมอุปกรณ์ประกอบ ได้แก่ จอภาพคอมพิวเตอร์ ยี่ห้อ HP รุ่น V1936 จำนวน ๑๐ จอ รุ่น V242 จำนวน ๑๐ จอ แป้นพิมพ์ (Keyboard) รุ่น KU-1156 จำนวน ๒๐ ตัว และเมาส์ ยี่ห้อ HP จำนวน ๒๐ ตัว</w:t>
             </w:r>
           </w:p>
         </w:tc>
@@ -12167,7 +12156,7 @@
                 <w:szCs w:val="32"/>
                 <w:cs/>
               </w:rPr>
-              <w:t>ขบ.326/001/2569</w:t>
+              <w:t>ขบ.325/001-020/2568</w:t>
             </w:r>
           </w:p>
         </w:tc>
@@ -12193,36 +12182,36 @@
                 <w:szCs w:val="32"/>
                 <w:cs/>
               </w:rPr>
+              <w:t>๒๐ ชุด</w:t>
+            </w:r>
+          </w:p>
+        </w:tc>
+        <w:tc>
+          <w:tcPr>
+            <w:tcW w:w="474" w:type="pct"/>
+          </w:tcPr>
+          <w:p>
+            <w:pPr>
+              <w:jc w:val="center"/>
+              <w:rPr>
+                <w:rFonts w:ascii="TH SarabunIT๙" w:hAnsi="TH SarabunIT๙" w:cs="TH SarabunIT๙"/>
+                <w:sz w:val="32"/>
+                <w:szCs w:val="32"/>
+              </w:rPr>
+            </w:pPr>
+            <w:r>
+              <w:rPr>
+                <w:rFonts w:ascii="TH SarabunIT๙" w:hAnsi="TH SarabunIT๙" w:cs="TH SarabunIT๙"/>
+                <w:sz w:val="32"/>
+                <w:szCs w:val="32"/>
+                <w:cs/>
+              </w:rPr>
               <w:t>-</w:t>
             </w:r>
           </w:p>
         </w:tc>
         <w:tc>
           <w:tcPr>
-            <w:tcW w:w="474" w:type="pct"/>
-          </w:tcPr>
-          <w:p>
-            <w:pPr>
-              <w:jc w:val="center"/>
-              <w:rPr>
-                <w:rFonts w:ascii="TH SarabunIT๙" w:hAnsi="TH SarabunIT๙" w:cs="TH SarabunIT๙"/>
-                <w:sz w:val="32"/>
-                <w:szCs w:val="32"/>
-              </w:rPr>
-            </w:pPr>
-            <w:r>
-              <w:rPr>
-                <w:rFonts w:ascii="TH SarabunIT๙" w:hAnsi="TH SarabunIT๙" w:cs="TH SarabunIT๙"/>
-                <w:sz w:val="32"/>
-                <w:szCs w:val="32"/>
-                <w:cs/>
-              </w:rPr>
-              <w:t>๑ เครื่อง</w:t>
-            </w:r>
-          </w:p>
-        </w:tc>
-        <w:tc>
-          <w:tcPr>
             <w:tcW w:w="511" w:type="pct"/>
           </w:tcPr>
           <w:p>
@@ -12242,7 +12231,7 @@
                 <w:szCs w:val="32"/>
                 <w:cs/>
               </w:rPr>
-              <w:t>-</w:t>
+              <w:t>๑๒ ชุด</w:t>
             </w:r>
           </w:p>
         </w:tc>
@@ -12268,7 +12257,7 @@
                 <w:szCs w:val="32"/>
                 <w:cs/>
               </w:rPr>
-              <w:t>๑ เครื่อง</w:t>
+              <w:t>๘ ชุด</w:t>
             </w:r>
           </w:p>
         </w:tc>
@@ -12284,6 +12273,15 @@
                 <w:szCs w:val="32"/>
               </w:rPr>
             </w:pPr>
+            <w:r>
+              <w:rPr>
+                <w:rFonts w:ascii="TH SarabunIT๙" w:hAnsi="TH SarabunIT๙" w:cs="TH SarabunIT๙"/>
+                <w:sz w:val="32"/>
+                <w:szCs w:val="32"/>
+                <w:cs/>
+              </w:rPr>
+              <w:t>จำหน่าย ๑๒ ชุด ได้แก่ ขบ.325/002, 003, 004, 007, 008, 009, 010, 014, 015, 016, 017 และ 018/2568 และจำหน่ายจอภาพ HP รุ่น V242 ของชุด ขบ.325/006/2568 จำนวน ๑ จอ</w:t>
+            </w:r>
           </w:p>
         </w:tc>
       </w:tr>
@@ -12324,20 +12322,20 @@
             <w:pPr>
               <w:spacing w:after="200" w:line="276" w:lineRule="auto"/>
               <w:rPr>
-                <w:rFonts w:ascii="TH SarabunIT๙" w:hAnsi="TH SarabunIT๙" w:cs="TH SarabunIT๙" w:hint="cs"/>
-                <w:sz w:val="32"/>
-                <w:szCs w:val="32"/>
-                <w:cs/>
-              </w:rPr>
-            </w:pPr>
-            <w:r>
-              <w:rPr>
-                <w:rFonts w:ascii="TH SarabunIT๙" w:hAnsi="TH SarabunIT๙" w:cs="TH SarabunIT๙"/>
-                <w:sz w:val="32"/>
-                <w:szCs w:val="32"/>
-                <w:cs/>
-              </w:rPr>
-              <w:t>โทรทัศน์ (TV) จอแบน ยี่ห้อ Sharp</w:t>
+                <w:rFonts w:ascii="TH SarabunIT๙" w:hAnsi="TH SarabunIT๙" w:cs="TH SarabunIT๙"/>
+                <w:sz w:val="32"/>
+                <w:szCs w:val="32"/>
+                <w:cs/>
+              </w:rPr>
+            </w:pPr>
+            <w:r>
+              <w:rPr>
+                <w:rFonts w:ascii="TH SarabunIT๙" w:hAnsi="TH SarabunIT๙" w:cs="TH SarabunIT๙"/>
+                <w:sz w:val="32"/>
+                <w:szCs w:val="32"/>
+                <w:cs/>
+              </w:rPr>
+              <w:t>เครื่องพิมพ์ ยี่ห้อ Canon รุ่น G3010</w:t>
             </w:r>
           </w:p>
         </w:tc>
@@ -12349,20 +12347,20 @@
             <w:pPr>
               <w:spacing w:after="200" w:line="276" w:lineRule="auto"/>
               <w:rPr>
-                <w:rFonts w:ascii="TH SarabunIT๙" w:hAnsi="TH SarabunIT๙" w:cs="TH SarabunIT๙" w:hint="cs"/>
-                <w:sz w:val="32"/>
-                <w:szCs w:val="32"/>
-                <w:cs/>
-              </w:rPr>
-            </w:pPr>
-            <w:r>
-              <w:rPr>
-                <w:rFonts w:ascii="TH SarabunIT๙" w:hAnsi="TH SarabunIT๙" w:cs="TH SarabunIT๙"/>
-                <w:sz w:val="32"/>
-                <w:szCs w:val="32"/>
-                <w:cs/>
-              </w:rPr>
-              <w:t>ขบ.327/001-002/2569</w:t>
+                <w:rFonts w:ascii="TH SarabunIT๙" w:hAnsi="TH SarabunIT๙" w:cs="TH SarabunIT๙"/>
+                <w:sz w:val="32"/>
+                <w:szCs w:val="32"/>
+                <w:cs/>
+              </w:rPr>
+            </w:pPr>
+            <w:r>
+              <w:rPr>
+                <w:rFonts w:ascii="TH SarabunIT๙" w:hAnsi="TH SarabunIT๙" w:cs="TH SarabunIT๙"/>
+                <w:sz w:val="32"/>
+                <w:szCs w:val="32"/>
+                <w:cs/>
+              </w:rPr>
+              <w:t>ขบ.326/001/2569</w:t>
             </w:r>
           </w:p>
         </w:tc>
@@ -12412,7 +12410,7 @@
                 <w:szCs w:val="32"/>
                 <w:cs/>
               </w:rPr>
-              <w:t>๒ เครื่อง</w:t>
+              <w:t>๑ เครื่อง</w:t>
             </w:r>
           </w:p>
         </w:tc>
@@ -12463,7 +12461,7 @@
                 <w:szCs w:val="32"/>
                 <w:cs/>
               </w:rPr>
-              <w:t>๒ เครื่อง</w:t>
+              <w:t>๑ เครื่อง</w:t>
             </w:r>
           </w:p>
         </w:tc>
@@ -12519,20 +12517,20 @@
             <w:pPr>
               <w:spacing w:after="200" w:line="276" w:lineRule="auto"/>
               <w:rPr>
-                <w:rFonts w:ascii="TH SarabunIT๙" w:hAnsi="TH SarabunIT๙" w:cs="TH SarabunIT๙" w:hint="cs"/>
-                <w:sz w:val="32"/>
-                <w:szCs w:val="32"/>
-                <w:cs/>
-              </w:rPr>
-            </w:pPr>
-            <w:r>
-              <w:rPr>
-                <w:rFonts w:ascii="TH SarabunIT๙" w:hAnsi="TH SarabunIT๙" w:cs="TH SarabunIT๙"/>
-                <w:sz w:val="32"/>
-                <w:szCs w:val="32"/>
-                <w:cs/>
-              </w:rPr>
-              <w:t>โต๊ะเรียน</w:t>
+                <w:rFonts w:ascii="TH SarabunIT๙" w:hAnsi="TH SarabunIT๙" w:cs="TH SarabunIT๙"/>
+                <w:sz w:val="32"/>
+                <w:szCs w:val="32"/>
+                <w:cs/>
+              </w:rPr>
+            </w:pPr>
+            <w:r>
+              <w:rPr>
+                <w:rFonts w:ascii="TH SarabunIT๙" w:hAnsi="TH SarabunIT๙" w:cs="TH SarabunIT๙"/>
+                <w:sz w:val="32"/>
+                <w:szCs w:val="32"/>
+                <w:cs/>
+              </w:rPr>
+              <w:t>โทรทัศน์ (TV) จอแบน ยี่ห้อ Sharp</w:t>
             </w:r>
           </w:p>
         </w:tc>
@@ -12557,7 +12555,7 @@
                 <w:szCs w:val="32"/>
                 <w:cs/>
               </w:rPr>
-              <w:t>ขบ.328/001-010/2569</w:t>
+              <w:t>ขบ.327/001-002/2569</w:t>
             </w:r>
           </w:p>
         </w:tc>
@@ -12607,7 +12605,7 @@
                 <w:szCs w:val="32"/>
                 <w:cs/>
               </w:rPr>
-              <w:t>๑๐ ชุด</w:t>
+              <w:t>๒ เครื่อง</w:t>
             </w:r>
           </w:p>
         </w:tc>
@@ -12658,7 +12656,7 @@
                 <w:szCs w:val="32"/>
                 <w:cs/>
               </w:rPr>
-              <w:t>๑๐ ชุด</w:t>
+              <w:t>๒ เครื่อง</w:t>
             </w:r>
           </w:p>
         </w:tc>
@@ -12714,20 +12712,20 @@
             <w:pPr>
               <w:spacing w:after="200" w:line="276" w:lineRule="auto"/>
               <w:rPr>
-                <w:rFonts w:ascii="TH SarabunIT๙" w:hAnsi="TH SarabunIT๙" w:cs="TH SarabunIT๙" w:hint="cs"/>
-                <w:sz w:val="32"/>
-                <w:szCs w:val="32"/>
-                <w:cs/>
-              </w:rPr>
-            </w:pPr>
-            <w:r>
-              <w:rPr>
-                <w:rFonts w:ascii="TH SarabunIT๙" w:hAnsi="TH SarabunIT๙" w:cs="TH SarabunIT๙"/>
-                <w:sz w:val="32"/>
-                <w:szCs w:val="32"/>
-                <w:cs/>
-              </w:rPr>
-              <w:t>ตู้เหล็กบานเปิดสองบาน</w:t>
+                <w:rFonts w:ascii="TH SarabunIT๙" w:hAnsi="TH SarabunIT๙" w:cs="TH SarabunIT๙"/>
+                <w:sz w:val="32"/>
+                <w:szCs w:val="32"/>
+                <w:cs/>
+              </w:rPr>
+            </w:pPr>
+            <w:r>
+              <w:rPr>
+                <w:rFonts w:ascii="TH SarabunIT๙" w:hAnsi="TH SarabunIT๙" w:cs="TH SarabunIT๙"/>
+                <w:sz w:val="32"/>
+                <w:szCs w:val="32"/>
+                <w:cs/>
+              </w:rPr>
+              <w:t>โต๊ะเรียน</w:t>
             </w:r>
           </w:p>
         </w:tc>
@@ -12752,7 +12750,7 @@
                 <w:szCs w:val="32"/>
                 <w:cs/>
               </w:rPr>
-              <w:t>ขบ.329/001/2569</w:t>
+              <w:t>ขบ.328/001-010/2569</w:t>
             </w:r>
           </w:p>
         </w:tc>
@@ -12802,7 +12800,7 @@
                 <w:szCs w:val="32"/>
                 <w:cs/>
               </w:rPr>
-              <w:t>๑ ตู้</w:t>
+              <w:t>๑๐ ชุด</w:t>
             </w:r>
           </w:p>
         </w:tc>
@@ -12853,7 +12851,7 @@
                 <w:szCs w:val="32"/>
                 <w:cs/>
               </w:rPr>
-              <w:t>๑ ตู้</w:t>
+              <w:t>๑๐ ชุด</w:t>
             </w:r>
           </w:p>
         </w:tc>
@@ -12909,22 +12907,20 @@
             <w:pPr>
               <w:spacing w:after="200" w:line="276" w:lineRule="auto"/>
               <w:rPr>
-                <w:rFonts w:ascii="TH SarabunIT๙" w:hAnsi="TH SarabunIT๙" w:cs="TH SarabunIT๙" w:hint="cs"/>
-                <w:sz w:val="32"/>
-                <w:szCs w:val="32"/>
-                <w:cs/>
-              </w:rPr>
-            </w:pPr>
-            <w:proofErr w:type="spellStart"/>
-            <w:proofErr w:type="spellEnd"/>
-            <w:r>
-              <w:rPr>
-                <w:rFonts w:ascii="TH SarabunIT๙" w:hAnsi="TH SarabunIT๙" w:cs="TH SarabunIT๙"/>
-                <w:sz w:val="32"/>
-                <w:szCs w:val="32"/>
-                <w:cs/>
-              </w:rPr>
-              <w:t>ตู้ล็อกเกอร์ ๓ ชั้น</w:t>
+                <w:rFonts w:ascii="TH SarabunIT๙" w:hAnsi="TH SarabunIT๙" w:cs="TH SarabunIT๙"/>
+                <w:sz w:val="32"/>
+                <w:szCs w:val="32"/>
+                <w:cs/>
+              </w:rPr>
+            </w:pPr>
+            <w:r>
+              <w:rPr>
+                <w:rFonts w:ascii="TH SarabunIT๙" w:hAnsi="TH SarabunIT๙" w:cs="TH SarabunIT๙"/>
+                <w:sz w:val="32"/>
+                <w:szCs w:val="32"/>
+                <w:cs/>
+              </w:rPr>
+              <w:t>ตู้เหล็กบานเปิดสองบาน</w:t>
             </w:r>
           </w:p>
         </w:tc>
@@ -12949,7 +12945,7 @@
                 <w:szCs w:val="32"/>
                 <w:cs/>
               </w:rPr>
-              <w:t>ขบ.330/001-008/2569</w:t>
+              <w:t>ขบ.329/001/2569</w:t>
             </w:r>
           </w:p>
         </w:tc>
@@ -12999,7 +12995,7 @@
                 <w:szCs w:val="32"/>
                 <w:cs/>
               </w:rPr>
-              <w:t>๘ อัน</w:t>
+              <w:t>๑ ตู้</w:t>
             </w:r>
           </w:p>
         </w:tc>
@@ -13050,7 +13046,7 @@
                 <w:szCs w:val="32"/>
                 <w:cs/>
               </w:rPr>
-              <w:t>๘ อัน</w:t>
+              <w:t>๑ ตู้</w:t>
             </w:r>
           </w:p>
         </w:tc>
@@ -13106,20 +13102,20 @@
             <w:pPr>
               <w:spacing w:after="200" w:line="276" w:lineRule="auto"/>
               <w:rPr>
-                <w:rFonts w:ascii="TH SarabunIT๙" w:hAnsi="TH SarabunIT๙" w:cs="TH SarabunIT๙" w:hint="cs"/>
-                <w:sz w:val="32"/>
-                <w:szCs w:val="32"/>
-                <w:cs/>
-              </w:rPr>
-            </w:pPr>
-            <w:r>
-              <w:rPr>
-                <w:rFonts w:ascii="TH SarabunIT๙" w:hAnsi="TH SarabunIT๙" w:cs="TH SarabunIT๙"/>
-                <w:sz w:val="32"/>
-                <w:szCs w:val="32"/>
-                <w:cs/>
-              </w:rPr>
-              <w:t>ชั้นอเนกประสงค์ ๓ ช่องโล่ง</w:t>
+                <w:rFonts w:ascii="TH SarabunIT๙" w:hAnsi="TH SarabunIT๙" w:cs="TH SarabunIT๙"/>
+                <w:sz w:val="32"/>
+                <w:szCs w:val="32"/>
+                <w:cs/>
+              </w:rPr>
+            </w:pPr>
+            <w:r>
+              <w:rPr>
+                <w:rFonts w:ascii="TH SarabunIT๙" w:hAnsi="TH SarabunIT๙" w:cs="TH SarabunIT๙"/>
+                <w:sz w:val="32"/>
+                <w:szCs w:val="32"/>
+                <w:cs/>
+              </w:rPr>
+              <w:t>ตู้ล็อกเกอร์ ๓ ชั้น</w:t>
             </w:r>
           </w:p>
         </w:tc>
@@ -13131,20 +13127,20 @@
             <w:pPr>
               <w:spacing w:after="200" w:line="276" w:lineRule="auto"/>
               <w:rPr>
-                <w:rFonts w:ascii="TH SarabunIT๙" w:hAnsi="TH SarabunIT๙" w:cs="TH SarabunIT๙" w:hint="cs"/>
-                <w:sz w:val="32"/>
-                <w:szCs w:val="32"/>
-                <w:cs/>
-              </w:rPr>
-            </w:pPr>
-            <w:r>
-              <w:rPr>
-                <w:rFonts w:ascii="TH SarabunIT๙" w:hAnsi="TH SarabunIT๙" w:cs="TH SarabunIT๙"/>
-                <w:sz w:val="32"/>
-                <w:szCs w:val="32"/>
-                <w:cs/>
-              </w:rPr>
-              <w:t>ขบ.331/001-002/2569</w:t>
+                <w:rFonts w:ascii="TH SarabunIT๙" w:hAnsi="TH SarabunIT๙" w:cs="TH SarabunIT๙"/>
+                <w:sz w:val="32"/>
+                <w:szCs w:val="32"/>
+                <w:cs/>
+              </w:rPr>
+            </w:pPr>
+            <w:r>
+              <w:rPr>
+                <w:rFonts w:ascii="TH SarabunIT๙" w:hAnsi="TH SarabunIT๙" w:cs="TH SarabunIT๙"/>
+                <w:sz w:val="32"/>
+                <w:szCs w:val="32"/>
+                <w:cs/>
+              </w:rPr>
+              <w:t>ขบ.330/001-008/2569</w:t>
             </w:r>
           </w:p>
         </w:tc>
@@ -13194,7 +13190,7 @@
                 <w:szCs w:val="32"/>
                 <w:cs/>
               </w:rPr>
-              <w:t>๒ อัน</w:t>
+              <w:t>๘ อัน</w:t>
             </w:r>
           </w:p>
         </w:tc>
@@ -13245,7 +13241,7 @@
                 <w:szCs w:val="32"/>
                 <w:cs/>
               </w:rPr>
-              <w:t>๒ อัน</w:t>
+              <w:t>๘ อัน</w:t>
             </w:r>
           </w:p>
         </w:tc>
@@ -13301,20 +13297,20 @@
             <w:pPr>
               <w:spacing w:after="200" w:line="276" w:lineRule="auto"/>
               <w:rPr>
-                <w:rFonts w:ascii="TH SarabunIT๙" w:hAnsi="TH SarabunIT๙" w:cs="TH SarabunIT๙" w:hint="cs"/>
-                <w:sz w:val="32"/>
-                <w:szCs w:val="32"/>
-                <w:cs/>
-              </w:rPr>
-            </w:pPr>
-            <w:r>
-              <w:rPr>
-                <w:rFonts w:ascii="TH SarabunIT๙" w:hAnsi="TH SarabunIT๙" w:cs="TH SarabunIT๙"/>
-                <w:sz w:val="32"/>
-                <w:szCs w:val="32"/>
-                <w:cs/>
-              </w:rPr>
-              <w:t>พัดลมติดผนัง ยี่ห้อฮาตาริ ขนาด ๑๘ นิ้ว</w:t>
+                <w:rFonts w:ascii="TH SarabunIT๙" w:hAnsi="TH SarabunIT๙" w:cs="TH SarabunIT๙"/>
+                <w:sz w:val="32"/>
+                <w:szCs w:val="32"/>
+                <w:cs/>
+              </w:rPr>
+            </w:pPr>
+            <w:r>
+              <w:rPr>
+                <w:rFonts w:ascii="TH SarabunIT๙" w:hAnsi="TH SarabunIT๙" w:cs="TH SarabunIT๙"/>
+                <w:sz w:val="32"/>
+                <w:szCs w:val="32"/>
+                <w:cs/>
+              </w:rPr>
+              <w:t>ชั้นอเนกประสงค์ ๓ ช่องโล่ง</w:t>
             </w:r>
           </w:p>
         </w:tc>
@@ -13326,20 +13322,20 @@
             <w:pPr>
               <w:spacing w:after="200" w:line="276" w:lineRule="auto"/>
               <w:rPr>
-                <w:rFonts w:ascii="TH SarabunIT๙" w:hAnsi="TH SarabunIT๙" w:cs="TH SarabunIT๙" w:hint="cs"/>
-                <w:sz w:val="32"/>
-                <w:szCs w:val="32"/>
-                <w:cs/>
-              </w:rPr>
-            </w:pPr>
-            <w:r>
-              <w:rPr>
-                <w:rFonts w:ascii="TH SarabunIT๙" w:hAnsi="TH SarabunIT๙" w:cs="TH SarabunIT๙"/>
-                <w:sz w:val="32"/>
-                <w:szCs w:val="32"/>
-                <w:cs/>
-              </w:rPr>
-              <w:t>ขบ.332/001-012/2569</w:t>
+                <w:rFonts w:ascii="TH SarabunIT๙" w:hAnsi="TH SarabunIT๙" w:cs="TH SarabunIT๙"/>
+                <w:sz w:val="32"/>
+                <w:szCs w:val="32"/>
+                <w:cs/>
+              </w:rPr>
+            </w:pPr>
+            <w:r>
+              <w:rPr>
+                <w:rFonts w:ascii="TH SarabunIT๙" w:hAnsi="TH SarabunIT๙" w:cs="TH SarabunIT๙"/>
+                <w:sz w:val="32"/>
+                <w:szCs w:val="32"/>
+                <w:cs/>
+              </w:rPr>
+              <w:t>ขบ.331/001-002/2569</w:t>
             </w:r>
           </w:p>
         </w:tc>
@@ -13389,7 +13385,7 @@
                 <w:szCs w:val="32"/>
                 <w:cs/>
               </w:rPr>
-              <w:t>๑๒ ตัว</w:t>
+              <w:t>๒ อัน</w:t>
             </w:r>
           </w:p>
         </w:tc>
@@ -13440,7 +13436,7 @@
                 <w:szCs w:val="32"/>
                 <w:cs/>
               </w:rPr>
-              <w:t>๑๒ ตัว</w:t>
+              <w:t>๒ อัน</w:t>
             </w:r>
           </w:p>
         </w:tc>
@@ -13508,7 +13504,7 @@
                 <w:szCs w:val="32"/>
                 <w:cs/>
               </w:rPr>
-              <w:t>ชั้นวางอเนกประสงค์ ๓ ช่องโล่ง</w:t>
+              <w:t>พัดลมติดผนัง ยี่ห้อฮาตาริ ขนาด ๑๘ นิ้ว</w:t>
             </w:r>
           </w:p>
         </w:tc>
@@ -13520,20 +13516,20 @@
             <w:pPr>
               <w:spacing w:after="200" w:line="276" w:lineRule="auto"/>
               <w:rPr>
-                <w:rFonts w:ascii="TH SarabunIT๙" w:hAnsi="TH SarabunIT๙" w:cs="TH SarabunIT๙" w:hint="cs"/>
-                <w:sz w:val="32"/>
-                <w:szCs w:val="32"/>
-                <w:cs/>
-              </w:rPr>
-            </w:pPr>
-            <w:r>
-              <w:rPr>
-                <w:rFonts w:ascii="TH SarabunIT๙" w:hAnsi="TH SarabunIT๙" w:cs="TH SarabunIT๙"/>
-                <w:sz w:val="32"/>
-                <w:szCs w:val="32"/>
-                <w:cs/>
-              </w:rPr>
-              <w:t>ขบ.333/001-006/2569</w:t>
+                <w:rFonts w:ascii="TH SarabunIT๙" w:hAnsi="TH SarabunIT๙" w:cs="TH SarabunIT๙"/>
+                <w:sz w:val="32"/>
+                <w:szCs w:val="32"/>
+                <w:cs/>
+              </w:rPr>
+            </w:pPr>
+            <w:r>
+              <w:rPr>
+                <w:rFonts w:ascii="TH SarabunIT๙" w:hAnsi="TH SarabunIT๙" w:cs="TH SarabunIT๙"/>
+                <w:sz w:val="32"/>
+                <w:szCs w:val="32"/>
+                <w:cs/>
+              </w:rPr>
+              <w:t>ขบ.332/001-012/2569</w:t>
             </w:r>
           </w:p>
         </w:tc>
@@ -13583,7 +13579,7 @@
                 <w:szCs w:val="32"/>
                 <w:cs/>
               </w:rPr>
-              <w:t>๖ ตัว</w:t>
+              <w:t>๑๒ ตัว</w:t>
             </w:r>
           </w:p>
         </w:tc>
@@ -13634,7 +13630,7 @@
                 <w:szCs w:val="32"/>
                 <w:cs/>
               </w:rPr>
-              <w:t>๖ ตัว</w:t>
+              <w:t>๑๒ ตัว</w:t>
             </w:r>
           </w:p>
         </w:tc>
@@ -13690,20 +13686,20 @@
             <w:pPr>
               <w:spacing w:after="200" w:line="276" w:lineRule="auto"/>
               <w:rPr>
-                <w:rFonts w:ascii="TH SarabunIT๙" w:hAnsi="TH SarabunIT๙" w:cs="TH SarabunIT๙" w:hint="cs"/>
-                <w:sz w:val="32"/>
-                <w:szCs w:val="32"/>
-                <w:cs/>
-              </w:rPr>
-            </w:pPr>
-            <w:r>
-              <w:rPr>
-                <w:rFonts w:ascii="TH SarabunIT๙" w:hAnsi="TH SarabunIT๙" w:cs="TH SarabunIT๙"/>
-                <w:sz w:val="32"/>
-                <w:szCs w:val="32"/>
-                <w:cs/>
-              </w:rPr>
-              <w:t>โพเดียมหน้าฉลุ</w:t>
+                <w:rFonts w:ascii="TH SarabunIT๙" w:hAnsi="TH SarabunIT๙" w:cs="TH SarabunIT๙"/>
+                <w:sz w:val="32"/>
+                <w:szCs w:val="32"/>
+                <w:cs/>
+              </w:rPr>
+            </w:pPr>
+            <w:r>
+              <w:rPr>
+                <w:rFonts w:ascii="TH SarabunIT๙" w:hAnsi="TH SarabunIT๙" w:cs="TH SarabunIT๙"/>
+                <w:sz w:val="32"/>
+                <w:szCs w:val="32"/>
+                <w:cs/>
+              </w:rPr>
+              <w:t>ชั้นวางอเนกประสงค์ ๓ ช่องโล่ง</w:t>
             </w:r>
           </w:p>
         </w:tc>
@@ -13715,20 +13711,20 @@
             <w:pPr>
               <w:spacing w:after="200" w:line="276" w:lineRule="auto"/>
               <w:rPr>
-                <w:rFonts w:ascii="TH SarabunIT๙" w:hAnsi="TH SarabunIT๙" w:cs="TH SarabunIT๙" w:hint="cs"/>
-                <w:sz w:val="32"/>
-                <w:szCs w:val="32"/>
-                <w:cs/>
-              </w:rPr>
-            </w:pPr>
-            <w:r>
-              <w:rPr>
-                <w:rFonts w:ascii="TH SarabunIT๙" w:hAnsi="TH SarabunIT๙" w:cs="TH SarabunIT๙"/>
-                <w:sz w:val="32"/>
-                <w:szCs w:val="32"/>
-                <w:cs/>
-              </w:rPr>
-              <w:t>ขบ.334/001/2569</w:t>
+                <w:rFonts w:ascii="TH SarabunIT๙" w:hAnsi="TH SarabunIT๙" w:cs="TH SarabunIT๙"/>
+                <w:sz w:val="32"/>
+                <w:szCs w:val="32"/>
+                <w:cs/>
+              </w:rPr>
+            </w:pPr>
+            <w:r>
+              <w:rPr>
+                <w:rFonts w:ascii="TH SarabunIT๙" w:hAnsi="TH SarabunIT๙" w:cs="TH SarabunIT๙"/>
+                <w:sz w:val="32"/>
+                <w:szCs w:val="32"/>
+                <w:cs/>
+              </w:rPr>
+              <w:t>ขบ.333/001-006/2569</w:t>
             </w:r>
           </w:p>
         </w:tc>
@@ -13778,7 +13774,7 @@
                 <w:szCs w:val="32"/>
                 <w:cs/>
               </w:rPr>
-              <w:t>๑ ตัว</w:t>
+              <w:t>๖ ตัว</w:t>
             </w:r>
           </w:p>
         </w:tc>
@@ -13829,7 +13825,7 @@
                 <w:szCs w:val="32"/>
                 <w:cs/>
               </w:rPr>
-              <w:t>๑ ตัว</w:t>
+              <w:t>๖ ตัว</w:t>
             </w:r>
           </w:p>
         </w:tc>
@@ -13885,20 +13881,20 @@
             <w:pPr>
               <w:spacing w:after="200" w:line="276" w:lineRule="auto"/>
               <w:rPr>
-                <w:rFonts w:ascii="TH SarabunIT๙" w:hAnsi="TH SarabunIT๙" w:cs="TH SarabunIT๙" w:hint="cs"/>
-                <w:sz w:val="32"/>
-                <w:szCs w:val="32"/>
-                <w:cs/>
-              </w:rPr>
-            </w:pPr>
-            <w:r>
-              <w:rPr>
-                <w:rFonts w:ascii="TH SarabunIT๙" w:hAnsi="TH SarabunIT๙" w:cs="TH SarabunIT๙"/>
-                <w:sz w:val="32"/>
-                <w:szCs w:val="32"/>
-                <w:cs/>
-              </w:rPr>
-              <w:t>โพเดียมหน้าทึบ</w:t>
+                <w:rFonts w:ascii="TH SarabunIT๙" w:hAnsi="TH SarabunIT๙" w:cs="TH SarabunIT๙"/>
+                <w:sz w:val="32"/>
+                <w:szCs w:val="32"/>
+                <w:cs/>
+              </w:rPr>
+            </w:pPr>
+            <w:r>
+              <w:rPr>
+                <w:rFonts w:ascii="TH SarabunIT๙" w:hAnsi="TH SarabunIT๙" w:cs="TH SarabunIT๙"/>
+                <w:sz w:val="32"/>
+                <w:szCs w:val="32"/>
+                <w:cs/>
+              </w:rPr>
+              <w:t>โพเดียมหน้าฉลุ</w:t>
             </w:r>
           </w:p>
         </w:tc>
@@ -13910,20 +13906,20 @@
             <w:pPr>
               <w:spacing w:after="200" w:line="276" w:lineRule="auto"/>
               <w:rPr>
-                <w:rFonts w:ascii="TH SarabunIT๙" w:hAnsi="TH SarabunIT๙" w:cs="TH SarabunIT๙" w:hint="cs"/>
-                <w:sz w:val="32"/>
-                <w:szCs w:val="32"/>
-                <w:cs/>
-              </w:rPr>
-            </w:pPr>
-            <w:r>
-              <w:rPr>
-                <w:rFonts w:ascii="TH SarabunIT๙" w:hAnsi="TH SarabunIT๙" w:cs="TH SarabunIT๙"/>
-                <w:sz w:val="32"/>
-                <w:szCs w:val="32"/>
-                <w:cs/>
-              </w:rPr>
-              <w:t>ขบ.334/002/2569</w:t>
+                <w:rFonts w:ascii="TH SarabunIT๙" w:hAnsi="TH SarabunIT๙" w:cs="TH SarabunIT๙"/>
+                <w:sz w:val="32"/>
+                <w:szCs w:val="32"/>
+                <w:cs/>
+              </w:rPr>
+            </w:pPr>
+            <w:r>
+              <w:rPr>
+                <w:rFonts w:ascii="TH SarabunIT๙" w:hAnsi="TH SarabunIT๙" w:cs="TH SarabunIT๙"/>
+                <w:sz w:val="32"/>
+                <w:szCs w:val="32"/>
+                <w:cs/>
+              </w:rPr>
+              <w:t>ขบ.334/001/2569</w:t>
             </w:r>
           </w:p>
         </w:tc>
@@ -14056,9 +14052,10 @@
               <w:spacing w:after="200" w:line="276" w:lineRule="auto"/>
               <w:jc w:val="center"/>
               <w:rPr>
-                <w:rFonts w:ascii="TH SarabunIT๙" w:eastAsia="Calibri" w:hAnsi="TH SarabunIT๙" w:cs="TH SarabunIT๙"/>
-                <w:sz w:val="32"/>
-                <w:szCs w:val="32"/>
+                <w:rFonts w:ascii="TH SarabunIT๙" w:hAnsi="TH SarabunIT๙" w:cs="TH SarabunIT๙"/>
+                <w:sz w:val="32"/>
+                <w:szCs w:val="32"/>
+                <w:cs/>
               </w:rPr>
             </w:pPr>
             <w:r>
@@ -14080,7 +14077,204 @@
             <w:pPr>
               <w:spacing w:after="200" w:line="276" w:lineRule="auto"/>
               <w:rPr>
-                <w:rFonts w:ascii="TH SarabunIT๙" w:hAnsi="TH SarabunIT๙" w:cs="TH SarabunIT๙" w:hint="cs"/>
+                <w:rFonts w:ascii="TH SarabunIT๙" w:hAnsi="TH SarabunIT๙" w:cs="TH SarabunIT๙"/>
+                <w:sz w:val="32"/>
+                <w:szCs w:val="32"/>
+                <w:cs/>
+              </w:rPr>
+            </w:pPr>
+            <w:r>
+              <w:rPr>
+                <w:rFonts w:ascii="TH SarabunIT๙" w:hAnsi="TH SarabunIT๙" w:cs="TH SarabunIT๙"/>
+                <w:sz w:val="32"/>
+                <w:szCs w:val="32"/>
+                <w:cs/>
+              </w:rPr>
+              <w:t>โพเดียมหน้าทึบ</w:t>
+            </w:r>
+          </w:p>
+        </w:tc>
+        <w:tc>
+          <w:tcPr>
+            <w:tcW w:w="983" w:type="pct"/>
+          </w:tcPr>
+          <w:p>
+            <w:pPr>
+              <w:spacing w:after="200" w:line="276" w:lineRule="auto"/>
+              <w:rPr>
+                <w:rFonts w:ascii="TH SarabunIT๙" w:hAnsi="TH SarabunIT๙" w:cs="TH SarabunIT๙"/>
+                <w:sz w:val="32"/>
+                <w:szCs w:val="32"/>
+                <w:cs/>
+              </w:rPr>
+            </w:pPr>
+            <w:r>
+              <w:rPr>
+                <w:rFonts w:ascii="TH SarabunIT๙" w:hAnsi="TH SarabunIT๙" w:cs="TH SarabunIT๙"/>
+                <w:sz w:val="32"/>
+                <w:szCs w:val="32"/>
+                <w:cs/>
+              </w:rPr>
+              <w:t>ขบ.334/002/2569</w:t>
+            </w:r>
+          </w:p>
+        </w:tc>
+        <w:tc>
+          <w:tcPr>
+            <w:tcW w:w="696" w:type="pct"/>
+          </w:tcPr>
+          <w:p>
+            <w:pPr>
+              <w:spacing w:after="200" w:line="276" w:lineRule="auto"/>
+              <w:jc w:val="center"/>
+              <w:rPr>
+                <w:rFonts w:ascii="TH SarabunIT๙" w:hAnsi="TH SarabunIT๙" w:cs="TH SarabunIT๙"/>
+                <w:sz w:val="32"/>
+                <w:szCs w:val="32"/>
+                <w:cs/>
+              </w:rPr>
+            </w:pPr>
+            <w:r>
+              <w:rPr>
+                <w:rFonts w:ascii="TH SarabunIT๙" w:hAnsi="TH SarabunIT๙" w:cs="TH SarabunIT๙"/>
+                <w:sz w:val="32"/>
+                <w:szCs w:val="32"/>
+                <w:cs/>
+              </w:rPr>
+              <w:t>-</w:t>
+            </w:r>
+          </w:p>
+        </w:tc>
+        <w:tc>
+          <w:tcPr>
+            <w:tcW w:w="474" w:type="pct"/>
+          </w:tcPr>
+          <w:p>
+            <w:pPr>
+              <w:jc w:val="center"/>
+              <w:rPr>
+                <w:rFonts w:ascii="TH SarabunIT๙" w:hAnsi="TH SarabunIT๙" w:cs="TH SarabunIT๙"/>
+                <w:sz w:val="32"/>
+                <w:szCs w:val="32"/>
+                <w:cs/>
+              </w:rPr>
+            </w:pPr>
+            <w:r>
+              <w:rPr>
+                <w:rFonts w:ascii="TH SarabunIT๙" w:hAnsi="TH SarabunIT๙" w:cs="TH SarabunIT๙"/>
+                <w:sz w:val="32"/>
+                <w:szCs w:val="32"/>
+                <w:cs/>
+              </w:rPr>
+              <w:t>๑ ตัว</w:t>
+            </w:r>
+          </w:p>
+        </w:tc>
+        <w:tc>
+          <w:tcPr>
+            <w:tcW w:w="511" w:type="pct"/>
+          </w:tcPr>
+          <w:p>
+            <w:pPr>
+              <w:jc w:val="center"/>
+              <w:rPr>
+                <w:rFonts w:ascii="TH SarabunIT๙" w:hAnsi="TH SarabunIT๙" w:cs="TH SarabunIT๙"/>
+                <w:sz w:val="32"/>
+                <w:szCs w:val="32"/>
+                <w:cs/>
+              </w:rPr>
+            </w:pPr>
+            <w:r>
+              <w:rPr>
+                <w:rFonts w:ascii="TH SarabunIT๙" w:hAnsi="TH SarabunIT๙" w:cs="TH SarabunIT๙"/>
+                <w:sz w:val="32"/>
+                <w:szCs w:val="32"/>
+                <w:cs/>
+              </w:rPr>
+              <w:t>-</w:t>
+            </w:r>
+          </w:p>
+        </w:tc>
+        <w:tc>
+          <w:tcPr>
+            <w:tcW w:w="488" w:type="pct"/>
+          </w:tcPr>
+          <w:p>
+            <w:pPr>
+              <w:spacing w:after="200" w:line="276" w:lineRule="auto"/>
+              <w:jc w:val="center"/>
+              <w:rPr>
+                <w:rFonts w:ascii="TH SarabunIT๙" w:hAnsi="TH SarabunIT๙" w:cs="TH SarabunIT๙"/>
+                <w:sz w:val="32"/>
+                <w:szCs w:val="32"/>
+                <w:cs/>
+              </w:rPr>
+            </w:pPr>
+            <w:r>
+              <w:rPr>
+                <w:rFonts w:ascii="TH SarabunIT๙" w:hAnsi="TH SarabunIT๙" w:cs="TH SarabunIT๙"/>
+                <w:sz w:val="32"/>
+                <w:szCs w:val="32"/>
+                <w:cs/>
+              </w:rPr>
+              <w:t>๑ ตัว</w:t>
+            </w:r>
+          </w:p>
+        </w:tc>
+        <w:tc>
+          <w:tcPr>
+            <w:tcW w:w="469" w:type="pct"/>
+          </w:tcPr>
+          <w:p>
+            <w:pPr>
+              <w:rPr>
+                <w:rFonts w:ascii="TH SarabunIT๙" w:eastAsia="Calibri" w:hAnsi="TH SarabunIT๙" w:cs="TH SarabunIT๙"/>
+                <w:sz w:val="32"/>
+                <w:szCs w:val="32"/>
+              </w:rPr>
+            </w:pPr>
+          </w:p>
+        </w:tc>
+      </w:tr>
+      <w:tr>
+        <w:trPr>
+          <w:trHeight w:val="739"/>
+        </w:trPr>
+        <w:tc>
+          <w:tcPr>
+            <w:tcW w:w="387" w:type="pct"/>
+          </w:tcPr>
+          <w:p>
+            <w:pPr>
+              <w:spacing w:after="200" w:line="276" w:lineRule="auto"/>
+              <w:jc w:val="center"/>
+              <w:rPr>
+                <w:rFonts w:ascii="TH SarabunIT๙" w:hAnsi="TH SarabunIT๙" w:cs="TH SarabunIT๙"/>
+                <w:sz w:val="32"/>
+                <w:szCs w:val="32"/>
+                <w:cs/>
+              </w:rPr>
+            </w:pPr>
+            <w:r>
+              <w:rPr>
+                <w:rFonts w:ascii="TH SarabunIT๙" w:hAnsi="TH SarabunIT๙" w:cs="TH SarabunIT๙"/>
+                <w:sz w:val="32"/>
+                <w:szCs w:val="32"/>
+                <w:cs/>
+              </w:rPr>
+              <w:t>๑๓</w:t>
+            </w:r>
+          </w:p>
+        </w:tc>
+        <w:tc>
+          <w:tcPr>
+            <w:tcW w:w="992" w:type="pct"/>
+          </w:tcPr>
+          <w:p>
+            <w:pPr>
+              <w:spacing w:after="200" w:line="276" w:lineRule="auto"/>
+              <w:rPr>
+                <w:rFonts w:ascii="TH SarabunIT๙" w:hAnsi="TH SarabunIT๙" w:cs="TH SarabunIT๙"/>
                 <w:sz w:val="32"/>
                 <w:szCs w:val="32"/>
                 <w:cs/>
@@ -14105,7 +14299,7 @@
             <w:pPr>
               <w:spacing w:after="200" w:line="276" w:lineRule="auto"/>
               <w:rPr>
-                <w:rFonts w:ascii="TH SarabunIT๙" w:hAnsi="TH SarabunIT๙" w:cs="TH SarabunIT๙" w:hint="cs"/>
+                <w:rFonts w:ascii="TH SarabunIT๙" w:hAnsi="TH SarabunIT๙" w:cs="TH SarabunIT๙"/>
                 <w:sz w:val="32"/>
                 <w:szCs w:val="32"/>
                 <w:cs/>
@@ -14159,6 +14353,7 @@
                 <w:rFonts w:ascii="TH SarabunIT๙" w:hAnsi="TH SarabunIT๙" w:cs="TH SarabunIT๙"/>
                 <w:sz w:val="32"/>
                 <w:szCs w:val="32"/>
+                <w:cs/>
               </w:rPr>
             </w:pPr>
             <w:r>
@@ -14242,9 +14437,10 @@
     <w:p>
       <w:pPr>
         <w:rPr>
-          <w:rFonts w:ascii="TH SarabunIT๙" w:eastAsia="Calibri" w:hAnsi="TH SarabunIT๙" w:cs="TH SarabunIT๙"/>
+          <w:rFonts w:ascii="TH SarabunIT๙" w:eastAsia="Calibri" w:hAnsi="TH SarabunIT๙" w:cs="TH SarabunIT๙" w:hint="cs"/>
           <w:sz w:val="32"/>
           <w:szCs w:val="32"/>
+          <w:cs/>
         </w:rPr>
       </w:pPr>
     </w:p>
@@ -14640,16 +14836,7 @@
                           <w:szCs w:val="32"/>
                           <w:cs/>
                         </w:rPr>
-                        <w:t xml:space="preserve"> </w:t>
-                      </w:r>
-                      <w:r>
-                        <w:rPr>
-                          <w:rFonts w:ascii="TH SarabunIT๙" w:hAnsi="TH SarabunIT๙" w:cs="TH SarabunIT๙" w:hint="cs"/>
-                          <w:sz w:val="32"/>
-                          <w:szCs w:val="32"/>
-                          <w:cs/>
-                        </w:rPr>
-                        <w:t>นางสาวนรินทร</w:t>
+                        <w:t xml:space="preserve"> นางสาวนรินทร</w:t>
                       </w:r>
                       <w:r>
                         <w:rPr>
@@ -15556,7 +15743,6 @@
   <w:style w:type="character" w:default="1" w:styleId="a0">
     <w:name w:val="Default Paragraph Font"/>
     <w:uiPriority w:val="1"/>
-    <w:semiHidden/>
     <w:unhideWhenUsed/>
   </w:style>
   <w:style w:type="table" w:default="1" w:styleId="a1">

</xml_diff>

<commit_message>
Use full HP EliteDesk set name in quotation and document No. 3
Co-Authored-By: Claude Opus 5.5 <noreply@anthropic.com>
Claude-Session: https://claude.ai/code/session_01CLAnyDuhFnWhH7sKpyCM9s
</commit_message>
<xml_diff>
--- a/เอกสารหมายเลข3.docx
+++ b/เอกสารหมายเลข3.docx
@@ -5565,7 +5565,7 @@
                 <w:szCs w:val="32"/>
                 <w:cs/>
               </w:rPr>
-              <w:t>เครื่องคอมพิวเตอร์ตั้งโต๊ะ ยี่ห้อ HP รุ่น EliteDesk 705 G2 SFF</w:t>
+              <w:t>เครื่องคอมพิวเตอร์ตั้งโต๊ะ ยี่ห้อ HP รุ่น EliteDesk 705 G2 SFF พร้อมอุปกรณ์ประกอบ ได้แก่ จอภาพคอมพิวเตอร์ ยี่ห้อ HP รุ่น V1936 จำนวน ๑๐ จอ รุ่น V242 จำนวน ๑๐ จอ แป้นพิมพ์ (Keyboard) รุ่น KU-1156 จำนวน ๒๐ ตัว และเมาส์ ยี่ห้อ HP จำนวน ๒๐ ตัว</w:t>
             </w:r>
           </w:p>
         </w:tc>
@@ -5815,7 +5815,7 @@
                 <w:szCs w:val="32"/>
                 <w:cs/>
               </w:rPr>
-              <w:t>เครื่องคอมพิวเตอร์ตั้งโต๊ะ ยี่ห้อ HP รุ่น EliteDesk 705 G2 SFF</w:t>
+              <w:t>เครื่องคอมพิวเตอร์ตั้งโต๊ะ ยี่ห้อ HP รุ่น EliteDesk 705 G2 SFF พร้อมอุปกรณ์ประกอบ ได้แก่ จอภาพคอมพิวเตอร์ ยี่ห้อ HP รุ่น V1936 จำนวน ๑๐ จอ รุ่น V242 จำนวน ๑๐ จอ แป้นพิมพ์ (Keyboard) รุ่น KU-1156 จำนวน ๒๐ ตัว และเมาส์ ยี่ห้อ HP จำนวน ๒๐ ตัว</w:t>
             </w:r>
           </w:p>
         </w:tc>
@@ -6067,7 +6067,7 @@
                 <w:szCs w:val="32"/>
                 <w:cs/>
               </w:rPr>
-              <w:t>เครื่องคอมพิวเตอร์ตั้งโต๊ะ ยี่ห้อ HP รุ่น EliteDesk 705 G2 SFF</w:t>
+              <w:t>เครื่องคอมพิวเตอร์ตั้งโต๊ะ ยี่ห้อ HP รุ่น EliteDesk 705 G2 SFF พร้อมอุปกรณ์ประกอบ ได้แก่ จอภาพคอมพิวเตอร์ ยี่ห้อ HP รุ่น V1936 จำนวน ๑๐ จอ รุ่น V242 จำนวน ๑๐ จอ แป้นพิมพ์ (Keyboard) รุ่น KU-1156 จำนวน ๒๐ ตัว และเมาส์ ยี่ห้อ HP จำนวน ๒๐ ตัว</w:t>
             </w:r>
           </w:p>
         </w:tc>
@@ -6573,7 +6573,7 @@
                 <w:szCs w:val="32"/>
                 <w:cs/>
               </w:rPr>
-              <w:t>เครื่องคอมพิวเตอร์ตั้งโต๊ะ ยี่ห้อ HP รุ่น EliteDesk 705 G2 SFF</w:t>
+              <w:t>เครื่องคอมพิวเตอร์ตั้งโต๊ะ ยี่ห้อ HP รุ่น EliteDesk 705 G2 SFF พร้อมอุปกรณ์ประกอบ ได้แก่ จอภาพคอมพิวเตอร์ ยี่ห้อ HP รุ่น V1936 จำนวน ๑๐ จอ รุ่น V242 จำนวน ๑๐ จอ แป้นพิมพ์ (Keyboard) รุ่น KU-1156 จำนวน ๒๐ ตัว และเมาส์ ยี่ห้อ HP จำนวน ๒๐ ตัว</w:t>
             </w:r>
           </w:p>
         </w:tc>
@@ -6826,7 +6826,7 @@
                 <w:szCs w:val="32"/>
                 <w:cs/>
               </w:rPr>
-              <w:t>เครื่องคอมพิวเตอร์ตั้งโต๊ะ ยี่ห้อ HP รุ่น EliteDesk 705 G2 SFF</w:t>
+              <w:t>เครื่องคอมพิวเตอร์ตั้งโต๊ะ ยี่ห้อ HP รุ่น EliteDesk 705 G2 SFF พร้อมอุปกรณ์ประกอบ ได้แก่ จอภาพคอมพิวเตอร์ ยี่ห้อ HP รุ่น V1936 จำนวน ๑๐ จอ รุ่น V242 จำนวน ๑๐ จอ แป้นพิมพ์ (Keyboard) รุ่น KU-1156 จำนวน ๒๐ ตัว และเมาส์ ยี่ห้อ HP จำนวน ๒๐ ตัว</w:t>
             </w:r>
           </w:p>
         </w:tc>
@@ -7080,7 +7080,7 @@
                 <w:szCs w:val="32"/>
                 <w:cs/>
               </w:rPr>
-              <w:t>เครื่องคอมพิวเตอร์ตั้งโต๊ะ ยี่ห้อ HP รุ่น EliteDesk 705 G2 SFF</w:t>
+              <w:t>เครื่องคอมพิวเตอร์ตั้งโต๊ะ ยี่ห้อ HP รุ่น EliteDesk 705 G2 SFF พร้อมอุปกรณ์ประกอบ ได้แก่ จอภาพคอมพิวเตอร์ ยี่ห้อ HP รุ่น V1936 จำนวน ๑๐ จอ รุ่น V242 จำนวน ๑๐ จอ แป้นพิมพ์ (Keyboard) รุ่น KU-1156 จำนวน ๒๐ ตัว และเมาส์ ยี่ห้อ HP จำนวน ๒๐ ตัว</w:t>
             </w:r>
           </w:p>
         </w:tc>
@@ -7333,7 +7333,7 @@
                 <w:szCs w:val="32"/>
                 <w:cs/>
               </w:rPr>
-              <w:t>เครื่องคอมพิวเตอร์ตั้งโต๊ะ ยี่ห้อ HP รุ่น EliteDesk 705 G2 SFF</w:t>
+              <w:t>เครื่องคอมพิวเตอร์ตั้งโต๊ะ ยี่ห้อ HP รุ่น EliteDesk 705 G2 SFF พร้อมอุปกรณ์ประกอบ ได้แก่ จอภาพคอมพิวเตอร์ ยี่ห้อ HP รุ่น V1936 จำนวน ๑๐ จอ รุ่น V242 จำนวน ๑๐ จอ แป้นพิมพ์ (Keyboard) รุ่น KU-1156 จำนวน ๒๐ ตัว และเมาส์ ยี่ห้อ HP จำนวน ๒๐ ตัว</w:t>
             </w:r>
           </w:p>
         </w:tc>
@@ -7587,7 +7587,7 @@
                 <w:szCs w:val="32"/>
                 <w:cs/>
               </w:rPr>
-              <w:t>เครื่องคอมพิวเตอร์ตั้งโต๊ะ ยี่ห้อ HP รุ่น EliteDesk 705 G2 SFF</w:t>
+              <w:t>เครื่องคอมพิวเตอร์ตั้งโต๊ะ ยี่ห้อ HP รุ่น EliteDesk 705 G2 SFF พร้อมอุปกรณ์ประกอบ ได้แก่ จอภาพคอมพิวเตอร์ ยี่ห้อ HP รุ่น V1936 จำนวน ๑๐ จอ รุ่น V242 จำนวน ๑๐ จอ แป้นพิมพ์ (Keyboard) รุ่น KU-1156 จำนวน ๒๐ ตัว และเมาส์ ยี่ห้อ HP จำนวน ๒๐ ตัว</w:t>
             </w:r>
           </w:p>
         </w:tc>
@@ -7841,7 +7841,7 @@
                 <w:szCs w:val="32"/>
                 <w:cs/>
               </w:rPr>
-              <w:t>เครื่องคอมพิวเตอร์ตั้งโต๊ะ ยี่ห้อ HP รุ่น EliteDesk 705 G2 SFF</w:t>
+              <w:t>เครื่องคอมพิวเตอร์ตั้งโต๊ะ ยี่ห้อ HP รุ่น EliteDesk 705 G2 SFF พร้อมอุปกรณ์ประกอบ ได้แก่ จอภาพคอมพิวเตอร์ ยี่ห้อ HP รุ่น V1936 จำนวน ๑๐ จอ รุ่น V242 จำนวน ๑๐ จอ แป้นพิมพ์ (Keyboard) รุ่น KU-1156 จำนวน ๒๐ ตัว และเมาส์ ยี่ห้อ HP จำนวน ๒๐ ตัว</w:t>
             </w:r>
           </w:p>
         </w:tc>
@@ -8094,7 +8094,7 @@
                 <w:szCs w:val="32"/>
                 <w:cs/>
               </w:rPr>
-              <w:t>เครื่องคอมพิวเตอร์ตั้งโต๊ะ ยี่ห้อ HP รุ่น EliteDesk 705 G2 SFF</w:t>
+              <w:t>เครื่องคอมพิวเตอร์ตั้งโต๊ะ ยี่ห้อ HP รุ่น EliteDesk 705 G2 SFF พร้อมอุปกรณ์ประกอบ ได้แก่ จอภาพคอมพิวเตอร์ ยี่ห้อ HP รุ่น V1936 จำนวน ๑๐ จอ รุ่น V242 จำนวน ๑๐ จอ แป้นพิมพ์ (Keyboard) รุ่น KU-1156 จำนวน ๒๐ ตัว และเมาส์ ยี่ห้อ HP จำนวน ๒๐ ตัว</w:t>
             </w:r>
           </w:p>
         </w:tc>
@@ -8347,7 +8347,7 @@
                 <w:szCs w:val="32"/>
                 <w:cs/>
               </w:rPr>
-              <w:t>เครื่องคอมพิวเตอร์ตั้งโต๊ะ ยี่ห้อ HP รุ่น EliteDesk 705 G2 SFF</w:t>
+              <w:t>เครื่องคอมพิวเตอร์ตั้งโต๊ะ ยี่ห้อ HP รุ่น EliteDesk 705 G2 SFF พร้อมอุปกรณ์ประกอบ ได้แก่ จอภาพคอมพิวเตอร์ ยี่ห้อ HP รุ่น V1936 จำนวน ๑๐ จอ รุ่น V242 จำนวน ๑๐ จอ แป้นพิมพ์ (Keyboard) รุ่น KU-1156 จำนวน ๒๐ ตัว และเมาส์ ยี่ห้อ HP จำนวน ๒๐ ตัว</w:t>
             </w:r>
           </w:p>
         </w:tc>
@@ -8600,7 +8600,7 @@
                 <w:szCs w:val="32"/>
                 <w:cs/>
               </w:rPr>
-              <w:t>เครื่องคอมพิวเตอร์ตั้งโต๊ะ ยี่ห้อ HP รุ่น EliteDesk 705 G2 SFF</w:t>
+              <w:t>เครื่องคอมพิวเตอร์ตั้งโต๊ะ ยี่ห้อ HP รุ่น EliteDesk 705 G2 SFF พร้อมอุปกรณ์ประกอบ ได้แก่ จอภาพคอมพิวเตอร์ ยี่ห้อ HP รุ่น V1936 จำนวน ๑๐ จอ รุ่น V242 จำนวน ๑๐ จอ แป้นพิมพ์ (Keyboard) รุ่น KU-1156 จำนวน ๒๐ ตัว และเมาส์ ยี่ห้อ HP จำนวน ๒๐ ตัว</w:t>
             </w:r>
           </w:p>
         </w:tc>

</xml_diff>

<commit_message>
Document No. 3: repeat item name on every row (undo cell merge)
Co-Authored-By: Claude Opus 5.5 <noreply@anthropic.com>
Claude-Session: https://claude.ai/code/session_01CLAnyDuhFnWhH7sKpyCM9s
</commit_message>
<xml_diff>
--- a/เอกสารหมายเลข3.docx
+++ b/เอกสารหมายเลข3.docx
@@ -890,8 +890,6 @@
         <w:tc>
           <w:tcPr>
             <w:tcW w:w="0" w:type="auto"/>
-            <w:vMerge w:val="restart"/>
-            <w:vAlign w:val="top"/>
           </w:tcPr>
           <w:p>
             <w:pPr>
@@ -1157,249 +1155,6 @@
         <w:tc>
           <w:tcPr>
             <w:tcW w:w="0" w:type="auto"/>
-            <w:vMerge/>
-          </w:tcPr>
-          <w:p/>
-        </w:tc>
-        <w:tc>
-          <w:tcPr>
-            <w:tcW w:w="0" w:type="auto"/>
-          </w:tcPr>
-          <w:p>
-            <w:pPr>
-              <w:jc w:val="center"/>
-              <w:rPr>
-                <w:rFonts w:ascii="TH SarabunIT๙" w:eastAsia="Calibri" w:hAnsi="TH SarabunIT๙" w:cs="TH SarabunIT๙"/>
-                <w:sz w:val="32"/>
-                <w:szCs w:val="32"/>
-              </w:rPr>
-            </w:pPr>
-            <w:r>
-              <w:rPr>
-                <w:rFonts w:ascii="TH SarabunIT๙" w:eastAsia="Calibri" w:hAnsi="TH SarabunIT๙" w:cs="TH SarabunIT๙"/>
-                <w:sz w:val="32"/>
-                <w:szCs w:val="32"/>
-                <w:cs/>
-              </w:rPr>
-              <w:t>ขบ.170/149/2556</w:t>
-            </w:r>
-          </w:p>
-        </w:tc>
-        <w:tc>
-          <w:tcPr>
-            <w:tcW w:w="0" w:type="auto"/>
-          </w:tcPr>
-          <w:p>
-            <w:pPr>
-              <w:jc w:val="center"/>
-              <w:rPr>
-                <w:rFonts w:ascii="TH SarabunIT๙" w:eastAsia="Calibri" w:hAnsi="TH SarabunIT๙" w:cs="TH SarabunIT๙"/>
-                <w:sz w:val="32"/>
-                <w:szCs w:val="32"/>
-                <w:cs/>
-              </w:rPr>
-            </w:pPr>
-            <w:r>
-              <w:rPr>
-                <w:rFonts w:ascii="Segoe UI Symbol" w:eastAsia="Calibri" w:hAnsi="Segoe UI Symbol" w:cs="Segoe UI Symbol" w:hint="cs"/>
-                <w:sz w:val="32"/>
-                <w:szCs w:val="32"/>
-                <w:cs/>
-              </w:rPr>
-              <w:t>✓</w:t>
-            </w:r>
-          </w:p>
-        </w:tc>
-        <w:tc>
-          <w:tcPr>
-            <w:tcW w:w="0" w:type="auto"/>
-          </w:tcPr>
-          <w:p>
-            <w:pPr>
-              <w:jc w:val="center"/>
-              <w:rPr>
-                <w:rFonts w:ascii="TH SarabunIT๙" w:eastAsia="Calibri" w:hAnsi="TH SarabunIT๙" w:cs="TH SarabunIT๙"/>
-                <w:sz w:val="32"/>
-                <w:szCs w:val="32"/>
-                <w:cs/>
-              </w:rPr>
-            </w:pPr>
-            <w:r>
-              <w:rPr>
-                <w:rFonts w:ascii="Segoe UI Symbol" w:eastAsia="Calibri" w:hAnsi="Segoe UI Symbol" w:cs="Segoe UI Symbol" w:hint="cs"/>
-                <w:sz w:val="32"/>
-                <w:szCs w:val="32"/>
-                <w:cs/>
-              </w:rPr>
-              <w:t>✓</w:t>
-            </w:r>
-          </w:p>
-        </w:tc>
-        <w:tc>
-          <w:tcPr>
-            <w:tcW w:w="0" w:type="auto"/>
-          </w:tcPr>
-          <w:p>
-            <w:pPr>
-              <w:jc w:val="center"/>
-              <w:rPr>
-                <w:rFonts w:ascii="TH SarabunIT๙" w:eastAsia="Calibri" w:hAnsi="TH SarabunIT๙" w:cs="TH SarabunIT๙"/>
-                <w:sz w:val="32"/>
-                <w:szCs w:val="32"/>
-                <w:cs/>
-              </w:rPr>
-            </w:pPr>
-          </w:p>
-        </w:tc>
-        <w:tc>
-          <w:tcPr>
-            <w:tcW w:w="0" w:type="auto"/>
-          </w:tcPr>
-          <w:p>
-            <w:pPr>
-              <w:jc w:val="center"/>
-              <w:rPr>
-                <w:rFonts w:ascii="TH SarabunIT๙" w:eastAsia="Calibri" w:hAnsi="TH SarabunIT๙" w:cs="TH SarabunIT๙"/>
-                <w:sz w:val="32"/>
-                <w:szCs w:val="32"/>
-                <w:cs/>
-              </w:rPr>
-            </w:pPr>
-            <w:r>
-              <w:rPr>
-                <w:rFonts w:ascii="TH SarabunIT๙" w:eastAsia="Calibri" w:hAnsi="TH SarabunIT๙" w:cs="TH SarabunIT๙"/>
-                <w:sz w:val="32"/>
-                <w:szCs w:val="32"/>
-                <w:cs/>
-              </w:rPr>
-              <w:t>ชำรุด เสื่อมสภาพ</w:t>
-            </w:r>
-          </w:p>
-        </w:tc>
-        <w:tc>
-          <w:tcPr>
-            <w:tcW w:w="0" w:type="auto"/>
-          </w:tcPr>
-          <w:p>
-            <w:pPr>
-              <w:jc w:val="center"/>
-              <w:rPr>
-                <w:rFonts w:ascii="TH SarabunIT๙" w:eastAsia="Calibri" w:hAnsi="TH SarabunIT๙" w:cs="TH SarabunIT๙"/>
-                <w:sz w:val="32"/>
-                <w:szCs w:val="32"/>
-                <w:cs/>
-              </w:rPr>
-            </w:pPr>
-          </w:p>
-        </w:tc>
-        <w:tc>
-          <w:tcPr>
-            <w:tcW w:w="0" w:type="auto"/>
-          </w:tcPr>
-          <w:p>
-            <w:pPr>
-              <w:jc w:val="center"/>
-              <w:rPr>
-                <w:rFonts w:ascii="TH SarabunIT๙" w:eastAsia="Calibri" w:hAnsi="TH SarabunIT๙" w:cs="TH SarabunIT๙"/>
-                <w:sz w:val="32"/>
-                <w:szCs w:val="32"/>
-                <w:cs/>
-              </w:rPr>
-            </w:pPr>
-            <w:r>
-              <w:rPr>
-                <w:rFonts w:ascii="TH SarabunIT๙" w:eastAsia="Calibri" w:hAnsi="TH SarabunIT๙" w:cs="TH SarabunIT๙"/>
-                <w:sz w:val="32"/>
-                <w:szCs w:val="32"/>
-                <w:cs/>
-              </w:rPr>
-              <w:t>2556</w:t>
-            </w:r>
-          </w:p>
-        </w:tc>
-        <w:tc>
-          <w:tcPr>
-            <w:tcW w:w="0" w:type="auto"/>
-          </w:tcPr>
-          <w:p>
-            <w:pPr>
-              <w:jc w:val="center"/>
-              <w:rPr>
-                <w:rFonts w:ascii="TH SarabunIT๙" w:eastAsia="Calibri" w:hAnsi="TH SarabunIT๙" w:cs="TH SarabunIT๙"/>
-                <w:sz w:val="32"/>
-                <w:szCs w:val="32"/>
-                <w:cs/>
-              </w:rPr>
-            </w:pPr>
-          </w:p>
-        </w:tc>
-        <w:tc>
-          <w:tcPr>
-            <w:tcW w:w="0" w:type="auto"/>
-          </w:tcPr>
-          <w:p>
-            <w:pPr>
-              <w:jc w:val="center"/>
-              <w:rPr>
-                <w:rFonts w:ascii="TH SarabunIT๙" w:eastAsia="Calibri" w:hAnsi="TH SarabunIT๙" w:cs="TH SarabunIT๙"/>
-                <w:sz w:val="32"/>
-                <w:szCs w:val="32"/>
-              </w:rPr>
-            </w:pPr>
-          </w:p>
-        </w:tc>
-        <w:tc>
-          <w:tcPr>
-            <w:tcW w:w="0" w:type="auto"/>
-          </w:tcPr>
-          <w:p>
-            <w:pPr>
-              <w:rPr>
-                <w:rFonts w:ascii="TH SarabunIT๙" w:eastAsia="Calibri" w:hAnsi="TH SarabunIT๙" w:cs="TH SarabunIT๙"/>
-                <w:sz w:val="32"/>
-                <w:szCs w:val="32"/>
-              </w:rPr>
-            </w:pPr>
-            <w:r>
-              <w:rPr>
-                <w:rFonts w:ascii="TH SarabunIT๙" w:eastAsia="Calibri" w:hAnsi="TH SarabunIT๙" w:cs="TH SarabunIT๙"/>
-                <w:sz w:val="32"/>
-                <w:szCs w:val="32"/>
-                <w:cs/>
-              </w:rPr>
-              <w:t>ชำรุดและเสื่อมสภาพตามอายุการใช้งาน ใช้งานไม่ปลอดภัย ซ่อมแซมไม่คุ้มค่า</w:t>
-            </w:r>
-          </w:p>
-        </w:tc>
-      </w:tr>
-      <w:tr>
-        <w:tc>
-          <w:tcPr>
-            <w:tcW w:w="0" w:type="auto"/>
-          </w:tcPr>
-          <w:p>
-            <w:pPr>
-              <w:jc w:val="center"/>
-              <w:rPr>
-                <w:rFonts w:ascii="TH SarabunIT๙" w:eastAsia="Calibri" w:hAnsi="TH SarabunIT๙" w:cs="TH SarabunIT๙"/>
-                <w:sz w:val="32"/>
-                <w:szCs w:val="32"/>
-              </w:rPr>
-            </w:pPr>
-            <w:r>
-              <w:rPr>
-                <w:rFonts w:ascii="TH SarabunIT๙" w:eastAsia="Calibri" w:hAnsi="TH SarabunIT๙" w:cs="TH SarabunIT๙"/>
-                <w:sz w:val="32"/>
-                <w:szCs w:val="32"/>
-                <w:cs/>
-              </w:rPr>
-              <w:t>๔</w:t>
-            </w:r>
-          </w:p>
-        </w:tc>
-        <w:tc>
-          <w:tcPr>
-            <w:tcW w:w="0" w:type="auto"/>
           </w:tcPr>
           <w:p>
             <w:pPr>
@@ -1422,31 +1177,31 @@
                 <w:szCs w:val="32"/>
                 <w:cs/>
               </w:rPr>
-              <w:t>เครื่องคอมพิวเตอร์ตั้งโต๊ะ ยี่ห้อ Acer รุ่น Aspire TC-780 Series</w:t>
-            </w:r>
-          </w:p>
-        </w:tc>
-        <w:tc>
-          <w:tcPr>
-            <w:tcW w:w="0" w:type="auto"/>
-          </w:tcPr>
-          <w:p>
-            <w:pPr>
-              <w:jc w:val="center"/>
-              <w:rPr>
-                <w:rFonts w:ascii="TH SarabunIT๙" w:eastAsia="Calibri" w:hAnsi="TH SarabunIT๙" w:cs="TH SarabunIT๙"/>
-                <w:sz w:val="32"/>
-                <w:szCs w:val="32"/>
-              </w:rPr>
-            </w:pPr>
-            <w:r>
-              <w:rPr>
-                <w:rFonts w:ascii="TH SarabunIT๙" w:eastAsia="Calibri" w:hAnsi="TH SarabunIT๙" w:cs="TH SarabunIT๙"/>
-                <w:sz w:val="32"/>
-                <w:szCs w:val="32"/>
-                <w:cs/>
-              </w:rPr>
-              <w:t>ขบ.267/001/2562</w:t>
+              <w:t>เก้าอี้พลาสติกมีพนักพิง</w:t>
+            </w:r>
+          </w:p>
+        </w:tc>
+        <w:tc>
+          <w:tcPr>
+            <w:tcW w:w="0" w:type="auto"/>
+          </w:tcPr>
+          <w:p>
+            <w:pPr>
+              <w:jc w:val="center"/>
+              <w:rPr>
+                <w:rFonts w:ascii="TH SarabunIT๙" w:eastAsia="Calibri" w:hAnsi="TH SarabunIT๙" w:cs="TH SarabunIT๙"/>
+                <w:sz w:val="32"/>
+                <w:szCs w:val="32"/>
+              </w:rPr>
+            </w:pPr>
+            <w:r>
+              <w:rPr>
+                <w:rFonts w:ascii="TH SarabunIT๙" w:eastAsia="Calibri" w:hAnsi="TH SarabunIT๙" w:cs="TH SarabunIT๙"/>
+                <w:sz w:val="32"/>
+                <w:szCs w:val="32"/>
+                <w:cs/>
+              </w:rPr>
+              <w:t>ขบ.170/149/2556</w:t>
             </w:r>
           </w:p>
         </w:tc>
@@ -1489,141 +1244,150 @@
                 <w:cs/>
               </w:rPr>
             </w:pPr>
-          </w:p>
-        </w:tc>
-        <w:tc>
-          <w:tcPr>
-            <w:tcW w:w="0" w:type="auto"/>
-          </w:tcPr>
-          <w:p>
-            <w:pPr>
-              <w:jc w:val="center"/>
-              <w:rPr>
-                <w:rFonts w:ascii="TH SarabunIT๙" w:eastAsia="Calibri" w:hAnsi="TH SarabunIT๙" w:cs="TH SarabunIT๙"/>
-                <w:sz w:val="32"/>
-                <w:szCs w:val="32"/>
-                <w:cs/>
-              </w:rPr>
-            </w:pPr>
-          </w:p>
-        </w:tc>
-        <w:tc>
-          <w:tcPr>
-            <w:tcW w:w="0" w:type="auto"/>
-          </w:tcPr>
-          <w:p>
-            <w:pPr>
-              <w:jc w:val="center"/>
-              <w:rPr>
-                <w:rFonts w:ascii="TH SarabunIT๙" w:eastAsia="Calibri" w:hAnsi="TH SarabunIT๙" w:cs="TH SarabunIT๙"/>
-                <w:sz w:val="32"/>
-                <w:szCs w:val="32"/>
-                <w:cs/>
-              </w:rPr>
-            </w:pPr>
-            <w:r>
-              <w:rPr>
-                <w:rFonts w:ascii="TH SarabunIT๙" w:eastAsia="Calibri" w:hAnsi="TH SarabunIT๙" w:cs="TH SarabunIT๙"/>
-                <w:sz w:val="32"/>
-                <w:szCs w:val="32"/>
-                <w:cs/>
-              </w:rPr>
-              <w:t>ใช้งานไม่ได้</w:t>
-            </w:r>
-          </w:p>
-        </w:tc>
-        <w:tc>
-          <w:tcPr>
-            <w:tcW w:w="0" w:type="auto"/>
-          </w:tcPr>
-          <w:p>
-            <w:pPr>
-              <w:jc w:val="center"/>
-              <w:rPr>
-                <w:rFonts w:ascii="TH SarabunIT๙" w:eastAsia="Calibri" w:hAnsi="TH SarabunIT๙" w:cs="TH SarabunIT๙"/>
-                <w:sz w:val="32"/>
-                <w:szCs w:val="32"/>
-                <w:cs/>
-              </w:rPr>
-            </w:pPr>
-          </w:p>
-        </w:tc>
-        <w:tc>
-          <w:tcPr>
-            <w:tcW w:w="0" w:type="auto"/>
-          </w:tcPr>
-          <w:p>
-            <w:pPr>
-              <w:jc w:val="center"/>
-              <w:rPr>
-                <w:rFonts w:ascii="TH SarabunIT๙" w:eastAsia="Calibri" w:hAnsi="TH SarabunIT๙" w:cs="TH SarabunIT๙"/>
-                <w:sz w:val="32"/>
-                <w:szCs w:val="32"/>
-                <w:cs/>
-              </w:rPr>
-            </w:pPr>
-            <w:r>
-              <w:rPr>
-                <w:rFonts w:ascii="TH SarabunIT๙" w:eastAsia="Calibri" w:hAnsi="TH SarabunIT๙" w:cs="TH SarabunIT๙"/>
-                <w:sz w:val="32"/>
-                <w:szCs w:val="32"/>
-                <w:cs/>
-              </w:rPr>
-              <w:t>2562</w:t>
-            </w:r>
-          </w:p>
-        </w:tc>
-        <w:tc>
-          <w:tcPr>
-            <w:tcW w:w="0" w:type="auto"/>
-          </w:tcPr>
-          <w:p>
-            <w:pPr>
-              <w:jc w:val="center"/>
-              <w:rPr>
-                <w:rFonts w:ascii="TH SarabunIT๙" w:eastAsia="Calibri" w:hAnsi="TH SarabunIT๙" w:cs="TH SarabunIT๙"/>
-                <w:sz w:val="32"/>
-                <w:szCs w:val="32"/>
-                <w:cs/>
-              </w:rPr>
-            </w:pPr>
-          </w:p>
-        </w:tc>
-        <w:tc>
-          <w:tcPr>
-            <w:tcW w:w="0" w:type="auto"/>
-          </w:tcPr>
-          <w:p>
-            <w:pPr>
-              <w:jc w:val="center"/>
-              <w:rPr>
-                <w:rFonts w:ascii="TH SarabunIT๙" w:eastAsia="Calibri" w:hAnsi="TH SarabunIT๙" w:cs="TH SarabunIT๙"/>
-                <w:sz w:val="32"/>
-                <w:szCs w:val="32"/>
-              </w:rPr>
-            </w:pPr>
-          </w:p>
-        </w:tc>
-        <w:tc>
-          <w:tcPr>
-            <w:tcW w:w="0" w:type="auto"/>
-          </w:tcPr>
-          <w:p>
-            <w:pPr>
-              <w:rPr>
-                <w:rFonts w:ascii="TH SarabunIT๙" w:eastAsia="Calibri" w:hAnsi="TH SarabunIT๙" w:cs="TH SarabunIT๙"/>
-                <w:sz w:val="32"/>
-                <w:szCs w:val="32"/>
-              </w:rPr>
-            </w:pPr>
-            <w:r>
-              <w:rPr>
-                <w:rFonts w:ascii="TH SarabunIT๙" w:eastAsia="Calibri" w:hAnsi="TH SarabunIT๙" w:cs="TH SarabunIT๙"/>
-                <w:sz w:val="32"/>
-                <w:szCs w:val="32"/>
-                <w:cs/>
-              </w:rPr>
-              <w:t>ชำรุด เปิดเครื่องไม่ได้ ซ่อมแซมไม่คุ้มค่า</w:t>
+            <w:r>
+              <w:rPr>
+                <w:rFonts w:ascii="Segoe UI Symbol" w:eastAsia="Calibri" w:hAnsi="Segoe UI Symbol" w:cs="Segoe UI Symbol" w:hint="cs"/>
+                <w:sz w:val="32"/>
+                <w:szCs w:val="32"/>
+                <w:cs/>
+              </w:rPr>
+              <w:t>✓</w:t>
+            </w:r>
+          </w:p>
+        </w:tc>
+        <w:tc>
+          <w:tcPr>
+            <w:tcW w:w="0" w:type="auto"/>
+          </w:tcPr>
+          <w:p>
+            <w:pPr>
+              <w:jc w:val="center"/>
+              <w:rPr>
+                <w:rFonts w:ascii="TH SarabunIT๙" w:eastAsia="Calibri" w:hAnsi="TH SarabunIT๙" w:cs="TH SarabunIT๙"/>
+                <w:sz w:val="32"/>
+                <w:szCs w:val="32"/>
+                <w:cs/>
+              </w:rPr>
+            </w:pPr>
+          </w:p>
+        </w:tc>
+        <w:tc>
+          <w:tcPr>
+            <w:tcW w:w="0" w:type="auto"/>
+          </w:tcPr>
+          <w:p>
+            <w:pPr>
+              <w:jc w:val="center"/>
+              <w:rPr>
+                <w:rFonts w:ascii="TH SarabunIT๙" w:eastAsia="Calibri" w:hAnsi="TH SarabunIT๙" w:cs="TH SarabunIT๙"/>
+                <w:sz w:val="32"/>
+                <w:szCs w:val="32"/>
+                <w:cs/>
+              </w:rPr>
+            </w:pPr>
+            <w:r>
+              <w:rPr>
+                <w:rFonts w:ascii="TH SarabunIT๙" w:eastAsia="Calibri" w:hAnsi="TH SarabunIT๙" w:cs="TH SarabunIT๙"/>
+                <w:sz w:val="32"/>
+                <w:szCs w:val="32"/>
+                <w:cs/>
+              </w:rPr>
+              <w:t>ชำรุด เสื่อมสภาพ</w:t>
+            </w:r>
+          </w:p>
+        </w:tc>
+        <w:tc>
+          <w:tcPr>
+            <w:tcW w:w="0" w:type="auto"/>
+          </w:tcPr>
+          <w:p>
+            <w:pPr>
+              <w:jc w:val="center"/>
+              <w:rPr>
+                <w:rFonts w:ascii="TH SarabunIT๙" w:eastAsia="Calibri" w:hAnsi="TH SarabunIT๙" w:cs="TH SarabunIT๙"/>
+                <w:sz w:val="32"/>
+                <w:szCs w:val="32"/>
+                <w:cs/>
+              </w:rPr>
+            </w:pPr>
+          </w:p>
+        </w:tc>
+        <w:tc>
+          <w:tcPr>
+            <w:tcW w:w="0" w:type="auto"/>
+          </w:tcPr>
+          <w:p>
+            <w:pPr>
+              <w:jc w:val="center"/>
+              <w:rPr>
+                <w:rFonts w:ascii="TH SarabunIT๙" w:eastAsia="Calibri" w:hAnsi="TH SarabunIT๙" w:cs="TH SarabunIT๙"/>
+                <w:sz w:val="32"/>
+                <w:szCs w:val="32"/>
+                <w:cs/>
+              </w:rPr>
+            </w:pPr>
+            <w:r>
+              <w:rPr>
+                <w:rFonts w:ascii="TH SarabunIT๙" w:eastAsia="Calibri" w:hAnsi="TH SarabunIT๙" w:cs="TH SarabunIT๙"/>
+                <w:sz w:val="32"/>
+                <w:szCs w:val="32"/>
+                <w:cs/>
+              </w:rPr>
+              <w:t>2556</w:t>
+            </w:r>
+          </w:p>
+        </w:tc>
+        <w:tc>
+          <w:tcPr>
+            <w:tcW w:w="0" w:type="auto"/>
+          </w:tcPr>
+          <w:p>
+            <w:pPr>
+              <w:jc w:val="center"/>
+              <w:rPr>
+                <w:rFonts w:ascii="TH SarabunIT๙" w:eastAsia="Calibri" w:hAnsi="TH SarabunIT๙" w:cs="TH SarabunIT๙"/>
+                <w:sz w:val="32"/>
+                <w:szCs w:val="32"/>
+                <w:cs/>
+              </w:rPr>
+            </w:pPr>
+          </w:p>
+        </w:tc>
+        <w:tc>
+          <w:tcPr>
+            <w:tcW w:w="0" w:type="auto"/>
+          </w:tcPr>
+          <w:p>
+            <w:pPr>
+              <w:jc w:val="center"/>
+              <w:rPr>
+                <w:rFonts w:ascii="TH SarabunIT๙" w:eastAsia="Calibri" w:hAnsi="TH SarabunIT๙" w:cs="TH SarabunIT๙"/>
+                <w:sz w:val="32"/>
+                <w:szCs w:val="32"/>
+              </w:rPr>
+            </w:pPr>
+          </w:p>
+        </w:tc>
+        <w:tc>
+          <w:tcPr>
+            <w:tcW w:w="0" w:type="auto"/>
+          </w:tcPr>
+          <w:p>
+            <w:pPr>
+              <w:rPr>
+                <w:rFonts w:ascii="TH SarabunIT๙" w:eastAsia="Calibri" w:hAnsi="TH SarabunIT๙" w:cs="TH SarabunIT๙"/>
+                <w:sz w:val="32"/>
+                <w:szCs w:val="32"/>
+              </w:rPr>
+            </w:pPr>
+            <w:r>
+              <w:rPr>
+                <w:rFonts w:ascii="TH SarabunIT๙" w:eastAsia="Calibri" w:hAnsi="TH SarabunIT๙" w:cs="TH SarabunIT๙"/>
+                <w:sz w:val="32"/>
+                <w:szCs w:val="32"/>
+                <w:cs/>
+              </w:rPr>
+              <w:t>ชำรุดและเสื่อมสภาพตามอายุการใช้งาน ใช้งานไม่ปลอดภัย ซ่อมแซมไม่คุ้มค่า</w:t>
             </w:r>
           </w:p>
         </w:tc>
@@ -1649,15 +1413,13 @@
                 <w:szCs w:val="32"/>
                 <w:cs/>
               </w:rPr>
-              <w:t>๕</w:t>
-            </w:r>
-          </w:p>
-        </w:tc>
-        <w:tc>
-          <w:tcPr>
-            <w:tcW w:w="0" w:type="auto"/>
-            <w:vMerge w:val="restart"/>
-            <w:vAlign w:val="top"/>
+              <w:t>๔</w:t>
+            </w:r>
+          </w:p>
+        </w:tc>
+        <w:tc>
+          <w:tcPr>
+            <w:tcW w:w="0" w:type="auto"/>
           </w:tcPr>
           <w:p>
             <w:pPr>
@@ -1680,31 +1442,31 @@
                 <w:szCs w:val="32"/>
                 <w:cs/>
               </w:rPr>
-              <w:t>เครื่องคอมพิวเตอร์ All-in-One สำหรับประมวลผล ยี่ห้อ Acer รุ่น Veriton Z4660G</w:t>
-            </w:r>
-          </w:p>
-        </w:tc>
-        <w:tc>
-          <w:tcPr>
-            <w:tcW w:w="0" w:type="auto"/>
-          </w:tcPr>
-          <w:p>
-            <w:pPr>
-              <w:jc w:val="center"/>
-              <w:rPr>
-                <w:rFonts w:ascii="TH SarabunIT๙" w:eastAsia="Calibri" w:hAnsi="TH SarabunIT๙" w:cs="TH SarabunIT๙"/>
-                <w:sz w:val="32"/>
-                <w:szCs w:val="32"/>
-              </w:rPr>
-            </w:pPr>
-            <w:r>
-              <w:rPr>
-                <w:rFonts w:ascii="TH SarabunIT๙" w:eastAsia="Calibri" w:hAnsi="TH SarabunIT๙" w:cs="TH SarabunIT๙"/>
-                <w:sz w:val="32"/>
-                <w:szCs w:val="32"/>
-                <w:cs/>
-              </w:rPr>
-              <w:t>ขบ.269/001/2562</w:t>
+              <w:t>เครื่องคอมพิวเตอร์ตั้งโต๊ะ ยี่ห้อ Acer รุ่น Aspire TC-780 Series</w:t>
+            </w:r>
+          </w:p>
+        </w:tc>
+        <w:tc>
+          <w:tcPr>
+            <w:tcW w:w="0" w:type="auto"/>
+          </w:tcPr>
+          <w:p>
+            <w:pPr>
+              <w:jc w:val="center"/>
+              <w:rPr>
+                <w:rFonts w:ascii="TH SarabunIT๙" w:eastAsia="Calibri" w:hAnsi="TH SarabunIT๙" w:cs="TH SarabunIT๙"/>
+                <w:sz w:val="32"/>
+                <w:szCs w:val="32"/>
+              </w:rPr>
+            </w:pPr>
+            <w:r>
+              <w:rPr>
+                <w:rFonts w:ascii="TH SarabunIT๙" w:eastAsia="Calibri" w:hAnsi="TH SarabunIT๙" w:cs="TH SarabunIT๙"/>
+                <w:sz w:val="32"/>
+                <w:szCs w:val="32"/>
+                <w:cs/>
+              </w:rPr>
+              <w:t>ขบ.267/001/2562</w:t>
             </w:r>
           </w:p>
         </w:tc>
@@ -1907,38 +1669,60 @@
                 <w:szCs w:val="32"/>
                 <w:cs/>
               </w:rPr>
-              <w:t>๖</w:t>
-            </w:r>
-          </w:p>
-        </w:tc>
-        <w:tc>
-          <w:tcPr>
-            <w:tcW w:w="0" w:type="auto"/>
-            <w:vMerge/>
-          </w:tcPr>
-          <w:p/>
-        </w:tc>
-        <w:tc>
-          <w:tcPr>
-            <w:tcW w:w="0" w:type="auto"/>
-          </w:tcPr>
-          <w:p>
-            <w:pPr>
-              <w:jc w:val="center"/>
-              <w:rPr>
-                <w:rFonts w:ascii="TH SarabunIT๙" w:eastAsia="Calibri" w:hAnsi="TH SarabunIT๙" w:cs="TH SarabunIT๙"/>
-                <w:sz w:val="32"/>
-                <w:szCs w:val="32"/>
-              </w:rPr>
-            </w:pPr>
-            <w:r>
-              <w:rPr>
-                <w:rFonts w:ascii="TH SarabunIT๙" w:eastAsia="Calibri" w:hAnsi="TH SarabunIT๙" w:cs="TH SarabunIT๙"/>
-                <w:sz w:val="32"/>
-                <w:szCs w:val="32"/>
-                <w:cs/>
-              </w:rPr>
-              <w:t>ขบ.269/002/2562</w:t>
+              <w:t>๕</w:t>
+            </w:r>
+          </w:p>
+        </w:tc>
+        <w:tc>
+          <w:tcPr>
+            <w:tcW w:w="0" w:type="auto"/>
+          </w:tcPr>
+          <w:p>
+            <w:pPr>
+              <w:rPr>
+                <w:rFonts w:ascii="TH SarabunIT๙" w:eastAsia="Calibri" w:hAnsi="TH SarabunIT๙" w:cs="TH SarabunIT๙"/>
+                <w:sz w:val="32"/>
+                <w:szCs w:val="32"/>
+              </w:rPr>
+            </w:pPr>
+            <w:proofErr w:type="spellStart"/>
+            <w:proofErr w:type="spellEnd"/>
+            <w:proofErr w:type="spellStart"/>
+            <w:proofErr w:type="spellEnd"/>
+            <w:proofErr w:type="spellStart"/>
+            <w:proofErr w:type="spellEnd"/>
+            <w:r>
+              <w:rPr>
+                <w:rFonts w:ascii="TH SarabunIT๙" w:eastAsia="Calibri" w:hAnsi="TH SarabunIT๙" w:cs="TH SarabunIT๙"/>
+                <w:sz w:val="32"/>
+                <w:szCs w:val="32"/>
+                <w:cs/>
+              </w:rPr>
+              <w:t>เครื่องคอมพิวเตอร์ All-in-One สำหรับประมวลผล ยี่ห้อ Acer รุ่น Veriton Z4660G</w:t>
+            </w:r>
+          </w:p>
+        </w:tc>
+        <w:tc>
+          <w:tcPr>
+            <w:tcW w:w="0" w:type="auto"/>
+          </w:tcPr>
+          <w:p>
+            <w:pPr>
+              <w:jc w:val="center"/>
+              <w:rPr>
+                <w:rFonts w:ascii="TH SarabunIT๙" w:eastAsia="Calibri" w:hAnsi="TH SarabunIT๙" w:cs="TH SarabunIT๙"/>
+                <w:sz w:val="32"/>
+                <w:szCs w:val="32"/>
+              </w:rPr>
+            </w:pPr>
+            <w:r>
+              <w:rPr>
+                <w:rFonts w:ascii="TH SarabunIT๙" w:eastAsia="Calibri" w:hAnsi="TH SarabunIT๙" w:cs="TH SarabunIT๙"/>
+                <w:sz w:val="32"/>
+                <w:szCs w:val="32"/>
+                <w:cs/>
+              </w:rPr>
+              <w:t>ขบ.269/001/2562</w:t>
             </w:r>
           </w:p>
         </w:tc>
@@ -2141,38 +1925,60 @@
                 <w:szCs w:val="32"/>
                 <w:cs/>
               </w:rPr>
-              <w:t>๗</w:t>
-            </w:r>
-          </w:p>
-        </w:tc>
-        <w:tc>
-          <w:tcPr>
-            <w:tcW w:w="0" w:type="auto"/>
-            <w:vMerge/>
-          </w:tcPr>
-          <w:p/>
-        </w:tc>
-        <w:tc>
-          <w:tcPr>
-            <w:tcW w:w="0" w:type="auto"/>
-          </w:tcPr>
-          <w:p>
-            <w:pPr>
-              <w:jc w:val="center"/>
-              <w:rPr>
-                <w:rFonts w:ascii="TH SarabunIT๙" w:eastAsia="Calibri" w:hAnsi="TH SarabunIT๙" w:cs="TH SarabunIT๙"/>
-                <w:sz w:val="32"/>
-                <w:szCs w:val="32"/>
-              </w:rPr>
-            </w:pPr>
-            <w:r>
-              <w:rPr>
-                <w:rFonts w:ascii="TH SarabunIT๙" w:eastAsia="Calibri" w:hAnsi="TH SarabunIT๙" w:cs="TH SarabunIT๙"/>
-                <w:sz w:val="32"/>
-                <w:szCs w:val="32"/>
-                <w:cs/>
-              </w:rPr>
-              <w:t>ขบ.269/003/2562</w:t>
+              <w:t>๖</w:t>
+            </w:r>
+          </w:p>
+        </w:tc>
+        <w:tc>
+          <w:tcPr>
+            <w:tcW w:w="0" w:type="auto"/>
+          </w:tcPr>
+          <w:p>
+            <w:pPr>
+              <w:rPr>
+                <w:rFonts w:ascii="TH SarabunIT๙" w:eastAsia="Calibri" w:hAnsi="TH SarabunIT๙" w:cs="TH SarabunIT๙"/>
+                <w:sz w:val="32"/>
+                <w:szCs w:val="32"/>
+              </w:rPr>
+            </w:pPr>
+            <w:proofErr w:type="spellStart"/>
+            <w:proofErr w:type="spellEnd"/>
+            <w:proofErr w:type="spellStart"/>
+            <w:proofErr w:type="spellEnd"/>
+            <w:proofErr w:type="spellStart"/>
+            <w:proofErr w:type="spellEnd"/>
+            <w:r>
+              <w:rPr>
+                <w:rFonts w:ascii="TH SarabunIT๙" w:eastAsia="Calibri" w:hAnsi="TH SarabunIT๙" w:cs="TH SarabunIT๙"/>
+                <w:sz w:val="32"/>
+                <w:szCs w:val="32"/>
+                <w:cs/>
+              </w:rPr>
+              <w:t>เครื่องคอมพิวเตอร์ All-in-One สำหรับประมวลผล ยี่ห้อ Acer รุ่น Veriton Z4660G</w:t>
+            </w:r>
+          </w:p>
+        </w:tc>
+        <w:tc>
+          <w:tcPr>
+            <w:tcW w:w="0" w:type="auto"/>
+          </w:tcPr>
+          <w:p>
+            <w:pPr>
+              <w:jc w:val="center"/>
+              <w:rPr>
+                <w:rFonts w:ascii="TH SarabunIT๙" w:eastAsia="Calibri" w:hAnsi="TH SarabunIT๙" w:cs="TH SarabunIT๙"/>
+                <w:sz w:val="32"/>
+                <w:szCs w:val="32"/>
+              </w:rPr>
+            </w:pPr>
+            <w:r>
+              <w:rPr>
+                <w:rFonts w:ascii="TH SarabunIT๙" w:eastAsia="Calibri" w:hAnsi="TH SarabunIT๙" w:cs="TH SarabunIT๙"/>
+                <w:sz w:val="32"/>
+                <w:szCs w:val="32"/>
+                <w:cs/>
+              </w:rPr>
+              <w:t>ขบ.269/002/2562</w:t>
             </w:r>
           </w:p>
         </w:tc>
@@ -2375,38 +2181,60 @@
                 <w:szCs w:val="32"/>
                 <w:cs/>
               </w:rPr>
-              <w:t>๘</w:t>
-            </w:r>
-          </w:p>
-        </w:tc>
-        <w:tc>
-          <w:tcPr>
-            <w:tcW w:w="0" w:type="auto"/>
-            <w:vMerge/>
-          </w:tcPr>
-          <w:p/>
-        </w:tc>
-        <w:tc>
-          <w:tcPr>
-            <w:tcW w:w="0" w:type="auto"/>
-          </w:tcPr>
-          <w:p>
-            <w:pPr>
-              <w:jc w:val="center"/>
-              <w:rPr>
-                <w:rFonts w:ascii="TH SarabunIT๙" w:eastAsia="Calibri" w:hAnsi="TH SarabunIT๙" w:cs="TH SarabunIT๙"/>
-                <w:sz w:val="32"/>
-                <w:szCs w:val="32"/>
-              </w:rPr>
-            </w:pPr>
-            <w:r>
-              <w:rPr>
-                <w:rFonts w:ascii="TH SarabunIT๙" w:eastAsia="Calibri" w:hAnsi="TH SarabunIT๙" w:cs="TH SarabunIT๙"/>
-                <w:sz w:val="32"/>
-                <w:szCs w:val="32"/>
-                <w:cs/>
-              </w:rPr>
-              <w:t>ขบ.269/004/2562</w:t>
+              <w:t>๗</w:t>
+            </w:r>
+          </w:p>
+        </w:tc>
+        <w:tc>
+          <w:tcPr>
+            <w:tcW w:w="0" w:type="auto"/>
+          </w:tcPr>
+          <w:p>
+            <w:pPr>
+              <w:rPr>
+                <w:rFonts w:ascii="TH SarabunIT๙" w:eastAsia="Calibri" w:hAnsi="TH SarabunIT๙" w:cs="TH SarabunIT๙"/>
+                <w:sz w:val="32"/>
+                <w:szCs w:val="32"/>
+              </w:rPr>
+            </w:pPr>
+            <w:proofErr w:type="spellStart"/>
+            <w:proofErr w:type="spellEnd"/>
+            <w:proofErr w:type="spellStart"/>
+            <w:proofErr w:type="spellEnd"/>
+            <w:proofErr w:type="spellStart"/>
+            <w:proofErr w:type="spellEnd"/>
+            <w:r>
+              <w:rPr>
+                <w:rFonts w:ascii="TH SarabunIT๙" w:eastAsia="Calibri" w:hAnsi="TH SarabunIT๙" w:cs="TH SarabunIT๙"/>
+                <w:sz w:val="32"/>
+                <w:szCs w:val="32"/>
+                <w:cs/>
+              </w:rPr>
+              <w:t>เครื่องคอมพิวเตอร์ All-in-One สำหรับประมวลผล ยี่ห้อ Acer รุ่น Veriton Z4660G</w:t>
+            </w:r>
+          </w:p>
+        </w:tc>
+        <w:tc>
+          <w:tcPr>
+            <w:tcW w:w="0" w:type="auto"/>
+          </w:tcPr>
+          <w:p>
+            <w:pPr>
+              <w:jc w:val="center"/>
+              <w:rPr>
+                <w:rFonts w:ascii="TH SarabunIT๙" w:eastAsia="Calibri" w:hAnsi="TH SarabunIT๙" w:cs="TH SarabunIT๙"/>
+                <w:sz w:val="32"/>
+                <w:szCs w:val="32"/>
+              </w:rPr>
+            </w:pPr>
+            <w:r>
+              <w:rPr>
+                <w:rFonts w:ascii="TH SarabunIT๙" w:eastAsia="Calibri" w:hAnsi="TH SarabunIT๙" w:cs="TH SarabunIT๙"/>
+                <w:sz w:val="32"/>
+                <w:szCs w:val="32"/>
+                <w:cs/>
+              </w:rPr>
+              <w:t>ขบ.269/003/2562</w:t>
             </w:r>
           </w:p>
         </w:tc>
@@ -2609,38 +2437,54 @@
                 <w:szCs w:val="32"/>
                 <w:cs/>
               </w:rPr>
-              <w:t>๙</w:t>
-            </w:r>
-          </w:p>
-        </w:tc>
-        <w:tc>
-          <w:tcPr>
-            <w:tcW w:w="0" w:type="auto"/>
-            <w:vMerge/>
-          </w:tcPr>
-          <w:p/>
-        </w:tc>
-        <w:tc>
-          <w:tcPr>
-            <w:tcW w:w="0" w:type="auto"/>
-          </w:tcPr>
-          <w:p>
-            <w:pPr>
-              <w:jc w:val="center"/>
-              <w:rPr>
-                <w:rFonts w:ascii="TH SarabunIT๙" w:eastAsia="Calibri" w:hAnsi="TH SarabunIT๙" w:cs="TH SarabunIT๙"/>
-                <w:sz w:val="32"/>
-                <w:szCs w:val="32"/>
-              </w:rPr>
-            </w:pPr>
-            <w:r>
-              <w:rPr>
-                <w:rFonts w:ascii="TH SarabunIT๙" w:eastAsia="Calibri" w:hAnsi="TH SarabunIT๙" w:cs="TH SarabunIT๙"/>
-                <w:sz w:val="32"/>
-                <w:szCs w:val="32"/>
-                <w:cs/>
-              </w:rPr>
-              <w:t>ขบ.269/008/2562</w:t>
+              <w:t>๘</w:t>
+            </w:r>
+          </w:p>
+        </w:tc>
+        <w:tc>
+          <w:tcPr>
+            <w:tcW w:w="0" w:type="auto"/>
+          </w:tcPr>
+          <w:p>
+            <w:pPr>
+              <w:rPr>
+                <w:rFonts w:ascii="TH SarabunIT๙" w:eastAsia="Calibri" w:hAnsi="TH SarabunIT๙" w:cs="TH SarabunIT๙"/>
+                <w:sz w:val="32"/>
+                <w:szCs w:val="32"/>
+              </w:rPr>
+            </w:pPr>
+            <w:r>
+              <w:rPr>
+                <w:rFonts w:ascii="TH SarabunIT๙" w:eastAsia="Calibri" w:hAnsi="TH SarabunIT๙" w:cs="TH SarabunIT๙"/>
+                <w:sz w:val="32"/>
+                <w:szCs w:val="32"/>
+                <w:cs/>
+              </w:rPr>
+              <w:t>เครื่องคอมพิวเตอร์ All-in-One สำหรับประมวลผล ยี่ห้อ Acer รุ่น Veriton Z4660G</w:t>
+            </w:r>
+          </w:p>
+        </w:tc>
+        <w:tc>
+          <w:tcPr>
+            <w:tcW w:w="0" w:type="auto"/>
+          </w:tcPr>
+          <w:p>
+            <w:pPr>
+              <w:jc w:val="center"/>
+              <w:rPr>
+                <w:rFonts w:ascii="TH SarabunIT๙" w:eastAsia="Calibri" w:hAnsi="TH SarabunIT๙" w:cs="TH SarabunIT๙"/>
+                <w:sz w:val="32"/>
+                <w:szCs w:val="32"/>
+              </w:rPr>
+            </w:pPr>
+            <w:r>
+              <w:rPr>
+                <w:rFonts w:ascii="TH SarabunIT๙" w:eastAsia="Calibri" w:hAnsi="TH SarabunIT๙" w:cs="TH SarabunIT๙"/>
+                <w:sz w:val="32"/>
+                <w:szCs w:val="32"/>
+                <w:cs/>
+              </w:rPr>
+              <w:t>ขบ.269/004/2562</w:t>
             </w:r>
           </w:p>
         </w:tc>
@@ -2843,7 +2687,7 @@
                 <w:szCs w:val="32"/>
                 <w:cs/>
               </w:rPr>
-              <w:t>๑๐</w:t>
+              <w:t>๙</w:t>
             </w:r>
           </w:p>
         </w:tc>
@@ -2868,31 +2712,31 @@
                 <w:szCs w:val="32"/>
                 <w:cs/>
               </w:rPr>
-              <w:t>เครื่องพิมพ์ชนิดเลเซอร์หรือชนิด LED ขาวดำ ชนิด Network แบบที่ ๒</w:t>
-            </w:r>
-          </w:p>
-        </w:tc>
-        <w:tc>
-          <w:tcPr>
-            <w:tcW w:w="0" w:type="auto"/>
-          </w:tcPr>
-          <w:p>
-            <w:pPr>
-              <w:jc w:val="center"/>
-              <w:rPr>
-                <w:rFonts w:ascii="TH SarabunIT๙" w:eastAsia="Calibri" w:hAnsi="TH SarabunIT๙" w:cs="TH SarabunIT๙"/>
-                <w:sz w:val="32"/>
-                <w:szCs w:val="32"/>
-              </w:rPr>
-            </w:pPr>
-            <w:r>
-              <w:rPr>
-                <w:rFonts w:ascii="TH SarabunIT๙" w:eastAsia="Calibri" w:hAnsi="TH SarabunIT๙" w:cs="TH SarabunIT๙"/>
-                <w:sz w:val="32"/>
-                <w:szCs w:val="32"/>
-                <w:cs/>
-              </w:rPr>
-              <w:t>ขบ.274/001/2562</w:t>
+              <w:t>เครื่องคอมพิวเตอร์ All-in-One สำหรับประมวลผล ยี่ห้อ Acer รุ่น Veriton Z4660G</w:t>
+            </w:r>
+          </w:p>
+        </w:tc>
+        <w:tc>
+          <w:tcPr>
+            <w:tcW w:w="0" w:type="auto"/>
+          </w:tcPr>
+          <w:p>
+            <w:pPr>
+              <w:jc w:val="center"/>
+              <w:rPr>
+                <w:rFonts w:ascii="TH SarabunIT๙" w:eastAsia="Calibri" w:hAnsi="TH SarabunIT๙" w:cs="TH SarabunIT๙"/>
+                <w:sz w:val="32"/>
+                <w:szCs w:val="32"/>
+              </w:rPr>
+            </w:pPr>
+            <w:r>
+              <w:rPr>
+                <w:rFonts w:ascii="TH SarabunIT๙" w:eastAsia="Calibri" w:hAnsi="TH SarabunIT๙" w:cs="TH SarabunIT๙"/>
+                <w:sz w:val="32"/>
+                <w:szCs w:val="32"/>
+                <w:cs/>
+              </w:rPr>
+              <w:t>ขบ.269/008/2562</w:t>
             </w:r>
           </w:p>
         </w:tc>
@@ -3069,7 +2913,7 @@
                 <w:szCs w:val="32"/>
                 <w:cs/>
               </w:rPr>
-              <w:t>ชำรุด พิมพ์เอกสารไม่ได้ ซ่อมแซมไม่คุ้มค่า</w:t>
+              <w:t>ชำรุด เปิดเครื่องไม่ได้ ซ่อมแซมไม่คุ้มค่า</w:t>
             </w:r>
           </w:p>
         </w:tc>
@@ -3095,15 +2939,13 @@
                 <w:szCs w:val="32"/>
                 <w:cs/>
               </w:rPr>
-              <w:t>๑๑</w:t>
-            </w:r>
-          </w:p>
-        </w:tc>
-        <w:tc>
-          <w:tcPr>
-            <w:tcW w:w="0" w:type="auto"/>
-            <w:vMerge w:val="restart"/>
-            <w:vAlign w:val="top"/>
+              <w:t>๑๐</w:t>
+            </w:r>
+          </w:p>
+        </w:tc>
+        <w:tc>
+          <w:tcPr>
+            <w:tcW w:w="0" w:type="auto"/>
           </w:tcPr>
           <w:p>
             <w:pPr>
@@ -3122,31 +2964,31 @@
                 <w:szCs w:val="32"/>
                 <w:cs/>
               </w:rPr>
-              <w:t>เก้าอี้จัดเลี้ยงเหล็กขาเอ</w:t>
-            </w:r>
-          </w:p>
-        </w:tc>
-        <w:tc>
-          <w:tcPr>
-            <w:tcW w:w="0" w:type="auto"/>
-          </w:tcPr>
-          <w:p>
-            <w:pPr>
-              <w:jc w:val="center"/>
-              <w:rPr>
-                <w:rFonts w:ascii="TH SarabunIT๙" w:eastAsia="Calibri" w:hAnsi="TH SarabunIT๙" w:cs="TH SarabunIT๙"/>
-                <w:sz w:val="32"/>
-                <w:szCs w:val="32"/>
-              </w:rPr>
-            </w:pPr>
-            <w:r>
-              <w:rPr>
-                <w:rFonts w:ascii="TH SarabunIT๙" w:eastAsia="Calibri" w:hAnsi="TH SarabunIT๙" w:cs="TH SarabunIT๙"/>
-                <w:sz w:val="32"/>
-                <w:szCs w:val="32"/>
-                <w:cs/>
-              </w:rPr>
-              <w:t>ขบ.279/001/2562</w:t>
+              <w:t>เครื่องพิมพ์ชนิดเลเซอร์หรือชนิด LED ขาวดำ ชนิด Network แบบที่ ๒</w:t>
+            </w:r>
+          </w:p>
+        </w:tc>
+        <w:tc>
+          <w:tcPr>
+            <w:tcW w:w="0" w:type="auto"/>
+          </w:tcPr>
+          <w:p>
+            <w:pPr>
+              <w:jc w:val="center"/>
+              <w:rPr>
+                <w:rFonts w:ascii="TH SarabunIT๙" w:eastAsia="Calibri" w:hAnsi="TH SarabunIT๙" w:cs="TH SarabunIT๙"/>
+                <w:sz w:val="32"/>
+                <w:szCs w:val="32"/>
+              </w:rPr>
+            </w:pPr>
+            <w:r>
+              <w:rPr>
+                <w:rFonts w:ascii="TH SarabunIT๙" w:eastAsia="Calibri" w:hAnsi="TH SarabunIT๙" w:cs="TH SarabunIT๙"/>
+                <w:sz w:val="32"/>
+                <w:szCs w:val="32"/>
+                <w:cs/>
+              </w:rPr>
+              <w:t>ขบ.274/001/2562</w:t>
             </w:r>
           </w:p>
         </w:tc>
@@ -3189,55 +3031,46 @@
                 <w:cs/>
               </w:rPr>
             </w:pPr>
-            <w:r>
-              <w:rPr>
-                <w:rFonts w:ascii="Segoe UI Symbol" w:eastAsia="Calibri" w:hAnsi="Segoe UI Symbol" w:cs="Segoe UI Symbol" w:hint="cs"/>
-                <w:sz w:val="32"/>
-                <w:szCs w:val="32"/>
-                <w:cs/>
-              </w:rPr>
-              <w:t>✓</w:t>
-            </w:r>
-          </w:p>
-        </w:tc>
-        <w:tc>
-          <w:tcPr>
-            <w:tcW w:w="0" w:type="auto"/>
-          </w:tcPr>
-          <w:p>
-            <w:pPr>
-              <w:jc w:val="center"/>
-              <w:rPr>
-                <w:rFonts w:ascii="TH SarabunIT๙" w:eastAsia="Calibri" w:hAnsi="TH SarabunIT๙" w:cs="TH SarabunIT๙"/>
-                <w:sz w:val="32"/>
-                <w:szCs w:val="32"/>
-                <w:cs/>
-              </w:rPr>
-            </w:pPr>
-          </w:p>
-        </w:tc>
-        <w:tc>
-          <w:tcPr>
-            <w:tcW w:w="0" w:type="auto"/>
-          </w:tcPr>
-          <w:p>
-            <w:pPr>
-              <w:jc w:val="center"/>
-              <w:rPr>
-                <w:rFonts w:ascii="TH SarabunIT๙" w:eastAsia="Calibri" w:hAnsi="TH SarabunIT๙" w:cs="TH SarabunIT๙"/>
-                <w:sz w:val="32"/>
-                <w:szCs w:val="32"/>
-                <w:cs/>
-              </w:rPr>
-            </w:pPr>
-            <w:r>
-              <w:rPr>
-                <w:rFonts w:ascii="TH SarabunIT๙" w:eastAsia="Calibri" w:hAnsi="TH SarabunIT๙" w:cs="TH SarabunIT๙"/>
-                <w:sz w:val="32"/>
-                <w:szCs w:val="32"/>
-                <w:cs/>
-              </w:rPr>
-              <w:t>ชำรุด เสื่อมสภาพ</w:t>
+          </w:p>
+        </w:tc>
+        <w:tc>
+          <w:tcPr>
+            <w:tcW w:w="0" w:type="auto"/>
+          </w:tcPr>
+          <w:p>
+            <w:pPr>
+              <w:jc w:val="center"/>
+              <w:rPr>
+                <w:rFonts w:ascii="TH SarabunIT๙" w:eastAsia="Calibri" w:hAnsi="TH SarabunIT๙" w:cs="TH SarabunIT๙"/>
+                <w:sz w:val="32"/>
+                <w:szCs w:val="32"/>
+                <w:cs/>
+              </w:rPr>
+            </w:pPr>
+          </w:p>
+        </w:tc>
+        <w:tc>
+          <w:tcPr>
+            <w:tcW w:w="0" w:type="auto"/>
+          </w:tcPr>
+          <w:p>
+            <w:pPr>
+              <w:jc w:val="center"/>
+              <w:rPr>
+                <w:rFonts w:ascii="TH SarabunIT๙" w:eastAsia="Calibri" w:hAnsi="TH SarabunIT๙" w:cs="TH SarabunIT๙"/>
+                <w:sz w:val="32"/>
+                <w:szCs w:val="32"/>
+                <w:cs/>
+              </w:rPr>
+            </w:pPr>
+            <w:r>
+              <w:rPr>
+                <w:rFonts w:ascii="TH SarabunIT๙" w:eastAsia="Calibri" w:hAnsi="TH SarabunIT๙" w:cs="TH SarabunIT๙"/>
+                <w:sz w:val="32"/>
+                <w:szCs w:val="32"/>
+                <w:cs/>
+              </w:rPr>
+              <w:t>ใช้งานไม่ได้</w:t>
             </w:r>
           </w:p>
         </w:tc>
@@ -3332,7 +3165,7 @@
                 <w:szCs w:val="32"/>
                 <w:cs/>
               </w:rPr>
-              <w:t>ชำรุดและเสื่อมสภาพตามอายุการใช้งาน ใช้งานไม่ปลอดภัย ซ่อมแซมไม่คุ้มค่า</w:t>
+              <w:t>ชำรุด พิมพ์เอกสารไม่ได้ ซ่อมแซมไม่คุ้มค่า</w:t>
             </w:r>
           </w:p>
         </w:tc>
@@ -3358,38 +3191,56 @@
                 <w:szCs w:val="32"/>
                 <w:cs/>
               </w:rPr>
-              <w:t>๑๒</w:t>
-            </w:r>
-          </w:p>
-        </w:tc>
-        <w:tc>
-          <w:tcPr>
-            <w:tcW w:w="0" w:type="auto"/>
-            <w:vMerge/>
-          </w:tcPr>
-          <w:p/>
-        </w:tc>
-        <w:tc>
-          <w:tcPr>
-            <w:tcW w:w="0" w:type="auto"/>
-          </w:tcPr>
-          <w:p>
-            <w:pPr>
-              <w:jc w:val="center"/>
-              <w:rPr>
-                <w:rFonts w:ascii="TH SarabunIT๙" w:eastAsia="Calibri" w:hAnsi="TH SarabunIT๙" w:cs="TH SarabunIT๙"/>
-                <w:sz w:val="32"/>
-                <w:szCs w:val="32"/>
-              </w:rPr>
-            </w:pPr>
-            <w:r>
-              <w:rPr>
-                <w:rFonts w:ascii="TH SarabunIT๙" w:eastAsia="Calibri" w:hAnsi="TH SarabunIT๙" w:cs="TH SarabunIT๙"/>
-                <w:sz w:val="32"/>
-                <w:szCs w:val="32"/>
-                <w:cs/>
-              </w:rPr>
-              <w:t>ขบ.279/002/2562</w:t>
+              <w:t>๑๑</w:t>
+            </w:r>
+          </w:p>
+        </w:tc>
+        <w:tc>
+          <w:tcPr>
+            <w:tcW w:w="0" w:type="auto"/>
+          </w:tcPr>
+          <w:p>
+            <w:pPr>
+              <w:rPr>
+                <w:rFonts w:ascii="TH SarabunIT๙" w:eastAsia="Calibri" w:hAnsi="TH SarabunIT๙" w:cs="TH SarabunIT๙"/>
+                <w:sz w:val="32"/>
+                <w:szCs w:val="32"/>
+              </w:rPr>
+            </w:pPr>
+            <w:proofErr w:type="spellStart"/>
+            <w:proofErr w:type="spellEnd"/>
+            <w:r>
+              <w:rPr>
+                <w:rFonts w:ascii="TH SarabunIT๙" w:eastAsia="Calibri" w:hAnsi="TH SarabunIT๙" w:cs="TH SarabunIT๙"/>
+                <w:sz w:val="32"/>
+                <w:szCs w:val="32"/>
+                <w:cs/>
+              </w:rPr>
+              <w:t>เก้าอี้จัดเลี้ยงเหล็กขาเอ</w:t>
+            </w:r>
+          </w:p>
+        </w:tc>
+        <w:tc>
+          <w:tcPr>
+            <w:tcW w:w="0" w:type="auto"/>
+          </w:tcPr>
+          <w:p>
+            <w:pPr>
+              <w:jc w:val="center"/>
+              <w:rPr>
+                <w:rFonts w:ascii="TH SarabunIT๙" w:eastAsia="Calibri" w:hAnsi="TH SarabunIT๙" w:cs="TH SarabunIT๙"/>
+                <w:sz w:val="32"/>
+                <w:szCs w:val="32"/>
+              </w:rPr>
+            </w:pPr>
+            <w:r>
+              <w:rPr>
+                <w:rFonts w:ascii="TH SarabunIT๙" w:eastAsia="Calibri" w:hAnsi="TH SarabunIT๙" w:cs="TH SarabunIT๙"/>
+                <w:sz w:val="32"/>
+                <w:szCs w:val="32"/>
+                <w:cs/>
+              </w:rPr>
+              <w:t>ขบ.279/001/2562</w:t>
             </w:r>
           </w:p>
         </w:tc>
@@ -3601,38 +3452,56 @@
                 <w:szCs w:val="32"/>
                 <w:cs/>
               </w:rPr>
-              <w:t>๑๓</w:t>
-            </w:r>
-          </w:p>
-        </w:tc>
-        <w:tc>
-          <w:tcPr>
-            <w:tcW w:w="0" w:type="auto"/>
-            <w:vMerge/>
-          </w:tcPr>
-          <w:p/>
-        </w:tc>
-        <w:tc>
-          <w:tcPr>
-            <w:tcW w:w="0" w:type="auto"/>
-          </w:tcPr>
-          <w:p>
-            <w:pPr>
-              <w:jc w:val="center"/>
-              <w:rPr>
-                <w:rFonts w:ascii="TH SarabunIT๙" w:eastAsia="Calibri" w:hAnsi="TH SarabunIT๙" w:cs="TH SarabunIT๙"/>
-                <w:sz w:val="32"/>
-                <w:szCs w:val="32"/>
-              </w:rPr>
-            </w:pPr>
-            <w:r>
-              <w:rPr>
-                <w:rFonts w:ascii="TH SarabunIT๙" w:eastAsia="Calibri" w:hAnsi="TH SarabunIT๙" w:cs="TH SarabunIT๙"/>
-                <w:sz w:val="32"/>
-                <w:szCs w:val="32"/>
-                <w:cs/>
-              </w:rPr>
-              <w:t>ขบ.279/003/2562</w:t>
+              <w:t>๑๒</w:t>
+            </w:r>
+          </w:p>
+        </w:tc>
+        <w:tc>
+          <w:tcPr>
+            <w:tcW w:w="0" w:type="auto"/>
+          </w:tcPr>
+          <w:p>
+            <w:pPr>
+              <w:rPr>
+                <w:rFonts w:ascii="TH SarabunIT๙" w:eastAsia="Calibri" w:hAnsi="TH SarabunIT๙" w:cs="TH SarabunIT๙"/>
+                <w:sz w:val="32"/>
+                <w:szCs w:val="32"/>
+              </w:rPr>
+            </w:pPr>
+            <w:proofErr w:type="spellStart"/>
+            <w:proofErr w:type="spellEnd"/>
+            <w:r>
+              <w:rPr>
+                <w:rFonts w:ascii="TH SarabunIT๙" w:eastAsia="Calibri" w:hAnsi="TH SarabunIT๙" w:cs="TH SarabunIT๙"/>
+                <w:sz w:val="32"/>
+                <w:szCs w:val="32"/>
+                <w:cs/>
+              </w:rPr>
+              <w:t>เก้าอี้จัดเลี้ยงเหล็กขาเอ</w:t>
+            </w:r>
+          </w:p>
+        </w:tc>
+        <w:tc>
+          <w:tcPr>
+            <w:tcW w:w="0" w:type="auto"/>
+          </w:tcPr>
+          <w:p>
+            <w:pPr>
+              <w:jc w:val="center"/>
+              <w:rPr>
+                <w:rFonts w:ascii="TH SarabunIT๙" w:eastAsia="Calibri" w:hAnsi="TH SarabunIT๙" w:cs="TH SarabunIT๙"/>
+                <w:sz w:val="32"/>
+                <w:szCs w:val="32"/>
+              </w:rPr>
+            </w:pPr>
+            <w:r>
+              <w:rPr>
+                <w:rFonts w:ascii="TH SarabunIT๙" w:eastAsia="Calibri" w:hAnsi="TH SarabunIT๙" w:cs="TH SarabunIT๙"/>
+                <w:sz w:val="32"/>
+                <w:szCs w:val="32"/>
+                <w:cs/>
+              </w:rPr>
+              <w:t>ขบ.279/002/2562</w:t>
             </w:r>
           </w:p>
         </w:tc>
@@ -3844,38 +3713,56 @@
                 <w:szCs w:val="32"/>
                 <w:cs/>
               </w:rPr>
-              <w:t>๑๔</w:t>
-            </w:r>
-          </w:p>
-        </w:tc>
-        <w:tc>
-          <w:tcPr>
-            <w:tcW w:w="0" w:type="auto"/>
-            <w:vMerge/>
-          </w:tcPr>
-          <w:p/>
-        </w:tc>
-        <w:tc>
-          <w:tcPr>
-            <w:tcW w:w="0" w:type="auto"/>
-          </w:tcPr>
-          <w:p>
-            <w:pPr>
-              <w:jc w:val="center"/>
-              <w:rPr>
-                <w:rFonts w:ascii="TH SarabunIT๙" w:eastAsia="Calibri" w:hAnsi="TH SarabunIT๙" w:cs="TH SarabunIT๙"/>
-                <w:sz w:val="32"/>
-                <w:szCs w:val="32"/>
-              </w:rPr>
-            </w:pPr>
-            <w:r>
-              <w:rPr>
-                <w:rFonts w:ascii="TH SarabunIT๙" w:eastAsia="Calibri" w:hAnsi="TH SarabunIT๙" w:cs="TH SarabunIT๙"/>
-                <w:sz w:val="32"/>
-                <w:szCs w:val="32"/>
-                <w:cs/>
-              </w:rPr>
-              <w:t>ขบ.279/005/2562</w:t>
+              <w:t>๑๓</w:t>
+            </w:r>
+          </w:p>
+        </w:tc>
+        <w:tc>
+          <w:tcPr>
+            <w:tcW w:w="0" w:type="auto"/>
+          </w:tcPr>
+          <w:p>
+            <w:pPr>
+              <w:rPr>
+                <w:rFonts w:ascii="TH SarabunIT๙" w:eastAsia="Calibri" w:hAnsi="TH SarabunIT๙" w:cs="TH SarabunIT๙"/>
+                <w:sz w:val="32"/>
+                <w:szCs w:val="32"/>
+              </w:rPr>
+            </w:pPr>
+            <w:proofErr w:type="spellStart"/>
+            <w:proofErr w:type="spellEnd"/>
+            <w:r>
+              <w:rPr>
+                <w:rFonts w:ascii="TH SarabunIT๙" w:eastAsia="Calibri" w:hAnsi="TH SarabunIT๙" w:cs="TH SarabunIT๙"/>
+                <w:sz w:val="32"/>
+                <w:szCs w:val="32"/>
+                <w:cs/>
+              </w:rPr>
+              <w:t>เก้าอี้จัดเลี้ยงเหล็กขาเอ</w:t>
+            </w:r>
+          </w:p>
+        </w:tc>
+        <w:tc>
+          <w:tcPr>
+            <w:tcW w:w="0" w:type="auto"/>
+          </w:tcPr>
+          <w:p>
+            <w:pPr>
+              <w:jc w:val="center"/>
+              <w:rPr>
+                <w:rFonts w:ascii="TH SarabunIT๙" w:eastAsia="Calibri" w:hAnsi="TH SarabunIT๙" w:cs="TH SarabunIT๙"/>
+                <w:sz w:val="32"/>
+                <w:szCs w:val="32"/>
+              </w:rPr>
+            </w:pPr>
+            <w:r>
+              <w:rPr>
+                <w:rFonts w:ascii="TH SarabunIT๙" w:eastAsia="Calibri" w:hAnsi="TH SarabunIT๙" w:cs="TH SarabunIT๙"/>
+                <w:sz w:val="32"/>
+                <w:szCs w:val="32"/>
+                <w:cs/>
+              </w:rPr>
+              <w:t>ขบ.279/003/2562</w:t>
             </w:r>
           </w:p>
         </w:tc>
@@ -4087,38 +3974,56 @@
                 <w:szCs w:val="32"/>
                 <w:cs/>
               </w:rPr>
-              <w:t>๑๕</w:t>
-            </w:r>
-          </w:p>
-        </w:tc>
-        <w:tc>
-          <w:tcPr>
-            <w:tcW w:w="0" w:type="auto"/>
-            <w:vMerge/>
-          </w:tcPr>
-          <w:p/>
-        </w:tc>
-        <w:tc>
-          <w:tcPr>
-            <w:tcW w:w="0" w:type="auto"/>
-          </w:tcPr>
-          <w:p>
-            <w:pPr>
-              <w:jc w:val="center"/>
-              <w:rPr>
-                <w:rFonts w:ascii="TH SarabunIT๙" w:eastAsia="Calibri" w:hAnsi="TH SarabunIT๙" w:cs="TH SarabunIT๙"/>
-                <w:sz w:val="32"/>
-                <w:szCs w:val="32"/>
-              </w:rPr>
-            </w:pPr>
-            <w:r>
-              <w:rPr>
-                <w:rFonts w:ascii="TH SarabunIT๙" w:eastAsia="Calibri" w:hAnsi="TH SarabunIT๙" w:cs="TH SarabunIT๙"/>
-                <w:sz w:val="32"/>
-                <w:szCs w:val="32"/>
-                <w:cs/>
-              </w:rPr>
-              <w:t>ขบ.279/006/2562</w:t>
+              <w:t>๑๔</w:t>
+            </w:r>
+          </w:p>
+        </w:tc>
+        <w:tc>
+          <w:tcPr>
+            <w:tcW w:w="0" w:type="auto"/>
+          </w:tcPr>
+          <w:p>
+            <w:pPr>
+              <w:rPr>
+                <w:rFonts w:ascii="TH SarabunIT๙" w:eastAsia="Calibri" w:hAnsi="TH SarabunIT๙" w:cs="TH SarabunIT๙"/>
+                <w:sz w:val="32"/>
+                <w:szCs w:val="32"/>
+              </w:rPr>
+            </w:pPr>
+            <w:proofErr w:type="spellStart"/>
+            <w:proofErr w:type="spellEnd"/>
+            <w:r>
+              <w:rPr>
+                <w:rFonts w:ascii="TH SarabunIT๙" w:eastAsia="Calibri" w:hAnsi="TH SarabunIT๙" w:cs="TH SarabunIT๙"/>
+                <w:sz w:val="32"/>
+                <w:szCs w:val="32"/>
+                <w:cs/>
+              </w:rPr>
+              <w:t>เก้าอี้จัดเลี้ยงเหล็กขาเอ</w:t>
+            </w:r>
+          </w:p>
+        </w:tc>
+        <w:tc>
+          <w:tcPr>
+            <w:tcW w:w="0" w:type="auto"/>
+          </w:tcPr>
+          <w:p>
+            <w:pPr>
+              <w:jc w:val="center"/>
+              <w:rPr>
+                <w:rFonts w:ascii="TH SarabunIT๙" w:eastAsia="Calibri" w:hAnsi="TH SarabunIT๙" w:cs="TH SarabunIT๙"/>
+                <w:sz w:val="32"/>
+                <w:szCs w:val="32"/>
+              </w:rPr>
+            </w:pPr>
+            <w:r>
+              <w:rPr>
+                <w:rFonts w:ascii="TH SarabunIT๙" w:eastAsia="Calibri" w:hAnsi="TH SarabunIT๙" w:cs="TH SarabunIT๙"/>
+                <w:sz w:val="32"/>
+                <w:szCs w:val="32"/>
+                <w:cs/>
+              </w:rPr>
+              <w:t>ขบ.279/005/2562</w:t>
             </w:r>
           </w:p>
         </w:tc>
@@ -4330,38 +4235,56 @@
                 <w:szCs w:val="32"/>
                 <w:cs/>
               </w:rPr>
-              <w:t>๑๖</w:t>
-            </w:r>
-          </w:p>
-        </w:tc>
-        <w:tc>
-          <w:tcPr>
-            <w:tcW w:w="0" w:type="auto"/>
-            <w:vMerge/>
-          </w:tcPr>
-          <w:p/>
-        </w:tc>
-        <w:tc>
-          <w:tcPr>
-            <w:tcW w:w="0" w:type="auto"/>
-          </w:tcPr>
-          <w:p>
-            <w:pPr>
-              <w:jc w:val="center"/>
-              <w:rPr>
-                <w:rFonts w:ascii="TH SarabunIT๙" w:eastAsia="Calibri" w:hAnsi="TH SarabunIT๙" w:cs="TH SarabunIT๙"/>
-                <w:sz w:val="32"/>
-                <w:szCs w:val="32"/>
-              </w:rPr>
-            </w:pPr>
-            <w:r>
-              <w:rPr>
-                <w:rFonts w:ascii="TH SarabunIT๙" w:eastAsia="Calibri" w:hAnsi="TH SarabunIT๙" w:cs="TH SarabunIT๙"/>
-                <w:sz w:val="32"/>
-                <w:szCs w:val="32"/>
-                <w:cs/>
-              </w:rPr>
-              <w:t>ขบ.279/007/2562</w:t>
+              <w:t>๑๕</w:t>
+            </w:r>
+          </w:p>
+        </w:tc>
+        <w:tc>
+          <w:tcPr>
+            <w:tcW w:w="0" w:type="auto"/>
+          </w:tcPr>
+          <w:p>
+            <w:pPr>
+              <w:rPr>
+                <w:rFonts w:ascii="TH SarabunIT๙" w:eastAsia="Calibri" w:hAnsi="TH SarabunIT๙" w:cs="TH SarabunIT๙"/>
+                <w:sz w:val="32"/>
+                <w:szCs w:val="32"/>
+              </w:rPr>
+            </w:pPr>
+            <w:proofErr w:type="spellStart"/>
+            <w:proofErr w:type="spellEnd"/>
+            <w:r>
+              <w:rPr>
+                <w:rFonts w:ascii="TH SarabunIT๙" w:eastAsia="Calibri" w:hAnsi="TH SarabunIT๙" w:cs="TH SarabunIT๙"/>
+                <w:sz w:val="32"/>
+                <w:szCs w:val="32"/>
+                <w:cs/>
+              </w:rPr>
+              <w:t>เก้าอี้จัดเลี้ยงเหล็กขาเอ</w:t>
+            </w:r>
+          </w:p>
+        </w:tc>
+        <w:tc>
+          <w:tcPr>
+            <w:tcW w:w="0" w:type="auto"/>
+          </w:tcPr>
+          <w:p>
+            <w:pPr>
+              <w:jc w:val="center"/>
+              <w:rPr>
+                <w:rFonts w:ascii="TH SarabunIT๙" w:eastAsia="Calibri" w:hAnsi="TH SarabunIT๙" w:cs="TH SarabunIT๙"/>
+                <w:sz w:val="32"/>
+                <w:szCs w:val="32"/>
+              </w:rPr>
+            </w:pPr>
+            <w:r>
+              <w:rPr>
+                <w:rFonts w:ascii="TH SarabunIT๙" w:eastAsia="Calibri" w:hAnsi="TH SarabunIT๙" w:cs="TH SarabunIT๙"/>
+                <w:sz w:val="32"/>
+                <w:szCs w:val="32"/>
+                <w:cs/>
+              </w:rPr>
+              <w:t>ขบ.279/006/2562</w:t>
             </w:r>
           </w:p>
         </w:tc>
@@ -4573,38 +4496,56 @@
                 <w:szCs w:val="32"/>
                 <w:cs/>
               </w:rPr>
-              <w:t>๑๗</w:t>
-            </w:r>
-          </w:p>
-        </w:tc>
-        <w:tc>
-          <w:tcPr>
-            <w:tcW w:w="0" w:type="auto"/>
-            <w:vMerge/>
-          </w:tcPr>
-          <w:p/>
-        </w:tc>
-        <w:tc>
-          <w:tcPr>
-            <w:tcW w:w="0" w:type="auto"/>
-          </w:tcPr>
-          <w:p>
-            <w:pPr>
-              <w:jc w:val="center"/>
-              <w:rPr>
-                <w:rFonts w:ascii="TH SarabunIT๙" w:eastAsia="Calibri" w:hAnsi="TH SarabunIT๙" w:cs="TH SarabunIT๙"/>
-                <w:sz w:val="32"/>
-                <w:szCs w:val="32"/>
-              </w:rPr>
-            </w:pPr>
-            <w:r>
-              <w:rPr>
-                <w:rFonts w:ascii="TH SarabunIT๙" w:eastAsia="Calibri" w:hAnsi="TH SarabunIT๙" w:cs="TH SarabunIT๙"/>
-                <w:sz w:val="32"/>
-                <w:szCs w:val="32"/>
-                <w:cs/>
-              </w:rPr>
-              <w:t>ขบ.279/008/2562</w:t>
+              <w:t>๑๖</w:t>
+            </w:r>
+          </w:p>
+        </w:tc>
+        <w:tc>
+          <w:tcPr>
+            <w:tcW w:w="0" w:type="auto"/>
+          </w:tcPr>
+          <w:p>
+            <w:pPr>
+              <w:rPr>
+                <w:rFonts w:ascii="TH SarabunIT๙" w:eastAsia="Calibri" w:hAnsi="TH SarabunIT๙" w:cs="TH SarabunIT๙"/>
+                <w:sz w:val="32"/>
+                <w:szCs w:val="32"/>
+              </w:rPr>
+            </w:pPr>
+            <w:proofErr w:type="spellStart"/>
+            <w:proofErr w:type="spellEnd"/>
+            <w:r>
+              <w:rPr>
+                <w:rFonts w:ascii="TH SarabunIT๙" w:eastAsia="Calibri" w:hAnsi="TH SarabunIT๙" w:cs="TH SarabunIT๙"/>
+                <w:sz w:val="32"/>
+                <w:szCs w:val="32"/>
+                <w:cs/>
+              </w:rPr>
+              <w:t>เก้าอี้จัดเลี้ยงเหล็กขาเอ</w:t>
+            </w:r>
+          </w:p>
+        </w:tc>
+        <w:tc>
+          <w:tcPr>
+            <w:tcW w:w="0" w:type="auto"/>
+          </w:tcPr>
+          <w:p>
+            <w:pPr>
+              <w:jc w:val="center"/>
+              <w:rPr>
+                <w:rFonts w:ascii="TH SarabunIT๙" w:eastAsia="Calibri" w:hAnsi="TH SarabunIT๙" w:cs="TH SarabunIT๙"/>
+                <w:sz w:val="32"/>
+                <w:szCs w:val="32"/>
+              </w:rPr>
+            </w:pPr>
+            <w:r>
+              <w:rPr>
+                <w:rFonts w:ascii="TH SarabunIT๙" w:eastAsia="Calibri" w:hAnsi="TH SarabunIT๙" w:cs="TH SarabunIT๙"/>
+                <w:sz w:val="32"/>
+                <w:szCs w:val="32"/>
+                <w:cs/>
+              </w:rPr>
+              <w:t>ขบ.279/007/2562</w:t>
             </w:r>
           </w:p>
         </w:tc>
@@ -4816,38 +4757,56 @@
                 <w:szCs w:val="32"/>
                 <w:cs/>
               </w:rPr>
-              <w:t>๑๘</w:t>
-            </w:r>
-          </w:p>
-        </w:tc>
-        <w:tc>
-          <w:tcPr>
-            <w:tcW w:w="0" w:type="auto"/>
-            <w:vMerge/>
-          </w:tcPr>
-          <w:p/>
-        </w:tc>
-        <w:tc>
-          <w:tcPr>
-            <w:tcW w:w="0" w:type="auto"/>
-          </w:tcPr>
-          <w:p>
-            <w:pPr>
-              <w:jc w:val="center"/>
-              <w:rPr>
-                <w:rFonts w:ascii="TH SarabunIT๙" w:eastAsia="Calibri" w:hAnsi="TH SarabunIT๙" w:cs="TH SarabunIT๙"/>
-                <w:sz w:val="32"/>
-                <w:szCs w:val="32"/>
-              </w:rPr>
-            </w:pPr>
-            <w:r>
-              <w:rPr>
-                <w:rFonts w:ascii="TH SarabunIT๙" w:eastAsia="Calibri" w:hAnsi="TH SarabunIT๙" w:cs="TH SarabunIT๙"/>
-                <w:sz w:val="32"/>
-                <w:szCs w:val="32"/>
-                <w:cs/>
-              </w:rPr>
-              <w:t>ขบ.279/010/2562</w:t>
+              <w:t>๑๗</w:t>
+            </w:r>
+          </w:p>
+        </w:tc>
+        <w:tc>
+          <w:tcPr>
+            <w:tcW w:w="0" w:type="auto"/>
+          </w:tcPr>
+          <w:p>
+            <w:pPr>
+              <w:rPr>
+                <w:rFonts w:ascii="TH SarabunIT๙" w:eastAsia="Calibri" w:hAnsi="TH SarabunIT๙" w:cs="TH SarabunIT๙"/>
+                <w:sz w:val="32"/>
+                <w:szCs w:val="32"/>
+              </w:rPr>
+            </w:pPr>
+            <w:proofErr w:type="spellStart"/>
+            <w:proofErr w:type="spellEnd"/>
+            <w:r>
+              <w:rPr>
+                <w:rFonts w:ascii="TH SarabunIT๙" w:eastAsia="Calibri" w:hAnsi="TH SarabunIT๙" w:cs="TH SarabunIT๙"/>
+                <w:sz w:val="32"/>
+                <w:szCs w:val="32"/>
+                <w:cs/>
+              </w:rPr>
+              <w:t>เก้าอี้จัดเลี้ยงเหล็กขาเอ</w:t>
+            </w:r>
+          </w:p>
+        </w:tc>
+        <w:tc>
+          <w:tcPr>
+            <w:tcW w:w="0" w:type="auto"/>
+          </w:tcPr>
+          <w:p>
+            <w:pPr>
+              <w:jc w:val="center"/>
+              <w:rPr>
+                <w:rFonts w:ascii="TH SarabunIT๙" w:eastAsia="Calibri" w:hAnsi="TH SarabunIT๙" w:cs="TH SarabunIT๙"/>
+                <w:sz w:val="32"/>
+                <w:szCs w:val="32"/>
+              </w:rPr>
+            </w:pPr>
+            <w:r>
+              <w:rPr>
+                <w:rFonts w:ascii="TH SarabunIT๙" w:eastAsia="Calibri" w:hAnsi="TH SarabunIT๙" w:cs="TH SarabunIT๙"/>
+                <w:sz w:val="32"/>
+                <w:szCs w:val="32"/>
+                <w:cs/>
+              </w:rPr>
+              <w:t>ขบ.279/008/2562</w:t>
             </w:r>
           </w:p>
         </w:tc>
@@ -5059,38 +5018,56 @@
                 <w:szCs w:val="32"/>
                 <w:cs/>
               </w:rPr>
-              <w:t>๑๙</w:t>
-            </w:r>
-          </w:p>
-        </w:tc>
-        <w:tc>
-          <w:tcPr>
-            <w:tcW w:w="0" w:type="auto"/>
-            <w:vMerge/>
-          </w:tcPr>
-          <w:p/>
-        </w:tc>
-        <w:tc>
-          <w:tcPr>
-            <w:tcW w:w="0" w:type="auto"/>
-          </w:tcPr>
-          <w:p>
-            <w:pPr>
-              <w:jc w:val="center"/>
-              <w:rPr>
-                <w:rFonts w:ascii="TH SarabunIT๙" w:eastAsia="Calibri" w:hAnsi="TH SarabunIT๙" w:cs="TH SarabunIT๙"/>
-                <w:sz w:val="32"/>
-                <w:szCs w:val="32"/>
-              </w:rPr>
-            </w:pPr>
-            <w:r>
-              <w:rPr>
-                <w:rFonts w:ascii="TH SarabunIT๙" w:eastAsia="Calibri" w:hAnsi="TH SarabunIT๙" w:cs="TH SarabunIT๙"/>
-                <w:sz w:val="32"/>
-                <w:szCs w:val="32"/>
-                <w:cs/>
-              </w:rPr>
-              <w:t>ขบ.279/012/2562</w:t>
+              <w:t>๑๘</w:t>
+            </w:r>
+          </w:p>
+        </w:tc>
+        <w:tc>
+          <w:tcPr>
+            <w:tcW w:w="0" w:type="auto"/>
+          </w:tcPr>
+          <w:p>
+            <w:pPr>
+              <w:rPr>
+                <w:rFonts w:ascii="TH SarabunIT๙" w:eastAsia="Calibri" w:hAnsi="TH SarabunIT๙" w:cs="TH SarabunIT๙"/>
+                <w:sz w:val="32"/>
+                <w:szCs w:val="32"/>
+              </w:rPr>
+            </w:pPr>
+            <w:proofErr w:type="spellStart"/>
+            <w:proofErr w:type="spellEnd"/>
+            <w:r>
+              <w:rPr>
+                <w:rFonts w:ascii="TH SarabunIT๙" w:eastAsia="Calibri" w:hAnsi="TH SarabunIT๙" w:cs="TH SarabunIT๙"/>
+                <w:sz w:val="32"/>
+                <w:szCs w:val="32"/>
+                <w:cs/>
+              </w:rPr>
+              <w:t>เก้าอี้จัดเลี้ยงเหล็กขาเอ</w:t>
+            </w:r>
+          </w:p>
+        </w:tc>
+        <w:tc>
+          <w:tcPr>
+            <w:tcW w:w="0" w:type="auto"/>
+          </w:tcPr>
+          <w:p>
+            <w:pPr>
+              <w:jc w:val="center"/>
+              <w:rPr>
+                <w:rFonts w:ascii="TH SarabunIT๙" w:eastAsia="Calibri" w:hAnsi="TH SarabunIT๙" w:cs="TH SarabunIT๙"/>
+                <w:sz w:val="32"/>
+                <w:szCs w:val="32"/>
+              </w:rPr>
+            </w:pPr>
+            <w:r>
+              <w:rPr>
+                <w:rFonts w:ascii="TH SarabunIT๙" w:eastAsia="Calibri" w:hAnsi="TH SarabunIT๙" w:cs="TH SarabunIT๙"/>
+                <w:sz w:val="32"/>
+                <w:szCs w:val="32"/>
+                <w:cs/>
+              </w:rPr>
+              <w:t>ขบ.279/010/2562</w:t>
             </w:r>
           </w:p>
         </w:tc>
@@ -5302,15 +5279,13 @@
                 <w:szCs w:val="32"/>
                 <w:cs/>
               </w:rPr>
-              <w:t>๒๐</w:t>
-            </w:r>
-          </w:p>
-        </w:tc>
-        <w:tc>
-          <w:tcPr>
-            <w:tcW w:w="0" w:type="auto"/>
-            <w:vMerge w:val="restart"/>
-            <w:vAlign w:val="top"/>
+              <w:t>๑๙</w:t>
+            </w:r>
+          </w:p>
+        </w:tc>
+        <w:tc>
+          <w:tcPr>
+            <w:tcW w:w="0" w:type="auto"/>
           </w:tcPr>
           <w:p>
             <w:pPr>
@@ -5329,31 +5304,31 @@
                 <w:szCs w:val="32"/>
                 <w:cs/>
               </w:rPr>
-              <w:t>เครื่องคอมพิวเตอร์ตั้งโต๊ะ ยี่ห้อ HP รุ่น EliteDesk 705 G2 SFF</w:t>
-            </w:r>
-          </w:p>
-        </w:tc>
-        <w:tc>
-          <w:tcPr>
-            <w:tcW w:w="0" w:type="auto"/>
-          </w:tcPr>
-          <w:p>
-            <w:pPr>
-              <w:jc w:val="center"/>
-              <w:rPr>
-                <w:rFonts w:ascii="TH SarabunIT๙" w:eastAsia="Calibri" w:hAnsi="TH SarabunIT๙" w:cs="TH SarabunIT๙"/>
-                <w:sz w:val="32"/>
-                <w:szCs w:val="32"/>
-              </w:rPr>
-            </w:pPr>
-            <w:r>
-              <w:rPr>
-                <w:rFonts w:ascii="TH SarabunIT๙" w:eastAsia="Calibri" w:hAnsi="TH SarabunIT๙" w:cs="TH SarabunIT๙"/>
-                <w:sz w:val="32"/>
-                <w:szCs w:val="32"/>
-                <w:cs/>
-              </w:rPr>
-              <w:t>ขบ.325/002/2568</w:t>
+              <w:t>เก้าอี้จัดเลี้ยงเหล็กขาเอ</w:t>
+            </w:r>
+          </w:p>
+        </w:tc>
+        <w:tc>
+          <w:tcPr>
+            <w:tcW w:w="0" w:type="auto"/>
+          </w:tcPr>
+          <w:p>
+            <w:pPr>
+              <w:jc w:val="center"/>
+              <w:rPr>
+                <w:rFonts w:ascii="TH SarabunIT๙" w:eastAsia="Calibri" w:hAnsi="TH SarabunIT๙" w:cs="TH SarabunIT๙"/>
+                <w:sz w:val="32"/>
+                <w:szCs w:val="32"/>
+              </w:rPr>
+            </w:pPr>
+            <w:r>
+              <w:rPr>
+                <w:rFonts w:ascii="TH SarabunIT๙" w:eastAsia="Calibri" w:hAnsi="TH SarabunIT๙" w:cs="TH SarabunIT๙"/>
+                <w:sz w:val="32"/>
+                <w:szCs w:val="32"/>
+                <w:cs/>
+              </w:rPr>
+              <w:t>ขบ.279/012/2562</w:t>
             </w:r>
           </w:p>
         </w:tc>
@@ -5396,141 +5371,150 @@
                 <w:cs/>
               </w:rPr>
             </w:pPr>
-          </w:p>
-        </w:tc>
-        <w:tc>
-          <w:tcPr>
-            <w:tcW w:w="0" w:type="auto"/>
-          </w:tcPr>
-          <w:p>
-            <w:pPr>
-              <w:jc w:val="center"/>
-              <w:rPr>
-                <w:rFonts w:ascii="TH SarabunIT๙" w:eastAsia="Calibri" w:hAnsi="TH SarabunIT๙" w:cs="TH SarabunIT๙"/>
-                <w:sz w:val="32"/>
-                <w:szCs w:val="32"/>
-                <w:cs/>
-              </w:rPr>
-            </w:pPr>
-          </w:p>
-        </w:tc>
-        <w:tc>
-          <w:tcPr>
-            <w:tcW w:w="0" w:type="auto"/>
-          </w:tcPr>
-          <w:p>
-            <w:pPr>
-              <w:jc w:val="center"/>
-              <w:rPr>
-                <w:rFonts w:ascii="TH SarabunIT๙" w:eastAsia="Calibri" w:hAnsi="TH SarabunIT๙" w:cs="TH SarabunIT๙"/>
-                <w:sz w:val="32"/>
-                <w:szCs w:val="32"/>
-                <w:cs/>
-              </w:rPr>
-            </w:pPr>
-            <w:r>
-              <w:rPr>
-                <w:rFonts w:ascii="TH SarabunIT๙" w:eastAsia="Calibri" w:hAnsi="TH SarabunIT๙" w:cs="TH SarabunIT๙"/>
-                <w:sz w:val="32"/>
-                <w:szCs w:val="32"/>
-                <w:cs/>
-              </w:rPr>
-              <w:t>ใช้งานไม่ได้</w:t>
-            </w:r>
-          </w:p>
-        </w:tc>
-        <w:tc>
-          <w:tcPr>
-            <w:tcW w:w="0" w:type="auto"/>
-          </w:tcPr>
-          <w:p>
-            <w:pPr>
-              <w:jc w:val="center"/>
-              <w:rPr>
-                <w:rFonts w:ascii="TH SarabunIT๙" w:eastAsia="Calibri" w:hAnsi="TH SarabunIT๙" w:cs="TH SarabunIT๙"/>
-                <w:sz w:val="32"/>
-                <w:szCs w:val="32"/>
-                <w:cs/>
-              </w:rPr>
-            </w:pPr>
-          </w:p>
-        </w:tc>
-        <w:tc>
-          <w:tcPr>
-            <w:tcW w:w="0" w:type="auto"/>
-          </w:tcPr>
-          <w:p>
-            <w:pPr>
-              <w:jc w:val="center"/>
-              <w:rPr>
-                <w:rFonts w:ascii="TH SarabunIT๙" w:eastAsia="Calibri" w:hAnsi="TH SarabunIT๙" w:cs="TH SarabunIT๙"/>
-                <w:sz w:val="32"/>
-                <w:szCs w:val="32"/>
-                <w:cs/>
-              </w:rPr>
-            </w:pPr>
-            <w:r>
-              <w:rPr>
-                <w:rFonts w:ascii="TH SarabunIT๙" w:eastAsia="Calibri" w:hAnsi="TH SarabunIT๙" w:cs="TH SarabunIT๙"/>
-                <w:sz w:val="32"/>
-                <w:szCs w:val="32"/>
-                <w:cs/>
-              </w:rPr>
-              <w:t>2568</w:t>
-            </w:r>
-          </w:p>
-        </w:tc>
-        <w:tc>
-          <w:tcPr>
-            <w:tcW w:w="0" w:type="auto"/>
-          </w:tcPr>
-          <w:p>
-            <w:pPr>
-              <w:jc w:val="center"/>
-              <w:rPr>
-                <w:rFonts w:ascii="TH SarabunIT๙" w:eastAsia="Calibri" w:hAnsi="TH SarabunIT๙" w:cs="TH SarabunIT๙"/>
-                <w:sz w:val="32"/>
-                <w:szCs w:val="32"/>
-                <w:cs/>
-              </w:rPr>
-            </w:pPr>
-          </w:p>
-        </w:tc>
-        <w:tc>
-          <w:tcPr>
-            <w:tcW w:w="0" w:type="auto"/>
-          </w:tcPr>
-          <w:p>
-            <w:pPr>
-              <w:jc w:val="center"/>
-              <w:rPr>
-                <w:rFonts w:ascii="TH SarabunIT๙" w:eastAsia="Calibri" w:hAnsi="TH SarabunIT๙" w:cs="TH SarabunIT๙"/>
-                <w:sz w:val="32"/>
-                <w:szCs w:val="32"/>
-              </w:rPr>
-            </w:pPr>
-          </w:p>
-        </w:tc>
-        <w:tc>
-          <w:tcPr>
-            <w:tcW w:w="0" w:type="auto"/>
-          </w:tcPr>
-          <w:p>
-            <w:pPr>
-              <w:rPr>
-                <w:rFonts w:ascii="TH SarabunIT๙" w:eastAsia="Calibri" w:hAnsi="TH SarabunIT๙" w:cs="TH SarabunIT๙"/>
-                <w:sz w:val="32"/>
-                <w:szCs w:val="32"/>
-              </w:rPr>
-            </w:pPr>
-            <w:r>
-              <w:rPr>
-                <w:rFonts w:ascii="TH SarabunIT๙" w:eastAsia="Calibri" w:hAnsi="TH SarabunIT๙" w:cs="TH SarabunIT๙"/>
-                <w:sz w:val="32"/>
-                <w:szCs w:val="32"/>
-                <w:cs/>
-              </w:rPr>
-              <w:t>ชำรุด เปิดเครื่องไม่ได้ ซ่อมแซมไม่คุ้มค่า</w:t>
+            <w:r>
+              <w:rPr>
+                <w:rFonts w:ascii="Segoe UI Symbol" w:eastAsia="Calibri" w:hAnsi="Segoe UI Symbol" w:cs="Segoe UI Symbol" w:hint="cs"/>
+                <w:sz w:val="32"/>
+                <w:szCs w:val="32"/>
+                <w:cs/>
+              </w:rPr>
+              <w:t>✓</w:t>
+            </w:r>
+          </w:p>
+        </w:tc>
+        <w:tc>
+          <w:tcPr>
+            <w:tcW w:w="0" w:type="auto"/>
+          </w:tcPr>
+          <w:p>
+            <w:pPr>
+              <w:jc w:val="center"/>
+              <w:rPr>
+                <w:rFonts w:ascii="TH SarabunIT๙" w:eastAsia="Calibri" w:hAnsi="TH SarabunIT๙" w:cs="TH SarabunIT๙"/>
+                <w:sz w:val="32"/>
+                <w:szCs w:val="32"/>
+                <w:cs/>
+              </w:rPr>
+            </w:pPr>
+          </w:p>
+        </w:tc>
+        <w:tc>
+          <w:tcPr>
+            <w:tcW w:w="0" w:type="auto"/>
+          </w:tcPr>
+          <w:p>
+            <w:pPr>
+              <w:jc w:val="center"/>
+              <w:rPr>
+                <w:rFonts w:ascii="TH SarabunIT๙" w:eastAsia="Calibri" w:hAnsi="TH SarabunIT๙" w:cs="TH SarabunIT๙"/>
+                <w:sz w:val="32"/>
+                <w:szCs w:val="32"/>
+                <w:cs/>
+              </w:rPr>
+            </w:pPr>
+            <w:r>
+              <w:rPr>
+                <w:rFonts w:ascii="TH SarabunIT๙" w:eastAsia="Calibri" w:hAnsi="TH SarabunIT๙" w:cs="TH SarabunIT๙"/>
+                <w:sz w:val="32"/>
+                <w:szCs w:val="32"/>
+                <w:cs/>
+              </w:rPr>
+              <w:t>ชำรุด เสื่อมสภาพ</w:t>
+            </w:r>
+          </w:p>
+        </w:tc>
+        <w:tc>
+          <w:tcPr>
+            <w:tcW w:w="0" w:type="auto"/>
+          </w:tcPr>
+          <w:p>
+            <w:pPr>
+              <w:jc w:val="center"/>
+              <w:rPr>
+                <w:rFonts w:ascii="TH SarabunIT๙" w:eastAsia="Calibri" w:hAnsi="TH SarabunIT๙" w:cs="TH SarabunIT๙"/>
+                <w:sz w:val="32"/>
+                <w:szCs w:val="32"/>
+                <w:cs/>
+              </w:rPr>
+            </w:pPr>
+          </w:p>
+        </w:tc>
+        <w:tc>
+          <w:tcPr>
+            <w:tcW w:w="0" w:type="auto"/>
+          </w:tcPr>
+          <w:p>
+            <w:pPr>
+              <w:jc w:val="center"/>
+              <w:rPr>
+                <w:rFonts w:ascii="TH SarabunIT๙" w:eastAsia="Calibri" w:hAnsi="TH SarabunIT๙" w:cs="TH SarabunIT๙"/>
+                <w:sz w:val="32"/>
+                <w:szCs w:val="32"/>
+                <w:cs/>
+              </w:rPr>
+            </w:pPr>
+            <w:r>
+              <w:rPr>
+                <w:rFonts w:ascii="TH SarabunIT๙" w:eastAsia="Calibri" w:hAnsi="TH SarabunIT๙" w:cs="TH SarabunIT๙"/>
+                <w:sz w:val="32"/>
+                <w:szCs w:val="32"/>
+                <w:cs/>
+              </w:rPr>
+              <w:t>2562</w:t>
+            </w:r>
+          </w:p>
+        </w:tc>
+        <w:tc>
+          <w:tcPr>
+            <w:tcW w:w="0" w:type="auto"/>
+          </w:tcPr>
+          <w:p>
+            <w:pPr>
+              <w:jc w:val="center"/>
+              <w:rPr>
+                <w:rFonts w:ascii="TH SarabunIT๙" w:eastAsia="Calibri" w:hAnsi="TH SarabunIT๙" w:cs="TH SarabunIT๙"/>
+                <w:sz w:val="32"/>
+                <w:szCs w:val="32"/>
+                <w:cs/>
+              </w:rPr>
+            </w:pPr>
+          </w:p>
+        </w:tc>
+        <w:tc>
+          <w:tcPr>
+            <w:tcW w:w="0" w:type="auto"/>
+          </w:tcPr>
+          <w:p>
+            <w:pPr>
+              <w:jc w:val="center"/>
+              <w:rPr>
+                <w:rFonts w:ascii="TH SarabunIT๙" w:eastAsia="Calibri" w:hAnsi="TH SarabunIT๙" w:cs="TH SarabunIT๙"/>
+                <w:sz w:val="32"/>
+                <w:szCs w:val="32"/>
+              </w:rPr>
+            </w:pPr>
+          </w:p>
+        </w:tc>
+        <w:tc>
+          <w:tcPr>
+            <w:tcW w:w="0" w:type="auto"/>
+          </w:tcPr>
+          <w:p>
+            <w:pPr>
+              <w:rPr>
+                <w:rFonts w:ascii="TH SarabunIT๙" w:eastAsia="Calibri" w:hAnsi="TH SarabunIT๙" w:cs="TH SarabunIT๙"/>
+                <w:sz w:val="32"/>
+                <w:szCs w:val="32"/>
+              </w:rPr>
+            </w:pPr>
+            <w:r>
+              <w:rPr>
+                <w:rFonts w:ascii="TH SarabunIT๙" w:eastAsia="Calibri" w:hAnsi="TH SarabunIT๙" w:cs="TH SarabunIT๙"/>
+                <w:sz w:val="32"/>
+                <w:szCs w:val="32"/>
+                <w:cs/>
+              </w:rPr>
+              <w:t>ชำรุดและเสื่อมสภาพตามอายุการใช้งาน ใช้งานไม่ปลอดภัย ซ่อมแซมไม่คุ้มค่า</w:t>
             </w:r>
           </w:p>
         </w:tc>
@@ -5556,38 +5540,56 @@
                 <w:szCs w:val="32"/>
                 <w:cs/>
               </w:rPr>
-              <w:t>๒๑</w:t>
-            </w:r>
-          </w:p>
-        </w:tc>
-        <w:tc>
-          <w:tcPr>
-            <w:tcW w:w="0" w:type="auto"/>
-            <w:vMerge/>
-          </w:tcPr>
-          <w:p/>
-        </w:tc>
-        <w:tc>
-          <w:tcPr>
-            <w:tcW w:w="0" w:type="auto"/>
-          </w:tcPr>
-          <w:p>
-            <w:pPr>
-              <w:jc w:val="center"/>
-              <w:rPr>
-                <w:rFonts w:ascii="TH SarabunIT๙" w:eastAsia="Calibri" w:hAnsi="TH SarabunIT๙" w:cs="TH SarabunIT๙"/>
-                <w:sz w:val="32"/>
-                <w:szCs w:val="32"/>
-              </w:rPr>
-            </w:pPr>
-            <w:r>
-              <w:rPr>
-                <w:rFonts w:ascii="TH SarabunIT๙" w:eastAsia="Calibri" w:hAnsi="TH SarabunIT๙" w:cs="TH SarabunIT๙"/>
-                <w:sz w:val="32"/>
-                <w:szCs w:val="32"/>
-                <w:cs/>
-              </w:rPr>
-              <w:t>ขบ.325/003/2568</w:t>
+              <w:t>๒๐</w:t>
+            </w:r>
+          </w:p>
+        </w:tc>
+        <w:tc>
+          <w:tcPr>
+            <w:tcW w:w="0" w:type="auto"/>
+          </w:tcPr>
+          <w:p>
+            <w:pPr>
+              <w:rPr>
+                <w:rFonts w:ascii="TH SarabunIT๙" w:eastAsia="Calibri" w:hAnsi="TH SarabunIT๙" w:cs="TH SarabunIT๙"/>
+                <w:sz w:val="32"/>
+                <w:szCs w:val="32"/>
+              </w:rPr>
+            </w:pPr>
+            <w:proofErr w:type="spellStart"/>
+            <w:proofErr w:type="spellEnd"/>
+            <w:r>
+              <w:rPr>
+                <w:rFonts w:ascii="TH SarabunIT๙" w:eastAsia="Calibri" w:hAnsi="TH SarabunIT๙" w:cs="TH SarabunIT๙"/>
+                <w:sz w:val="32"/>
+                <w:szCs w:val="32"/>
+                <w:cs/>
+              </w:rPr>
+              <w:t>เครื่องคอมพิวเตอร์ตั้งโต๊ะ ยี่ห้อ HP รุ่น EliteDesk 705 G2 SFF</w:t>
+            </w:r>
+          </w:p>
+        </w:tc>
+        <w:tc>
+          <w:tcPr>
+            <w:tcW w:w="0" w:type="auto"/>
+          </w:tcPr>
+          <w:p>
+            <w:pPr>
+              <w:jc w:val="center"/>
+              <w:rPr>
+                <w:rFonts w:ascii="TH SarabunIT๙" w:eastAsia="Calibri" w:hAnsi="TH SarabunIT๙" w:cs="TH SarabunIT๙"/>
+                <w:sz w:val="32"/>
+                <w:szCs w:val="32"/>
+              </w:rPr>
+            </w:pPr>
+            <w:r>
+              <w:rPr>
+                <w:rFonts w:ascii="TH SarabunIT๙" w:eastAsia="Calibri" w:hAnsi="TH SarabunIT๙" w:cs="TH SarabunIT๙"/>
+                <w:sz w:val="32"/>
+                <w:szCs w:val="32"/>
+                <w:cs/>
+              </w:rPr>
+              <w:t>ขบ.325/002/2568</w:t>
             </w:r>
           </w:p>
         </w:tc>
@@ -5781,60 +5783,75 @@
                 <w:rFonts w:ascii="TH SarabunIT๙" w:eastAsia="Calibri" w:hAnsi="TH SarabunIT๙" w:cs="TH SarabunIT๙"/>
                 <w:sz w:val="32"/>
                 <w:szCs w:val="32"/>
-                <w:cs/>
-              </w:rPr>
-            </w:pPr>
-            <w:r>
-              <w:rPr>
-                <w:rFonts w:ascii="TH SarabunIT๙" w:eastAsia="Calibri" w:hAnsi="TH SarabunIT๙" w:cs="TH SarabunIT๙"/>
-                <w:sz w:val="32"/>
-                <w:szCs w:val="32"/>
-                <w:cs/>
-              </w:rPr>
-              <w:t>๒๒</w:t>
-            </w:r>
-          </w:p>
-        </w:tc>
-        <w:tc>
-          <w:tcPr>
-            <w:tcW w:w="0" w:type="auto"/>
-            <w:vMerge/>
-          </w:tcPr>
-          <w:p/>
-        </w:tc>
-        <w:tc>
-          <w:tcPr>
-            <w:tcW w:w="0" w:type="auto"/>
-          </w:tcPr>
-          <w:p>
-            <w:pPr>
-              <w:jc w:val="center"/>
-              <w:rPr>
-                <w:rFonts w:ascii="TH SarabunIT๙" w:eastAsia="Calibri" w:hAnsi="TH SarabunIT๙" w:cs="TH SarabunIT๙"/>
-                <w:sz w:val="32"/>
-                <w:szCs w:val="32"/>
-              </w:rPr>
-            </w:pPr>
-            <w:r>
-              <w:rPr>
-                <w:rFonts w:ascii="TH SarabunIT๙" w:eastAsia="Calibri" w:hAnsi="TH SarabunIT๙" w:cs="TH SarabunIT๙"/>
-                <w:sz w:val="32"/>
-                <w:szCs w:val="32"/>
-                <w:cs/>
-              </w:rPr>
-              <w:t>ขบ.325/004/2568</w:t>
-            </w:r>
-          </w:p>
-        </w:tc>
-        <w:tc>
-          <w:tcPr>
-            <w:tcW w:w="0" w:type="auto"/>
-          </w:tcPr>
-          <w:p>
-            <w:pPr>
-              <w:jc w:val="center"/>
-              <w:rPr>
-                <w:rFonts w:ascii="Segoe UI Symbol" w:eastAsia="Calibri" w:hAnsi="Segoe UI Symbol" w:cs="Segoe UI Symbol"/>
+              </w:rPr>
+            </w:pPr>
+            <w:r>
+              <w:rPr>
+                <w:rFonts w:ascii="TH SarabunIT๙" w:eastAsia="Calibri" w:hAnsi="TH SarabunIT๙" w:cs="TH SarabunIT๙"/>
+                <w:sz w:val="32"/>
+                <w:szCs w:val="32"/>
+                <w:cs/>
+              </w:rPr>
+              <w:t>๒๑</w:t>
+            </w:r>
+          </w:p>
+        </w:tc>
+        <w:tc>
+          <w:tcPr>
+            <w:tcW w:w="0" w:type="auto"/>
+          </w:tcPr>
+          <w:p>
+            <w:pPr>
+              <w:rPr>
+                <w:rFonts w:ascii="TH SarabunIT๙" w:eastAsia="Calibri" w:hAnsi="TH SarabunIT๙" w:cs="TH SarabunIT๙"/>
+                <w:sz w:val="32"/>
+                <w:szCs w:val="32"/>
+              </w:rPr>
+            </w:pPr>
+            <w:r>
+              <w:rPr>
+                <w:rFonts w:ascii="TH SarabunIT๙" w:eastAsia="Calibri" w:hAnsi="TH SarabunIT๙" w:cs="TH SarabunIT๙"/>
+                <w:sz w:val="32"/>
+                <w:szCs w:val="32"/>
+                <w:cs/>
+              </w:rPr>
+              <w:t>เครื่องคอมพิวเตอร์ตั้งโต๊ะ ยี่ห้อ HP รุ่น EliteDesk 705 G2 SFF</w:t>
+            </w:r>
+          </w:p>
+        </w:tc>
+        <w:tc>
+          <w:tcPr>
+            <w:tcW w:w="0" w:type="auto"/>
+          </w:tcPr>
+          <w:p>
+            <w:pPr>
+              <w:jc w:val="center"/>
+              <w:rPr>
+                <w:rFonts w:ascii="TH SarabunIT๙" w:eastAsia="Calibri" w:hAnsi="TH SarabunIT๙" w:cs="TH SarabunIT๙"/>
+                <w:sz w:val="32"/>
+                <w:szCs w:val="32"/>
+              </w:rPr>
+            </w:pPr>
+            <w:r>
+              <w:rPr>
+                <w:rFonts w:ascii="TH SarabunIT๙" w:eastAsia="Calibri" w:hAnsi="TH SarabunIT๙" w:cs="TH SarabunIT๙"/>
+                <w:sz w:val="32"/>
+                <w:szCs w:val="32"/>
+                <w:cs/>
+              </w:rPr>
+              <w:t>ขบ.325/003/2568</w:t>
+            </w:r>
+          </w:p>
+        </w:tc>
+        <w:tc>
+          <w:tcPr>
+            <w:tcW w:w="0" w:type="auto"/>
+          </w:tcPr>
+          <w:p>
+            <w:pPr>
+              <w:jc w:val="center"/>
+              <w:rPr>
+                <w:rFonts w:ascii="TH SarabunIT๙" w:eastAsia="Calibri" w:hAnsi="TH SarabunIT๙" w:cs="TH SarabunIT๙"/>
                 <w:sz w:val="32"/>
                 <w:szCs w:val="32"/>
                 <w:cs/>
@@ -5990,7 +6007,6 @@
                 <w:rFonts w:ascii="TH SarabunIT๙" w:eastAsia="Calibri" w:hAnsi="TH SarabunIT๙" w:cs="TH SarabunIT๙"/>
                 <w:sz w:val="32"/>
                 <w:szCs w:val="32"/>
-                <w:cs/>
               </w:rPr>
             </w:pPr>
             <w:r>
@@ -6027,55 +6043,55 @@
                 <w:szCs w:val="32"/>
                 <w:cs/>
               </w:rPr>
-              <w:t>๒๓</w:t>
-            </w:r>
-          </w:p>
-        </w:tc>
-        <w:tc>
-          <w:tcPr>
-            <w:tcW w:w="0" w:type="auto"/>
-          </w:tcPr>
-          <w:p>
-            <w:pPr>
-              <w:rPr>
-                <w:rFonts w:ascii="TH SarabunIT๙" w:eastAsia="Calibri" w:hAnsi="TH SarabunIT๙" w:cs="TH SarabunIT๙"/>
-                <w:sz w:val="32"/>
-                <w:szCs w:val="32"/>
-                <w:cs/>
-              </w:rPr>
-            </w:pPr>
-            <w:r>
-              <w:rPr>
-                <w:rFonts w:ascii="TH SarabunIT๙" w:eastAsia="Calibri" w:hAnsi="TH SarabunIT๙" w:cs="TH SarabunIT๙"/>
-                <w:sz w:val="32"/>
-                <w:szCs w:val="32"/>
-                <w:cs/>
-              </w:rPr>
-              <w:t>จอภาพคอมพิวเตอร์ ยี่ห้อ HP รุ่น V242</w:t>
-            </w:r>
-          </w:p>
-        </w:tc>
-        <w:tc>
-          <w:tcPr>
-            <w:tcW w:w="0" w:type="auto"/>
-          </w:tcPr>
-          <w:p>
-            <w:pPr>
-              <w:jc w:val="center"/>
-              <w:rPr>
-                <w:rFonts w:ascii="TH SarabunIT๙" w:eastAsia="Calibri" w:hAnsi="TH SarabunIT๙" w:cs="TH SarabunIT๙"/>
-                <w:sz w:val="32"/>
-                <w:szCs w:val="32"/>
-              </w:rPr>
-            </w:pPr>
-            <w:r>
-              <w:rPr>
-                <w:rFonts w:ascii="TH SarabunIT๙" w:eastAsia="Calibri" w:hAnsi="TH SarabunIT๙" w:cs="TH SarabunIT๙"/>
-                <w:sz w:val="32"/>
-                <w:szCs w:val="32"/>
-                <w:cs/>
-              </w:rPr>
-              <w:t>ขบ.325/006/2568</w:t>
+              <w:t>๒๒</w:t>
+            </w:r>
+          </w:p>
+        </w:tc>
+        <w:tc>
+          <w:tcPr>
+            <w:tcW w:w="0" w:type="auto"/>
+          </w:tcPr>
+          <w:p>
+            <w:pPr>
+              <w:rPr>
+                <w:rFonts w:ascii="TH SarabunIT๙" w:eastAsia="Calibri" w:hAnsi="TH SarabunIT๙" w:cs="TH SarabunIT๙"/>
+                <w:sz w:val="32"/>
+                <w:szCs w:val="32"/>
+                <w:cs/>
+              </w:rPr>
+            </w:pPr>
+            <w:r>
+              <w:rPr>
+                <w:rFonts w:ascii="TH SarabunIT๙" w:eastAsia="Calibri" w:hAnsi="TH SarabunIT๙" w:cs="TH SarabunIT๙"/>
+                <w:sz w:val="32"/>
+                <w:szCs w:val="32"/>
+                <w:cs/>
+              </w:rPr>
+              <w:t>เครื่องคอมพิวเตอร์ตั้งโต๊ะ ยี่ห้อ HP รุ่น EliteDesk 705 G2 SFF</w:t>
+            </w:r>
+          </w:p>
+        </w:tc>
+        <w:tc>
+          <w:tcPr>
+            <w:tcW w:w="0" w:type="auto"/>
+          </w:tcPr>
+          <w:p>
+            <w:pPr>
+              <w:jc w:val="center"/>
+              <w:rPr>
+                <w:rFonts w:ascii="TH SarabunIT๙" w:eastAsia="Calibri" w:hAnsi="TH SarabunIT๙" w:cs="TH SarabunIT๙"/>
+                <w:sz w:val="32"/>
+                <w:szCs w:val="32"/>
+              </w:rPr>
+            </w:pPr>
+            <w:r>
+              <w:rPr>
+                <w:rFonts w:ascii="TH SarabunIT๙" w:eastAsia="Calibri" w:hAnsi="TH SarabunIT๙" w:cs="TH SarabunIT๙"/>
+                <w:sz w:val="32"/>
+                <w:szCs w:val="32"/>
+                <w:cs/>
+              </w:rPr>
+              <w:t>ขบ.325/004/2568</w:t>
             </w:r>
           </w:p>
         </w:tc>
@@ -6253,7 +6269,7 @@
                 <w:szCs w:val="32"/>
                 <w:cs/>
               </w:rPr>
-              <w:t>ชำรุด แสดงผลภาพไม่ได้ ซ่อมแซมไม่คุ้มค่า</w:t>
+              <w:t>ชำรุด เปิดเครื่องไม่ได้ ซ่อมแซมไม่คุ้มค่า</w:t>
             </w:r>
           </w:p>
         </w:tc>
@@ -6280,57 +6296,55 @@
                 <w:szCs w:val="32"/>
                 <w:cs/>
               </w:rPr>
-              <w:t>๒๔</w:t>
-            </w:r>
-          </w:p>
-        </w:tc>
-        <w:tc>
-          <w:tcPr>
-            <w:tcW w:w="0" w:type="auto"/>
-            <w:vMerge w:val="restart"/>
-            <w:vAlign w:val="top"/>
-          </w:tcPr>
-          <w:p>
-            <w:pPr>
-              <w:rPr>
-                <w:rFonts w:ascii="TH SarabunIT๙" w:eastAsia="Calibri" w:hAnsi="TH SarabunIT๙" w:cs="TH SarabunIT๙"/>
-                <w:sz w:val="32"/>
-                <w:szCs w:val="32"/>
-                <w:cs/>
-              </w:rPr>
-            </w:pPr>
-            <w:r>
-              <w:rPr>
-                <w:rFonts w:ascii="TH SarabunIT๙" w:eastAsia="Calibri" w:hAnsi="TH SarabunIT๙" w:cs="TH SarabunIT๙"/>
-                <w:sz w:val="32"/>
-                <w:szCs w:val="32"/>
-                <w:cs/>
-              </w:rPr>
-              <w:t>เครื่องคอมพิวเตอร์ตั้งโต๊ะ ยี่ห้อ HP รุ่น EliteDesk 705 G2 SFF</w:t>
-            </w:r>
-          </w:p>
-        </w:tc>
-        <w:tc>
-          <w:tcPr>
-            <w:tcW w:w="0" w:type="auto"/>
-          </w:tcPr>
-          <w:p>
-            <w:pPr>
-              <w:jc w:val="center"/>
-              <w:rPr>
-                <w:rFonts w:ascii="TH SarabunIT๙" w:eastAsia="Calibri" w:hAnsi="TH SarabunIT๙" w:cs="TH SarabunIT๙"/>
-                <w:sz w:val="32"/>
-                <w:szCs w:val="32"/>
-              </w:rPr>
-            </w:pPr>
-            <w:r>
-              <w:rPr>
-                <w:rFonts w:ascii="TH SarabunIT๙" w:eastAsia="Calibri" w:hAnsi="TH SarabunIT๙" w:cs="TH SarabunIT๙"/>
-                <w:sz w:val="32"/>
-                <w:szCs w:val="32"/>
-                <w:cs/>
-              </w:rPr>
-              <w:t>ขบ.325/007/2568</w:t>
+              <w:t>๒๓</w:t>
+            </w:r>
+          </w:p>
+        </w:tc>
+        <w:tc>
+          <w:tcPr>
+            <w:tcW w:w="0" w:type="auto"/>
+          </w:tcPr>
+          <w:p>
+            <w:pPr>
+              <w:rPr>
+                <w:rFonts w:ascii="TH SarabunIT๙" w:eastAsia="Calibri" w:hAnsi="TH SarabunIT๙" w:cs="TH SarabunIT๙"/>
+                <w:sz w:val="32"/>
+                <w:szCs w:val="32"/>
+                <w:cs/>
+              </w:rPr>
+            </w:pPr>
+            <w:r>
+              <w:rPr>
+                <w:rFonts w:ascii="TH SarabunIT๙" w:eastAsia="Calibri" w:hAnsi="TH SarabunIT๙" w:cs="TH SarabunIT๙"/>
+                <w:sz w:val="32"/>
+                <w:szCs w:val="32"/>
+                <w:cs/>
+              </w:rPr>
+              <w:t>จอภาพคอมพิวเตอร์ ยี่ห้อ HP รุ่น V242</w:t>
+            </w:r>
+          </w:p>
+        </w:tc>
+        <w:tc>
+          <w:tcPr>
+            <w:tcW w:w="0" w:type="auto"/>
+          </w:tcPr>
+          <w:p>
+            <w:pPr>
+              <w:jc w:val="center"/>
+              <w:rPr>
+                <w:rFonts w:ascii="TH SarabunIT๙" w:eastAsia="Calibri" w:hAnsi="TH SarabunIT๙" w:cs="TH SarabunIT๙"/>
+                <w:sz w:val="32"/>
+                <w:szCs w:val="32"/>
+              </w:rPr>
+            </w:pPr>
+            <w:r>
+              <w:rPr>
+                <w:rFonts w:ascii="TH SarabunIT๙" w:eastAsia="Calibri" w:hAnsi="TH SarabunIT๙" w:cs="TH SarabunIT๙"/>
+                <w:sz w:val="32"/>
+                <w:szCs w:val="32"/>
+                <w:cs/>
+              </w:rPr>
+              <w:t>ขบ.325/006/2568</w:t>
             </w:r>
           </w:p>
         </w:tc>
@@ -6508,7 +6522,7 @@
                 <w:szCs w:val="32"/>
                 <w:cs/>
               </w:rPr>
-              <w:t>ชำรุด เปิดเครื่องไม่ได้ ซ่อมแซมไม่คุ้มค่า</w:t>
+              <w:t>ชำรุด แสดงผลภาพไม่ได้ ซ่อมแซมไม่คุ้มค่า</w:t>
             </w:r>
           </w:p>
         </w:tc>
@@ -6535,39 +6549,55 @@
                 <w:szCs w:val="32"/>
                 <w:cs/>
               </w:rPr>
-              <w:t>๒๕</w:t>
-            </w:r>
-          </w:p>
-        </w:tc>
-        <w:tc>
-          <w:tcPr>
-            <w:tcW w:w="0" w:type="auto"/>
-            <w:vMerge/>
-          </w:tcPr>
-          <w:p/>
-        </w:tc>
-        <w:tc>
-          <w:tcPr>
-            <w:tcW w:w="0" w:type="auto"/>
-          </w:tcPr>
-          <w:p>
-            <w:pPr>
-              <w:jc w:val="center"/>
-              <w:rPr>
-                <w:rFonts w:ascii="TH SarabunIT๙" w:eastAsia="Calibri" w:hAnsi="TH SarabunIT๙" w:cs="TH SarabunIT๙"/>
-                <w:sz w:val="32"/>
-                <w:szCs w:val="32"/>
-                <w:cs/>
-              </w:rPr>
-            </w:pPr>
-            <w:r>
-              <w:rPr>
-                <w:rFonts w:ascii="TH SarabunIT๙" w:eastAsia="Calibri" w:hAnsi="TH SarabunIT๙" w:cs="TH SarabunIT๙"/>
-                <w:sz w:val="32"/>
-                <w:szCs w:val="32"/>
-                <w:cs/>
-              </w:rPr>
-              <w:t>ขบ.325/008/2568</w:t>
+              <w:t>๒๔</w:t>
+            </w:r>
+          </w:p>
+        </w:tc>
+        <w:tc>
+          <w:tcPr>
+            <w:tcW w:w="0" w:type="auto"/>
+          </w:tcPr>
+          <w:p>
+            <w:pPr>
+              <w:rPr>
+                <w:rFonts w:ascii="TH SarabunIT๙" w:eastAsia="Calibri" w:hAnsi="TH SarabunIT๙" w:cs="TH SarabunIT๙"/>
+                <w:sz w:val="32"/>
+                <w:szCs w:val="32"/>
+                <w:cs/>
+              </w:rPr>
+            </w:pPr>
+            <w:r>
+              <w:rPr>
+                <w:rFonts w:ascii="TH SarabunIT๙" w:eastAsia="Calibri" w:hAnsi="TH SarabunIT๙" w:cs="TH SarabunIT๙"/>
+                <w:sz w:val="32"/>
+                <w:szCs w:val="32"/>
+                <w:cs/>
+              </w:rPr>
+              <w:t>เครื่องคอมพิวเตอร์ตั้งโต๊ะ ยี่ห้อ HP รุ่น EliteDesk 705 G2 SFF</w:t>
+            </w:r>
+          </w:p>
+        </w:tc>
+        <w:tc>
+          <w:tcPr>
+            <w:tcW w:w="0" w:type="auto"/>
+          </w:tcPr>
+          <w:p>
+            <w:pPr>
+              <w:jc w:val="center"/>
+              <w:rPr>
+                <w:rFonts w:ascii="TH SarabunIT๙" w:eastAsia="Calibri" w:hAnsi="TH SarabunIT๙" w:cs="TH SarabunIT๙"/>
+                <w:sz w:val="32"/>
+                <w:szCs w:val="32"/>
+              </w:rPr>
+            </w:pPr>
+            <w:r>
+              <w:rPr>
+                <w:rFonts w:ascii="TH SarabunIT๙" w:eastAsia="Calibri" w:hAnsi="TH SarabunIT๙" w:cs="TH SarabunIT๙"/>
+                <w:sz w:val="32"/>
+                <w:szCs w:val="32"/>
+                <w:cs/>
+              </w:rPr>
+              <w:t>ขบ.325/007/2568</w:t>
             </w:r>
           </w:p>
         </w:tc>
@@ -6772,38 +6802,56 @@
                 <w:szCs w:val="32"/>
                 <w:cs/>
               </w:rPr>
-              <w:t>๒๖</w:t>
-            </w:r>
-          </w:p>
-        </w:tc>
-        <w:tc>
-          <w:tcPr>
-            <w:tcW w:w="0" w:type="auto"/>
-            <w:vMerge/>
-          </w:tcPr>
-          <w:p/>
-        </w:tc>
-        <w:tc>
-          <w:tcPr>
-            <w:tcW w:w="0" w:type="auto"/>
-          </w:tcPr>
-          <w:p>
-            <w:pPr>
-              <w:jc w:val="center"/>
-              <w:rPr>
-                <w:rFonts w:ascii="TH SarabunIT๙" w:eastAsia="Calibri" w:hAnsi="TH SarabunIT๙" w:cs="TH SarabunIT๙"/>
-                <w:sz w:val="32"/>
-                <w:szCs w:val="32"/>
-              </w:rPr>
-            </w:pPr>
-            <w:r>
-              <w:rPr>
-                <w:rFonts w:ascii="TH SarabunIT๙" w:eastAsia="Calibri" w:hAnsi="TH SarabunIT๙" w:cs="TH SarabunIT๙"/>
-                <w:sz w:val="32"/>
-                <w:szCs w:val="32"/>
-                <w:cs/>
-              </w:rPr>
-              <w:t>ขบ.325/009/2568</w:t>
+              <w:t>๒๕</w:t>
+            </w:r>
+          </w:p>
+        </w:tc>
+        <w:tc>
+          <w:tcPr>
+            <w:tcW w:w="0" w:type="auto"/>
+          </w:tcPr>
+          <w:p>
+            <w:pPr>
+              <w:rPr>
+                <w:rFonts w:ascii="TH SarabunIT๙" w:eastAsia="Calibri" w:hAnsi="TH SarabunIT๙" w:cs="TH SarabunIT๙"/>
+                <w:sz w:val="32"/>
+                <w:szCs w:val="32"/>
+                <w:cs/>
+              </w:rPr>
+            </w:pPr>
+            <w:r>
+              <w:rPr>
+                <w:rFonts w:ascii="TH SarabunIT๙" w:eastAsia="Calibri" w:hAnsi="TH SarabunIT๙" w:cs="TH SarabunIT๙"/>
+                <w:sz w:val="32"/>
+                <w:szCs w:val="32"/>
+                <w:cs/>
+              </w:rPr>
+              <w:t>เครื่องคอมพิวเตอร์ตั้งโต๊ะ ยี่ห้อ HP รุ่น EliteDesk 705 G2 SFF</w:t>
+            </w:r>
+          </w:p>
+        </w:tc>
+        <w:tc>
+          <w:tcPr>
+            <w:tcW w:w="0" w:type="auto"/>
+          </w:tcPr>
+          <w:p>
+            <w:pPr>
+              <w:jc w:val="center"/>
+              <w:rPr>
+                <w:rFonts w:ascii="TH SarabunIT๙" w:eastAsia="Calibri" w:hAnsi="TH SarabunIT๙" w:cs="TH SarabunIT๙"/>
+                <w:sz w:val="32"/>
+                <w:szCs w:val="32"/>
+                <w:cs/>
+              </w:rPr>
+            </w:pPr>
+            <w:r>
+              <w:rPr>
+                <w:rFonts w:ascii="TH SarabunIT๙" w:eastAsia="Calibri" w:hAnsi="TH SarabunIT๙" w:cs="TH SarabunIT๙"/>
+                <w:sz w:val="32"/>
+                <w:szCs w:val="32"/>
+                <w:cs/>
+              </w:rPr>
+              <w:t>ขบ.325/008/2568</w:t>
             </w:r>
           </w:p>
         </w:tc>
@@ -7008,39 +7056,55 @@
                 <w:szCs w:val="32"/>
                 <w:cs/>
               </w:rPr>
-              <w:t>๒๗</w:t>
-            </w:r>
-          </w:p>
-        </w:tc>
-        <w:tc>
-          <w:tcPr>
-            <w:tcW w:w="0" w:type="auto"/>
-            <w:vMerge/>
-          </w:tcPr>
-          <w:p/>
-        </w:tc>
-        <w:tc>
-          <w:tcPr>
-            <w:tcW w:w="0" w:type="auto"/>
-          </w:tcPr>
-          <w:p>
-            <w:pPr>
-              <w:jc w:val="center"/>
-              <w:rPr>
-                <w:rFonts w:ascii="TH SarabunIT๙" w:eastAsia="Calibri" w:hAnsi="TH SarabunIT๙" w:cs="TH SarabunIT๙"/>
-                <w:sz w:val="32"/>
-                <w:szCs w:val="32"/>
-                <w:cs/>
-              </w:rPr>
-            </w:pPr>
-            <w:r>
-              <w:rPr>
-                <w:rFonts w:ascii="TH SarabunIT๙" w:eastAsia="Calibri" w:hAnsi="TH SarabunIT๙" w:cs="TH SarabunIT๙"/>
-                <w:sz w:val="32"/>
-                <w:szCs w:val="32"/>
-                <w:cs/>
-              </w:rPr>
-              <w:t>ขบ.325/010/2568</w:t>
+              <w:t>๒๖</w:t>
+            </w:r>
+          </w:p>
+        </w:tc>
+        <w:tc>
+          <w:tcPr>
+            <w:tcW w:w="0" w:type="auto"/>
+          </w:tcPr>
+          <w:p>
+            <w:pPr>
+              <w:rPr>
+                <w:rFonts w:ascii="TH SarabunIT๙" w:eastAsia="Calibri" w:hAnsi="TH SarabunIT๙" w:cs="TH SarabunIT๙"/>
+                <w:sz w:val="32"/>
+                <w:szCs w:val="32"/>
+                <w:cs/>
+              </w:rPr>
+            </w:pPr>
+            <w:r>
+              <w:rPr>
+                <w:rFonts w:ascii="TH SarabunIT๙" w:eastAsia="Calibri" w:hAnsi="TH SarabunIT๙" w:cs="TH SarabunIT๙"/>
+                <w:sz w:val="32"/>
+                <w:szCs w:val="32"/>
+                <w:cs/>
+              </w:rPr>
+              <w:t>เครื่องคอมพิวเตอร์ตั้งโต๊ะ ยี่ห้อ HP รุ่น EliteDesk 705 G2 SFF</w:t>
+            </w:r>
+          </w:p>
+        </w:tc>
+        <w:tc>
+          <w:tcPr>
+            <w:tcW w:w="0" w:type="auto"/>
+          </w:tcPr>
+          <w:p>
+            <w:pPr>
+              <w:jc w:val="center"/>
+              <w:rPr>
+                <w:rFonts w:ascii="TH SarabunIT๙" w:eastAsia="Calibri" w:hAnsi="TH SarabunIT๙" w:cs="TH SarabunIT๙"/>
+                <w:sz w:val="32"/>
+                <w:szCs w:val="32"/>
+              </w:rPr>
+            </w:pPr>
+            <w:r>
+              <w:rPr>
+                <w:rFonts w:ascii="TH SarabunIT๙" w:eastAsia="Calibri" w:hAnsi="TH SarabunIT๙" w:cs="TH SarabunIT๙"/>
+                <w:sz w:val="32"/>
+                <w:szCs w:val="32"/>
+                <w:cs/>
+              </w:rPr>
+              <w:t>ขบ.325/009/2568</w:t>
             </w:r>
           </w:p>
         </w:tc>
@@ -7245,39 +7309,56 @@
                 <w:szCs w:val="32"/>
                 <w:cs/>
               </w:rPr>
-              <w:t>๒๘</w:t>
-            </w:r>
-          </w:p>
-        </w:tc>
-        <w:tc>
-          <w:tcPr>
-            <w:tcW w:w="0" w:type="auto"/>
-            <w:vMerge/>
-          </w:tcPr>
-          <w:p/>
-        </w:tc>
-        <w:tc>
-          <w:tcPr>
-            <w:tcW w:w="0" w:type="auto"/>
-          </w:tcPr>
-          <w:p>
-            <w:pPr>
-              <w:jc w:val="center"/>
-              <w:rPr>
-                <w:rFonts w:ascii="TH SarabunIT๙" w:eastAsia="Calibri" w:hAnsi="TH SarabunIT๙" w:cs="TH SarabunIT๙"/>
-                <w:sz w:val="32"/>
-                <w:szCs w:val="32"/>
-                <w:cs/>
-              </w:rPr>
-            </w:pPr>
-            <w:r>
-              <w:rPr>
-                <w:rFonts w:ascii="TH SarabunIT๙" w:eastAsia="Calibri" w:hAnsi="TH SarabunIT๙" w:cs="TH SarabunIT๙"/>
-                <w:sz w:val="32"/>
-                <w:szCs w:val="32"/>
-                <w:cs/>
-              </w:rPr>
-              <w:t>ขบ.325/014/2568</w:t>
+              <w:t>๒๗</w:t>
+            </w:r>
+          </w:p>
+        </w:tc>
+        <w:tc>
+          <w:tcPr>
+            <w:tcW w:w="0" w:type="auto"/>
+          </w:tcPr>
+          <w:p>
+            <w:pPr>
+              <w:rPr>
+                <w:rFonts w:ascii="TH SarabunIT๙" w:eastAsia="Calibri" w:hAnsi="TH SarabunIT๙" w:cs="TH SarabunIT๙"/>
+                <w:sz w:val="32"/>
+                <w:szCs w:val="32"/>
+                <w:cs/>
+              </w:rPr>
+            </w:pPr>
+            <w:r>
+              <w:rPr>
+                <w:rFonts w:ascii="TH SarabunIT๙" w:eastAsia="Calibri" w:hAnsi="TH SarabunIT๙" w:cs="TH SarabunIT๙"/>
+                <w:sz w:val="32"/>
+                <w:szCs w:val="32"/>
+                <w:cs/>
+              </w:rPr>
+              <w:t>เครื่องคอมพิวเตอร์ตั้งโต๊ะ ยี่ห้อ HP รุ่น EliteDesk 705 G2 SFF</w:t>
+            </w:r>
+          </w:p>
+        </w:tc>
+        <w:tc>
+          <w:tcPr>
+            <w:tcW w:w="0" w:type="auto"/>
+          </w:tcPr>
+          <w:p>
+            <w:pPr>
+              <w:jc w:val="center"/>
+              <w:rPr>
+                <w:rFonts w:ascii="TH SarabunIT๙" w:eastAsia="Calibri" w:hAnsi="TH SarabunIT๙" w:cs="TH SarabunIT๙"/>
+                <w:sz w:val="32"/>
+                <w:szCs w:val="32"/>
+                <w:cs/>
+              </w:rPr>
+            </w:pPr>
+            <w:r>
+              <w:rPr>
+                <w:rFonts w:ascii="TH SarabunIT๙" w:eastAsia="Calibri" w:hAnsi="TH SarabunIT๙" w:cs="TH SarabunIT๙"/>
+                <w:sz w:val="32"/>
+                <w:szCs w:val="32"/>
+                <w:cs/>
+              </w:rPr>
+              <w:t>ขบ.325/010/2568</w:t>
             </w:r>
           </w:p>
         </w:tc>
@@ -7482,38 +7563,56 @@
                 <w:szCs w:val="32"/>
                 <w:cs/>
               </w:rPr>
-              <w:t>๒๙</w:t>
-            </w:r>
-          </w:p>
-        </w:tc>
-        <w:tc>
-          <w:tcPr>
-            <w:tcW w:w="0" w:type="auto"/>
-            <w:vMerge/>
-          </w:tcPr>
-          <w:p/>
-        </w:tc>
-        <w:tc>
-          <w:tcPr>
-            <w:tcW w:w="0" w:type="auto"/>
-          </w:tcPr>
-          <w:p>
-            <w:pPr>
-              <w:jc w:val="center"/>
-              <w:rPr>
-                <w:rFonts w:ascii="TH SarabunIT๙" w:eastAsia="Calibri" w:hAnsi="TH SarabunIT๙" w:cs="TH SarabunIT๙"/>
-                <w:sz w:val="32"/>
-                <w:szCs w:val="32"/>
-              </w:rPr>
-            </w:pPr>
-            <w:r>
-              <w:rPr>
-                <w:rFonts w:ascii="TH SarabunIT๙" w:eastAsia="Calibri" w:hAnsi="TH SarabunIT๙" w:cs="TH SarabunIT๙"/>
-                <w:sz w:val="32"/>
-                <w:szCs w:val="32"/>
-                <w:cs/>
-              </w:rPr>
-              <w:t>ขบ.325/015/2568</w:t>
+              <w:t>๒๘</w:t>
+            </w:r>
+          </w:p>
+        </w:tc>
+        <w:tc>
+          <w:tcPr>
+            <w:tcW w:w="0" w:type="auto"/>
+          </w:tcPr>
+          <w:p>
+            <w:pPr>
+              <w:rPr>
+                <w:rFonts w:ascii="TH SarabunIT๙" w:eastAsia="Calibri" w:hAnsi="TH SarabunIT๙" w:cs="TH SarabunIT๙"/>
+                <w:sz w:val="32"/>
+                <w:szCs w:val="32"/>
+                <w:cs/>
+              </w:rPr>
+            </w:pPr>
+            <w:r>
+              <w:rPr>
+                <w:rFonts w:ascii="TH SarabunIT๙" w:eastAsia="Calibri" w:hAnsi="TH SarabunIT๙" w:cs="TH SarabunIT๙"/>
+                <w:sz w:val="32"/>
+                <w:szCs w:val="32"/>
+                <w:cs/>
+              </w:rPr>
+              <w:t>เครื่องคอมพิวเตอร์ตั้งโต๊ะ ยี่ห้อ HP รุ่น EliteDesk 705 G2 SFF</w:t>
+            </w:r>
+          </w:p>
+        </w:tc>
+        <w:tc>
+          <w:tcPr>
+            <w:tcW w:w="0" w:type="auto"/>
+          </w:tcPr>
+          <w:p>
+            <w:pPr>
+              <w:jc w:val="center"/>
+              <w:rPr>
+                <w:rFonts w:ascii="TH SarabunIT๙" w:eastAsia="Calibri" w:hAnsi="TH SarabunIT๙" w:cs="TH SarabunIT๙"/>
+                <w:sz w:val="32"/>
+                <w:szCs w:val="32"/>
+                <w:cs/>
+              </w:rPr>
+            </w:pPr>
+            <w:r>
+              <w:rPr>
+                <w:rFonts w:ascii="TH SarabunIT๙" w:eastAsia="Calibri" w:hAnsi="TH SarabunIT๙" w:cs="TH SarabunIT๙"/>
+                <w:sz w:val="32"/>
+                <w:szCs w:val="32"/>
+                <w:cs/>
+              </w:rPr>
+              <w:t>ขบ.325/014/2568</w:t>
             </w:r>
           </w:p>
         </w:tc>
@@ -7718,38 +7817,55 @@
                 <w:szCs w:val="32"/>
                 <w:cs/>
               </w:rPr>
-              <w:t>๓๐</w:t>
-            </w:r>
-          </w:p>
-        </w:tc>
-        <w:tc>
-          <w:tcPr>
-            <w:tcW w:w="0" w:type="auto"/>
-            <w:vMerge/>
-          </w:tcPr>
-          <w:p/>
-        </w:tc>
-        <w:tc>
-          <w:tcPr>
-            <w:tcW w:w="0" w:type="auto"/>
-          </w:tcPr>
-          <w:p>
-            <w:pPr>
-              <w:jc w:val="center"/>
-              <w:rPr>
-                <w:rFonts w:ascii="TH SarabunIT๙" w:eastAsia="Calibri" w:hAnsi="TH SarabunIT๙" w:cs="TH SarabunIT๙"/>
-                <w:sz w:val="32"/>
-                <w:szCs w:val="32"/>
-              </w:rPr>
-            </w:pPr>
-            <w:r>
-              <w:rPr>
-                <w:rFonts w:ascii="TH SarabunIT๙" w:eastAsia="Calibri" w:hAnsi="TH SarabunIT๙" w:cs="TH SarabunIT๙"/>
-                <w:sz w:val="32"/>
-                <w:szCs w:val="32"/>
-                <w:cs/>
-              </w:rPr>
-              <w:t>ขบ.325/016/2568</w:t>
+              <w:t>๒๙</w:t>
+            </w:r>
+          </w:p>
+        </w:tc>
+        <w:tc>
+          <w:tcPr>
+            <w:tcW w:w="0" w:type="auto"/>
+          </w:tcPr>
+          <w:p>
+            <w:pPr>
+              <w:rPr>
+                <w:rFonts w:ascii="TH SarabunIT๙" w:eastAsia="Calibri" w:hAnsi="TH SarabunIT๙" w:cs="TH SarabunIT๙"/>
+                <w:sz w:val="32"/>
+                <w:szCs w:val="32"/>
+                <w:cs/>
+              </w:rPr>
+            </w:pPr>
+            <w:r>
+              <w:rPr>
+                <w:rFonts w:ascii="TH SarabunIT๙" w:eastAsia="Calibri" w:hAnsi="TH SarabunIT๙" w:cs="TH SarabunIT๙"/>
+                <w:sz w:val="32"/>
+                <w:szCs w:val="32"/>
+                <w:cs/>
+              </w:rPr>
+              <w:t>เครื่องคอมพิวเตอร์ตั้งโต๊ะ ยี่ห้อ HP รุ่น EliteDesk 705 G2 SFF</w:t>
+            </w:r>
+          </w:p>
+        </w:tc>
+        <w:tc>
+          <w:tcPr>
+            <w:tcW w:w="0" w:type="auto"/>
+          </w:tcPr>
+          <w:p>
+            <w:pPr>
+              <w:jc w:val="center"/>
+              <w:rPr>
+                <w:rFonts w:ascii="TH SarabunIT๙" w:eastAsia="Calibri" w:hAnsi="TH SarabunIT๙" w:cs="TH SarabunIT๙"/>
+                <w:sz w:val="32"/>
+                <w:szCs w:val="32"/>
+              </w:rPr>
+            </w:pPr>
+            <w:r>
+              <w:rPr>
+                <w:rFonts w:ascii="TH SarabunIT๙" w:eastAsia="Calibri" w:hAnsi="TH SarabunIT๙" w:cs="TH SarabunIT๙"/>
+                <w:sz w:val="32"/>
+                <w:szCs w:val="32"/>
+                <w:cs/>
+              </w:rPr>
+              <w:t>ขบ.325/015/2568</w:t>
             </w:r>
           </w:p>
         </w:tc>
@@ -7954,38 +8070,55 @@
                 <w:szCs w:val="32"/>
                 <w:cs/>
               </w:rPr>
-              <w:t>๓๑</w:t>
-            </w:r>
-          </w:p>
-        </w:tc>
-        <w:tc>
-          <w:tcPr>
-            <w:tcW w:w="0" w:type="auto"/>
-            <w:vMerge/>
-          </w:tcPr>
-          <w:p/>
-        </w:tc>
-        <w:tc>
-          <w:tcPr>
-            <w:tcW w:w="0" w:type="auto"/>
-          </w:tcPr>
-          <w:p>
-            <w:pPr>
-              <w:jc w:val="center"/>
-              <w:rPr>
-                <w:rFonts w:ascii="TH SarabunIT๙" w:eastAsia="Calibri" w:hAnsi="TH SarabunIT๙" w:cs="TH SarabunIT๙"/>
-                <w:sz w:val="32"/>
-                <w:szCs w:val="32"/>
-              </w:rPr>
-            </w:pPr>
-            <w:r>
-              <w:rPr>
-                <w:rFonts w:ascii="TH SarabunIT๙" w:eastAsia="Calibri" w:hAnsi="TH SarabunIT๙" w:cs="TH SarabunIT๙"/>
-                <w:sz w:val="32"/>
-                <w:szCs w:val="32"/>
-                <w:cs/>
-              </w:rPr>
-              <w:t>ขบ.325/017/2568</w:t>
+              <w:t>๓๐</w:t>
+            </w:r>
+          </w:p>
+        </w:tc>
+        <w:tc>
+          <w:tcPr>
+            <w:tcW w:w="0" w:type="auto"/>
+          </w:tcPr>
+          <w:p>
+            <w:pPr>
+              <w:rPr>
+                <w:rFonts w:ascii="TH SarabunIT๙" w:eastAsia="Calibri" w:hAnsi="TH SarabunIT๙" w:cs="TH SarabunIT๙"/>
+                <w:sz w:val="32"/>
+                <w:szCs w:val="32"/>
+                <w:cs/>
+              </w:rPr>
+            </w:pPr>
+            <w:r>
+              <w:rPr>
+                <w:rFonts w:ascii="TH SarabunIT๙" w:eastAsia="Calibri" w:hAnsi="TH SarabunIT๙" w:cs="TH SarabunIT๙"/>
+                <w:sz w:val="32"/>
+                <w:szCs w:val="32"/>
+                <w:cs/>
+              </w:rPr>
+              <w:t>เครื่องคอมพิวเตอร์ตั้งโต๊ะ ยี่ห้อ HP รุ่น EliteDesk 705 G2 SFF</w:t>
+            </w:r>
+          </w:p>
+        </w:tc>
+        <w:tc>
+          <w:tcPr>
+            <w:tcW w:w="0" w:type="auto"/>
+          </w:tcPr>
+          <w:p>
+            <w:pPr>
+              <w:jc w:val="center"/>
+              <w:rPr>
+                <w:rFonts w:ascii="TH SarabunIT๙" w:eastAsia="Calibri" w:hAnsi="TH SarabunIT๙" w:cs="TH SarabunIT๙"/>
+                <w:sz w:val="32"/>
+                <w:szCs w:val="32"/>
+              </w:rPr>
+            </w:pPr>
+            <w:r>
+              <w:rPr>
+                <w:rFonts w:ascii="TH SarabunIT๙" w:eastAsia="Calibri" w:hAnsi="TH SarabunIT๙" w:cs="TH SarabunIT๙"/>
+                <w:sz w:val="32"/>
+                <w:szCs w:val="32"/>
+                <w:cs/>
+              </w:rPr>
+              <w:t>ขบ.325/016/2568</w:t>
             </w:r>
           </w:p>
         </w:tc>
@@ -8190,6 +8323,259 @@
                 <w:szCs w:val="32"/>
                 <w:cs/>
               </w:rPr>
+              <w:t>๓๑</w:t>
+            </w:r>
+          </w:p>
+        </w:tc>
+        <w:tc>
+          <w:tcPr>
+            <w:tcW w:w="0" w:type="auto"/>
+          </w:tcPr>
+          <w:p>
+            <w:pPr>
+              <w:rPr>
+                <w:rFonts w:ascii="TH SarabunIT๙" w:eastAsia="Calibri" w:hAnsi="TH SarabunIT๙" w:cs="TH SarabunIT๙"/>
+                <w:sz w:val="32"/>
+                <w:szCs w:val="32"/>
+                <w:cs/>
+              </w:rPr>
+            </w:pPr>
+            <w:r>
+              <w:rPr>
+                <w:rFonts w:ascii="TH SarabunIT๙" w:eastAsia="Calibri" w:hAnsi="TH SarabunIT๙" w:cs="TH SarabunIT๙"/>
+                <w:sz w:val="32"/>
+                <w:szCs w:val="32"/>
+                <w:cs/>
+              </w:rPr>
+              <w:t>เครื่องคอมพิวเตอร์ตั้งโต๊ะ ยี่ห้อ HP รุ่น EliteDesk 705 G2 SFF</w:t>
+            </w:r>
+          </w:p>
+        </w:tc>
+        <w:tc>
+          <w:tcPr>
+            <w:tcW w:w="0" w:type="auto"/>
+          </w:tcPr>
+          <w:p>
+            <w:pPr>
+              <w:jc w:val="center"/>
+              <w:rPr>
+                <w:rFonts w:ascii="TH SarabunIT๙" w:eastAsia="Calibri" w:hAnsi="TH SarabunIT๙" w:cs="TH SarabunIT๙"/>
+                <w:sz w:val="32"/>
+                <w:szCs w:val="32"/>
+              </w:rPr>
+            </w:pPr>
+            <w:r>
+              <w:rPr>
+                <w:rFonts w:ascii="TH SarabunIT๙" w:eastAsia="Calibri" w:hAnsi="TH SarabunIT๙" w:cs="TH SarabunIT๙"/>
+                <w:sz w:val="32"/>
+                <w:szCs w:val="32"/>
+                <w:cs/>
+              </w:rPr>
+              <w:t>ขบ.325/017/2568</w:t>
+            </w:r>
+          </w:p>
+        </w:tc>
+        <w:tc>
+          <w:tcPr>
+            <w:tcW w:w="0" w:type="auto"/>
+          </w:tcPr>
+          <w:p>
+            <w:pPr>
+              <w:jc w:val="center"/>
+              <w:rPr>
+                <w:rFonts w:ascii="Segoe UI Symbol" w:eastAsia="Calibri" w:hAnsi="Segoe UI Symbol" w:cs="Segoe UI Symbol"/>
+                <w:sz w:val="32"/>
+                <w:szCs w:val="32"/>
+                <w:cs/>
+              </w:rPr>
+            </w:pPr>
+            <w:r>
+              <w:rPr>
+                <w:rFonts w:ascii="Segoe UI Symbol" w:eastAsia="Calibri" w:hAnsi="Segoe UI Symbol" w:cs="Segoe UI Symbol" w:hint="cs"/>
+                <w:sz w:val="32"/>
+                <w:szCs w:val="32"/>
+                <w:cs/>
+              </w:rPr>
+              <w:t>✓</w:t>
+            </w:r>
+          </w:p>
+        </w:tc>
+        <w:tc>
+          <w:tcPr>
+            <w:tcW w:w="0" w:type="auto"/>
+          </w:tcPr>
+          <w:p>
+            <w:pPr>
+              <w:jc w:val="center"/>
+              <w:rPr>
+                <w:rFonts w:ascii="TH SarabunIT๙" w:eastAsia="Calibri" w:hAnsi="TH SarabunIT๙" w:cs="TH SarabunIT๙"/>
+                <w:sz w:val="32"/>
+                <w:szCs w:val="32"/>
+                <w:cs/>
+              </w:rPr>
+            </w:pPr>
+          </w:p>
+        </w:tc>
+        <w:tc>
+          <w:tcPr>
+            <w:tcW w:w="0" w:type="auto"/>
+          </w:tcPr>
+          <w:p>
+            <w:pPr>
+              <w:jc w:val="center"/>
+              <w:rPr>
+                <w:rFonts w:ascii="TH SarabunIT๙" w:eastAsia="Calibri" w:hAnsi="TH SarabunIT๙" w:cs="TH SarabunIT๙"/>
+                <w:sz w:val="32"/>
+                <w:szCs w:val="32"/>
+                <w:cs/>
+              </w:rPr>
+            </w:pPr>
+          </w:p>
+        </w:tc>
+        <w:tc>
+          <w:tcPr>
+            <w:tcW w:w="0" w:type="auto"/>
+          </w:tcPr>
+          <w:p>
+            <w:pPr>
+              <w:jc w:val="center"/>
+              <w:rPr>
+                <w:rFonts w:ascii="TH SarabunIT๙" w:eastAsia="Calibri" w:hAnsi="TH SarabunIT๙" w:cs="TH SarabunIT๙"/>
+                <w:sz w:val="32"/>
+                <w:szCs w:val="32"/>
+                <w:cs/>
+              </w:rPr>
+            </w:pPr>
+            <w:r>
+              <w:rPr>
+                <w:rFonts w:ascii="TH SarabunIT๙" w:eastAsia="Calibri" w:hAnsi="TH SarabunIT๙" w:cs="TH SarabunIT๙"/>
+                <w:sz w:val="32"/>
+                <w:szCs w:val="32"/>
+                <w:cs/>
+              </w:rPr>
+              <w:t>ใช้งานไม่ได้</w:t>
+            </w:r>
+          </w:p>
+        </w:tc>
+        <w:tc>
+          <w:tcPr>
+            <w:tcW w:w="0" w:type="auto"/>
+          </w:tcPr>
+          <w:p>
+            <w:pPr>
+              <w:jc w:val="center"/>
+              <w:rPr>
+                <w:rFonts w:ascii="TH SarabunIT๙" w:eastAsia="Calibri" w:hAnsi="TH SarabunIT๙" w:cs="TH SarabunIT๙"/>
+                <w:sz w:val="32"/>
+                <w:szCs w:val="32"/>
+                <w:cs/>
+              </w:rPr>
+            </w:pPr>
+          </w:p>
+        </w:tc>
+        <w:tc>
+          <w:tcPr>
+            <w:tcW w:w="0" w:type="auto"/>
+          </w:tcPr>
+          <w:p>
+            <w:pPr>
+              <w:jc w:val="center"/>
+              <w:rPr>
+                <w:rFonts w:ascii="TH SarabunIT๙" w:eastAsia="Calibri" w:hAnsi="TH SarabunIT๙" w:cs="TH SarabunIT๙"/>
+                <w:sz w:val="32"/>
+                <w:szCs w:val="32"/>
+                <w:cs/>
+              </w:rPr>
+            </w:pPr>
+            <w:r>
+              <w:rPr>
+                <w:rFonts w:ascii="TH SarabunIT๙" w:eastAsia="Calibri" w:hAnsi="TH SarabunIT๙" w:cs="TH SarabunIT๙"/>
+                <w:sz w:val="32"/>
+                <w:szCs w:val="32"/>
+                <w:cs/>
+              </w:rPr>
+              <w:t>2568</w:t>
+            </w:r>
+          </w:p>
+        </w:tc>
+        <w:tc>
+          <w:tcPr>
+            <w:tcW w:w="0" w:type="auto"/>
+          </w:tcPr>
+          <w:p>
+            <w:pPr>
+              <w:jc w:val="center"/>
+              <w:rPr>
+                <w:rFonts w:ascii="TH SarabunIT๙" w:eastAsia="Calibri" w:hAnsi="TH SarabunIT๙" w:cs="TH SarabunIT๙"/>
+                <w:sz w:val="32"/>
+                <w:szCs w:val="32"/>
+                <w:cs/>
+              </w:rPr>
+            </w:pPr>
+          </w:p>
+        </w:tc>
+        <w:tc>
+          <w:tcPr>
+            <w:tcW w:w="0" w:type="auto"/>
+          </w:tcPr>
+          <w:p>
+            <w:pPr>
+              <w:jc w:val="center"/>
+              <w:rPr>
+                <w:rFonts w:ascii="TH SarabunIT๙" w:eastAsia="Calibri" w:hAnsi="TH SarabunIT๙" w:cs="TH SarabunIT๙"/>
+                <w:sz w:val="32"/>
+                <w:szCs w:val="32"/>
+              </w:rPr>
+            </w:pPr>
+          </w:p>
+        </w:tc>
+        <w:tc>
+          <w:tcPr>
+            <w:tcW w:w="0" w:type="auto"/>
+          </w:tcPr>
+          <w:p>
+            <w:pPr>
+              <w:rPr>
+                <w:rFonts w:ascii="TH SarabunIT๙" w:eastAsia="Calibri" w:hAnsi="TH SarabunIT๙" w:cs="TH SarabunIT๙"/>
+                <w:sz w:val="32"/>
+                <w:szCs w:val="32"/>
+                <w:cs/>
+              </w:rPr>
+            </w:pPr>
+            <w:r>
+              <w:rPr>
+                <w:rFonts w:ascii="TH SarabunIT๙" w:eastAsia="Calibri" w:hAnsi="TH SarabunIT๙" w:cs="TH SarabunIT๙"/>
+                <w:sz w:val="32"/>
+                <w:szCs w:val="32"/>
+                <w:cs/>
+              </w:rPr>
+              <w:t>ชำรุด เปิดเครื่องไม่ได้ ซ่อมแซมไม่คุ้มค่า</w:t>
+            </w:r>
+          </w:p>
+        </w:tc>
+      </w:tr>
+      <w:tr>
+        <w:tc>
+          <w:tcPr>
+            <w:tcW w:w="0" w:type="auto"/>
+          </w:tcPr>
+          <w:p>
+            <w:pPr>
+              <w:jc w:val="center"/>
+              <w:rPr>
+                <w:rFonts w:ascii="TH SarabunIT๙" w:eastAsia="Calibri" w:hAnsi="TH SarabunIT๙" w:cs="TH SarabunIT๙"/>
+                <w:sz w:val="32"/>
+                <w:szCs w:val="32"/>
+                <w:cs/>
+              </w:rPr>
+            </w:pPr>
+            <w:r>
+              <w:rPr>
+                <w:rFonts w:ascii="TH SarabunIT๙" w:eastAsia="Calibri" w:hAnsi="TH SarabunIT๙" w:cs="TH SarabunIT๙"/>
+                <w:sz w:val="32"/>
+                <w:szCs w:val="32"/>
+                <w:cs/>
+              </w:rPr>
               <w:t>๓๒</w:t>
             </w:r>
           </w:p>
@@ -8197,9 +8583,26 @@
         <w:tc>
           <w:tcPr>
             <w:tcW w:w="0" w:type="auto"/>
-            <w:vMerge/>
-          </w:tcPr>
-          <w:p/>
+          </w:tcPr>
+          <w:p>
+            <w:pPr>
+              <w:rPr>
+                <w:rFonts w:ascii="TH SarabunIT๙" w:eastAsia="Calibri" w:hAnsi="TH SarabunIT๙" w:cs="TH SarabunIT๙"/>
+                <w:sz w:val="32"/>
+                <w:szCs w:val="32"/>
+                <w:cs/>
+              </w:rPr>
+            </w:pPr>
+            <w:r>
+              <w:rPr>
+                <w:rFonts w:ascii="TH SarabunIT๙" w:eastAsia="Calibri" w:hAnsi="TH SarabunIT๙" w:cs="TH SarabunIT๙"/>
+                <w:sz w:val="32"/>
+                <w:szCs w:val="32"/>
+                <w:cs/>
+              </w:rPr>
+              <w:t>เครื่องคอมพิวเตอร์ตั้งโต๊ะ ยี่ห้อ HP รุ่น EliteDesk 705 G2 SFF</w:t>
+            </w:r>
+          </w:p>
         </w:tc>
         <w:tc>
           <w:tcPr>

</xml_diff>